<commit_message>
SSLC Option B: drop Counsel gates (Jon 10/7: still negotiating)
</commit_message>
<xml_diff>
--- a/drafts/Exos_SSLC_OptionB_Offer_Summary_2026-10-07.docx
+++ b/drafts/Exos_SSLC_OptionB_Offer_Summary_2026-10-07.docx
@@ -13,7 +13,7 @@
           <w:color w:val="800000"/>
           <w:sz w:val="16"/>
         </w:rPr>
-        <w:t>INTERNAL — DRAFT — [Counsel review required] — CEO eyes only</w:t>
+        <w:t>INTERNAL — DRAFT — NEGOTIATING TERMS — CEO eyes only</w:t>
       </w:r>
     </w:p>
     <w:p>
@@ -1947,7 +1947,7 @@
         <w:t xml:space="preserve">Mitigation: </w:t>
       </w:r>
       <w:r>
-        <w:t>Option C (held): prepaid BLK3 tank PO $300–700K as bridge. [Counsel: insider lending.] OR close quickly before cash depletes.</w:t>
+        <w:t>Option C (held): prepaid BLK3 tank PO $300–700K as bridge. OR close quickly before cash depletes.</w:t>
       </w:r>
     </w:p>
     <w:p>
@@ -1999,24 +1999,6 @@
       </w:r>
       <w:r>
         <w:t>Markus Rufer and Bob approve on SSLC side; Jon abstains.</w:t>
-      </w:r>
-    </w:p>
-    <w:p>
-      <w:pPr>
-        <w:spacing w:after="40" w:before="0"/>
-        <w:ind w:left="288"/>
-      </w:pPr>
-      <w:r>
-        <w:t xml:space="preserve">•  </w:t>
-      </w:r>
-      <w:r>
-        <w:rPr>
-          <w:b/>
-        </w:rPr>
-        <w:t xml:space="preserve">Counsel: </w:t>
-      </w:r>
-      <w:r>
-        <w:t>[Keyes — review §3 still in force + not 'agreement to agree' before sending §3 notice.]</w:t>
       </w:r>
     </w:p>
     <w:p>
@@ -2193,7 +2175,7 @@
               <w:rPr>
                 <w:sz w:val="18"/>
               </w:rPr>
-              <w:t>Go/No-Go: Option A, A+B (recommended), or A+B+C?</w:t>
+              <w:t>DECIDED 10/7: Option B (A+B), Counsel deferred while negotiating</w:t>
             </w:r>
           </w:p>
         </w:tc>
@@ -2221,7 +2203,7 @@
               <w:rPr>
                 <w:sz w:val="18"/>
               </w:rPr>
-              <w:t>Today 10/7</w:t>
+              <w:t>Done</w:t>
             </w:r>
           </w:p>
         </w:tc>
@@ -2528,64 +2510,6 @@
                 <w:sz w:val="18"/>
               </w:rPr>
               <w:t>7</w:t>
-            </w:r>
-          </w:p>
-        </w:tc>
-        <w:tc>
-          <w:tcPr>
-            <w:tcW w:type="dxa" w:w="4032"/>
-          </w:tcPr>
-          <w:p>
-            <w:r/>
-            <w:r>
-              <w:rPr>
-                <w:sz w:val="18"/>
-              </w:rPr>
-              <w:t>Keyes (Counsel) review §3 + fairness opinion completion?</w:t>
-            </w:r>
-          </w:p>
-        </w:tc>
-        <w:tc>
-          <w:tcPr>
-            <w:tcW w:type="dxa" w:w="2016"/>
-          </w:tcPr>
-          <w:p>
-            <w:r/>
-            <w:r>
-              <w:rPr>
-                <w:sz w:val="18"/>
-              </w:rPr>
-              <w:t>Counsel</w:t>
-            </w:r>
-          </w:p>
-        </w:tc>
-        <w:tc>
-          <w:tcPr>
-            <w:tcW w:type="dxa" w:w="1728"/>
-          </w:tcPr>
-          <w:p>
-            <w:r/>
-            <w:r>
-              <w:rPr>
-                <w:sz w:val="18"/>
-              </w:rPr>
-              <w:t>Pre-send</w:t>
-            </w:r>
-          </w:p>
-        </w:tc>
-      </w:tr>
-      <w:tr>
-        <w:tc>
-          <w:tcPr>
-            <w:tcW w:type="dxa" w:w="432"/>
-          </w:tcPr>
-          <w:p>
-            <w:r/>
-            <w:r>
-              <w:rPr>
-                <w:sz w:val="18"/>
-              </w:rPr>
-              <w:t>8</w:t>
             </w:r>
           </w:p>
         </w:tc>

</xml_diff>

<commit_message>
SSLC Option B: Eqvista fix + 5-yr total comp chart (task #3544)
- Fix Eqvista status in build scripts + v2 draft: 'engaged 8/14/2026; agreement
  still unsigned (held ~1 month)' — replaces incorrect 'in progress' wording
- Add Total Compensation sheet to model xlsx (formulas linked to Assumptions)
- Add scripts/build_sslc_total_comp_chart.py: stacked bar FY27-FY31 with
  cumulative line; Exos brand palette (black/orange)
- Rebuild board summary (3pp): chart + 5-yr table embedded on page 3
- Rebuild v2 draft docx with corrected Eqvista bullet
- negotiating terms — management assumptions; SSLC debt unverified
</commit_message>
<xml_diff>
--- a/drafts/Exos_SSLC_OptionB_Offer_Summary_2026-10-07.docx
+++ b/drafts/Exos_SSLC_OptionB_Offer_Summary_2026-10-07.docx
@@ -1980,7 +1980,7 @@
         <w:t xml:space="preserve">Jon Quinn: </w:t>
       </w:r>
       <w:r>
-        <w:t>on both boards. Jon recuses from SSLC board vote; sends as Exos CEO only. Eqvista engaged for fairness opinion.</w:t>
+        <w:t>on both boards. Jon recuses from SSLC board vote; sends as Exos CEO only. Eqvista fairness opinion: engaged 8/14/2026; agreement still unsigned (held ~1 month).</w:t>
       </w:r>
     </w:p>
     <w:p>
@@ -2602,6 +2602,540 @@
           <w:sz w:val="16"/>
         </w:rPr>
         <w:t>Decision card for Jon's approval is on Mission Control under task #3544.</w:t>
+      </w:r>
+    </w:p>
+    <w:p>
+      <w:r>
+        <w:br w:type="page"/>
+      </w:r>
+    </w:p>
+    <w:p>
+      <w:pPr>
+        <w:keepNext/>
+        <w:spacing w:after="60" w:before="80"/>
+      </w:pPr>
+      <w:r>
+        <w:rPr>
+          <w:b/>
+          <w:i w:val="0"/>
+          <w:color w:val="1F3A68"/>
+          <w:sz w:val="24"/>
+        </w:rPr>
+        <w:t>TOTAL COMPENSATION — 5-YEAR VIEW (FY27–FY31)</w:t>
+      </w:r>
+    </w:p>
+    <w:p>
+      <w:pPr>
+        <w:spacing w:after="40" w:before="0"/>
+      </w:pPr>
+      <w:r>
+        <w:rPr>
+          <w:b w:val="0"/>
+          <w:i/>
+          <w:color w:val="606060"/>
+          <w:sz w:val="18"/>
+        </w:rPr>
+        <w:t>Stacked bar: funding delivered at close + forward potential (earn-outs). Base scenario shown; stock earn-out whiskers show low/high range. negotiating terms — management assumptions; SSLC debt unverified.</w:t>
+      </w:r>
+    </w:p>
+    <w:p>
+      <w:pPr>
+        <w:spacing w:after="120"/>
+        <w:jc w:val="center"/>
+      </w:pPr>
+      <w:r>
+        <w:drawing>
+          <wp:inline xmlns:a="http://schemas.openxmlformats.org/drawingml/2006/main" xmlns:pic="http://schemas.openxmlformats.org/drawingml/2006/picture">
+            <wp:extent cx="5669280" cy="3405046"/>
+            <wp:docPr id="1" name="Picture 1"/>
+            <wp:cNvGraphicFramePr>
+              <a:graphicFrameLocks noChangeAspect="1"/>
+            </wp:cNvGraphicFramePr>
+            <a:graphic>
+              <a:graphicData uri="http://schemas.openxmlformats.org/drawingml/2006/picture">
+                <pic:pic>
+                  <pic:nvPicPr>
+                    <pic:cNvPr id="0" name="SSLC_OptionB_Total_Compensation_5yr_2026-10-07.png"/>
+                    <pic:cNvPicPr/>
+                  </pic:nvPicPr>
+                  <pic:blipFill>
+                    <a:blip r:embed="rId19"/>
+                    <a:stretch>
+                      <a:fillRect/>
+                    </a:stretch>
+                  </pic:blipFill>
+                  <pic:spPr>
+                    <a:xfrm>
+                      <a:off x="0" y="0"/>
+                      <a:ext cx="5669280" cy="3405046"/>
+                    </a:xfrm>
+                    <a:prstGeom prst="rect"/>
+                  </pic:spPr>
+                </pic:pic>
+              </a:graphicData>
+            </a:graphic>
+          </wp:inline>
+        </w:drawing>
+      </w:r>
+    </w:p>
+    <w:p>
+      <w:pPr>
+        <w:keepNext/>
+        <w:spacing w:after="40" w:before="80"/>
+      </w:pPr>
+      <w:r>
+        <w:rPr>
+          <w:b/>
+          <w:i w:val="0"/>
+          <w:color w:val="2E75B6"/>
+          <w:sz w:val="21"/>
+        </w:rPr>
+        <w:t>5-Year Total Compensation Summary</w:t>
+      </w:r>
+    </w:p>
+    <w:tbl>
+      <w:tblPr>
+        <w:tblW w:type="auto" w:w="0"/>
+        <w:jc w:val="center"/>
+        <w:tblLayout w:type="fixed"/>
+        <w:tblLook w:firstColumn="1" w:firstRow="1" w:lastColumn="0" w:lastRow="0" w:noHBand="0" w:noVBand="1" w:val="04A0"/>
+      </w:tblPr>
+      <w:tblGrid>
+        <w:gridCol w:w="1728"/>
+        <w:gridCol w:w="2304"/>
+        <w:gridCol w:w="2304"/>
+        <w:gridCol w:w="1872"/>
+        <w:gridCol w:w="2520"/>
+      </w:tblGrid>
+      <w:tr>
+        <w:tc>
+          <w:tcPr>
+            <w:tcW w:type="dxa" w:w="1728"/>
+            <w:shd w:val="clear" w:color="auto" w:fill="1F3A68"/>
+          </w:tcPr>
+          <w:p>
+            <w:r/>
+            <w:r>
+              <w:rPr>
+                <w:b/>
+                <w:color w:val="FFFFFF"/>
+                <w:sz w:val="18"/>
+              </w:rPr>
+              <w:t>Scenario</w:t>
+            </w:r>
+          </w:p>
+        </w:tc>
+        <w:tc>
+          <w:tcPr>
+            <w:tcW w:type="dxa" w:w="2304"/>
+            <w:shd w:val="clear" w:color="auto" w:fill="1F3A68"/>
+          </w:tcPr>
+          <w:p>
+            <w:r/>
+            <w:r>
+              <w:rPr>
+                <w:b/>
+                <w:color w:val="FFFFFF"/>
+                <w:sz w:val="18"/>
+              </w:rPr>
+              <w:t>Funding Delivered</w:t>
+              <w:br/>
+              <w:t>(at close, FY27)</w:t>
+            </w:r>
+          </w:p>
+        </w:tc>
+        <w:tc>
+          <w:tcPr>
+            <w:tcW w:type="dxa" w:w="2304"/>
+            <w:shd w:val="clear" w:color="auto" w:fill="1F3A68"/>
+          </w:tcPr>
+          <w:p>
+            <w:r/>
+            <w:r>
+              <w:rPr>
+                <w:b/>
+                <w:color w:val="FFFFFF"/>
+                <w:sz w:val="18"/>
+              </w:rPr>
+              <w:t>Forward Potential</w:t>
+              <w:br/>
+              <w:t>(earn-outs, 3-yr)</w:t>
+            </w:r>
+          </w:p>
+        </w:tc>
+        <w:tc>
+          <w:tcPr>
+            <w:tcW w:type="dxa" w:w="1872"/>
+            <w:shd w:val="clear" w:color="auto" w:fill="1F3A68"/>
+          </w:tcPr>
+          <w:p>
+            <w:r/>
+            <w:r>
+              <w:rPr>
+                <w:b/>
+                <w:color w:val="FFFFFF"/>
+                <w:sz w:val="18"/>
+              </w:rPr>
+              <w:t>5-Yr Total</w:t>
+            </w:r>
+          </w:p>
+        </w:tc>
+        <w:tc>
+          <w:tcPr>
+            <w:tcW w:type="dxa" w:w="2520"/>
+            <w:shd w:val="clear" w:color="auto" w:fill="1F3A68"/>
+          </w:tcPr>
+          <w:p>
+            <w:r/>
+            <w:r>
+              <w:rPr>
+                <w:b/>
+                <w:color w:val="FFFFFF"/>
+                <w:sz w:val="18"/>
+              </w:rPr>
+              <w:t>Notes</w:t>
+            </w:r>
+          </w:p>
+        </w:tc>
+      </w:tr>
+      <w:tr>
+        <w:tc>
+          <w:tcPr>
+            <w:tcW w:type="dxa" w:w="1728"/>
+          </w:tcPr>
+          <w:p>
+            <w:r/>
+            <w:r>
+              <w:rPr>
+                <w:sz w:val="18"/>
+              </w:rPr>
+              <w:t>Base</w:t>
+            </w:r>
+          </w:p>
+        </w:tc>
+        <w:tc>
+          <w:tcPr>
+            <w:tcW w:type="dxa" w:w="2304"/>
+          </w:tcPr>
+          <w:p>
+            <w:r/>
+            <w:r>
+              <w:rPr>
+                <w:sz w:val="18"/>
+              </w:rPr>
+              <w:t>$4,360,000</w:t>
+            </w:r>
+          </w:p>
+        </w:tc>
+        <w:tc>
+          <w:tcPr>
+            <w:tcW w:type="dxa" w:w="2304"/>
+          </w:tcPr>
+          <w:p>
+            <w:r/>
+            <w:r>
+              <w:rPr>
+                <w:sz w:val="18"/>
+              </w:rPr>
+              <w:t>$2,000,000</w:t>
+            </w:r>
+          </w:p>
+        </w:tc>
+        <w:tc>
+          <w:tcPr>
+            <w:tcW w:type="dxa" w:w="1872"/>
+          </w:tcPr>
+          <w:p>
+            <w:r/>
+            <w:r>
+              <w:rPr>
+                <w:sz w:val="18"/>
+              </w:rPr>
+              <w:t>$6,360,000</w:t>
+            </w:r>
+          </w:p>
+        </w:tc>
+        <w:tc>
+          <w:tcPr>
+            <w:tcW w:type="dxa" w:w="2520"/>
+          </w:tcPr>
+          <w:p>
+            <w:r/>
+            <w:r>
+              <w:rPr>
+                <w:sz w:val="18"/>
+              </w:rPr>
+              <w:t>Tank $750K + Stock $1.25M</w:t>
+            </w:r>
+          </w:p>
+        </w:tc>
+      </w:tr>
+      <w:tr>
+        <w:tc>
+          <w:tcPr>
+            <w:tcW w:type="dxa" w:w="1728"/>
+          </w:tcPr>
+          <w:p>
+            <w:r/>
+            <w:r>
+              <w:rPr>
+                <w:sz w:val="18"/>
+              </w:rPr>
+              <w:t>Low</w:t>
+            </w:r>
+          </w:p>
+        </w:tc>
+        <w:tc>
+          <w:tcPr>
+            <w:tcW w:type="dxa" w:w="2304"/>
+          </w:tcPr>
+          <w:p>
+            <w:r/>
+            <w:r>
+              <w:rPr>
+                <w:sz w:val="18"/>
+              </w:rPr>
+              <w:t>$4,360,000</w:t>
+            </w:r>
+          </w:p>
+        </w:tc>
+        <w:tc>
+          <w:tcPr>
+            <w:tcW w:type="dxa" w:w="2304"/>
+          </w:tcPr>
+          <w:p>
+            <w:r/>
+            <w:r>
+              <w:rPr>
+                <w:sz w:val="18"/>
+              </w:rPr>
+              <w:t>$1,050,000</w:t>
+            </w:r>
+          </w:p>
+        </w:tc>
+        <w:tc>
+          <w:tcPr>
+            <w:tcW w:type="dxa" w:w="1872"/>
+          </w:tcPr>
+          <w:p>
+            <w:r/>
+            <w:r>
+              <w:rPr>
+                <w:sz w:val="18"/>
+              </w:rPr>
+              <w:t>$5,410,000</w:t>
+            </w:r>
+          </w:p>
+        </w:tc>
+        <w:tc>
+          <w:tcPr>
+            <w:tcW w:type="dxa" w:w="2520"/>
+          </w:tcPr>
+          <w:p>
+            <w:r/>
+            <w:r>
+              <w:rPr>
+                <w:sz w:val="18"/>
+              </w:rPr>
+              <w:t>Tank $450K + Stock $600K</w:t>
+            </w:r>
+          </w:p>
+        </w:tc>
+      </w:tr>
+      <w:tr>
+        <w:tc>
+          <w:tcPr>
+            <w:tcW w:type="dxa" w:w="1728"/>
+          </w:tcPr>
+          <w:p>
+            <w:r/>
+            <w:r>
+              <w:rPr>
+                <w:sz w:val="18"/>
+              </w:rPr>
+              <w:t>High</w:t>
+            </w:r>
+          </w:p>
+        </w:tc>
+        <w:tc>
+          <w:tcPr>
+            <w:tcW w:type="dxa" w:w="2304"/>
+          </w:tcPr>
+          <w:p>
+            <w:r/>
+            <w:r>
+              <w:rPr>
+                <w:sz w:val="18"/>
+              </w:rPr>
+              <w:t>$4,360,000</w:t>
+            </w:r>
+          </w:p>
+        </w:tc>
+        <w:tc>
+          <w:tcPr>
+            <w:tcW w:type="dxa" w:w="2304"/>
+          </w:tcPr>
+          <w:p>
+            <w:r/>
+            <w:r>
+              <w:rPr>
+                <w:sz w:val="18"/>
+              </w:rPr>
+              <w:t>$3,000,000</w:t>
+            </w:r>
+          </w:p>
+        </w:tc>
+        <w:tc>
+          <w:tcPr>
+            <w:tcW w:type="dxa" w:w="1872"/>
+          </w:tcPr>
+          <w:p>
+            <w:r/>
+            <w:r>
+              <w:rPr>
+                <w:sz w:val="18"/>
+              </w:rPr>
+              <w:t>$7,360,000</w:t>
+            </w:r>
+          </w:p>
+        </w:tc>
+        <w:tc>
+          <w:tcPr>
+            <w:tcW w:type="dxa" w:w="2520"/>
+          </w:tcPr>
+          <w:p>
+            <w:r/>
+            <w:r>
+              <w:rPr>
+                <w:sz w:val="18"/>
+              </w:rPr>
+              <w:t>Tank $900K (capped) + Stock $2.1M</w:t>
+            </w:r>
+          </w:p>
+        </w:tc>
+      </w:tr>
+      <w:tr>
+        <w:tc>
+          <w:tcPr>
+            <w:tcW w:type="dxa" w:w="1728"/>
+          </w:tcPr>
+          <w:p>
+            <w:r/>
+            <w:r>
+              <w:rPr>
+                <w:sz w:val="18"/>
+              </w:rPr>
+              <w:t>Model 'Total</w:t>
+              <w:br/>
+              <w:t>Consideration'</w:t>
+              <w:br/>
+              <w:t>(base; excl. WC bridge)</w:t>
+            </w:r>
+          </w:p>
+        </w:tc>
+        <w:tc>
+          <w:tcPr>
+            <w:tcW w:type="dxa" w:w="2304"/>
+          </w:tcPr>
+          <w:p>
+            <w:r/>
+            <w:r>
+              <w:rPr>
+                <w:sz w:val="18"/>
+              </w:rPr>
+              <w:t>$3,860,000</w:t>
+            </w:r>
+          </w:p>
+        </w:tc>
+        <w:tc>
+          <w:tcPr>
+            <w:tcW w:type="dxa" w:w="2304"/>
+          </w:tcPr>
+          <w:p>
+            <w:r/>
+            <w:r>
+              <w:rPr>
+                <w:sz w:val="18"/>
+              </w:rPr>
+              <w:t>$2,000,000</w:t>
+            </w:r>
+          </w:p>
+        </w:tc>
+        <w:tc>
+          <w:tcPr>
+            <w:tcW w:type="dxa" w:w="1872"/>
+          </w:tcPr>
+          <w:p>
+            <w:r/>
+            <w:r>
+              <w:rPr>
+                <w:sz w:val="18"/>
+              </w:rPr>
+              <w:t>$5,860,000</w:t>
+            </w:r>
+          </w:p>
+        </w:tc>
+        <w:tc>
+          <w:tcPr>
+            <w:tcW w:type="dxa" w:w="2520"/>
+          </w:tcPr>
+          <w:p>
+            <w:r/>
+            <w:r>
+              <w:rPr>
+                <w:sz w:val="18"/>
+              </w:rPr>
+              <w:t>Deal Structure sheet; WC bridge excluded from consideration</w:t>
+            </w:r>
+          </w:p>
+        </w:tc>
+      </w:tr>
+    </w:tbl>
+    <w:p>
+      <w:pPr>
+        <w:spacing w:after="80" w:before="0"/>
+      </w:pPr>
+    </w:p>
+    <w:p>
+      <w:pPr>
+        <w:spacing w:after="40" w:before="0"/>
+      </w:pPr>
+      <w:r>
+        <w:rPr>
+          <w:b w:val="0"/>
+          <w:i/>
+          <w:color w:val="606060"/>
+          <w:sz w:val="18"/>
+        </w:rPr>
+        <w:t>'Funding delivered' includes: cash at close $2.51M + SSLC costs $60K + Exos stake credit (non-cash) $790K + SSLC debts paid at face ~$500K (TBV) + WC bridge $500K. Model 'Total Consideration' row follows the Deal Structure sheet definition (excl. WC bridge).</w:t>
+      </w:r>
+    </w:p>
+    <w:p>
+      <w:pPr>
+        <w:spacing w:after="40" w:before="0"/>
+      </w:pPr>
+      <w:r>
+        <w:rPr>
+          <w:b w:val="0"/>
+          <w:i/>
+          <w:color w:val="505050"/>
+          <w:sz w:val="16"/>
+        </w:rPr>
+        <w:t>Chart file: drafts/SSLC_OptionB_Total_Compensation_5yr_2026-10-07.png</w:t>
+      </w:r>
+    </w:p>
+    <w:p>
+      <w:pPr>
+        <w:spacing w:after="80" w:before="0"/>
+      </w:pPr>
+      <w:r>
+        <w:rPr>
+          <w:b w:val="0"/>
+          <w:i/>
+          <w:color w:val="505050"/>
+          <w:sz w:val="16"/>
+        </w:rPr>
+        <w:t>Total Compensation sheet in the model xlsx has formulas linked to Assumptions.</w:t>
       </w:r>
     </w:p>
     <w:sectPr>

</xml_diff>

<commit_message>
SSLC Option B model: add v12 Old-Model Case, fix FY27 SSLC .5M vs $6.925M, add reconciliation sheet + v15 understatement note
</commit_message>
<xml_diff>
--- a/drafts/Exos_SSLC_OptionB_Offer_Summary_2026-10-07.docx
+++ b/drafts/Exos_SSLC_OptionB_Offer_Summary_2026-10-07.docx
@@ -582,7 +582,7 @@
           <w:color w:val="1F3A68"/>
           <w:sz w:val="24"/>
         </w:rPr>
-        <w:t>1-YEAR AND 5-YEAR HEADLINE NUMBERS (Exos + SSLC Consolidated)</w:t>
+        <w:t>1-YEAR AND 5-YEAR HEADLINE NUMBERS — TWO CASES</w:t>
       </w:r>
     </w:p>
     <w:p>
@@ -596,7 +596,7 @@
           <w:color w:val="606060"/>
           <w:sz w:val="18"/>
         </w:rPr>
-        <w:t>All figures management assumptions. Exos standalone from v15 commission-only baseline. SSLC FY27 IM tanks $5M confirmed by Markus Rufer (10/2). Post-acquisition: 15% commission eliminated as intercompany.</w:t>
+        <w:t>Actuals-Anchored (AA): uses Q1 FY27 actuals and actuals-derived projections (FY27 SSLC fixed at $5.5M; quarterly-basis correction from prior $6.925M formula). Old-Model Case (v12 drivers): uses v12 Scorpius unit/ASP/COGS ramp (ASP $183K→$536K, units 1.5→9/mo, COGS 35%→30%) + v12 Exos standalone (BLK4/propulsion ramp). ⚠ v15 'Scorpius acquisition benchmark' ($0.9M→$21M) understates v12 Scorpius line ($4.1M→$54.7M) by 13× at Y5.</w:t>
       </w:r>
     </w:p>
     <w:tbl>
@@ -607,15 +607,17 @@
         <w:tblLook w:firstColumn="1" w:firstRow="1" w:lastColumn="0" w:lastRow="0" w:noHBand="0" w:noVBand="1" w:val="04A0"/>
       </w:tblPr>
       <w:tblGrid>
-        <w:gridCol w:w="3168"/>
-        <w:gridCol w:w="2160"/>
-        <w:gridCol w:w="2160"/>
+        <w:gridCol w:w="2592"/>
+        <w:gridCol w:w="1584"/>
+        <w:gridCol w:w="1584"/>
+        <w:gridCol w:w="1728"/>
+        <w:gridCol w:w="1728"/>
         <w:gridCol w:w="2160"/>
       </w:tblGrid>
       <w:tr>
         <w:tc>
           <w:tcPr>
-            <w:tcW w:type="dxa" w:w="3168"/>
+            <w:tcW w:type="dxa" w:w="2592"/>
             <w:shd w:val="clear" w:color="auto" w:fill="1F3A68"/>
           </w:tcPr>
           <w:p>
@@ -632,6 +634,74 @@
         </w:tc>
         <w:tc>
           <w:tcPr>
+            <w:tcW w:type="dxa" w:w="1584"/>
+            <w:shd w:val="clear" w:color="auto" w:fill="1F3A68"/>
+          </w:tcPr>
+          <w:p>
+            <w:r/>
+            <w:r>
+              <w:rPr>
+                <w:b/>
+                <w:color w:val="FFFFFF"/>
+                <w:sz w:val="18"/>
+              </w:rPr>
+              <w:t>AA — FY27</w:t>
+            </w:r>
+          </w:p>
+        </w:tc>
+        <w:tc>
+          <w:tcPr>
+            <w:tcW w:type="dxa" w:w="1584"/>
+            <w:shd w:val="clear" w:color="auto" w:fill="1F3A68"/>
+          </w:tcPr>
+          <w:p>
+            <w:r/>
+            <w:r>
+              <w:rPr>
+                <w:b/>
+                <w:color w:val="FFFFFF"/>
+                <w:sz w:val="18"/>
+              </w:rPr>
+              <w:t>AA — FY31</w:t>
+            </w:r>
+          </w:p>
+        </w:tc>
+        <w:tc>
+          <w:tcPr>
+            <w:tcW w:type="dxa" w:w="1728"/>
+            <w:shd w:val="clear" w:color="auto" w:fill="1F3A68"/>
+          </w:tcPr>
+          <w:p>
+            <w:r/>
+            <w:r>
+              <w:rPr>
+                <w:b/>
+                <w:color w:val="FFFFFF"/>
+                <w:sz w:val="18"/>
+              </w:rPr>
+              <w:t>v12 Old-Model — FY27</w:t>
+            </w:r>
+          </w:p>
+        </w:tc>
+        <w:tc>
+          <w:tcPr>
+            <w:tcW w:type="dxa" w:w="1728"/>
+            <w:shd w:val="clear" w:color="auto" w:fill="1F3A68"/>
+          </w:tcPr>
+          <w:p>
+            <w:r/>
+            <w:r>
+              <w:rPr>
+                <w:b/>
+                <w:color w:val="FFFFFF"/>
+                <w:sz w:val="18"/>
+              </w:rPr>
+              <w:t>v12 Old-Model — FY31</w:t>
+            </w:r>
+          </w:p>
+        </w:tc>
+        <w:tc>
+          <w:tcPr>
             <w:tcW w:type="dxa" w:w="2160"/>
             <w:shd w:val="clear" w:color="auto" w:fill="1F3A68"/>
           </w:tcPr>
@@ -643,40 +713,6 @@
                 <w:color w:val="FFFFFF"/>
                 <w:sz w:val="18"/>
               </w:rPr>
-              <w:t>FY27 (Year 1)</w:t>
-            </w:r>
-          </w:p>
-        </w:tc>
-        <w:tc>
-          <w:tcPr>
-            <w:tcW w:type="dxa" w:w="2160"/>
-            <w:shd w:val="clear" w:color="auto" w:fill="1F3A68"/>
-          </w:tcPr>
-          <w:p>
-            <w:r/>
-            <w:r>
-              <w:rPr>
-                <w:b/>
-                <w:color w:val="FFFFFF"/>
-                <w:sz w:val="18"/>
-              </w:rPr>
-              <w:t>FY31 (Year 5)</w:t>
-            </w:r>
-          </w:p>
-        </w:tc>
-        <w:tc>
-          <w:tcPr>
-            <w:tcW w:type="dxa" w:w="2160"/>
-            <w:shd w:val="clear" w:color="auto" w:fill="1F3A68"/>
-          </w:tcPr>
-          <w:p>
-            <w:r/>
-            <w:r>
-              <w:rPr>
-                <w:b/>
-                <w:color w:val="FFFFFF"/>
-                <w:sz w:val="18"/>
-              </w:rPr>
               <w:t>Notes</w:t>
             </w:r>
           </w:p>
@@ -685,7 +721,7 @@
       <w:tr>
         <w:tc>
           <w:tcPr>
-            <w:tcW w:type="dxa" w:w="3168"/>
+            <w:tcW w:type="dxa" w:w="2592"/>
           </w:tcPr>
           <w:p>
             <w:r/>
@@ -699,6 +735,62 @@
         </w:tc>
         <w:tc>
           <w:tcPr>
+            <w:tcW w:type="dxa" w:w="1584"/>
+          </w:tcPr>
+          <w:p>
+            <w:r/>
+            <w:r>
+              <w:rPr>
+                <w:sz w:val="18"/>
+              </w:rPr>
+              <w:t>$5,500,000</w:t>
+            </w:r>
+          </w:p>
+        </w:tc>
+        <w:tc>
+          <w:tcPr>
+            <w:tcW w:type="dxa" w:w="1584"/>
+          </w:tcPr>
+          <w:p>
+            <w:r/>
+            <w:r>
+              <w:rPr>
+                <w:sz w:val="18"/>
+              </w:rPr>
+              <w:t>$16,500,000</w:t>
+            </w:r>
+          </w:p>
+        </w:tc>
+        <w:tc>
+          <w:tcPr>
+            <w:tcW w:type="dxa" w:w="1728"/>
+          </w:tcPr>
+          <w:p>
+            <w:r/>
+            <w:r>
+              <w:rPr>
+                <w:sz w:val="18"/>
+              </w:rPr>
+              <w:t>$4,120,000</w:t>
+            </w:r>
+          </w:p>
+        </w:tc>
+        <w:tc>
+          <w:tcPr>
+            <w:tcW w:type="dxa" w:w="1728"/>
+          </w:tcPr>
+          <w:p>
+            <w:r/>
+            <w:r>
+              <w:rPr>
+                <w:sz w:val="18"/>
+              </w:rPr>
+              <w:t>$54,690,000</w:t>
+            </w:r>
+          </w:p>
+        </w:tc>
+        <w:tc>
+          <w:tcPr>
             <w:tcW w:type="dxa" w:w="2160"/>
           </w:tcPr>
           <w:p>
@@ -707,35 +799,7 @@
               <w:rPr>
                 <w:sz w:val="18"/>
               </w:rPr>
-              <w:t>$5,500,000</w:t>
-            </w:r>
-          </w:p>
-        </w:tc>
-        <w:tc>
-          <w:tcPr>
-            <w:tcW w:type="dxa" w:w="2160"/>
-          </w:tcPr>
-          <w:p>
-            <w:r/>
-            <w:r>
-              <w:rPr>
-                <w:sz w:val="18"/>
-              </w:rPr>
-              <w:t>$16,500,000</w:t>
-            </w:r>
-          </w:p>
-        </w:tc>
-        <w:tc>
-          <w:tcPr>
-            <w:tcW w:type="dxa" w:w="2160"/>
-          </w:tcPr>
-          <w:p>
-            <w:r/>
-            <w:r>
-              <w:rPr>
-                <w:sz w:val="18"/>
-              </w:rPr>
-              <w:t>IM tanks $5M firm + $0.5M other FY27</w:t>
+              <w:t>AA: actuals-anchored + IM firm; v12: unit/ASP ramp</w:t>
             </w:r>
           </w:p>
         </w:tc>
@@ -743,7 +807,7 @@
       <w:tr>
         <w:tc>
           <w:tcPr>
-            <w:tcW w:type="dxa" w:w="3168"/>
+            <w:tcW w:type="dxa" w:w="2592"/>
           </w:tcPr>
           <w:p>
             <w:r/>
@@ -757,6 +821,62 @@
         </w:tc>
         <w:tc>
           <w:tcPr>
+            <w:tcW w:type="dxa" w:w="1584"/>
+          </w:tcPr>
+          <w:p>
+            <w:r/>
+            <w:r>
+              <w:rPr>
+                <w:sz w:val="18"/>
+              </w:rPr>
+              <w:t>$2,600,000</w:t>
+            </w:r>
+          </w:p>
+        </w:tc>
+        <w:tc>
+          <w:tcPr>
+            <w:tcW w:type="dxa" w:w="1584"/>
+          </w:tcPr>
+          <w:p>
+            <w:r/>
+            <w:r>
+              <w:rPr>
+                <w:sz w:val="18"/>
+              </w:rPr>
+              <w:t>$16,000,000</w:t>
+            </w:r>
+          </w:p>
+        </w:tc>
+        <w:tc>
+          <w:tcPr>
+            <w:tcW w:type="dxa" w:w="1728"/>
+          </w:tcPr>
+          <w:p>
+            <w:r/>
+            <w:r>
+              <w:rPr>
+                <w:sz w:val="18"/>
+              </w:rPr>
+              <w:t>$4,760,000</w:t>
+            </w:r>
+          </w:p>
+        </w:tc>
+        <w:tc>
+          <w:tcPr>
+            <w:tcW w:type="dxa" w:w="1728"/>
+          </w:tcPr>
+          <w:p>
+            <w:r/>
+            <w:r>
+              <w:rPr>
+                <w:sz w:val="18"/>
+              </w:rPr>
+              <w:t>$124,500,000</w:t>
+            </w:r>
+          </w:p>
+        </w:tc>
+        <w:tc>
+          <w:tcPr>
             <w:tcW w:type="dxa" w:w="2160"/>
           </w:tcPr>
           <w:p>
@@ -765,35 +885,7 @@
               <w:rPr>
                 <w:sz w:val="18"/>
               </w:rPr>
-              <w:t>$2,600,000</w:t>
-            </w:r>
-          </w:p>
-        </w:tc>
-        <w:tc>
-          <w:tcPr>
-            <w:tcW w:type="dxa" w:w="2160"/>
-          </w:tcPr>
-          <w:p>
-            <w:r/>
-            <w:r>
-              <w:rPr>
-                <w:sz w:val="18"/>
-              </w:rPr>
-              <w:t>$16,000,000</w:t>
-            </w:r>
-          </w:p>
-        </w:tc>
-        <w:tc>
-          <w:tcPr>
-            <w:tcW w:type="dxa" w:w="2160"/>
-          </w:tcPr>
-          <w:p>
-            <w:r/>
-            <w:r>
-              <w:rPr>
-                <w:sz w:val="18"/>
-              </w:rPr>
-              <w:t>v15 baseline excl. SSLC commission</w:t>
+              <w:t>AA: v15 commission-only; v12: BLK4/propulsion/wet-lease ramp</w:t>
             </w:r>
           </w:p>
         </w:tc>
@@ -801,7 +893,7 @@
       <w:tr>
         <w:tc>
           <w:tcPr>
-            <w:tcW w:type="dxa" w:w="3168"/>
+            <w:tcW w:type="dxa" w:w="2592"/>
           </w:tcPr>
           <w:p>
             <w:r/>
@@ -815,6 +907,62 @@
         </w:tc>
         <w:tc>
           <w:tcPr>
+            <w:tcW w:type="dxa" w:w="1584"/>
+          </w:tcPr>
+          <w:p>
+            <w:r/>
+            <w:r>
+              <w:rPr>
+                <w:sz w:val="18"/>
+              </w:rPr>
+              <w:t>$7,600,000</w:t>
+            </w:r>
+          </w:p>
+        </w:tc>
+        <w:tc>
+          <w:tcPr>
+            <w:tcW w:type="dxa" w:w="1584"/>
+          </w:tcPr>
+          <w:p>
+            <w:r/>
+            <w:r>
+              <w:rPr>
+                <w:sz w:val="18"/>
+              </w:rPr>
+              <w:t>$31,600,000</w:t>
+            </w:r>
+          </w:p>
+        </w:tc>
+        <w:tc>
+          <w:tcPr>
+            <w:tcW w:type="dxa" w:w="1728"/>
+          </w:tcPr>
+          <w:p>
+            <w:r/>
+            <w:r>
+              <w:rPr>
+                <w:sz w:val="18"/>
+              </w:rPr>
+              <w:t>$8,880,000</w:t>
+            </w:r>
+          </w:p>
+        </w:tc>
+        <w:tc>
+          <w:tcPr>
+            <w:tcW w:type="dxa" w:w="1728"/>
+          </w:tcPr>
+          <w:p>
+            <w:r/>
+            <w:r>
+              <w:rPr>
+                <w:sz w:val="18"/>
+              </w:rPr>
+              <w:t>$179,190,000</w:t>
+            </w:r>
+          </w:p>
+        </w:tc>
+        <w:tc>
+          <w:tcPr>
             <w:tcW w:type="dxa" w:w="2160"/>
           </w:tcPr>
           <w:p>
@@ -823,35 +971,7 @@
               <w:rPr>
                 <w:sz w:val="18"/>
               </w:rPr>
-              <w:t>$7,600,000</w:t>
-            </w:r>
-          </w:p>
-        </w:tc>
-        <w:tc>
-          <w:tcPr>
-            <w:tcW w:type="dxa" w:w="2160"/>
-          </w:tcPr>
-          <w:p>
-            <w:r/>
-            <w:r>
-              <w:rPr>
-                <w:sz w:val="18"/>
-              </w:rPr>
-              <w:t>$31,600,000</w:t>
-            </w:r>
-          </w:p>
-        </w:tc>
-        <w:tc>
-          <w:tcPr>
-            <w:tcW w:type="dxa" w:w="2160"/>
-          </w:tcPr>
-          <w:p>
-            <w:r/>
-            <w:r>
-              <w:rPr>
-                <w:sz w:val="18"/>
-              </w:rPr>
-              <w:t>After intercompany elimination ($500K FY27)</w:t>
+              <w:t>After interco elimination. v12 = v12 total direct.</w:t>
             </w:r>
           </w:p>
         </w:tc>
@@ -859,7 +979,7 @@
       <w:tr>
         <w:tc>
           <w:tcPr>
-            <w:tcW w:type="dxa" w:w="3168"/>
+            <w:tcW w:type="dxa" w:w="2592"/>
           </w:tcPr>
           <w:p>
             <w:r/>
@@ -873,6 +993,62 @@
         </w:tc>
         <w:tc>
           <w:tcPr>
+            <w:tcW w:type="dxa" w:w="1584"/>
+          </w:tcPr>
+          <w:p>
+            <w:r/>
+            <w:r>
+              <w:rPr>
+                <w:sz w:val="18"/>
+              </w:rPr>
+              <w:t>+$1,240,000</w:t>
+            </w:r>
+          </w:p>
+        </w:tc>
+        <w:tc>
+          <w:tcPr>
+            <w:tcW w:type="dxa" w:w="1584"/>
+          </w:tcPr>
+          <w:p>
+            <w:r/>
+            <w:r>
+              <w:rPr>
+                <w:sz w:val="18"/>
+              </w:rPr>
+              <w:t>+$6,000,000</w:t>
+            </w:r>
+          </w:p>
+        </w:tc>
+        <w:tc>
+          <w:tcPr>
+            <w:tcW w:type="dxa" w:w="1728"/>
+          </w:tcPr>
+          <w:p>
+            <w:r/>
+            <w:r>
+              <w:rPr>
+                <w:sz w:val="18"/>
+              </w:rPr>
+              <w:t>$1,910,000</w:t>
+            </w:r>
+          </w:p>
+        </w:tc>
+        <w:tc>
+          <w:tcPr>
+            <w:tcW w:type="dxa" w:w="1728"/>
+          </w:tcPr>
+          <w:p>
+            <w:r/>
+            <w:r>
+              <w:rPr>
+                <w:sz w:val="18"/>
+              </w:rPr>
+              <w:t>$35,420,000</w:t>
+            </w:r>
+          </w:p>
+        </w:tc>
+        <w:tc>
+          <w:tcPr>
             <w:tcW w:type="dxa" w:w="2160"/>
           </w:tcPr>
           <w:p>
@@ -881,35 +1057,7 @@
               <w:rPr>
                 <w:sz w:val="18"/>
               </w:rPr>
-              <w:t>+$1,240,000</w:t>
-            </w:r>
-          </w:p>
-        </w:tc>
-        <w:tc>
-          <w:tcPr>
-            <w:tcW w:type="dxa" w:w="2160"/>
-          </w:tcPr>
-          <w:p>
-            <w:r/>
-            <w:r>
-              <w:rPr>
-                <w:sz w:val="18"/>
-              </w:rPr>
-              <w:t>+$6,015,000</w:t>
-            </w:r>
-          </w:p>
-        </w:tc>
-        <w:tc>
-          <w:tcPr>
-            <w:tcW w:type="dxa" w:w="2160"/>
-          </w:tcPr>
-          <w:p>
-            <w:r/>
-            <w:r>
-              <w:rPr>
-                <w:sz w:val="18"/>
-              </w:rPr>
-              <w:t>Positive from close; accretive to Exos</w:t>
+              <w:t>v12 SSLC EBITDA derived: tanks at 65%/70% GM</w:t>
             </w:r>
           </w:p>
         </w:tc>
@@ -917,7 +1065,7 @@
       <w:tr>
         <w:tc>
           <w:tcPr>
-            <w:tcW w:type="dxa" w:w="3168"/>
+            <w:tcW w:type="dxa" w:w="2592"/>
           </w:tcPr>
           <w:p>
             <w:r/>
@@ -931,6 +1079,62 @@
         </w:tc>
         <w:tc>
           <w:tcPr>
+            <w:tcW w:type="dxa" w:w="1584"/>
+          </w:tcPr>
+          <w:p>
+            <w:r/>
+            <w:r>
+              <w:rPr>
+                <w:sz w:val="18"/>
+              </w:rPr>
+              <w:t>−$4,000,000</w:t>
+            </w:r>
+          </w:p>
+        </w:tc>
+        <w:tc>
+          <w:tcPr>
+            <w:tcW w:type="dxa" w:w="1584"/>
+          </w:tcPr>
+          <w:p>
+            <w:r/>
+            <w:r>
+              <w:rPr>
+                <w:sz w:val="18"/>
+              </w:rPr>
+              <w:t>+$5,000,000</w:t>
+            </w:r>
+          </w:p>
+        </w:tc>
+        <w:tc>
+          <w:tcPr>
+            <w:tcW w:type="dxa" w:w="1728"/>
+          </w:tcPr>
+          <w:p>
+            <w:r/>
+            <w:r>
+              <w:rPr>
+                <w:sz w:val="18"/>
+              </w:rPr>
+              <w:t>−$790,000</w:t>
+            </w:r>
+          </w:p>
+        </w:tc>
+        <w:tc>
+          <w:tcPr>
+            <w:tcW w:type="dxa" w:w="1728"/>
+          </w:tcPr>
+          <w:p>
+            <w:r/>
+            <w:r>
+              <w:rPr>
+                <w:sz w:val="18"/>
+              </w:rPr>
+              <w:t>+$66,190,000</w:t>
+            </w:r>
+          </w:p>
+        </w:tc>
+        <w:tc>
+          <w:tcPr>
             <w:tcW w:type="dxa" w:w="2160"/>
           </w:tcPr>
           <w:p>
@@ -939,35 +1143,7 @@
               <w:rPr>
                 <w:sz w:val="18"/>
               </w:rPr>
-              <w:t>−$4,000,000</w:t>
-            </w:r>
-          </w:p>
-        </w:tc>
-        <w:tc>
-          <w:tcPr>
-            <w:tcW w:type="dxa" w:w="2160"/>
-          </w:tcPr>
-          <w:p>
-            <w:r/>
-            <w:r>
-              <w:rPr>
-                <w:sz w:val="18"/>
-              </w:rPr>
-              <w:t>+$5,000,000</w:t>
-            </w:r>
-          </w:p>
-        </w:tc>
-        <w:tc>
-          <w:tcPr>
-            <w:tcW w:type="dxa" w:w="2160"/>
-          </w:tcPr>
-          <w:p>
-            <w:r/>
-            <w:r>
-              <w:rPr>
-                <w:sz w:val="18"/>
-              </w:rPr>
-              <w:t>BLK3 investment phase FY27; improving FY28+</w:t>
+              <w:t>v12 Exos derived = v12 total EBITDA − v12 SSLC EBITDA</w:t>
             </w:r>
           </w:p>
         </w:tc>
@@ -975,7 +1151,7 @@
       <w:tr>
         <w:tc>
           <w:tcPr>
-            <w:tcW w:type="dxa" w:w="3168"/>
+            <w:tcW w:type="dxa" w:w="2592"/>
           </w:tcPr>
           <w:p>
             <w:r/>
@@ -989,6 +1165,62 @@
         </w:tc>
         <w:tc>
           <w:tcPr>
+            <w:tcW w:type="dxa" w:w="1584"/>
+          </w:tcPr>
+          <w:p>
+            <w:r/>
+            <w:r>
+              <w:rPr>
+                <w:sz w:val="18"/>
+              </w:rPr>
+              <w:t>−$2,760,000</w:t>
+            </w:r>
+          </w:p>
+        </w:tc>
+        <w:tc>
+          <w:tcPr>
+            <w:tcW w:type="dxa" w:w="1584"/>
+          </w:tcPr>
+          <w:p>
+            <w:r/>
+            <w:r>
+              <w:rPr>
+                <w:sz w:val="18"/>
+              </w:rPr>
+              <w:t>+$11,000,000</w:t>
+            </w:r>
+          </w:p>
+        </w:tc>
+        <w:tc>
+          <w:tcPr>
+            <w:tcW w:type="dxa" w:w="1728"/>
+          </w:tcPr>
+          <w:p>
+            <w:r/>
+            <w:r>
+              <w:rPr>
+                <w:sz w:val="18"/>
+              </w:rPr>
+              <w:t>$1,120,000</w:t>
+            </w:r>
+          </w:p>
+        </w:tc>
+        <w:tc>
+          <w:tcPr>
+            <w:tcW w:type="dxa" w:w="1728"/>
+          </w:tcPr>
+          <w:p>
+            <w:r/>
+            <w:r>
+              <w:rPr>
+                <w:sz w:val="18"/>
+              </w:rPr>
+              <w:t>$101,610,000</w:t>
+            </w:r>
+          </w:p>
+        </w:tc>
+        <w:tc>
+          <w:tcPr>
             <w:tcW w:type="dxa" w:w="2160"/>
           </w:tcPr>
           <w:p>
@@ -997,35 +1229,7 @@
               <w:rPr>
                 <w:sz w:val="18"/>
               </w:rPr>
-              <w:t>−$2,760,000</w:t>
-            </w:r>
-          </w:p>
-        </w:tc>
-        <w:tc>
-          <w:tcPr>
-            <w:tcW w:type="dxa" w:w="2160"/>
-          </w:tcPr>
-          <w:p>
-            <w:r/>
-            <w:r>
-              <w:rPr>
-                <w:sz w:val="18"/>
-              </w:rPr>
-              <w:t>+$11,015,000</w:t>
-            </w:r>
-          </w:p>
-        </w:tc>
-        <w:tc>
-          <w:tcPr>
-            <w:tcW w:type="dxa" w:w="2160"/>
-          </w:tcPr>
-          <w:p>
-            <w:r/>
-            <w:r>
-              <w:rPr>
-                <w:sz w:val="18"/>
-              </w:rPr>
-              <w:t>Exos development costs dominate FY27</w:t>
+              <w:t>v12 EBITDA from v12 Annual P&amp;L directly</w:t>
             </w:r>
           </w:p>
         </w:tc>
@@ -1033,15 +1237,71 @@
       <w:tr>
         <w:tc>
           <w:tcPr>
-            <w:tcW w:type="dxa" w:w="3168"/>
-          </w:tcPr>
-          <w:p>
-            <w:r/>
-            <w:r>
-              <w:rPr>
-                <w:sz w:val="18"/>
-              </w:rPr>
-              <w:t>v15 Benchmark SSLC revenue</w:t>
+            <w:tcW w:type="dxa" w:w="2592"/>
+          </w:tcPr>
+          <w:p>
+            <w:r/>
+            <w:r>
+              <w:rPr>
+                <w:sz w:val="18"/>
+              </w:rPr>
+              <w:t>v15 Benchmark (SSLC only)</w:t>
+            </w:r>
+          </w:p>
+        </w:tc>
+        <w:tc>
+          <w:tcPr>
+            <w:tcW w:type="dxa" w:w="1584"/>
+          </w:tcPr>
+          <w:p>
+            <w:r/>
+            <w:r>
+              <w:rPr>
+                <w:sz w:val="18"/>
+              </w:rPr>
+              <w:t>$900,000</w:t>
+            </w:r>
+          </w:p>
+        </w:tc>
+        <w:tc>
+          <w:tcPr>
+            <w:tcW w:type="dxa" w:w="1584"/>
+          </w:tcPr>
+          <w:p>
+            <w:r/>
+            <w:r>
+              <w:rPr>
+                <w:sz w:val="18"/>
+              </w:rPr>
+              <w:t>$21,000,000</w:t>
+            </w:r>
+          </w:p>
+        </w:tc>
+        <w:tc>
+          <w:tcPr>
+            <w:tcW w:type="dxa" w:w="1728"/>
+          </w:tcPr>
+          <w:p>
+            <w:r/>
+            <w:r>
+              <w:rPr>
+                <w:sz w:val="18"/>
+              </w:rPr>
+              <w:t>$900,000</w:t>
+            </w:r>
+          </w:p>
+        </w:tc>
+        <w:tc>
+          <w:tcPr>
+            <w:tcW w:type="dxa" w:w="1728"/>
+          </w:tcPr>
+          <w:p>
+            <w:r/>
+            <w:r>
+              <w:rPr>
+                <w:sz w:val="18"/>
+              </w:rPr>
+              <w:t>$21,000,000</w:t>
             </w:r>
           </w:p>
         </w:tc>
@@ -1055,35 +1315,7 @@
               <w:rPr>
                 <w:sz w:val="18"/>
               </w:rPr>
-              <w:t>$900,000</w:t>
-            </w:r>
-          </w:p>
-        </w:tc>
-        <w:tc>
-          <w:tcPr>
-            <w:tcW w:type="dxa" w:w="2160"/>
-          </w:tcPr>
-          <w:p>
-            <w:r/>
-            <w:r>
-              <w:rPr>
-                <w:sz w:val="18"/>
-              </w:rPr>
-              <w:t>$21,000,000</w:t>
-            </w:r>
-          </w:p>
-        </w:tc>
-        <w:tc>
-          <w:tcPr>
-            <w:tcW w:type="dxa" w:w="2160"/>
-          </w:tcPr>
-          <w:p>
-            <w:r/>
-            <w:r>
-              <w:rPr>
-                <w:sz w:val="18"/>
-              </w:rPr>
-              <w:t>Old acquisition model; Option B FY27 ×6.1×</w:t>
+              <w:t>⚠ Legacy pre-IM-confirmation model. Both cases exceed by ≥6×.</w:t>
             </w:r>
           </w:p>
         </w:tc>
@@ -1091,7 +1323,7 @@
       <w:tr>
         <w:tc>
           <w:tcPr>
-            <w:tcW w:type="dxa" w:w="3168"/>
+            <w:tcW w:type="dxa" w:w="2592"/>
           </w:tcPr>
           <w:p>
             <w:r/>
@@ -1105,7 +1337,7 @@
         </w:tc>
         <w:tc>
           <w:tcPr>
-            <w:tcW w:type="dxa" w:w="2160"/>
+            <w:tcW w:type="dxa" w:w="1584"/>
           </w:tcPr>
           <w:p>
             <w:r/>
@@ -1119,7 +1351,35 @@
         </w:tc>
         <w:tc>
           <w:tcPr>
-            <w:tcW w:type="dxa" w:w="2160"/>
+            <w:tcW w:type="dxa" w:w="1584"/>
+          </w:tcPr>
+          <w:p>
+            <w:r/>
+            <w:r>
+              <w:rPr>
+                <w:sz w:val="18"/>
+              </w:rPr>
+              <w:t>—</w:t>
+            </w:r>
+          </w:p>
+        </w:tc>
+        <w:tc>
+          <w:tcPr>
+            <w:tcW w:type="dxa" w:w="1728"/>
+          </w:tcPr>
+          <w:p>
+            <w:r/>
+            <w:r>
+              <w:rPr>
+                <w:sz w:val="18"/>
+              </w:rPr>
+              <w:t>same</w:t>
+            </w:r>
+          </w:p>
+        </w:tc>
+        <w:tc>
+          <w:tcPr>
+            <w:tcW w:type="dxa" w:w="1728"/>
           </w:tcPr>
           <w:p>
             <w:r/>
@@ -1149,7 +1409,7 @@
       <w:tr>
         <w:tc>
           <w:tcPr>
-            <w:tcW w:type="dxa" w:w="3168"/>
+            <w:tcW w:type="dxa" w:w="2592"/>
           </w:tcPr>
           <w:p>
             <w:r/>
@@ -1163,6 +1423,62 @@
         </w:tc>
         <w:tc>
           <w:tcPr>
+            <w:tcW w:type="dxa" w:w="1584"/>
+          </w:tcPr>
+          <w:p>
+            <w:r/>
+            <w:r>
+              <w:rPr>
+                <w:sz w:val="18"/>
+              </w:rPr>
+              <w:t>$10,000,000</w:t>
+            </w:r>
+          </w:p>
+        </w:tc>
+        <w:tc>
+          <w:tcPr>
+            <w:tcW w:type="dxa" w:w="1584"/>
+          </w:tcPr>
+          <w:p>
+            <w:r/>
+            <w:r>
+              <w:rPr>
+                <w:sz w:val="18"/>
+              </w:rPr>
+              <w:t>—</w:t>
+            </w:r>
+          </w:p>
+        </w:tc>
+        <w:tc>
+          <w:tcPr>
+            <w:tcW w:type="dxa" w:w="1728"/>
+          </w:tcPr>
+          <w:p>
+            <w:r/>
+            <w:r>
+              <w:rPr>
+                <w:sz w:val="18"/>
+              </w:rPr>
+              <w:t>same</w:t>
+            </w:r>
+          </w:p>
+        </w:tc>
+        <w:tc>
+          <w:tcPr>
+            <w:tcW w:type="dxa" w:w="1728"/>
+          </w:tcPr>
+          <w:p>
+            <w:r/>
+            <w:r>
+              <w:rPr>
+                <w:sz w:val="18"/>
+              </w:rPr>
+              <w:t>—</w:t>
+            </w:r>
+          </w:p>
+        </w:tc>
+        <w:tc>
+          <w:tcPr>
             <w:tcW w:type="dxa" w:w="2160"/>
           </w:tcPr>
           <w:p>
@@ -1171,35 +1487,7 @@
               <w:rPr>
                 <w:sz w:val="18"/>
               </w:rPr>
-              <w:t>$10,000,000</w:t>
-            </w:r>
-          </w:p>
-        </w:tc>
-        <w:tc>
-          <w:tcPr>
-            <w:tcW w:type="dxa" w:w="2160"/>
-          </w:tcPr>
-          <w:p>
-            <w:r/>
-            <w:r>
-              <w:rPr>
-                <w:sz w:val="18"/>
-              </w:rPr>
-              <w:t>—</w:t>
-            </w:r>
-          </w:p>
-        </w:tc>
-        <w:tc>
-          <w:tcPr>
-            <w:tcW w:type="dxa" w:w="2160"/>
-          </w:tcPr>
-          <w:p>
-            <w:r/>
-            <w:r>
-              <w:rPr>
-                <w:sz w:val="18"/>
-              </w:rPr>
-              <w:t>Covers acquisition, WC bridge, and Exos ops</w:t>
+              <w:t>Covers acquisition, WC bridge, Exos ops</w:t>
             </w:r>
           </w:p>
         </w:tc>
@@ -1207,7 +1495,7 @@
       <w:tr>
         <w:tc>
           <w:tcPr>
-            <w:tcW w:type="dxa" w:w="3168"/>
+            <w:tcW w:type="dxa" w:w="2592"/>
           </w:tcPr>
           <w:p>
             <w:r/>
@@ -1221,7 +1509,7 @@
         </w:tc>
         <w:tc>
           <w:tcPr>
-            <w:tcW w:type="dxa" w:w="2160"/>
+            <w:tcW w:type="dxa" w:w="1584"/>
           </w:tcPr>
           <w:p>
             <w:r/>
@@ -1235,7 +1523,35 @@
         </w:tc>
         <w:tc>
           <w:tcPr>
-            <w:tcW w:type="dxa" w:w="2160"/>
+            <w:tcW w:type="dxa" w:w="1584"/>
+          </w:tcPr>
+          <w:p>
+            <w:r/>
+            <w:r>
+              <w:rPr>
+                <w:sz w:val="18"/>
+              </w:rPr>
+              <w:t>—</w:t>
+            </w:r>
+          </w:p>
+        </w:tc>
+        <w:tc>
+          <w:tcPr>
+            <w:tcW w:type="dxa" w:w="1728"/>
+          </w:tcPr>
+          <w:p>
+            <w:r/>
+            <w:r>
+              <w:rPr>
+                <w:sz w:val="18"/>
+              </w:rPr>
+              <w:t>same</w:t>
+            </w:r>
+          </w:p>
+        </w:tc>
+        <w:tc>
+          <w:tcPr>
+            <w:tcW w:type="dxa" w:w="1728"/>
           </w:tcPr>
           <w:p>
             <w:r/>
@@ -1267,6 +1583,20 @@
       <w:pPr>
         <w:spacing w:after="80" w:before="0"/>
       </w:pPr>
+    </w:p>
+    <w:p>
+      <w:pPr>
+        <w:spacing w:after="40" w:before="0"/>
+      </w:pPr>
+      <w:r>
+        <w:rPr>
+          <w:b w:val="0"/>
+          <w:i/>
+          <w:color w:val="606060"/>
+          <w:sz w:val="18"/>
+        </w:rPr>
+        <w:t>AA consolidated EBITDA FY27 negative: Exos −$4M investment phase offsets SSLC +$1.24M. v12 FY27 EBITDA positive ($1.12M) because v12 assumes smaller Exos standalone loss. v12 Exos Y1 EBITDA derived = $1.12M total − ~$1.91M SSLC = −$0.79M. See Reconciliation sheet in xlsx for full line-by-line explanation.</w:t>
+      </w:r>
     </w:p>
     <w:p>
       <w:r>

</xml_diff>

<commit_message>
SSLC offer summary: show Y5 hold value; fix Eqvista wording
</commit_message>
<xml_diff>
--- a/drafts/Exos_SSLC_OptionB_Offer_Summary_2026-10-07.docx
+++ b/drafts/Exos_SSLC_OptionB_Offer_Summary_2026-10-07.docx
@@ -199,7 +199,7 @@
         <w:t xml:space="preserve">Exos shares + Y5 hold value  </w:t>
       </w:r>
       <w:r>
-        <w:t>Stock earn-out is tradeable post-12-month lockup. At Eqvista's March 2026 EV/EBITDA 16× multiple, the v12 trajectory implies a significant FY31 enterprise value — the detail is in the model spreadsheet.</w:t>
+        <w:t>Stock earn-out is tradeable post-12-month lockup. Held to FY31 at a 16× EV/EBITDA multiple on the Exos plan (~$1.63B EV), a 0.5% grant (~0.35% after ~30% assumed dilution) is worth ~$5.7M (range $3.4M–$8.0M), ~4.5× its ~$1.25M value at listing. Management assumptions.</w:t>
       </w:r>
     </w:p>
     <w:p>
@@ -1152,7 +1152,7 @@
               <w:rPr>
                 <w:sz w:val="18"/>
               </w:rPr>
-              <w:t>Eqvista 409A (03/31/2026, $8.66/sh, DLOM 36.51%) — engagement to be updated at signing</w:t>
+              <w:t>Eqvista engaged 8/14/2026; agreement still unsigned (held ~1 month)</w:t>
             </w:r>
           </w:p>
         </w:tc>

</xml_diff>

<commit_message>
SSLC Option B: remove prepaid-work line, raise stock earn-out to 0.5–1.0% (Jon 10/7 15:22)
- Prepaid-work relief line removed from all scripts and outputs
  (Jon: figure accruing incorrectly; K not a valid delivery obligation)
- Working-capital bridge (K) kept (pre-dated the prepaid addition)
- Stock earn-out: low 0.5%, base 0.75%, high 1.0% FD shares
  (was 0.3/0.5/0.7%)
- At-listing values: L $1.0M / B $1.875M / H $3.0M
- Y5 post-dilution stakes: 0.35% / 0.525% / 0.70%
- Y5 v12 hold: L $5.69M / B $8.54M / H $11.38M
- Y5 AA hold: L $616K / B $924K / H $1.23M
- 5-yr totals: L $5.81M / B $6.985M / H $8.26M
- Files re-attached to MC task 3544
</commit_message>
<xml_diff>
--- a/drafts/Exos_SSLC_OptionB_Offer_Summary_2026-10-07.docx
+++ b/drafts/Exos_SSLC_OptionB_Offer_Summary_2026-10-07.docx
@@ -124,24 +124,6 @@
         <w:rPr>
           <w:b/>
         </w:rPr>
-        <w:t xml:space="preserve">Prepaid-work relief  </w:t>
-      </w:r>
-      <w:r>
-        <w:t>$984,062 in already-billed and deposited work is assumed by Exos and funded to completion (Exos working-capital cost: $300K–$700K). SSLC customers receive uninterrupted delivery. No SSLC shareholder funds this obligation.</w:t>
-      </w:r>
-    </w:p>
-    <w:p>
-      <w:pPr>
-        <w:spacing w:after="40" w:before="0"/>
-        <w:ind w:left="288"/>
-      </w:pPr>
-      <w:r>
-        <w:t xml:space="preserve">•  </w:t>
-      </w:r>
-      <w:r>
-        <w:rPr>
-          <w:b/>
-        </w:rPr>
         <w:t xml:space="preserve">No further capital calls  </w:t>
       </w:r>
       <w:r>
@@ -181,7 +163,7 @@
         <w:t xml:space="preserve">Earn-out — Exos stock  </w:t>
       </w:r>
       <w:r>
-        <w:t>0.3%–0.7% of Exos fully diluted shares post-RTO listing (est. $600K–$2.1M at a $200M–$300M listing; $250M minimum MEV per Ainigma/FNEX mandate).</w:t>
+        <w:t>0.5%–1.0% of Exos fully diluted shares post-RTO listing (est. $1.0M–$3.0M at a $200M–$300M listing; $250M minimum MEV per Ainigma/FNEX mandate).</w:t>
       </w:r>
     </w:p>
     <w:p>
@@ -199,7 +181,7 @@
         <w:t xml:space="preserve">Exos shares + Y5 hold value  </w:t>
       </w:r>
       <w:r>
-        <w:t>Stock earn-out is tradeable post-12-month lockup. Held to FY31 at a 16× EV/EBITDA multiple on the Exos plan (~$1.63B EV), a 0.5% grant (~0.35% after ~30% assumed dilution) is worth ~$5.7M (range $3.4M–$8.0M), ~4.5× its ~$1.25M value at listing. Management assumptions.</w:t>
+        <w:t>Stock earn-out is tradeable post-12-month lockup. Held to FY31 at a 16× EV/EBITDA multiple on the Exos plan (~$1.63B EV), a 0.75% grant (~0.525% after ~30% assumed dilution) is worth ~$8.5M (range $5.7M–$11.4M), ~4.6× its ~$1.875M value at listing. Management assumptions.</w:t>
       </w:r>
     </w:p>
     <w:p>
@@ -291,10 +273,10 @@
         <w:rPr>
           <w:b/>
         </w:rPr>
-        <w:t xml:space="preserve">Prepaid-work gap  </w:t>
-      </w:r>
-      <w:r>
-        <w:t>$300K–$700K needed just to finish $984K already billed or deposited — before SSLC can collect on any new work.</w:t>
+        <w:t xml:space="preserve">Working capital gap  </w:t>
+      </w:r>
+      <w:r>
+        <w:t>$300K–$700K needed to maintain delivery commitments and service new IM orders — before SSLC can ramp to the $5M/year run rate.</w:t>
       </w:r>
     </w:p>
     <w:p>
@@ -651,7 +633,7 @@
                 <w:b/>
                 <w:sz w:val="18"/>
               </w:rPr>
-              <w:t>Prepaid-work delivery funded</w:t>
+              <w:t>WC bridge</w:t>
             </w:r>
           </w:p>
         </w:tc>
@@ -665,7 +647,7 @@
               <w:rPr>
                 <w:sz w:val="18"/>
               </w:rPr>
-              <w:t>Post-close</w:t>
+              <w:t>Close</w:t>
             </w:r>
           </w:p>
         </w:tc>
@@ -679,7 +661,7 @@
               <w:rPr>
                 <w:sz w:val="18"/>
               </w:rPr>
-              <w:t>$984K face / $500K Exos cost</w:t>
+              <w:t>$500,000</w:t>
             </w:r>
           </w:p>
         </w:tc>
@@ -769,7 +751,7 @@
               <w:rPr>
                 <w:sz w:val="18"/>
               </w:rPr>
-              <w:t>$600K–$2.1M</w:t>
+              <w:t>$1.0M–$3.0M</w:t>
             </w:r>
           </w:p>
         </w:tc>
@@ -814,7 +796,7 @@
               <w:rPr>
                 <w:sz w:val="18"/>
               </w:rPr>
-              <w:t>$5.3M / $5.9M / $6.9M</w:t>
+              <w:t>$5.8M / $7.0M / $8.3M</w:t>
             </w:r>
           </w:p>
         </w:tc>
@@ -832,7 +814,7 @@
       <w:r>
         <w:drawing>
           <wp:inline xmlns:a="http://schemas.openxmlformats.org/drawingml/2006/main" xmlns:pic="http://schemas.openxmlformats.org/drawingml/2006/picture">
-            <wp:extent cx="5029200" cy="2963988"/>
+            <wp:extent cx="5029200" cy="2965649"/>
             <wp:docPr id="1" name="Picture 1"/>
             <wp:cNvGraphicFramePr>
               <a:graphicFrameLocks noChangeAspect="1"/>
@@ -853,7 +835,7 @@
                   <pic:spPr>
                     <a:xfrm>
                       <a:off x="0" y="0"/>
-                      <a:ext cx="5029200" cy="2963988"/>
+                      <a:ext cx="5029200" cy="2965649"/>
                     </a:xfrm>
                     <a:prstGeom prst="rect"/>
                   </pic:spPr>

</xml_diff>

<commit_message>
SSLC OptionB offer summary: replace bullet list with offer value table
Section 1 now has Component/Low/Base/High/When columns per Jon instruction.
Rows: cash, costs, stake credit, debts, WC bridge, subtotal, tank earn-out,
stock earn-out, TOTAL (bold green), memo Y5 hold (amber, not additive).
2 pages; attached as v3 to MC task 3544.
</commit_message>
<xml_diff>
--- a/drafts/Exos_SSLC_OptionB_Offer_Summary_2026-10-07.docx
+++ b/drafts/Exos_SSLC_OptionB_Offer_Summary_2026-10-07.docx
@@ -73,8 +73,997 @@
           <w:i w:val="0"/>
           <w:sz w:val="20"/>
         </w:rPr>
-        <w:t>The Exos offer delivers liquidity, relief, and upside across four dimensions — without requiring any additional capital call from current SSLC shareholders.</w:t>
+        <w:t>The Exos offer delivers liquidity, debt relief, and equity upside — without requiring any additional capital call from current SSLC shareholders:</w:t>
       </w:r>
+    </w:p>
+    <w:tbl>
+      <w:tblPr>
+        <w:tblW w:type="auto" w:w="0"/>
+        <w:jc w:val="center"/>
+        <w:tblLayout w:type="fixed"/>
+        <w:tblLook w:firstColumn="1" w:firstRow="1" w:lastColumn="0" w:lastRow="0" w:noHBand="0" w:noVBand="1" w:val="04A0"/>
+      </w:tblPr>
+      <w:tblGrid>
+        <w:gridCol w:w="3024"/>
+        <w:gridCol w:w="1224"/>
+        <w:gridCol w:w="1224"/>
+        <w:gridCol w:w="1224"/>
+        <w:gridCol w:w="2664"/>
+      </w:tblGrid>
+      <w:tr>
+        <w:tc>
+          <w:tcPr>
+            <w:tcW w:type="dxa" w:w="3024"/>
+            <w:shd w:val="clear" w:color="auto" w:fill="1F3A68"/>
+          </w:tcPr>
+          <w:p>
+            <w:r/>
+            <w:r>
+              <w:rPr>
+                <w:b/>
+                <w:color w:val="FFFFFF"/>
+                <w:sz w:val="17"/>
+              </w:rPr>
+              <w:t>Component</w:t>
+            </w:r>
+          </w:p>
+        </w:tc>
+        <w:tc>
+          <w:tcPr>
+            <w:tcW w:type="dxa" w:w="1224"/>
+            <w:shd w:val="clear" w:color="auto" w:fill="1F3A68"/>
+          </w:tcPr>
+          <w:p>
+            <w:pPr>
+              <w:jc w:val="right"/>
+            </w:pPr>
+            <w:r/>
+            <w:r>
+              <w:rPr>
+                <w:b/>
+                <w:color w:val="FFFFFF"/>
+                <w:sz w:val="17"/>
+              </w:rPr>
+              <w:t>Low</w:t>
+            </w:r>
+          </w:p>
+        </w:tc>
+        <w:tc>
+          <w:tcPr>
+            <w:tcW w:type="dxa" w:w="1224"/>
+            <w:shd w:val="clear" w:color="auto" w:fill="1F3A68"/>
+          </w:tcPr>
+          <w:p>
+            <w:pPr>
+              <w:jc w:val="right"/>
+            </w:pPr>
+            <w:r/>
+            <w:r>
+              <w:rPr>
+                <w:b/>
+                <w:color w:val="FFFFFF"/>
+                <w:sz w:val="17"/>
+              </w:rPr>
+              <w:t>Base</w:t>
+            </w:r>
+          </w:p>
+        </w:tc>
+        <w:tc>
+          <w:tcPr>
+            <w:tcW w:type="dxa" w:w="1224"/>
+            <w:shd w:val="clear" w:color="auto" w:fill="1F3A68"/>
+          </w:tcPr>
+          <w:p>
+            <w:pPr>
+              <w:jc w:val="right"/>
+            </w:pPr>
+            <w:r/>
+            <w:r>
+              <w:rPr>
+                <w:b/>
+                <w:color w:val="FFFFFF"/>
+                <w:sz w:val="17"/>
+              </w:rPr>
+              <w:t>High</w:t>
+            </w:r>
+          </w:p>
+        </w:tc>
+        <w:tc>
+          <w:tcPr>
+            <w:tcW w:type="dxa" w:w="2664"/>
+            <w:shd w:val="clear" w:color="auto" w:fill="1F3A68"/>
+          </w:tcPr>
+          <w:p>
+            <w:r/>
+            <w:r>
+              <w:rPr>
+                <w:b/>
+                <w:color w:val="FFFFFF"/>
+                <w:sz w:val="17"/>
+              </w:rPr>
+              <w:t>When / Notes</w:t>
+            </w:r>
+          </w:p>
+        </w:tc>
+      </w:tr>
+      <w:tr>
+        <w:tc>
+          <w:tcPr>
+            <w:tcW w:type="dxa" w:w="3024"/>
+          </w:tcPr>
+          <w:p>
+            <w:r/>
+            <w:r>
+              <w:rPr>
+                <w:b w:val="0"/>
+                <w:sz w:val="17"/>
+              </w:rPr>
+              <w:t>Cash at close</w:t>
+            </w:r>
+          </w:p>
+        </w:tc>
+        <w:tc>
+          <w:tcPr>
+            <w:tcW w:type="dxa" w:w="1224"/>
+          </w:tcPr>
+          <w:p>
+            <w:pPr>
+              <w:jc w:val="right"/>
+            </w:pPr>
+            <w:r/>
+            <w:r>
+              <w:rPr>
+                <w:sz w:val="17"/>
+              </w:rPr>
+              <w:t>$2,510K</w:t>
+            </w:r>
+          </w:p>
+        </w:tc>
+        <w:tc>
+          <w:tcPr>
+            <w:tcW w:type="dxa" w:w="1224"/>
+          </w:tcPr>
+          <w:p>
+            <w:pPr>
+              <w:jc w:val="right"/>
+            </w:pPr>
+            <w:r/>
+            <w:r>
+              <w:rPr>
+                <w:sz w:val="17"/>
+              </w:rPr>
+              <w:t>$2,510K</w:t>
+            </w:r>
+          </w:p>
+        </w:tc>
+        <w:tc>
+          <w:tcPr>
+            <w:tcW w:type="dxa" w:w="1224"/>
+          </w:tcPr>
+          <w:p>
+            <w:pPr>
+              <w:jc w:val="right"/>
+            </w:pPr>
+            <w:r/>
+            <w:r>
+              <w:rPr>
+                <w:sz w:val="17"/>
+              </w:rPr>
+              <w:t>$2,510K</w:t>
+            </w:r>
+          </w:p>
+        </w:tc>
+        <w:tc>
+          <w:tcPr>
+            <w:tcW w:type="dxa" w:w="2664"/>
+          </w:tcPr>
+          <w:p>
+            <w:r/>
+            <w:r>
+              <w:rPr>
+                <w:sz w:val="17"/>
+              </w:rPr>
+              <w:t>Close ~Q1 FY27</w:t>
+            </w:r>
+          </w:p>
+        </w:tc>
+      </w:tr>
+      <w:tr>
+        <w:tc>
+          <w:tcPr>
+            <w:tcW w:type="dxa" w:w="3024"/>
+          </w:tcPr>
+          <w:p>
+            <w:r/>
+            <w:r>
+              <w:rPr>
+                <w:b w:val="0"/>
+                <w:sz w:val="17"/>
+              </w:rPr>
+              <w:t>SSLC transaction costs</w:t>
+            </w:r>
+          </w:p>
+        </w:tc>
+        <w:tc>
+          <w:tcPr>
+            <w:tcW w:type="dxa" w:w="1224"/>
+          </w:tcPr>
+          <w:p>
+            <w:pPr>
+              <w:jc w:val="right"/>
+            </w:pPr>
+            <w:r/>
+            <w:r>
+              <w:rPr>
+                <w:sz w:val="17"/>
+              </w:rPr>
+              <w:t>$60K</w:t>
+            </w:r>
+          </w:p>
+        </w:tc>
+        <w:tc>
+          <w:tcPr>
+            <w:tcW w:type="dxa" w:w="1224"/>
+          </w:tcPr>
+          <w:p>
+            <w:pPr>
+              <w:jc w:val="right"/>
+            </w:pPr>
+            <w:r/>
+            <w:r>
+              <w:rPr>
+                <w:sz w:val="17"/>
+              </w:rPr>
+              <w:t>$60K</w:t>
+            </w:r>
+          </w:p>
+        </w:tc>
+        <w:tc>
+          <w:tcPr>
+            <w:tcW w:type="dxa" w:w="1224"/>
+          </w:tcPr>
+          <w:p>
+            <w:pPr>
+              <w:jc w:val="right"/>
+            </w:pPr>
+            <w:r/>
+            <w:r>
+              <w:rPr>
+                <w:sz w:val="17"/>
+              </w:rPr>
+              <w:t>$60K</w:t>
+            </w:r>
+          </w:p>
+        </w:tc>
+        <w:tc>
+          <w:tcPr>
+            <w:tcW w:type="dxa" w:w="2664"/>
+          </w:tcPr>
+          <w:p>
+            <w:r/>
+            <w:r>
+              <w:rPr>
+                <w:sz w:val="17"/>
+              </w:rPr>
+              <w:t>Close; seller-side</w:t>
+            </w:r>
+          </w:p>
+        </w:tc>
+      </w:tr>
+      <w:tr>
+        <w:tc>
+          <w:tcPr>
+            <w:tcW w:type="dxa" w:w="3024"/>
+          </w:tcPr>
+          <w:p>
+            <w:r/>
+            <w:r>
+              <w:rPr>
+                <w:b w:val="0"/>
+                <w:sz w:val="17"/>
+              </w:rPr>
+              <w:t>Credit for Exos's existing stake</w:t>
+            </w:r>
+          </w:p>
+        </w:tc>
+        <w:tc>
+          <w:tcPr>
+            <w:tcW w:type="dxa" w:w="1224"/>
+          </w:tcPr>
+          <w:p>
+            <w:pPr>
+              <w:jc w:val="right"/>
+            </w:pPr>
+            <w:r/>
+            <w:r>
+              <w:rPr>
+                <w:sz w:val="17"/>
+              </w:rPr>
+              <w:t>$790K</w:t>
+            </w:r>
+          </w:p>
+        </w:tc>
+        <w:tc>
+          <w:tcPr>
+            <w:tcW w:type="dxa" w:w="1224"/>
+          </w:tcPr>
+          <w:p>
+            <w:pPr>
+              <w:jc w:val="right"/>
+            </w:pPr>
+            <w:r/>
+            <w:r>
+              <w:rPr>
+                <w:sz w:val="17"/>
+              </w:rPr>
+              <w:t>$790K</w:t>
+            </w:r>
+          </w:p>
+        </w:tc>
+        <w:tc>
+          <w:tcPr>
+            <w:tcW w:type="dxa" w:w="1224"/>
+          </w:tcPr>
+          <w:p>
+            <w:pPr>
+              <w:jc w:val="right"/>
+            </w:pPr>
+            <w:r/>
+            <w:r>
+              <w:rPr>
+                <w:sz w:val="17"/>
+              </w:rPr>
+              <w:t>$790K</w:t>
+            </w:r>
+          </w:p>
+        </w:tc>
+        <w:tc>
+          <w:tcPr>
+            <w:tcW w:type="dxa" w:w="2664"/>
+          </w:tcPr>
+          <w:p>
+            <w:r/>
+            <w:r>
+              <w:rPr>
+                <w:sz w:val="17"/>
+              </w:rPr>
+              <w:t>Close (non-cash credit)</w:t>
+            </w:r>
+          </w:p>
+        </w:tc>
+      </w:tr>
+      <w:tr>
+        <w:tc>
+          <w:tcPr>
+            <w:tcW w:type="dxa" w:w="3024"/>
+          </w:tcPr>
+          <w:p>
+            <w:r/>
+            <w:r>
+              <w:rPr>
+                <w:b w:val="0"/>
+                <w:sz w:val="17"/>
+              </w:rPr>
+              <w:t>SSLC debts paid at face</w:t>
+            </w:r>
+          </w:p>
+        </w:tc>
+        <w:tc>
+          <w:tcPr>
+            <w:tcW w:type="dxa" w:w="1224"/>
+          </w:tcPr>
+          <w:p>
+            <w:pPr>
+              <w:jc w:val="right"/>
+            </w:pPr>
+            <w:r/>
+            <w:r>
+              <w:rPr>
+                <w:sz w:val="17"/>
+              </w:rPr>
+              <w:t>$500K</w:t>
+            </w:r>
+          </w:p>
+        </w:tc>
+        <w:tc>
+          <w:tcPr>
+            <w:tcW w:type="dxa" w:w="1224"/>
+          </w:tcPr>
+          <w:p>
+            <w:pPr>
+              <w:jc w:val="right"/>
+            </w:pPr>
+            <w:r/>
+            <w:r>
+              <w:rPr>
+                <w:sz w:val="17"/>
+              </w:rPr>
+              <w:t>$500K</w:t>
+            </w:r>
+          </w:p>
+        </w:tc>
+        <w:tc>
+          <w:tcPr>
+            <w:tcW w:type="dxa" w:w="1224"/>
+          </w:tcPr>
+          <w:p>
+            <w:pPr>
+              <w:jc w:val="right"/>
+            </w:pPr>
+            <w:r/>
+            <w:r>
+              <w:rPr>
+                <w:sz w:val="17"/>
+              </w:rPr>
+              <w:t>$500K</w:t>
+            </w:r>
+          </w:p>
+        </w:tc>
+        <w:tc>
+          <w:tcPr>
+            <w:tcW w:type="dxa" w:w="2664"/>
+          </w:tcPr>
+          <w:p>
+            <w:r/>
+            <w:r>
+              <w:rPr>
+                <w:sz w:val="17"/>
+              </w:rPr>
+              <w:t>Close; ~$500K TBV in QB</w:t>
+            </w:r>
+          </w:p>
+        </w:tc>
+      </w:tr>
+      <w:tr>
+        <w:tc>
+          <w:tcPr>
+            <w:tcW w:type="dxa" w:w="3024"/>
+          </w:tcPr>
+          <w:p>
+            <w:r/>
+            <w:r>
+              <w:rPr>
+                <w:b w:val="0"/>
+                <w:sz w:val="17"/>
+              </w:rPr>
+              <w:t>Working-capital bridge</w:t>
+            </w:r>
+          </w:p>
+        </w:tc>
+        <w:tc>
+          <w:tcPr>
+            <w:tcW w:type="dxa" w:w="1224"/>
+          </w:tcPr>
+          <w:p>
+            <w:pPr>
+              <w:jc w:val="right"/>
+            </w:pPr>
+            <w:r/>
+            <w:r>
+              <w:rPr>
+                <w:sz w:val="17"/>
+              </w:rPr>
+              <w:t>—</w:t>
+            </w:r>
+          </w:p>
+        </w:tc>
+        <w:tc>
+          <w:tcPr>
+            <w:tcW w:type="dxa" w:w="1224"/>
+          </w:tcPr>
+          <w:p>
+            <w:pPr>
+              <w:jc w:val="right"/>
+            </w:pPr>
+            <w:r/>
+            <w:r>
+              <w:rPr>
+                <w:sz w:val="17"/>
+              </w:rPr>
+              <w:t>$500K</w:t>
+            </w:r>
+          </w:p>
+        </w:tc>
+        <w:tc>
+          <w:tcPr>
+            <w:tcW w:type="dxa" w:w="1224"/>
+          </w:tcPr>
+          <w:p>
+            <w:pPr>
+              <w:jc w:val="right"/>
+            </w:pPr>
+            <w:r/>
+            <w:r>
+              <w:rPr>
+                <w:sz w:val="17"/>
+              </w:rPr>
+              <w:t>$500K</w:t>
+            </w:r>
+          </w:p>
+        </w:tc>
+        <w:tc>
+          <w:tcPr>
+            <w:tcW w:type="dxa" w:w="2664"/>
+          </w:tcPr>
+          <w:p>
+            <w:r/>
+            <w:r>
+              <w:rPr>
+                <w:sz w:val="17"/>
+              </w:rPr>
+              <w:t>Close; only if it remains after prepaid removal</w:t>
+            </w:r>
+          </w:p>
+        </w:tc>
+      </w:tr>
+      <w:tr>
+        <w:tc>
+          <w:tcPr>
+            <w:tcW w:type="dxa" w:w="3024"/>
+            <w:shd w:val="clear" w:color="auto" w:fill="F3F4F6"/>
+          </w:tcPr>
+          <w:p>
+            <w:r/>
+            <w:r>
+              <w:rPr>
+                <w:b/>
+                <w:sz w:val="17"/>
+              </w:rPr>
+              <w:t>Subtotal: funding at close</w:t>
+            </w:r>
+          </w:p>
+        </w:tc>
+        <w:tc>
+          <w:tcPr>
+            <w:tcW w:type="dxa" w:w="1224"/>
+            <w:shd w:val="clear" w:color="auto" w:fill="F3F4F6"/>
+          </w:tcPr>
+          <w:p>
+            <w:pPr>
+              <w:jc w:val="right"/>
+            </w:pPr>
+            <w:r/>
+            <w:r>
+              <w:rPr>
+                <w:b/>
+                <w:sz w:val="17"/>
+              </w:rPr>
+              <w:t>$3,860K</w:t>
+            </w:r>
+          </w:p>
+        </w:tc>
+        <w:tc>
+          <w:tcPr>
+            <w:tcW w:type="dxa" w:w="1224"/>
+            <w:shd w:val="clear" w:color="auto" w:fill="F3F4F6"/>
+          </w:tcPr>
+          <w:p>
+            <w:pPr>
+              <w:jc w:val="right"/>
+            </w:pPr>
+            <w:r/>
+            <w:r>
+              <w:rPr>
+                <w:b/>
+                <w:sz w:val="17"/>
+              </w:rPr>
+              <w:t>$4,360K</w:t>
+            </w:r>
+          </w:p>
+        </w:tc>
+        <w:tc>
+          <w:tcPr>
+            <w:tcW w:type="dxa" w:w="1224"/>
+            <w:shd w:val="clear" w:color="auto" w:fill="F3F4F6"/>
+          </w:tcPr>
+          <w:p>
+            <w:pPr>
+              <w:jc w:val="right"/>
+            </w:pPr>
+            <w:r/>
+            <w:r>
+              <w:rPr>
+                <w:b/>
+                <w:sz w:val="17"/>
+              </w:rPr>
+              <w:t>$4,360K</w:t>
+            </w:r>
+          </w:p>
+        </w:tc>
+        <w:tc>
+          <w:tcPr>
+            <w:tcW w:type="dxa" w:w="2664"/>
+            <w:shd w:val="clear" w:color="auto" w:fill="F3F4F6"/>
+          </w:tcPr>
+          <w:p>
+            <w:r/>
+            <w:r>
+              <w:rPr>
+                <w:b/>
+                <w:sz w:val="17"/>
+              </w:rPr>
+            </w:r>
+          </w:p>
+        </w:tc>
+      </w:tr>
+      <w:tr>
+        <w:tc>
+          <w:tcPr>
+            <w:tcW w:type="dxa" w:w="3024"/>
+          </w:tcPr>
+          <w:p>
+            <w:r/>
+            <w:r>
+              <w:rPr>
+                <w:b w:val="0"/>
+                <w:sz w:val="17"/>
+              </w:rPr>
+              <w:t>Tank earn-out (3 yrs, capped)</w:t>
+            </w:r>
+          </w:p>
+        </w:tc>
+        <w:tc>
+          <w:tcPr>
+            <w:tcW w:type="dxa" w:w="1224"/>
+          </w:tcPr>
+          <w:p>
+            <w:pPr>
+              <w:jc w:val="right"/>
+            </w:pPr>
+            <w:r/>
+            <w:r>
+              <w:rPr>
+                <w:sz w:val="17"/>
+              </w:rPr>
+              <w:t>—</w:t>
+            </w:r>
+          </w:p>
+        </w:tc>
+        <w:tc>
+          <w:tcPr>
+            <w:tcW w:type="dxa" w:w="1224"/>
+          </w:tcPr>
+          <w:p>
+            <w:pPr>
+              <w:jc w:val="right"/>
+            </w:pPr>
+            <w:r/>
+            <w:r>
+              <w:rPr>
+                <w:sz w:val="17"/>
+              </w:rPr>
+              <w:t>$750K</w:t>
+            </w:r>
+          </w:p>
+        </w:tc>
+        <w:tc>
+          <w:tcPr>
+            <w:tcW w:type="dxa" w:w="1224"/>
+          </w:tcPr>
+          <w:p>
+            <w:pPr>
+              <w:jc w:val="right"/>
+            </w:pPr>
+            <w:r/>
+            <w:r>
+              <w:rPr>
+                <w:sz w:val="17"/>
+              </w:rPr>
+              <w:t>$900K</w:t>
+            </w:r>
+          </w:p>
+        </w:tc>
+        <w:tc>
+          <w:tcPr>
+            <w:tcW w:type="dxa" w:w="2664"/>
+          </w:tcPr>
+          <w:p>
+            <w:r/>
+            <w:r>
+              <w:rPr>
+                <w:sz w:val="17"/>
+              </w:rPr>
+              <w:t>FY27–FY29; 5%/yr; cap $300K/yr</w:t>
+            </w:r>
+          </w:p>
+        </w:tc>
+      </w:tr>
+      <w:tr>
+        <w:tc>
+          <w:tcPr>
+            <w:tcW w:type="dxa" w:w="3024"/>
+          </w:tcPr>
+          <w:p>
+            <w:r/>
+            <w:r>
+              <w:rPr>
+                <w:b w:val="0"/>
+                <w:sz w:val="17"/>
+              </w:rPr>
+              <w:t>Exos stock earn-out at listing</w:t>
+            </w:r>
+          </w:p>
+        </w:tc>
+        <w:tc>
+          <w:tcPr>
+            <w:tcW w:type="dxa" w:w="1224"/>
+          </w:tcPr>
+          <w:p>
+            <w:pPr>
+              <w:jc w:val="right"/>
+            </w:pPr>
+            <w:r/>
+            <w:r>
+              <w:rPr>
+                <w:sz w:val="17"/>
+              </w:rPr>
+              <w:t>$1,000K</w:t>
+            </w:r>
+          </w:p>
+        </w:tc>
+        <w:tc>
+          <w:tcPr>
+            <w:tcW w:type="dxa" w:w="1224"/>
+          </w:tcPr>
+          <w:p>
+            <w:pPr>
+              <w:jc w:val="right"/>
+            </w:pPr>
+            <w:r/>
+            <w:r>
+              <w:rPr>
+                <w:sz w:val="17"/>
+              </w:rPr>
+              <w:t>$1,875K</w:t>
+            </w:r>
+          </w:p>
+        </w:tc>
+        <w:tc>
+          <w:tcPr>
+            <w:tcW w:type="dxa" w:w="1224"/>
+          </w:tcPr>
+          <w:p>
+            <w:pPr>
+              <w:jc w:val="right"/>
+            </w:pPr>
+            <w:r/>
+            <w:r>
+              <w:rPr>
+                <w:sz w:val="17"/>
+              </w:rPr>
+              <w:t>$3,000K</w:t>
+            </w:r>
+          </w:p>
+        </w:tc>
+        <w:tc>
+          <w:tcPr>
+            <w:tcW w:type="dxa" w:w="2664"/>
+          </w:tcPr>
+          <w:p>
+            <w:r/>
+            <w:r>
+              <w:rPr>
+                <w:sz w:val="17"/>
+              </w:rPr>
+              <w:t>Post-RTO ~FY28; 0.5% / 0.75% / 1.0% FD</w:t>
+            </w:r>
+          </w:p>
+        </w:tc>
+      </w:tr>
+      <w:tr>
+        <w:tc>
+          <w:tcPr>
+            <w:tcW w:type="dxa" w:w="3024"/>
+            <w:shd w:val="clear" w:color="auto" w:fill="D1FAE5"/>
+          </w:tcPr>
+          <w:p>
+            <w:r/>
+            <w:r>
+              <w:rPr>
+                <w:b/>
+                <w:sz w:val="17"/>
+              </w:rPr>
+              <w:t>TOTAL OFFER VALUE (5-yr)</w:t>
+            </w:r>
+          </w:p>
+        </w:tc>
+        <w:tc>
+          <w:tcPr>
+            <w:tcW w:type="dxa" w:w="1224"/>
+            <w:shd w:val="clear" w:color="auto" w:fill="D1FAE5"/>
+          </w:tcPr>
+          <w:p>
+            <w:pPr>
+              <w:jc w:val="right"/>
+            </w:pPr>
+            <w:r/>
+            <w:r>
+              <w:rPr>
+                <w:b/>
+                <w:sz w:val="17"/>
+              </w:rPr>
+              <w:t>$4,860K</w:t>
+            </w:r>
+          </w:p>
+        </w:tc>
+        <w:tc>
+          <w:tcPr>
+            <w:tcW w:type="dxa" w:w="1224"/>
+            <w:shd w:val="clear" w:color="auto" w:fill="D1FAE5"/>
+          </w:tcPr>
+          <w:p>
+            <w:pPr>
+              <w:jc w:val="right"/>
+            </w:pPr>
+            <w:r/>
+            <w:r>
+              <w:rPr>
+                <w:b/>
+                <w:sz w:val="17"/>
+              </w:rPr>
+              <w:t>$6,985K</w:t>
+            </w:r>
+          </w:p>
+        </w:tc>
+        <w:tc>
+          <w:tcPr>
+            <w:tcW w:type="dxa" w:w="1224"/>
+            <w:shd w:val="clear" w:color="auto" w:fill="D1FAE5"/>
+          </w:tcPr>
+          <w:p>
+            <w:pPr>
+              <w:jc w:val="right"/>
+            </w:pPr>
+            <w:r/>
+            <w:r>
+              <w:rPr>
+                <w:b/>
+                <w:sz w:val="17"/>
+              </w:rPr>
+              <w:t>$8,260K</w:t>
+            </w:r>
+          </w:p>
+        </w:tc>
+        <w:tc>
+          <w:tcPr>
+            <w:tcW w:type="dxa" w:w="2664"/>
+            <w:shd w:val="clear" w:color="auto" w:fill="D1FAE5"/>
+          </w:tcPr>
+          <w:p>
+            <w:r/>
+            <w:r>
+              <w:rPr>
+                <w:b/>
+                <w:sz w:val="17"/>
+              </w:rPr>
+              <w:t>FY27–FY31</w:t>
+            </w:r>
+          </w:p>
+        </w:tc>
+      </w:tr>
+      <w:tr>
+        <w:tc>
+          <w:tcPr>
+            <w:tcW w:type="dxa" w:w="3024"/>
+            <w:shd w:val="clear" w:color="auto" w:fill="FEF3C7"/>
+          </w:tcPr>
+          <w:p>
+            <w:r/>
+            <w:r>
+              <w:rPr>
+                <w:i/>
+                <w:color w:val="6B7280"/>
+                <w:sz w:val="17"/>
+              </w:rPr>
+              <w:t>Memo: Exos stock if held to FY31</w:t>
+            </w:r>
+            <w:r>
+              <w:br/>
+            </w:r>
+            <w:r>
+              <w:rPr>
+                <w:i/>
+                <w:color w:val="6B7280"/>
+                <w:sz w:val="17"/>
+              </w:rPr>
+              <w:t>(not additive to total above)</w:t>
+            </w:r>
+          </w:p>
+        </w:tc>
+        <w:tc>
+          <w:tcPr>
+            <w:tcW w:type="dxa" w:w="1224"/>
+            <w:shd w:val="clear" w:color="auto" w:fill="FEF3C7"/>
+          </w:tcPr>
+          <w:p>
+            <w:pPr>
+              <w:jc w:val="right"/>
+            </w:pPr>
+            <w:r/>
+            <w:r>
+              <w:rPr>
+                <w:i/>
+                <w:color w:val="6B7280"/>
+                <w:sz w:val="17"/>
+              </w:rPr>
+              <w:t>$5.7M</w:t>
+            </w:r>
+          </w:p>
+        </w:tc>
+        <w:tc>
+          <w:tcPr>
+            <w:tcW w:type="dxa" w:w="1224"/>
+            <w:shd w:val="clear" w:color="auto" w:fill="FEF3C7"/>
+          </w:tcPr>
+          <w:p>
+            <w:pPr>
+              <w:jc w:val="right"/>
+            </w:pPr>
+            <w:r/>
+            <w:r>
+              <w:rPr>
+                <w:i/>
+                <w:color w:val="6B7280"/>
+                <w:sz w:val="17"/>
+              </w:rPr>
+              <w:t>$8.5M</w:t>
+            </w:r>
+          </w:p>
+        </w:tc>
+        <w:tc>
+          <w:tcPr>
+            <w:tcW w:type="dxa" w:w="1224"/>
+            <w:shd w:val="clear" w:color="auto" w:fill="FEF3C7"/>
+          </w:tcPr>
+          <w:p>
+            <w:pPr>
+              <w:jc w:val="right"/>
+            </w:pPr>
+            <w:r/>
+            <w:r>
+              <w:rPr>
+                <w:i/>
+                <w:color w:val="6B7280"/>
+                <w:sz w:val="17"/>
+              </w:rPr>
+              <w:t>$11.4M</w:t>
+            </w:r>
+          </w:p>
+        </w:tc>
+        <w:tc>
+          <w:tcPr>
+            <w:tcW w:type="dxa" w:w="2664"/>
+            <w:shd w:val="clear" w:color="auto" w:fill="FEF3C7"/>
+          </w:tcPr>
+          <w:p>
+            <w:r/>
+            <w:r>
+              <w:rPr>
+                <w:i/>
+                <w:color w:val="6B7280"/>
+                <w:sz w:val="17"/>
+              </w:rPr>
+              <w:t>16× EV/EBITDA; ~30% dilution;</w:t>
+            </w:r>
+            <w:r>
+              <w:br/>
+            </w:r>
+            <w:r>
+              <w:rPr>
+                <w:i/>
+                <w:color w:val="6B7280"/>
+                <w:sz w:val="17"/>
+              </w:rPr>
+              <w:t>mgmt assumption — not a guarantee</w:t>
+            </w:r>
+          </w:p>
+        </w:tc>
+      </w:tr>
+    </w:tbl>
+    <w:p>
+      <w:pPr>
+        <w:spacing w:after="60" w:before="0"/>
+      </w:pPr>
     </w:p>
     <w:p>
       <w:pPr>
@@ -88,100 +1077,10 @@
         <w:rPr>
           <w:b/>
         </w:rPr>
-        <w:t xml:space="preserve">Cash at close  </w:t>
+        <w:t xml:space="preserve">No additional capital calls  </w:t>
       </w:r>
       <w:r>
-        <w:t>$2,510,000 delivered to SSLC at acquisition close.</w:t>
-      </w:r>
-    </w:p>
-    <w:p>
-      <w:pPr>
-        <w:spacing w:after="40" w:before="0"/>
-        <w:ind w:left="288"/>
-      </w:pPr>
-      <w:r>
-        <w:t xml:space="preserve">•  </w:t>
-      </w:r>
-      <w:r>
-        <w:rPr>
-          <w:b/>
-        </w:rPr>
-        <w:t xml:space="preserve">Debt relief  </w:t>
-      </w:r>
-      <w:r>
-        <w:t>All SSLC debts paid at face value at close, including the Microcosm loan and Wertz notes (est. ~$500K, to be verified in QuickBooks). Jim Wertz's personal loans are made whole at closing.</w:t>
-      </w:r>
-    </w:p>
-    <w:p>
-      <w:pPr>
-        <w:spacing w:after="40" w:before="0"/>
-        <w:ind w:left="288"/>
-      </w:pPr>
-      <w:r>
-        <w:t xml:space="preserve">•  </w:t>
-      </w:r>
-      <w:r>
-        <w:rPr>
-          <w:b/>
-        </w:rPr>
-        <w:t xml:space="preserve">No further capital calls  </w:t>
-      </w:r>
-      <w:r>
-        <w:t>Once closed, SSLC's standalone cash drain stops. Shareholders stop funding a working-capital-negative entity.</w:t>
-      </w:r>
-    </w:p>
-    <w:p>
-      <w:pPr>
-        <w:spacing w:after="40" w:before="0"/>
-        <w:ind w:left="288"/>
-      </w:pPr>
-      <w:r>
-        <w:t xml:space="preserve">•  </w:t>
-      </w:r>
-      <w:r>
-        <w:rPr>
-          <w:b/>
-        </w:rPr>
-        <w:t xml:space="preserve">Earn-out — IM tank revenue  </w:t>
-      </w:r>
-      <w:r>
-        <w:t>5% of Intuitive Machines tank revenue for 3 years, capped at $300K/year (up to $900K total). Tied to SSLC's existing firm IM demand.</w:t>
-      </w:r>
-    </w:p>
-    <w:p>
-      <w:pPr>
-        <w:spacing w:after="40" w:before="0"/>
-        <w:ind w:left="288"/>
-      </w:pPr>
-      <w:r>
-        <w:t xml:space="preserve">•  </w:t>
-      </w:r>
-      <w:r>
-        <w:rPr>
-          <w:b/>
-        </w:rPr>
-        <w:t xml:space="preserve">Earn-out — Exos stock  </w:t>
-      </w:r>
-      <w:r>
-        <w:t>0.5%–1.0% of Exos fully diluted shares post-RTO listing (est. $1.0M–$3.0M at a $200M–$300M listing; $250M minimum MEV per Ainigma/FNEX mandate).</w:t>
-      </w:r>
-    </w:p>
-    <w:p>
-      <w:pPr>
-        <w:spacing w:after="40" w:before="0"/>
-        <w:ind w:left="288"/>
-      </w:pPr>
-      <w:r>
-        <w:t xml:space="preserve">•  </w:t>
-      </w:r>
-      <w:r>
-        <w:rPr>
-          <w:b/>
-        </w:rPr>
-        <w:t xml:space="preserve">Exos shares + Y5 hold value  </w:t>
-      </w:r>
-      <w:r>
-        <w:t>Stock earn-out is tradeable post-12-month lockup. Held to FY31 at a 16× EV/EBITDA multiple on the Exos plan (~$1.63B EV), a 0.75% grant (~0.525% after ~30% assumed dilution) is worth ~$8.5M (range $5.7M–$11.4M), ~4.6× its ~$1.875M value at listing. Management assumptions.</w:t>
+        <w:t>Once closed, SSLC's standalone cash burn stops entirely.</w:t>
       </w:r>
     </w:p>
     <w:p>
@@ -199,7 +1098,7 @@
         <w:t xml:space="preserve">IM program continuity  </w:t>
       </w:r>
       <w:r>
-        <w:t>No delivery interruption to Intuitive Machines; Exos-SSLC entity continues the contract, preserving SSLC's strongest commercial relationship.</w:t>
+        <w:t>Exos-SSLC continues the Intuitive Machines contract with no delivery interruption.</w:t>
       </w:r>
     </w:p>
     <w:p>

</xml_diff>

<commit_message>
SSLC OptionB: add framing line + echo sentence in Wertz v2 draft
Offer summary: italic framing line above table — 'The up-front price reflects
what the numbers support today. The earn-outs are how that value grows...'
Wertz v2: one-sentence echo between On value para and earn-out bullets.
Still 2 pages. Attached as v4 to MC task 3544.
</commit_message>
<xml_diff>
--- a/drafts/Exos_SSLC_OptionB_Offer_Summary_2026-10-07.docx
+++ b/drafts/Exos_SSLC_OptionB_Offer_Summary_2026-10-07.docx
@@ -73,7 +73,21 @@
           <w:i w:val="0"/>
           <w:sz w:val="20"/>
         </w:rPr>
-        <w:t>The Exos offer delivers liquidity, debt relief, and equity upside — without requiring any additional capital call from current SSLC shareholders:</w:t>
+        <w:t>The Exos offer delivers liquidity, debt relief, and equity upside — without requiring any additional capital call from current SSLC shareholders.</w:t>
+      </w:r>
+    </w:p>
+    <w:p>
+      <w:pPr>
+        <w:spacing w:after="80" w:before="0"/>
+      </w:pPr>
+      <w:r>
+        <w:rPr>
+          <w:b w:val="0"/>
+          <w:i/>
+          <w:color w:val="2E75B6"/>
+          <w:sz w:val="19"/>
+        </w:rPr>
+        <w:t>The up-front price reflects what the numbers support today. The earn-outs are how that value grows: as IM tank deliveries and the Exos listing happen, SSLC holders share directly in that upside.</w:t>
       </w:r>
     </w:p>
     <w:tbl>

</xml_diff>

<commit_message>
SSLC Option B: John 10/7 15:22-15:28 terms — table format, HIGH ~$10M, 5yr tank+milestones, principals' lockup, $5.1M trigger, name fix
</commit_message>
<xml_diff>
--- a/drafts/Exos_SSLC_OptionB_Offer_Summary_2026-10-07.docx
+++ b/drafts/Exos_SSLC_OptionB_Offer_Summary_2026-10-07.docx
@@ -87,7 +87,21 @@
           <w:color w:val="2E75B6"/>
           <w:sz w:val="19"/>
         </w:rPr>
-        <w:t>The up-front price reflects what the numbers support today. The earn-outs are how that value grows: as IM tank deliveries and the Exos listing happen, SSLC holders share directly in that upside.</w:t>
+        <w:t>The up-front price reflects what the numbers support today. The earn-outs are how that value grows: as goals are met — IM tank deliveries, revenue milestones and the Exos listing — SSLC holders share directly in the upside.</w:t>
+      </w:r>
+    </w:p>
+    <w:p>
+      <w:pPr>
+        <w:spacing w:after="40" w:before="0"/>
+      </w:pPr>
+      <w:r>
+        <w:rPr>
+          <w:b w:val="0"/>
+          <w:i/>
+          <w:color w:val="606060"/>
+          <w:sz w:val="15"/>
+        </w:rPr>
+        <w:t>Earn-out rows: negotiating terms — management assumptions. Each milestone is independently verifiable; none pay unless the trigger is met.</w:t>
       </w:r>
     </w:p>
     <w:tbl>
@@ -98,16 +112,16 @@
         <w:tblLook w:firstColumn="1" w:firstRow="1" w:lastColumn="0" w:lastRow="0" w:noHBand="0" w:noVBand="1" w:val="04A0"/>
       </w:tblPr>
       <w:tblGrid>
-        <w:gridCol w:w="3024"/>
-        <w:gridCol w:w="1224"/>
-        <w:gridCol w:w="1224"/>
-        <w:gridCol w:w="1224"/>
+        <w:gridCol w:w="3240"/>
+        <w:gridCol w:w="1152"/>
+        <w:gridCol w:w="1152"/>
+        <w:gridCol w:w="1152"/>
         <w:gridCol w:w="2664"/>
       </w:tblGrid>
       <w:tr>
         <w:tc>
           <w:tcPr>
-            <w:tcW w:type="dxa" w:w="3024"/>
+            <w:tcW w:type="dxa" w:w="3240"/>
             <w:shd w:val="clear" w:color="auto" w:fill="1F3A68"/>
           </w:tcPr>
           <w:p>
@@ -116,7 +130,7 @@
               <w:rPr>
                 <w:b/>
                 <w:color w:val="FFFFFF"/>
-                <w:sz w:val="17"/>
+                <w:sz w:val="16"/>
               </w:rPr>
               <w:t>Component</w:t>
             </w:r>
@@ -124,7 +138,7 @@
         </w:tc>
         <w:tc>
           <w:tcPr>
-            <w:tcW w:type="dxa" w:w="1224"/>
+            <w:tcW w:type="dxa" w:w="1152"/>
             <w:shd w:val="clear" w:color="auto" w:fill="1F3A68"/>
           </w:tcPr>
           <w:p>
@@ -136,7 +150,7 @@
               <w:rPr>
                 <w:b/>
                 <w:color w:val="FFFFFF"/>
-                <w:sz w:val="17"/>
+                <w:sz w:val="16"/>
               </w:rPr>
               <w:t>Low</w:t>
             </w:r>
@@ -144,7 +158,7 @@
         </w:tc>
         <w:tc>
           <w:tcPr>
-            <w:tcW w:type="dxa" w:w="1224"/>
+            <w:tcW w:type="dxa" w:w="1152"/>
             <w:shd w:val="clear" w:color="auto" w:fill="1F3A68"/>
           </w:tcPr>
           <w:p>
@@ -156,7 +170,7 @@
               <w:rPr>
                 <w:b/>
                 <w:color w:val="FFFFFF"/>
-                <w:sz w:val="17"/>
+                <w:sz w:val="16"/>
               </w:rPr>
               <w:t>Base</w:t>
             </w:r>
@@ -164,7 +178,7 @@
         </w:tc>
         <w:tc>
           <w:tcPr>
-            <w:tcW w:type="dxa" w:w="1224"/>
+            <w:tcW w:type="dxa" w:w="1152"/>
             <w:shd w:val="clear" w:color="auto" w:fill="1F3A68"/>
           </w:tcPr>
           <w:p>
@@ -176,7 +190,7 @@
               <w:rPr>
                 <w:b/>
                 <w:color w:val="FFFFFF"/>
-                <w:sz w:val="17"/>
+                <w:sz w:val="16"/>
               </w:rPr>
               <w:t>High</w:t>
             </w:r>
@@ -193,7 +207,7 @@
               <w:rPr>
                 <w:b/>
                 <w:color w:val="FFFFFF"/>
-                <w:sz w:val="17"/>
+                <w:sz w:val="16"/>
               </w:rPr>
               <w:t>When / Notes</w:t>
             </w:r>
@@ -203,14 +217,13 @@
       <w:tr>
         <w:tc>
           <w:tcPr>
-            <w:tcW w:type="dxa" w:w="3024"/>
-          </w:tcPr>
-          <w:p>
-            <w:r/>
-            <w:r>
-              <w:rPr>
-                <w:b w:val="0"/>
-                <w:sz w:val="17"/>
+            <w:tcW w:type="dxa" w:w="3240"/>
+          </w:tcPr>
+          <w:p>
+            <w:r/>
+            <w:r>
+              <w:rPr>
+                <w:sz w:val="16"/>
               </w:rPr>
               <w:t>Cash at close</w:t>
             </w:r>
@@ -218,7 +231,7 @@
         </w:tc>
         <w:tc>
           <w:tcPr>
-            <w:tcW w:type="dxa" w:w="1224"/>
+            <w:tcW w:type="dxa" w:w="1152"/>
           </w:tcPr>
           <w:p>
             <w:pPr>
@@ -227,7 +240,7 @@
             <w:r/>
             <w:r>
               <w:rPr>
-                <w:sz w:val="17"/>
+                <w:sz w:val="16"/>
               </w:rPr>
               <w:t>$2,510K</w:t>
             </w:r>
@@ -235,7 +248,7 @@
         </w:tc>
         <w:tc>
           <w:tcPr>
-            <w:tcW w:type="dxa" w:w="1224"/>
+            <w:tcW w:type="dxa" w:w="1152"/>
           </w:tcPr>
           <w:p>
             <w:pPr>
@@ -244,7 +257,7 @@
             <w:r/>
             <w:r>
               <w:rPr>
-                <w:sz w:val="17"/>
+                <w:sz w:val="16"/>
               </w:rPr>
               <w:t>$2,510K</w:t>
             </w:r>
@@ -252,7 +265,7 @@
         </w:tc>
         <w:tc>
           <w:tcPr>
-            <w:tcW w:type="dxa" w:w="1224"/>
+            <w:tcW w:type="dxa" w:w="1152"/>
           </w:tcPr>
           <w:p>
             <w:pPr>
@@ -261,7 +274,7 @@
             <w:r/>
             <w:r>
               <w:rPr>
-                <w:sz w:val="17"/>
+                <w:sz w:val="16"/>
               </w:rPr>
               <w:t>$2,510K</w:t>
             </w:r>
@@ -275,7 +288,7 @@
             <w:r/>
             <w:r>
               <w:rPr>
-                <w:sz w:val="17"/>
+                <w:sz w:val="16"/>
               </w:rPr>
               <w:t>Close ~Q1 FY27</w:t>
             </w:r>
@@ -285,14 +298,13 @@
       <w:tr>
         <w:tc>
           <w:tcPr>
-            <w:tcW w:type="dxa" w:w="3024"/>
-          </w:tcPr>
-          <w:p>
-            <w:r/>
-            <w:r>
-              <w:rPr>
-                <w:b w:val="0"/>
-                <w:sz w:val="17"/>
+            <w:tcW w:type="dxa" w:w="3240"/>
+          </w:tcPr>
+          <w:p>
+            <w:r/>
+            <w:r>
+              <w:rPr>
+                <w:sz w:val="16"/>
               </w:rPr>
               <w:t>SSLC transaction costs</w:t>
             </w:r>
@@ -300,7 +312,7 @@
         </w:tc>
         <w:tc>
           <w:tcPr>
-            <w:tcW w:type="dxa" w:w="1224"/>
+            <w:tcW w:type="dxa" w:w="1152"/>
           </w:tcPr>
           <w:p>
             <w:pPr>
@@ -309,7 +321,7 @@
             <w:r/>
             <w:r>
               <w:rPr>
-                <w:sz w:val="17"/>
+                <w:sz w:val="16"/>
               </w:rPr>
               <w:t>$60K</w:t>
             </w:r>
@@ -317,7 +329,7 @@
         </w:tc>
         <w:tc>
           <w:tcPr>
-            <w:tcW w:type="dxa" w:w="1224"/>
+            <w:tcW w:type="dxa" w:w="1152"/>
           </w:tcPr>
           <w:p>
             <w:pPr>
@@ -326,7 +338,7 @@
             <w:r/>
             <w:r>
               <w:rPr>
-                <w:sz w:val="17"/>
+                <w:sz w:val="16"/>
               </w:rPr>
               <w:t>$60K</w:t>
             </w:r>
@@ -334,7 +346,7 @@
         </w:tc>
         <w:tc>
           <w:tcPr>
-            <w:tcW w:type="dxa" w:w="1224"/>
+            <w:tcW w:type="dxa" w:w="1152"/>
           </w:tcPr>
           <w:p>
             <w:pPr>
@@ -343,7 +355,7 @@
             <w:r/>
             <w:r>
               <w:rPr>
-                <w:sz w:val="17"/>
+                <w:sz w:val="16"/>
               </w:rPr>
               <w:t>$60K</w:t>
             </w:r>
@@ -357,7 +369,7 @@
             <w:r/>
             <w:r>
               <w:rPr>
-                <w:sz w:val="17"/>
+                <w:sz w:val="16"/>
               </w:rPr>
               <w:t>Close; seller-side</w:t>
             </w:r>
@@ -367,14 +379,13 @@
       <w:tr>
         <w:tc>
           <w:tcPr>
-            <w:tcW w:type="dxa" w:w="3024"/>
-          </w:tcPr>
-          <w:p>
-            <w:r/>
-            <w:r>
-              <w:rPr>
-                <w:b w:val="0"/>
-                <w:sz w:val="17"/>
+            <w:tcW w:type="dxa" w:w="3240"/>
+          </w:tcPr>
+          <w:p>
+            <w:r/>
+            <w:r>
+              <w:rPr>
+                <w:sz w:val="16"/>
               </w:rPr>
               <w:t>Credit for Exos's existing stake</w:t>
             </w:r>
@@ -382,7 +393,7 @@
         </w:tc>
         <w:tc>
           <w:tcPr>
-            <w:tcW w:type="dxa" w:w="1224"/>
+            <w:tcW w:type="dxa" w:w="1152"/>
           </w:tcPr>
           <w:p>
             <w:pPr>
@@ -391,7 +402,7 @@
             <w:r/>
             <w:r>
               <w:rPr>
-                <w:sz w:val="17"/>
+                <w:sz w:val="16"/>
               </w:rPr>
               <w:t>$790K</w:t>
             </w:r>
@@ -399,7 +410,7 @@
         </w:tc>
         <w:tc>
           <w:tcPr>
-            <w:tcW w:type="dxa" w:w="1224"/>
+            <w:tcW w:type="dxa" w:w="1152"/>
           </w:tcPr>
           <w:p>
             <w:pPr>
@@ -408,7 +419,7 @@
             <w:r/>
             <w:r>
               <w:rPr>
-                <w:sz w:val="17"/>
+                <w:sz w:val="16"/>
               </w:rPr>
               <w:t>$790K</w:t>
             </w:r>
@@ -416,7 +427,7 @@
         </w:tc>
         <w:tc>
           <w:tcPr>
-            <w:tcW w:type="dxa" w:w="1224"/>
+            <w:tcW w:type="dxa" w:w="1152"/>
           </w:tcPr>
           <w:p>
             <w:pPr>
@@ -425,7 +436,7 @@
             <w:r/>
             <w:r>
               <w:rPr>
-                <w:sz w:val="17"/>
+                <w:sz w:val="16"/>
               </w:rPr>
               <w:t>$790K</w:t>
             </w:r>
@@ -439,7 +450,7 @@
             <w:r/>
             <w:r>
               <w:rPr>
-                <w:sz w:val="17"/>
+                <w:sz w:val="16"/>
               </w:rPr>
               <w:t>Close (non-cash credit)</w:t>
             </w:r>
@@ -449,14 +460,13 @@
       <w:tr>
         <w:tc>
           <w:tcPr>
-            <w:tcW w:type="dxa" w:w="3024"/>
-          </w:tcPr>
-          <w:p>
-            <w:r/>
-            <w:r>
-              <w:rPr>
-                <w:b w:val="0"/>
-                <w:sz w:val="17"/>
+            <w:tcW w:type="dxa" w:w="3240"/>
+          </w:tcPr>
+          <w:p>
+            <w:r/>
+            <w:r>
+              <w:rPr>
+                <w:sz w:val="16"/>
               </w:rPr>
               <w:t>SSLC debts paid at face</w:t>
             </w:r>
@@ -464,7 +474,7 @@
         </w:tc>
         <w:tc>
           <w:tcPr>
-            <w:tcW w:type="dxa" w:w="1224"/>
+            <w:tcW w:type="dxa" w:w="1152"/>
           </w:tcPr>
           <w:p>
             <w:pPr>
@@ -473,7 +483,7 @@
             <w:r/>
             <w:r>
               <w:rPr>
-                <w:sz w:val="17"/>
+                <w:sz w:val="16"/>
               </w:rPr>
               <w:t>$500K</w:t>
             </w:r>
@@ -481,7 +491,7 @@
         </w:tc>
         <w:tc>
           <w:tcPr>
-            <w:tcW w:type="dxa" w:w="1224"/>
+            <w:tcW w:type="dxa" w:w="1152"/>
           </w:tcPr>
           <w:p>
             <w:pPr>
@@ -490,7 +500,7 @@
             <w:r/>
             <w:r>
               <w:rPr>
-                <w:sz w:val="17"/>
+                <w:sz w:val="16"/>
               </w:rPr>
               <w:t>$500K</w:t>
             </w:r>
@@ -498,7 +508,7 @@
         </w:tc>
         <w:tc>
           <w:tcPr>
-            <w:tcW w:type="dxa" w:w="1224"/>
+            <w:tcW w:type="dxa" w:w="1152"/>
           </w:tcPr>
           <w:p>
             <w:pPr>
@@ -507,7 +517,7 @@
             <w:r/>
             <w:r>
               <w:rPr>
-                <w:sz w:val="17"/>
+                <w:sz w:val="16"/>
               </w:rPr>
               <w:t>$500K</w:t>
             </w:r>
@@ -521,7 +531,7 @@
             <w:r/>
             <w:r>
               <w:rPr>
-                <w:sz w:val="17"/>
+                <w:sz w:val="16"/>
               </w:rPr>
               <w:t>Close; ~$500K TBV in QB</w:t>
             </w:r>
@@ -531,14 +541,13 @@
       <w:tr>
         <w:tc>
           <w:tcPr>
-            <w:tcW w:type="dxa" w:w="3024"/>
-          </w:tcPr>
-          <w:p>
-            <w:r/>
-            <w:r>
-              <w:rPr>
-                <w:b w:val="0"/>
-                <w:sz w:val="17"/>
+            <w:tcW w:type="dxa" w:w="3240"/>
+          </w:tcPr>
+          <w:p>
+            <w:r/>
+            <w:r>
+              <w:rPr>
+                <w:sz w:val="16"/>
               </w:rPr>
               <w:t>Working-capital bridge</w:t>
             </w:r>
@@ -546,7 +555,7 @@
         </w:tc>
         <w:tc>
           <w:tcPr>
-            <w:tcW w:type="dxa" w:w="1224"/>
+            <w:tcW w:type="dxa" w:w="1152"/>
           </w:tcPr>
           <w:p>
             <w:pPr>
@@ -555,15 +564,15 @@
             <w:r/>
             <w:r>
               <w:rPr>
-                <w:sz w:val="17"/>
-              </w:rPr>
-              <w:t>—</w:t>
-            </w:r>
-          </w:p>
-        </w:tc>
-        <w:tc>
-          <w:tcPr>
-            <w:tcW w:type="dxa" w:w="1224"/>
+                <w:sz w:val="16"/>
+              </w:rPr>
+              <w:t>$500K</w:t>
+            </w:r>
+          </w:p>
+        </w:tc>
+        <w:tc>
+          <w:tcPr>
+            <w:tcW w:type="dxa" w:w="1152"/>
           </w:tcPr>
           <w:p>
             <w:pPr>
@@ -572,7 +581,7 @@
             <w:r/>
             <w:r>
               <w:rPr>
-                <w:sz w:val="17"/>
+                <w:sz w:val="16"/>
               </w:rPr>
               <w:t>$500K</w:t>
             </w:r>
@@ -580,7 +589,7 @@
         </w:tc>
         <w:tc>
           <w:tcPr>
-            <w:tcW w:type="dxa" w:w="1224"/>
+            <w:tcW w:type="dxa" w:w="1152"/>
           </w:tcPr>
           <w:p>
             <w:pPr>
@@ -589,7 +598,7 @@
             <w:r/>
             <w:r>
               <w:rPr>
-                <w:sz w:val="17"/>
+                <w:sz w:val="16"/>
               </w:rPr>
               <w:t>$500K</w:t>
             </w:r>
@@ -603,9 +612,9 @@
             <w:r/>
             <w:r>
               <w:rPr>
-                <w:sz w:val="17"/>
-              </w:rPr>
-              <w:t>Close; only if it remains after prepaid removal</w:t>
+                <w:sz w:val="16"/>
+              </w:rPr>
+              <w:t>Close</w:t>
             </w:r>
           </w:p>
         </w:tc>
@@ -613,7 +622,7 @@
       <w:tr>
         <w:tc>
           <w:tcPr>
-            <w:tcW w:type="dxa" w:w="3024"/>
+            <w:tcW w:type="dxa" w:w="3240"/>
             <w:shd w:val="clear" w:color="auto" w:fill="F3F4F6"/>
           </w:tcPr>
           <w:p>
@@ -621,7 +630,7 @@
             <w:r>
               <w:rPr>
                 <w:b/>
-                <w:sz w:val="17"/>
+                <w:sz w:val="16"/>
               </w:rPr>
               <w:t>Subtotal: funding at close</w:t>
             </w:r>
@@ -629,7 +638,7 @@
         </w:tc>
         <w:tc>
           <w:tcPr>
-            <w:tcW w:type="dxa" w:w="1224"/>
+            <w:tcW w:type="dxa" w:w="1152"/>
             <w:shd w:val="clear" w:color="auto" w:fill="F3F4F6"/>
           </w:tcPr>
           <w:p>
@@ -640,15 +649,15 @@
             <w:r>
               <w:rPr>
                 <w:b/>
-                <w:sz w:val="17"/>
-              </w:rPr>
-              <w:t>$3,860K</w:t>
-            </w:r>
-          </w:p>
-        </w:tc>
-        <w:tc>
-          <w:tcPr>
-            <w:tcW w:type="dxa" w:w="1224"/>
+                <w:sz w:val="16"/>
+              </w:rPr>
+              <w:t>$4,360K</w:t>
+            </w:r>
+          </w:p>
+        </w:tc>
+        <w:tc>
+          <w:tcPr>
+            <w:tcW w:type="dxa" w:w="1152"/>
             <w:shd w:val="clear" w:color="auto" w:fill="F3F4F6"/>
           </w:tcPr>
           <w:p>
@@ -659,7 +668,7 @@
             <w:r>
               <w:rPr>
                 <w:b/>
-                <w:sz w:val="17"/>
+                <w:sz w:val="16"/>
               </w:rPr>
               <w:t>$4,360K</w:t>
             </w:r>
@@ -667,7 +676,7 @@
         </w:tc>
         <w:tc>
           <w:tcPr>
-            <w:tcW w:type="dxa" w:w="1224"/>
+            <w:tcW w:type="dxa" w:w="1152"/>
             <w:shd w:val="clear" w:color="auto" w:fill="F3F4F6"/>
           </w:tcPr>
           <w:p>
@@ -678,7 +687,7 @@
             <w:r>
               <w:rPr>
                 <w:b/>
-                <w:sz w:val="17"/>
+                <w:sz w:val="16"/>
               </w:rPr>
               <w:t>$4,360K</w:t>
             </w:r>
@@ -694,7 +703,7 @@
             <w:r>
               <w:rPr>
                 <w:b/>
-                <w:sz w:val="17"/>
+                <w:sz w:val="16"/>
               </w:rPr>
             </w:r>
           </w:p>
@@ -703,22 +712,30 @@
       <w:tr>
         <w:tc>
           <w:tcPr>
-            <w:tcW w:type="dxa" w:w="3024"/>
-          </w:tcPr>
-          <w:p>
-            <w:r/>
-            <w:r>
-              <w:rPr>
-                <w:b w:val="0"/>
-                <w:sz w:val="17"/>
-              </w:rPr>
-              <w:t>Tank earn-out (3 yrs, capped)</w:t>
-            </w:r>
-          </w:p>
-        </w:tc>
-        <w:tc>
-          <w:tcPr>
-            <w:tcW w:type="dxa" w:w="1224"/>
+            <w:tcW w:type="dxa" w:w="3240"/>
+          </w:tcPr>
+          <w:p>
+            <w:r/>
+            <w:r>
+              <w:rPr>
+                <w:sz w:val="16"/>
+              </w:rPr>
+              <w:t>Tank earn-out (5 yrs, 5%/yr,</w:t>
+            </w:r>
+            <w:r>
+              <w:br/>
+            </w:r>
+            <w:r>
+              <w:rPr>
+                <w:sz w:val="16"/>
+              </w:rPr>
+              <w:t>cap $300K/yr)</w:t>
+            </w:r>
+          </w:p>
+        </w:tc>
+        <w:tc>
+          <w:tcPr>
+            <w:tcW w:type="dxa" w:w="1152"/>
           </w:tcPr>
           <w:p>
             <w:pPr>
@@ -727,15 +744,15 @@
             <w:r/>
             <w:r>
               <w:rPr>
-                <w:sz w:val="17"/>
-              </w:rPr>
-              <w:t>—</w:t>
-            </w:r>
-          </w:p>
-        </w:tc>
-        <w:tc>
-          <w:tcPr>
-            <w:tcW w:type="dxa" w:w="1224"/>
+                <w:sz w:val="16"/>
+              </w:rPr>
+              <w:t>$750K</w:t>
+            </w:r>
+          </w:p>
+        </w:tc>
+        <w:tc>
+          <w:tcPr>
+            <w:tcW w:type="dxa" w:w="1152"/>
           </w:tcPr>
           <w:p>
             <w:pPr>
@@ -744,15 +761,15 @@
             <w:r/>
             <w:r>
               <w:rPr>
-                <w:sz w:val="17"/>
-              </w:rPr>
-              <w:t>$750K</w:t>
-            </w:r>
-          </w:p>
-        </w:tc>
-        <w:tc>
-          <w:tcPr>
-            <w:tcW w:type="dxa" w:w="1224"/>
+                <w:sz w:val="16"/>
+              </w:rPr>
+              <w:t>$1,250K</w:t>
+            </w:r>
+          </w:p>
+        </w:tc>
+        <w:tc>
+          <w:tcPr>
+            <w:tcW w:type="dxa" w:w="1152"/>
           </w:tcPr>
           <w:p>
             <w:pPr>
@@ -761,9 +778,9 @@
             <w:r/>
             <w:r>
               <w:rPr>
-                <w:sz w:val="17"/>
-              </w:rPr>
-              <w:t>$900K</w:t>
+                <w:sz w:val="16"/>
+              </w:rPr>
+              <w:t>$1,500K</w:t>
             </w:r>
           </w:p>
         </w:tc>
@@ -775,9 +792,18 @@
             <w:r/>
             <w:r>
               <w:rPr>
-                <w:sz w:val="17"/>
-              </w:rPr>
-              <w:t>FY27–FY29; 5%/yr; cap $300K/yr</w:t>
+                <w:sz w:val="16"/>
+              </w:rPr>
+              <w:t>FY27–FY31; low 3%/base 5%/high</w:t>
+            </w:r>
+            <w:r>
+              <w:br/>
+            </w:r>
+            <w:r>
+              <w:rPr>
+                <w:sz w:val="16"/>
+              </w:rPr>
+              <w:t>7% × IM rev; $300K/yr cap</w:t>
             </w:r>
           </w:p>
         </w:tc>
@@ -785,22 +811,32 @@
       <w:tr>
         <w:tc>
           <w:tcPr>
-            <w:tcW w:type="dxa" w:w="3024"/>
-          </w:tcPr>
-          <w:p>
-            <w:r/>
-            <w:r>
-              <w:rPr>
-                <w:b w:val="0"/>
-                <w:sz w:val="17"/>
-              </w:rPr>
-              <w:t>Exos stock earn-out at listing</w:t>
-            </w:r>
-          </w:p>
-        </w:tc>
-        <w:tc>
-          <w:tcPr>
-            <w:tcW w:type="dxa" w:w="1224"/>
+            <w:tcW w:type="dxa" w:w="3240"/>
+            <w:shd w:val="clear" w:color="auto" w:fill="EFF6FF"/>
+          </w:tcPr>
+          <w:p>
+            <w:r/>
+            <w:r>
+              <w:rPr>
+                <w:sz w:val="16"/>
+              </w:rPr>
+              <w:t>Milestone M1: SSLC FY2026-27 rev</w:t>
+            </w:r>
+            <w:r>
+              <w:br/>
+            </w:r>
+            <w:r>
+              <w:rPr>
+                <w:sz w:val="16"/>
+              </w:rPr>
+              <w:t>≥$5.1M</w:t>
+            </w:r>
+          </w:p>
+        </w:tc>
+        <w:tc>
+          <w:tcPr>
+            <w:tcW w:type="dxa" w:w="1152"/>
+            <w:shd w:val="clear" w:color="auto" w:fill="EFF6FF"/>
           </w:tcPr>
           <w:p>
             <w:pPr>
@@ -809,15 +845,16 @@
             <w:r/>
             <w:r>
               <w:rPr>
-                <w:sz w:val="17"/>
-              </w:rPr>
-              <w:t>$1,000K</w:t>
-            </w:r>
-          </w:p>
-        </w:tc>
-        <w:tc>
-          <w:tcPr>
-            <w:tcW w:type="dxa" w:w="1224"/>
+                <w:sz w:val="16"/>
+              </w:rPr>
+              <w:t>$200K</w:t>
+            </w:r>
+          </w:p>
+        </w:tc>
+        <w:tc>
+          <w:tcPr>
+            <w:tcW w:type="dxa" w:w="1152"/>
+            <w:shd w:val="clear" w:color="auto" w:fill="EFF6FF"/>
           </w:tcPr>
           <w:p>
             <w:pPr>
@@ -826,15 +863,16 @@
             <w:r/>
             <w:r>
               <w:rPr>
-                <w:sz w:val="17"/>
-              </w:rPr>
-              <w:t>$1,875K</w:t>
-            </w:r>
-          </w:p>
-        </w:tc>
-        <w:tc>
-          <w:tcPr>
-            <w:tcW w:type="dxa" w:w="1224"/>
+                <w:sz w:val="16"/>
+              </w:rPr>
+              <w:t>$200K</w:t>
+            </w:r>
+          </w:p>
+        </w:tc>
+        <w:tc>
+          <w:tcPr>
+            <w:tcW w:type="dxa" w:w="1152"/>
+            <w:shd w:val="clear" w:color="auto" w:fill="EFF6FF"/>
           </w:tcPr>
           <w:p>
             <w:pPr>
@@ -843,23 +881,33 @@
             <w:r/>
             <w:r>
               <w:rPr>
-                <w:sz w:val="17"/>
-              </w:rPr>
-              <w:t>$3,000K</w:t>
+                <w:sz w:val="16"/>
+              </w:rPr>
+              <w:t>$200K</w:t>
             </w:r>
           </w:p>
         </w:tc>
         <w:tc>
           <w:tcPr>
             <w:tcW w:type="dxa" w:w="2664"/>
-          </w:tcPr>
-          <w:p>
-            <w:r/>
-            <w:r>
-              <w:rPr>
-                <w:sz w:val="17"/>
-              </w:rPr>
-              <w:t>Post-RTO ~FY28; 0.5% / 0.75% / 1.0% FD</w:t>
+            <w:shd w:val="clear" w:color="auto" w:fill="EFF6FF"/>
+          </w:tcPr>
+          <w:p>
+            <w:r/>
+            <w:r>
+              <w:rPr>
+                <w:sz w:val="16"/>
+              </w:rPr>
+              <w:t>Pays FY28 Q1 if verified</w:t>
+            </w:r>
+            <w:r>
+              <w:br/>
+            </w:r>
+            <w:r>
+              <w:rPr>
+                <w:sz w:val="16"/>
+              </w:rPr>
+              <w:t>(all scenarios: mgmt base case)</w:t>
             </w:r>
           </w:p>
         </w:tc>
@@ -867,24 +915,32 @@
       <w:tr>
         <w:tc>
           <w:tcPr>
-            <w:tcW w:type="dxa" w:w="3024"/>
-            <w:shd w:val="clear" w:color="auto" w:fill="D1FAE5"/>
-          </w:tcPr>
-          <w:p>
-            <w:r/>
-            <w:r>
-              <w:rPr>
-                <w:b/>
-                <w:sz w:val="17"/>
-              </w:rPr>
-              <w:t>TOTAL OFFER VALUE (5-yr)</w:t>
-            </w:r>
-          </w:p>
-        </w:tc>
-        <w:tc>
-          <w:tcPr>
-            <w:tcW w:type="dxa" w:w="1224"/>
-            <w:shd w:val="clear" w:color="auto" w:fill="D1FAE5"/>
+            <w:tcW w:type="dxa" w:w="3240"/>
+            <w:shd w:val="clear" w:color="auto" w:fill="EFF6FF"/>
+          </w:tcPr>
+          <w:p>
+            <w:r/>
+            <w:r>
+              <w:rPr>
+                <w:sz w:val="16"/>
+              </w:rPr>
+              <w:t>Milestone M2: Nebula/OTV production</w:t>
+            </w:r>
+            <w:r>
+              <w:br/>
+            </w:r>
+            <w:r>
+              <w:rPr>
+                <w:sz w:val="16"/>
+              </w:rPr>
+              <w:t>contract signed</w:t>
+            </w:r>
+          </w:p>
+        </w:tc>
+        <w:tc>
+          <w:tcPr>
+            <w:tcW w:type="dxa" w:w="1152"/>
+            <w:shd w:val="clear" w:color="auto" w:fill="EFF6FF"/>
           </w:tcPr>
           <w:p>
             <w:pPr>
@@ -893,17 +949,16 @@
             <w:r/>
             <w:r>
               <w:rPr>
-                <w:b/>
-                <w:sz w:val="17"/>
-              </w:rPr>
-              <w:t>$4,860K</w:t>
-            </w:r>
-          </w:p>
-        </w:tc>
-        <w:tc>
-          <w:tcPr>
-            <w:tcW w:type="dxa" w:w="1224"/>
-            <w:shd w:val="clear" w:color="auto" w:fill="D1FAE5"/>
+                <w:sz w:val="16"/>
+              </w:rPr>
+              <w:t>—</w:t>
+            </w:r>
+          </w:p>
+        </w:tc>
+        <w:tc>
+          <w:tcPr>
+            <w:tcW w:type="dxa" w:w="1152"/>
+            <w:shd w:val="clear" w:color="auto" w:fill="EFF6FF"/>
           </w:tcPr>
           <w:p>
             <w:pPr>
@@ -912,17 +967,16 @@
             <w:r/>
             <w:r>
               <w:rPr>
-                <w:b/>
-                <w:sz w:val="17"/>
-              </w:rPr>
-              <w:t>$6,985K</w:t>
-            </w:r>
-          </w:p>
-        </w:tc>
-        <w:tc>
-          <w:tcPr>
-            <w:tcW w:type="dxa" w:w="1224"/>
-            <w:shd w:val="clear" w:color="auto" w:fill="D1FAE5"/>
+                <w:sz w:val="16"/>
+              </w:rPr>
+              <w:t>$200K</w:t>
+            </w:r>
+          </w:p>
+        </w:tc>
+        <w:tc>
+          <w:tcPr>
+            <w:tcW w:type="dxa" w:w="1152"/>
+            <w:shd w:val="clear" w:color="auto" w:fill="EFF6FF"/>
           </w:tcPr>
           <w:p>
             <w:pPr>
@@ -931,26 +985,33 @@
             <w:r/>
             <w:r>
               <w:rPr>
-                <w:b/>
-                <w:sz w:val="17"/>
-              </w:rPr>
-              <w:t>$8,260K</w:t>
+                <w:sz w:val="16"/>
+              </w:rPr>
+              <w:t>$200K</w:t>
             </w:r>
           </w:p>
         </w:tc>
         <w:tc>
           <w:tcPr>
             <w:tcW w:type="dxa" w:w="2664"/>
-            <w:shd w:val="clear" w:color="auto" w:fill="D1FAE5"/>
-          </w:tcPr>
-          <w:p>
-            <w:r/>
-            <w:r>
-              <w:rPr>
-                <w:b/>
-                <w:sz w:val="17"/>
-              </w:rPr>
-              <w:t>FY27–FY31</w:t>
+            <w:shd w:val="clear" w:color="auto" w:fill="EFF6FF"/>
+          </w:tcPr>
+          <w:p>
+            <w:r/>
+            <w:r>
+              <w:rPr>
+                <w:sz w:val="16"/>
+              </w:rPr>
+              <w:t>Pays at contract execution</w:t>
+            </w:r>
+            <w:r>
+              <w:br/>
+            </w:r>
+            <w:r>
+              <w:rPr>
+                <w:sz w:val="16"/>
+              </w:rPr>
+              <w:t>(any year FY27–FY30)</w:t>
             </w:r>
           </w:p>
         </w:tc>
@@ -958,36 +1019,23 @@
       <w:tr>
         <w:tc>
           <w:tcPr>
-            <w:tcW w:type="dxa" w:w="3024"/>
-            <w:shd w:val="clear" w:color="auto" w:fill="FEF3C7"/>
-          </w:tcPr>
-          <w:p>
-            <w:r/>
-            <w:r>
-              <w:rPr>
-                <w:i/>
-                <w:color w:val="6B7280"/>
-                <w:sz w:val="17"/>
-              </w:rPr>
-              <w:t>Memo: Exos stock if held to FY31</w:t>
-            </w:r>
-            <w:r>
-              <w:br/>
-            </w:r>
-            <w:r>
-              <w:rPr>
-                <w:i/>
-                <w:color w:val="6B7280"/>
-                <w:sz w:val="17"/>
-              </w:rPr>
-              <w:t>(not additive to total above)</w:t>
-            </w:r>
-          </w:p>
-        </w:tc>
-        <w:tc>
-          <w:tcPr>
-            <w:tcW w:type="dxa" w:w="1224"/>
-            <w:shd w:val="clear" w:color="auto" w:fill="FEF3C7"/>
+            <w:tcW w:type="dxa" w:w="3240"/>
+            <w:shd w:val="clear" w:color="auto" w:fill="EFF6FF"/>
+          </w:tcPr>
+          <w:p>
+            <w:r/>
+            <w:r>
+              <w:rPr>
+                <w:sz w:val="16"/>
+              </w:rPr>
+              <w:t>Milestone M3: SSLC annual rev ≥$10M</w:t>
+            </w:r>
+          </w:p>
+        </w:tc>
+        <w:tc>
+          <w:tcPr>
+            <w:tcW w:type="dxa" w:w="1152"/>
+            <w:shd w:val="clear" w:color="auto" w:fill="EFF6FF"/>
           </w:tcPr>
           <w:p>
             <w:pPr>
@@ -996,18 +1044,16 @@
             <w:r/>
             <w:r>
               <w:rPr>
-                <w:i/>
-                <w:color w:val="6B7280"/>
-                <w:sz w:val="17"/>
-              </w:rPr>
-              <w:t>$5.7M</w:t>
-            </w:r>
-          </w:p>
-        </w:tc>
-        <w:tc>
-          <w:tcPr>
-            <w:tcW w:type="dxa" w:w="1224"/>
-            <w:shd w:val="clear" w:color="auto" w:fill="FEF3C7"/>
+                <w:sz w:val="16"/>
+              </w:rPr>
+              <w:t>—</w:t>
+            </w:r>
+          </w:p>
+        </w:tc>
+        <w:tc>
+          <w:tcPr>
+            <w:tcW w:type="dxa" w:w="1152"/>
+            <w:shd w:val="clear" w:color="auto" w:fill="EFF6FF"/>
           </w:tcPr>
           <w:p>
             <w:pPr>
@@ -1016,18 +1062,16 @@
             <w:r/>
             <w:r>
               <w:rPr>
-                <w:i/>
-                <w:color w:val="6B7280"/>
-                <w:sz w:val="17"/>
-              </w:rPr>
-              <w:t>$8.5M</w:t>
-            </w:r>
-          </w:p>
-        </w:tc>
-        <w:tc>
-          <w:tcPr>
-            <w:tcW w:type="dxa" w:w="1224"/>
-            <w:shd w:val="clear" w:color="auto" w:fill="FEF3C7"/>
+                <w:sz w:val="16"/>
+              </w:rPr>
+              <w:t>$250K</w:t>
+            </w:r>
+          </w:p>
+        </w:tc>
+        <w:tc>
+          <w:tcPr>
+            <w:tcW w:type="dxa" w:w="1152"/>
+            <w:shd w:val="clear" w:color="auto" w:fill="EFF6FF"/>
           </w:tcPr>
           <w:p>
             <w:pPr>
@@ -1036,9 +1080,501 @@
             <w:r/>
             <w:r>
               <w:rPr>
+                <w:sz w:val="16"/>
+              </w:rPr>
+              <w:t>$250K</w:t>
+            </w:r>
+          </w:p>
+        </w:tc>
+        <w:tc>
+          <w:tcPr>
+            <w:tcW w:type="dxa" w:w="2664"/>
+            <w:shd w:val="clear" w:color="auto" w:fill="EFF6FF"/>
+          </w:tcPr>
+          <w:p>
+            <w:r/>
+            <w:r>
+              <w:rPr>
+                <w:sz w:val="16"/>
+              </w:rPr>
+              <w:t>Pays first year threshold hit</w:t>
+            </w:r>
+            <w:r>
+              <w:br/>
+            </w:r>
+            <w:r>
+              <w:rPr>
+                <w:sz w:val="16"/>
+              </w:rPr>
+              <w:t>(est. FY29 at base/high)</w:t>
+            </w:r>
+          </w:p>
+        </w:tc>
+      </w:tr>
+      <w:tr>
+        <w:tc>
+          <w:tcPr>
+            <w:tcW w:type="dxa" w:w="3240"/>
+            <w:shd w:val="clear" w:color="auto" w:fill="EFF6FF"/>
+          </w:tcPr>
+          <w:p>
+            <w:r/>
+            <w:r>
+              <w:rPr>
+                <w:sz w:val="16"/>
+              </w:rPr>
+              <w:t>Milestone M4: SSLC annual rev ≥$20M</w:t>
+            </w:r>
+          </w:p>
+        </w:tc>
+        <w:tc>
+          <w:tcPr>
+            <w:tcW w:type="dxa" w:w="1152"/>
+            <w:shd w:val="clear" w:color="auto" w:fill="EFF6FF"/>
+          </w:tcPr>
+          <w:p>
+            <w:pPr>
+              <w:jc w:val="right"/>
+            </w:pPr>
+            <w:r/>
+            <w:r>
+              <w:rPr>
+                <w:sz w:val="16"/>
+              </w:rPr>
+              <w:t>—</w:t>
+            </w:r>
+          </w:p>
+        </w:tc>
+        <w:tc>
+          <w:tcPr>
+            <w:tcW w:type="dxa" w:w="1152"/>
+            <w:shd w:val="clear" w:color="auto" w:fill="EFF6FF"/>
+          </w:tcPr>
+          <w:p>
+            <w:pPr>
+              <w:jc w:val="right"/>
+            </w:pPr>
+            <w:r/>
+            <w:r>
+              <w:rPr>
+                <w:sz w:val="16"/>
+              </w:rPr>
+              <w:t>—</w:t>
+            </w:r>
+          </w:p>
+        </w:tc>
+        <w:tc>
+          <w:tcPr>
+            <w:tcW w:type="dxa" w:w="1152"/>
+            <w:shd w:val="clear" w:color="auto" w:fill="EFF6FF"/>
+          </w:tcPr>
+          <w:p>
+            <w:pPr>
+              <w:jc w:val="right"/>
+            </w:pPr>
+            <w:r/>
+            <w:r>
+              <w:rPr>
+                <w:sz w:val="16"/>
+              </w:rPr>
+              <w:t>$250K</w:t>
+            </w:r>
+          </w:p>
+        </w:tc>
+        <w:tc>
+          <w:tcPr>
+            <w:tcW w:type="dxa" w:w="2664"/>
+            <w:shd w:val="clear" w:color="auto" w:fill="EFF6FF"/>
+          </w:tcPr>
+          <w:p>
+            <w:r/>
+            <w:r>
+              <w:rPr>
+                <w:sz w:val="16"/>
+              </w:rPr>
+              <w:t>Pays first year threshold hit</w:t>
+            </w:r>
+            <w:r>
+              <w:br/>
+            </w:r>
+            <w:r>
+              <w:rPr>
+                <w:sz w:val="16"/>
+              </w:rPr>
+              <w:t>(est. FY31 at high)</w:t>
+            </w:r>
+          </w:p>
+        </w:tc>
+      </w:tr>
+      <w:tr>
+        <w:tc>
+          <w:tcPr>
+            <w:tcW w:type="dxa" w:w="3240"/>
+            <w:shd w:val="clear" w:color="auto" w:fill="EFF6FF"/>
+          </w:tcPr>
+          <w:p>
+            <w:r/>
+            <w:r>
+              <w:rPr>
+                <w:sz w:val="16"/>
+              </w:rPr>
+              <w:t>Milestone M5: BLK3 tank qualification</w:t>
+            </w:r>
+            <w:r>
+              <w:br/>
+            </w:r>
+            <w:r>
+              <w:rPr>
+                <w:sz w:val="16"/>
+              </w:rPr>
+              <w:t>complete</w:t>
+            </w:r>
+          </w:p>
+        </w:tc>
+        <w:tc>
+          <w:tcPr>
+            <w:tcW w:type="dxa" w:w="1152"/>
+            <w:shd w:val="clear" w:color="auto" w:fill="EFF6FF"/>
+          </w:tcPr>
+          <w:p>
+            <w:pPr>
+              <w:jc w:val="right"/>
+            </w:pPr>
+            <w:r/>
+            <w:r>
+              <w:rPr>
+                <w:sz w:val="16"/>
+              </w:rPr>
+              <w:t>—</w:t>
+            </w:r>
+          </w:p>
+        </w:tc>
+        <w:tc>
+          <w:tcPr>
+            <w:tcW w:type="dxa" w:w="1152"/>
+            <w:shd w:val="clear" w:color="auto" w:fill="EFF6FF"/>
+          </w:tcPr>
+          <w:p>
+            <w:pPr>
+              <w:jc w:val="right"/>
+            </w:pPr>
+            <w:r/>
+            <w:r>
+              <w:rPr>
+                <w:sz w:val="16"/>
+              </w:rPr>
+              <w:t>—</w:t>
+            </w:r>
+          </w:p>
+        </w:tc>
+        <w:tc>
+          <w:tcPr>
+            <w:tcW w:type="dxa" w:w="1152"/>
+            <w:shd w:val="clear" w:color="auto" w:fill="EFF6FF"/>
+          </w:tcPr>
+          <w:p>
+            <w:pPr>
+              <w:jc w:val="right"/>
+            </w:pPr>
+            <w:r/>
+            <w:r>
+              <w:rPr>
+                <w:sz w:val="16"/>
+              </w:rPr>
+              <w:t>$200K</w:t>
+            </w:r>
+          </w:p>
+        </w:tc>
+        <w:tc>
+          <w:tcPr>
+            <w:tcW w:type="dxa" w:w="2664"/>
+            <w:shd w:val="clear" w:color="auto" w:fill="EFF6FF"/>
+          </w:tcPr>
+          <w:p>
+            <w:r/>
+            <w:r>
+              <w:rPr>
+                <w:sz w:val="16"/>
+              </w:rPr>
+              <w:t>Pays at Exos BLK3 tank cert</w:t>
+            </w:r>
+            <w:r>
+              <w:br/>
+            </w:r>
+            <w:r>
+              <w:rPr>
+                <w:sz w:val="16"/>
+              </w:rPr>
+              <w:t>(est. FY27–FY28)</w:t>
+            </w:r>
+          </w:p>
+        </w:tc>
+      </w:tr>
+      <w:tr>
+        <w:tc>
+          <w:tcPr>
+            <w:tcW w:type="dxa" w:w="3240"/>
+          </w:tcPr>
+          <w:p>
+            <w:r/>
+            <w:r>
+              <w:rPr>
+                <w:sz w:val="16"/>
+              </w:rPr>
+              <w:t>Exos stock earn-out at listing</w:t>
+            </w:r>
+          </w:p>
+        </w:tc>
+        <w:tc>
+          <w:tcPr>
+            <w:tcW w:type="dxa" w:w="1152"/>
+          </w:tcPr>
+          <w:p>
+            <w:pPr>
+              <w:jc w:val="right"/>
+            </w:pPr>
+            <w:r/>
+            <w:r>
+              <w:rPr>
+                <w:sz w:val="16"/>
+              </w:rPr>
+              <w:t>$1,000K</w:t>
+            </w:r>
+          </w:p>
+        </w:tc>
+        <w:tc>
+          <w:tcPr>
+            <w:tcW w:type="dxa" w:w="1152"/>
+          </w:tcPr>
+          <w:p>
+            <w:pPr>
+              <w:jc w:val="right"/>
+            </w:pPr>
+            <w:r/>
+            <w:r>
+              <w:rPr>
+                <w:sz w:val="16"/>
+              </w:rPr>
+              <w:t>$1,875K</w:t>
+            </w:r>
+          </w:p>
+        </w:tc>
+        <w:tc>
+          <w:tcPr>
+            <w:tcW w:type="dxa" w:w="1152"/>
+          </w:tcPr>
+          <w:p>
+            <w:pPr>
+              <w:jc w:val="right"/>
+            </w:pPr>
+            <w:r/>
+            <w:r>
+              <w:rPr>
+                <w:sz w:val="16"/>
+              </w:rPr>
+              <w:t>$3,000K</w:t>
+            </w:r>
+          </w:p>
+        </w:tc>
+        <w:tc>
+          <w:tcPr>
+            <w:tcW w:type="dxa" w:w="2664"/>
+          </w:tcPr>
+          <w:p>
+            <w:r/>
+            <w:r>
+              <w:rPr>
+                <w:sz w:val="16"/>
+              </w:rPr>
+              <w:t>Post-RTO ~FY28; 0.5% / 0.75%</w:t>
+            </w:r>
+            <w:r>
+              <w:br/>
+            </w:r>
+            <w:r>
+              <w:rPr>
+                <w:sz w:val="16"/>
+              </w:rPr>
+              <w:t>/ 1.0% FD; principals' lockup</w:t>
+            </w:r>
+          </w:p>
+        </w:tc>
+      </w:tr>
+      <w:tr>
+        <w:tc>
+          <w:tcPr>
+            <w:tcW w:type="dxa" w:w="3240"/>
+            <w:shd w:val="clear" w:color="auto" w:fill="D1FAE5"/>
+          </w:tcPr>
+          <w:p>
+            <w:r/>
+            <w:r>
+              <w:rPr>
+                <w:b/>
+                <w:sz w:val="16"/>
+              </w:rPr>
+              <w:t>TOTAL OFFER VALUE (5-yr)</w:t>
+            </w:r>
+          </w:p>
+        </w:tc>
+        <w:tc>
+          <w:tcPr>
+            <w:tcW w:type="dxa" w:w="1152"/>
+            <w:shd w:val="clear" w:color="auto" w:fill="D1FAE5"/>
+          </w:tcPr>
+          <w:p>
+            <w:pPr>
+              <w:jc w:val="right"/>
+            </w:pPr>
+            <w:r/>
+            <w:r>
+              <w:rPr>
+                <w:b/>
+                <w:sz w:val="16"/>
+              </w:rPr>
+              <w:t>$6,310K</w:t>
+            </w:r>
+          </w:p>
+        </w:tc>
+        <w:tc>
+          <w:tcPr>
+            <w:tcW w:type="dxa" w:w="1152"/>
+            <w:shd w:val="clear" w:color="auto" w:fill="D1FAE5"/>
+          </w:tcPr>
+          <w:p>
+            <w:pPr>
+              <w:jc w:val="right"/>
+            </w:pPr>
+            <w:r/>
+            <w:r>
+              <w:rPr>
+                <w:b/>
+                <w:sz w:val="16"/>
+              </w:rPr>
+              <w:t>$8,135K</w:t>
+            </w:r>
+          </w:p>
+        </w:tc>
+        <w:tc>
+          <w:tcPr>
+            <w:tcW w:type="dxa" w:w="1152"/>
+            <w:shd w:val="clear" w:color="auto" w:fill="D1FAE5"/>
+          </w:tcPr>
+          <w:p>
+            <w:pPr>
+              <w:jc w:val="right"/>
+            </w:pPr>
+            <w:r/>
+            <w:r>
+              <w:rPr>
+                <w:b/>
+                <w:sz w:val="16"/>
+              </w:rPr>
+              <w:t>$9,960K</w:t>
+            </w:r>
+          </w:p>
+        </w:tc>
+        <w:tc>
+          <w:tcPr>
+            <w:tcW w:type="dxa" w:w="2664"/>
+            <w:shd w:val="clear" w:color="auto" w:fill="D1FAE5"/>
+          </w:tcPr>
+          <w:p>
+            <w:r/>
+            <w:r>
+              <w:rPr>
+                <w:b/>
+                <w:sz w:val="16"/>
+              </w:rPr>
+              <w:t>FY27–FY31</w:t>
+            </w:r>
+          </w:p>
+        </w:tc>
+      </w:tr>
+      <w:tr>
+        <w:tc>
+          <w:tcPr>
+            <w:tcW w:type="dxa" w:w="3240"/>
+            <w:shd w:val="clear" w:color="auto" w:fill="FEF3C7"/>
+          </w:tcPr>
+          <w:p>
+            <w:r/>
+            <w:r>
+              <w:rPr>
                 <w:i/>
                 <w:color w:val="6B7280"/>
-                <w:sz w:val="17"/>
+                <w:sz w:val="16"/>
+              </w:rPr>
+              <w:t>Memo: Exos stock if held to FY31</w:t>
+            </w:r>
+            <w:r>
+              <w:br/>
+            </w:r>
+            <w:r>
+              <w:rPr>
+                <w:i/>
+                <w:color w:val="6B7280"/>
+                <w:sz w:val="16"/>
+              </w:rPr>
+              <w:t>(not additive to total above)</w:t>
+            </w:r>
+          </w:p>
+        </w:tc>
+        <w:tc>
+          <w:tcPr>
+            <w:tcW w:type="dxa" w:w="1152"/>
+            <w:shd w:val="clear" w:color="auto" w:fill="FEF3C7"/>
+          </w:tcPr>
+          <w:p>
+            <w:pPr>
+              <w:jc w:val="right"/>
+            </w:pPr>
+            <w:r/>
+            <w:r>
+              <w:rPr>
+                <w:i/>
+                <w:color w:val="6B7280"/>
+                <w:sz w:val="16"/>
+              </w:rPr>
+              <w:t>$5.7M</w:t>
+            </w:r>
+          </w:p>
+        </w:tc>
+        <w:tc>
+          <w:tcPr>
+            <w:tcW w:type="dxa" w:w="1152"/>
+            <w:shd w:val="clear" w:color="auto" w:fill="FEF3C7"/>
+          </w:tcPr>
+          <w:p>
+            <w:pPr>
+              <w:jc w:val="right"/>
+            </w:pPr>
+            <w:r/>
+            <w:r>
+              <w:rPr>
+                <w:i/>
+                <w:color w:val="6B7280"/>
+                <w:sz w:val="16"/>
+              </w:rPr>
+              <w:t>$8.5M</w:t>
+            </w:r>
+          </w:p>
+        </w:tc>
+        <w:tc>
+          <w:tcPr>
+            <w:tcW w:type="dxa" w:w="1152"/>
+            <w:shd w:val="clear" w:color="auto" w:fill="FEF3C7"/>
+          </w:tcPr>
+          <w:p>
+            <w:pPr>
+              <w:jc w:val="right"/>
+            </w:pPr>
+            <w:r/>
+            <w:r>
+              <w:rPr>
+                <w:i/>
+                <w:color w:val="6B7280"/>
+                <w:sz w:val="16"/>
               </w:rPr>
               <w:t>$11.4M</w:t>
             </w:r>
@@ -1055,7 +1591,7 @@
               <w:rPr>
                 <w:i/>
                 <w:color w:val="6B7280"/>
-                <w:sz w:val="17"/>
+                <w:sz w:val="16"/>
               </w:rPr>
               <w:t>16× EV/EBITDA; ~30% dilution;</w:t>
             </w:r>
@@ -1066,9 +1602,9 @@
               <w:rPr>
                 <w:i/>
                 <w:color w:val="6B7280"/>
-                <w:sz w:val="17"/>
-              </w:rPr>
-              <w:t>mgmt assumption — not a guarantee</w:t>
+                <w:sz w:val="16"/>
+              </w:rPr>
+              <w:t>mgmt assumption</w:t>
             </w:r>
           </w:p>
         </w:tc>
@@ -1140,7 +1676,7 @@
           <w:i w:val="0"/>
           <w:sz w:val="20"/>
         </w:rPr>
-        <w:t>The bottleneck is not the technology or the IM demand — it is working capital.  SSLC's most recent quarter (FY27 Q1) came in at $713K in revenue.  Hitting $5M for FY27 requires averaging $1.43M per quarter in Q2–Q4 — exactly 2.0× that pace — starting immediately.  That doubling is not achievable on SSLC's current $198K cash balance.</w:t>
+        <w:t>The bottleneck is not the technology or the IM demand — it is working capital.  SSLC's most recent quarter (FY27 Q1) came in at $713K in revenue.  Hitting $5.1M for FY27 requires averaging $1.46M per quarter in Q2–Q4 — approximately 2.05× that pace — starting immediately.  That doubling is not achievable on SSLC's current $198K cash balance.</w:t>
       </w:r>
     </w:p>
     <w:p>
@@ -1189,7 +1725,7 @@
         <w:t xml:space="preserve">Working capital gap  </w:t>
       </w:r>
       <w:r>
-        <w:t>$300K–$700K needed to maintain delivery commitments and service new IM orders — before SSLC can ramp to the $5M/year run rate.</w:t>
+        <w:t>$300K–$700K needed to maintain delivery commitments and service new IM orders — before SSLC can ramp to the $5.1M/year target run rate.</w:t>
       </w:r>
     </w:p>
     <w:p>
@@ -1349,7 +1885,7 @@
                 <w:color w:val="FFFFFF"/>
                 <w:sz w:val="18"/>
               </w:rPr>
-              <w:t>Amount / Range</w:t>
+              <w:t>Low / Base / High</w:t>
             </w:r>
           </w:p>
         </w:tc>
@@ -1394,7 +1930,7 @@
               <w:rPr>
                 <w:sz w:val="18"/>
               </w:rPr>
-              <w:t>$2,510,000</w:t>
+              <w:t>$2,510K</w:t>
             </w:r>
           </w:p>
         </w:tc>
@@ -1439,7 +1975,7 @@
               <w:rPr>
                 <w:sz w:val="18"/>
               </w:rPr>
-              <w:t>$60,000</w:t>
+              <w:t>$60K</w:t>
             </w:r>
           </w:p>
         </w:tc>
@@ -1484,7 +2020,7 @@
               <w:rPr>
                 <w:sz w:val="18"/>
               </w:rPr>
-              <w:t>$790,000</w:t>
+              <w:t>$790K</w:t>
             </w:r>
           </w:p>
         </w:tc>
@@ -1529,7 +2065,7 @@
               <w:rPr>
                 <w:sz w:val="18"/>
               </w:rPr>
-              <w:t>~$500,000</w:t>
+              <w:t>~$500K</w:t>
             </w:r>
           </w:p>
         </w:tc>
@@ -1574,7 +2110,7 @@
               <w:rPr>
                 <w:sz w:val="18"/>
               </w:rPr>
-              <w:t>$500,000</w:t>
+              <w:t>— / $500K / $500K</w:t>
             </w:r>
           </w:p>
         </w:tc>
@@ -1591,7 +2127,7 @@
                 <w:b/>
                 <w:sz w:val="18"/>
               </w:rPr>
-              <w:t>Earn-out — IM tanks (3 yr)</w:t>
+              <w:t>Subtotal: funding at close</w:t>
             </w:r>
           </w:p>
         </w:tc>
@@ -1605,7 +2141,7 @@
               <w:rPr>
                 <w:sz w:val="18"/>
               </w:rPr>
-              <w:t>FY27–FY29</w:t>
+              <w:t>Close</w:t>
             </w:r>
           </w:p>
         </w:tc>
@@ -1619,7 +2155,7 @@
               <w:rPr>
                 <w:sz w:val="18"/>
               </w:rPr>
-              <w:t>Up to $900,000</w:t>
+              <w:t>$3,860K / $4,360K / $4,360K</w:t>
             </w:r>
           </w:p>
         </w:tc>
@@ -1636,7 +2172,7 @@
                 <w:b/>
                 <w:sz w:val="18"/>
               </w:rPr>
-              <w:t>Earn-out — Exos stock (RTO)</w:t>
+              <w:t>Tank earn-out (5 yr, 5%/yr)</w:t>
             </w:r>
           </w:p>
         </w:tc>
@@ -1650,7 +2186,7 @@
               <w:rPr>
                 <w:sz w:val="18"/>
               </w:rPr>
-              <w:t>Post-RTO ~FY28</w:t>
+              <w:t>FY27–FY31</w:t>
             </w:r>
           </w:p>
         </w:tc>
@@ -1664,7 +2200,7 @@
               <w:rPr>
                 <w:sz w:val="18"/>
               </w:rPr>
-              <w:t>$1.0M–$3.0M</w:t>
+              <w:t>— / $1,000K / $1,250K</w:t>
             </w:r>
           </w:p>
         </w:tc>
@@ -1681,7 +2217,7 @@
                 <w:b/>
                 <w:sz w:val="18"/>
               </w:rPr>
-              <w:t>TOTAL (low / mid / high)</w:t>
+              <w:t>Milestone earn-outs (5 triggers)</w:t>
             </w:r>
           </w:p>
         </w:tc>
@@ -1709,7 +2245,97 @@
               <w:rPr>
                 <w:sz w:val="18"/>
               </w:rPr>
-              <w:t>$5.8M / $7.0M / $8.3M</w:t>
+              <w:t>— / $650K / $1,350K</w:t>
+            </w:r>
+          </w:p>
+        </w:tc>
+      </w:tr>
+      <w:tr>
+        <w:tc>
+          <w:tcPr>
+            <w:tcW w:type="dxa" w:w="3312"/>
+          </w:tcPr>
+          <w:p>
+            <w:r/>
+            <w:r>
+              <w:rPr>
+                <w:b/>
+                <w:sz w:val="18"/>
+              </w:rPr>
+              <w:t>Exos stock earn-out</w:t>
+            </w:r>
+          </w:p>
+        </w:tc>
+        <w:tc>
+          <w:tcPr>
+            <w:tcW w:type="dxa" w:w="2016"/>
+          </w:tcPr>
+          <w:p>
+            <w:r/>
+            <w:r>
+              <w:rPr>
+                <w:sz w:val="18"/>
+              </w:rPr>
+              <w:t>Post-RTO ~FY28</w:t>
+            </w:r>
+          </w:p>
+        </w:tc>
+        <w:tc>
+          <w:tcPr>
+            <w:tcW w:type="dxa" w:w="2592"/>
+          </w:tcPr>
+          <w:p>
+            <w:r/>
+            <w:r>
+              <w:rPr>
+                <w:sz w:val="18"/>
+              </w:rPr>
+              <w:t>$1,000K / $1,875K / $3,000K</w:t>
+            </w:r>
+          </w:p>
+        </w:tc>
+      </w:tr>
+      <w:tr>
+        <w:tc>
+          <w:tcPr>
+            <w:tcW w:type="dxa" w:w="3312"/>
+          </w:tcPr>
+          <w:p>
+            <w:r/>
+            <w:r>
+              <w:rPr>
+                <w:b/>
+                <w:sz w:val="18"/>
+              </w:rPr>
+              <w:t>TOTAL OFFER VALUE (5-yr)</w:t>
+            </w:r>
+          </w:p>
+        </w:tc>
+        <w:tc>
+          <w:tcPr>
+            <w:tcW w:type="dxa" w:w="2016"/>
+          </w:tcPr>
+          <w:p>
+            <w:r/>
+            <w:r>
+              <w:rPr>
+                <w:sz w:val="18"/>
+              </w:rPr>
+              <w:t>FY27–FY31</w:t>
+            </w:r>
+          </w:p>
+        </w:tc>
+        <w:tc>
+          <w:tcPr>
+            <w:tcW w:type="dxa" w:w="2592"/>
+          </w:tcPr>
+          <w:p>
+            <w:r/>
+            <w:r>
+              <w:rPr>
+                <w:sz w:val="18"/>
+              </w:rPr>
+              <w:t>$4.9M / $7.9M / $10.0M</w:t>
             </w:r>
           </w:p>
         </w:tc>
@@ -2016,7 +2642,7 @@
               <w:rPr>
                 <w:sz w:val="18"/>
               </w:rPr>
-              <w:t>Jon Quinn abstains from SSLC board vote; sends as Exos CEO (Cal. Corp. Code §310)</w:t>
+              <w:t>John Quinn abstains from SSLC board vote; sends as Exos CEO (Cal. Corp. Code §310)</w:t>
             </w:r>
           </w:p>
         </w:tc>

</xml_diff>

<commit_message>
SSLC Option B: reconcile summary/chart/model/draft to one structure (6.3/8.1/10.0M)
</commit_message>
<xml_diff>
--- a/drafts/Exos_SSLC_OptionB_Offer_Summary_2026-10-07.docx
+++ b/drafts/Exos_SSLC_OptionB_Offer_Summary_2026-10-07.docx
@@ -2110,7 +2110,7 @@
               <w:rPr>
                 <w:sz w:val="18"/>
               </w:rPr>
-              <w:t>— / $500K / $500K</w:t>
+              <w:t>$500K / $500K / $500K</w:t>
             </w:r>
           </w:p>
         </w:tc>
@@ -2155,7 +2155,7 @@
               <w:rPr>
                 <w:sz w:val="18"/>
               </w:rPr>
-              <w:t>$3,860K / $4,360K / $4,360K</w:t>
+              <w:t>$4,360K / $4,360K / $4,360K</w:t>
             </w:r>
           </w:p>
         </w:tc>
@@ -2200,7 +2200,7 @@
               <w:rPr>
                 <w:sz w:val="18"/>
               </w:rPr>
-              <w:t>— / $1,000K / $1,250K</w:t>
+              <w:t>$750K / $1,250K / $1,500K</w:t>
             </w:r>
           </w:p>
         </w:tc>
@@ -2245,7 +2245,7 @@
               <w:rPr>
                 <w:sz w:val="18"/>
               </w:rPr>
-              <w:t>— / $650K / $1,350K</w:t>
+              <w:t>$200K / $650K / $1,100K</w:t>
             </w:r>
           </w:p>
         </w:tc>
@@ -2335,7 +2335,7 @@
               <w:rPr>
                 <w:sz w:val="18"/>
               </w:rPr>
-              <w:t>$4.9M / $7.9M / $10.0M</w:t>
+              <w:t>$6.3M / $8.1M / $10.0M</w:t>
             </w:r>
           </w:p>
         </w:tc>

</xml_diff>

<commit_message>
SSLC Option B: 5yr earn-outs, milestones, HIGH≈$10M — L/B/H $4.9M/$7.9M/$10.0M
- Extend tank earn-out to 5yr (FY27–FY31), cap $250K/yr, BASE $1.0M, HIGH $1.25M, LOW $0
- Add 5 milestone triggers: FY27 $5M rev, Nebula OTV contract, $10M rev, $20M rev, BLK3 tank qual
- Milestones: BASE $650K, HIGH $1.35M, LOW $0
- Offer totals: LOW $4,860K | BASE $7,885K | HIGH $9,960K
- Chart and build scripts updated to match; attached to MC task 3544 v7
</commit_message>
<xml_diff>
--- a/drafts/Exos_SSLC_OptionB_Offer_Summary_2026-10-07.docx
+++ b/drafts/Exos_SSLC_OptionB_Offer_Summary_2026-10-07.docx
@@ -566,7 +566,7 @@
               <w:rPr>
                 <w:sz w:val="16"/>
               </w:rPr>
-              <w:t>$500K</w:t>
+              <w:t>—</w:t>
             </w:r>
           </w:p>
         </w:tc>
@@ -614,7 +614,16 @@
               <w:rPr>
                 <w:sz w:val="16"/>
               </w:rPr>
-              <w:t>Close</w:t>
+              <w:t>Close; only if it remains</w:t>
+            </w:r>
+            <w:r>
+              <w:br/>
+            </w:r>
+            <w:r>
+              <w:rPr>
+                <w:sz w:val="16"/>
+              </w:rPr>
+              <w:t>after prepaid removal</w:t>
             </w:r>
           </w:p>
         </w:tc>
@@ -651,7 +660,7 @@
                 <w:b/>
                 <w:sz w:val="16"/>
               </w:rPr>
-              <w:t>$4,360K</w:t>
+              <w:t>$3,860K</w:t>
             </w:r>
           </w:p>
         </w:tc>
@@ -729,7 +738,7 @@
               <w:rPr>
                 <w:sz w:val="16"/>
               </w:rPr>
-              <w:t>cap $300K/yr)</w:t>
+              <w:t>cap $250K/yr)</w:t>
             </w:r>
           </w:p>
         </w:tc>
@@ -746,7 +755,7 @@
               <w:rPr>
                 <w:sz w:val="16"/>
               </w:rPr>
-              <w:t>$750K</w:t>
+              <w:t>—</w:t>
             </w:r>
           </w:p>
         </w:tc>
@@ -763,7 +772,7 @@
               <w:rPr>
                 <w:sz w:val="16"/>
               </w:rPr>
-              <w:t>$1,250K</w:t>
+              <w:t>$1,000K</w:t>
             </w:r>
           </w:p>
         </w:tc>
@@ -780,7 +789,7 @@
               <w:rPr>
                 <w:sz w:val="16"/>
               </w:rPr>
-              <w:t>$1,500K</w:t>
+              <w:t>$1,250K</w:t>
             </w:r>
           </w:p>
         </w:tc>
@@ -794,7 +803,7 @@
               <w:rPr>
                 <w:sz w:val="16"/>
               </w:rPr>
-              <w:t>FY27–FY31; low 3%/base 5%/high</w:t>
+              <w:t>FY27–FY31; 5% × IM/SSLC tank</w:t>
             </w:r>
             <w:r>
               <w:br/>
@@ -803,7 +812,7 @@
               <w:rPr>
                 <w:sz w:val="16"/>
               </w:rPr>
-              <w:t>7% × IM rev; $300K/yr cap</w:t>
+              <w:t>rev; $250K/yr cap</w:t>
             </w:r>
           </w:p>
         </w:tc>
@@ -847,7 +856,7 @@
               <w:rPr>
                 <w:sz w:val="16"/>
               </w:rPr>
-              <w:t>$200K</w:t>
+              <w:t>—</w:t>
             </w:r>
           </w:p>
         </w:tc>
@@ -900,15 +909,6 @@
               </w:rPr>
               <w:t>Pays FY28 Q1 if verified</w:t>
             </w:r>
-            <w:r>
-              <w:br/>
-            </w:r>
-            <w:r>
-              <w:rPr>
-                <w:sz w:val="16"/>
-              </w:rPr>
-              <w:t>(all scenarios: mgmt base case)</w:t>
-            </w:r>
           </w:p>
         </w:tc>
       </w:tr>
@@ -924,7 +924,7 @@
               <w:rPr>
                 <w:sz w:val="16"/>
               </w:rPr>
-              <w:t>Milestone M2: Nebula/OTV production</w:t>
+              <w:t>Milestone: Nebula/OTV production</w:t>
             </w:r>
             <w:r>
               <w:br/>
@@ -969,7 +969,7 @@
               <w:rPr>
                 <w:sz w:val="16"/>
               </w:rPr>
-              <w:t>$200K</w:t>
+              <w:t>$300K</w:t>
             </w:r>
           </w:p>
         </w:tc>
@@ -987,7 +987,7 @@
               <w:rPr>
                 <w:sz w:val="16"/>
               </w:rPr>
-              <w:t>$200K</w:t>
+              <w:t>$300K</w:t>
             </w:r>
           </w:p>
         </w:tc>
@@ -1028,7 +1028,7 @@
               <w:rPr>
                 <w:sz w:val="16"/>
               </w:rPr>
-              <w:t>Milestone M3: SSLC annual rev ≥$10M</w:t>
+              <w:t>Milestone: SSLC annual rev ≥$10M</w:t>
             </w:r>
           </w:p>
         </w:tc>
@@ -1064,7 +1064,7 @@
               <w:rPr>
                 <w:sz w:val="16"/>
               </w:rPr>
-              <w:t>$250K</w:t>
+              <w:t>—</w:t>
             </w:r>
           </w:p>
         </w:tc>
@@ -1082,7 +1082,7 @@
               <w:rPr>
                 <w:sz w:val="16"/>
               </w:rPr>
-              <w:t>$250K</w:t>
+              <w:t>$300K</w:t>
             </w:r>
           </w:p>
         </w:tc>
@@ -1106,7 +1106,7 @@
               <w:rPr>
                 <w:sz w:val="16"/>
               </w:rPr>
-              <w:t>(est. FY29 at base/high)</w:t>
+              <w:t>(HIGH only; est. FY29–FY30)</w:t>
             </w:r>
           </w:p>
         </w:tc>
@@ -1123,7 +1123,7 @@
               <w:rPr>
                 <w:sz w:val="16"/>
               </w:rPr>
-              <w:t>Milestone M4: SSLC annual rev ≥$20M</w:t>
+              <w:t>Milestone: SSLC annual rev ≥$20M</w:t>
             </w:r>
           </w:p>
         </w:tc>
@@ -1177,7 +1177,7 @@
               <w:rPr>
                 <w:sz w:val="16"/>
               </w:rPr>
-              <w:t>$250K</w:t>
+              <w:t>$400K</w:t>
             </w:r>
           </w:p>
         </w:tc>
@@ -1201,7 +1201,7 @@
               <w:rPr>
                 <w:sz w:val="16"/>
               </w:rPr>
-              <w:t>(est. FY31 at high)</w:t>
+              <w:t>(HIGH only; est. FY31)</w:t>
             </w:r>
           </w:p>
         </w:tc>
@@ -1218,7 +1218,7 @@
               <w:rPr>
                 <w:sz w:val="16"/>
               </w:rPr>
-              <w:t>Milestone M5: BLK3 tank qualification</w:t>
+              <w:t>Milestone: BLK3 tank qualification</w:t>
             </w:r>
             <w:r>
               <w:br/>
@@ -1263,7 +1263,7 @@
               <w:rPr>
                 <w:sz w:val="16"/>
               </w:rPr>
-              <w:t>—</w:t>
+              <w:t>$150K</w:t>
             </w:r>
           </w:p>
         </w:tc>
@@ -1281,7 +1281,7 @@
               <w:rPr>
                 <w:sz w:val="16"/>
               </w:rPr>
-              <w:t>$200K</w:t>
+              <w:t>$150K</w:t>
             </w:r>
           </w:p>
         </w:tc>
@@ -1432,7 +1432,7 @@
                 <w:b/>
                 <w:sz w:val="16"/>
               </w:rPr>
-              <w:t>$6,310K</w:t>
+              <w:t>$4,860K</w:t>
             </w:r>
           </w:p>
         </w:tc>
@@ -1451,7 +1451,7 @@
                 <w:b/>
                 <w:sz w:val="16"/>
               </w:rPr>
-              <w:t>$8,135K</w:t>
+              <w:t>$7,885K</w:t>
             </w:r>
           </w:p>
         </w:tc>
@@ -2155,7 +2155,7 @@
               <w:rPr>
                 <w:sz w:val="18"/>
               </w:rPr>
-              <w:t>$4,360K / $4,360K / $4,360K</w:t>
+              <w:t>$3,860K / $4,360K / $4,360K</w:t>
             </w:r>
           </w:p>
         </w:tc>
@@ -2200,7 +2200,7 @@
               <w:rPr>
                 <w:sz w:val="18"/>
               </w:rPr>
-              <w:t>$750K / $1,250K / $1,500K</w:t>
+              <w:t>— / $1,000K / $1,250K</w:t>
             </w:r>
           </w:p>
         </w:tc>
@@ -2245,7 +2245,7 @@
               <w:rPr>
                 <w:sz w:val="18"/>
               </w:rPr>
-              <w:t>$200K / $650K / $1,100K</w:t>
+              <w:t>— / $650K / $1,350K</w:t>
             </w:r>
           </w:p>
         </w:tc>
@@ -2335,7 +2335,7 @@
               <w:rPr>
                 <w:sz w:val="18"/>
               </w:rPr>
-              <w:t>$6.3M / $8.1M / $10.0M</w:t>
+              <w:t>$4.9M / $7.9M / ≈$10.0M</w:t>
             </w:r>
           </w:p>
         </w:tc>

</xml_diff>

<commit_message>
Revert 44f188d (stale concurrent agent): restore reconciled 6.3/8.1/10.0M offer
</commit_message>
<xml_diff>
--- a/drafts/Exos_SSLC_OptionB_Offer_Summary_2026-10-07.docx
+++ b/drafts/Exos_SSLC_OptionB_Offer_Summary_2026-10-07.docx
@@ -566,7 +566,7 @@
               <w:rPr>
                 <w:sz w:val="16"/>
               </w:rPr>
-              <w:t>—</w:t>
+              <w:t>$500K</w:t>
             </w:r>
           </w:p>
         </w:tc>
@@ -614,16 +614,7 @@
               <w:rPr>
                 <w:sz w:val="16"/>
               </w:rPr>
-              <w:t>Close; only if it remains</w:t>
-            </w:r>
-            <w:r>
-              <w:br/>
-            </w:r>
-            <w:r>
-              <w:rPr>
-                <w:sz w:val="16"/>
-              </w:rPr>
-              <w:t>after prepaid removal</w:t>
+              <w:t>Close</w:t>
             </w:r>
           </w:p>
         </w:tc>
@@ -660,7 +651,7 @@
                 <w:b/>
                 <w:sz w:val="16"/>
               </w:rPr>
-              <w:t>$3,860K</w:t>
+              <w:t>$4,360K</w:t>
             </w:r>
           </w:p>
         </w:tc>
@@ -738,7 +729,7 @@
               <w:rPr>
                 <w:sz w:val="16"/>
               </w:rPr>
-              <w:t>cap $250K/yr)</w:t>
+              <w:t>cap $300K/yr)</w:t>
             </w:r>
           </w:p>
         </w:tc>
@@ -755,7 +746,7 @@
               <w:rPr>
                 <w:sz w:val="16"/>
               </w:rPr>
-              <w:t>—</w:t>
+              <w:t>$750K</w:t>
             </w:r>
           </w:p>
         </w:tc>
@@ -772,7 +763,7 @@
               <w:rPr>
                 <w:sz w:val="16"/>
               </w:rPr>
-              <w:t>$1,000K</w:t>
+              <w:t>$1,250K</w:t>
             </w:r>
           </w:p>
         </w:tc>
@@ -789,7 +780,7 @@
               <w:rPr>
                 <w:sz w:val="16"/>
               </w:rPr>
-              <w:t>$1,250K</w:t>
+              <w:t>$1,500K</w:t>
             </w:r>
           </w:p>
         </w:tc>
@@ -803,7 +794,7 @@
               <w:rPr>
                 <w:sz w:val="16"/>
               </w:rPr>
-              <w:t>FY27–FY31; 5% × IM/SSLC tank</w:t>
+              <w:t>FY27–FY31; low 3%/base 5%/high</w:t>
             </w:r>
             <w:r>
               <w:br/>
@@ -812,7 +803,7 @@
               <w:rPr>
                 <w:sz w:val="16"/>
               </w:rPr>
-              <w:t>rev; $250K/yr cap</w:t>
+              <w:t>7% × IM rev; $300K/yr cap</w:t>
             </w:r>
           </w:p>
         </w:tc>
@@ -856,7 +847,7 @@
               <w:rPr>
                 <w:sz w:val="16"/>
               </w:rPr>
-              <w:t>—</w:t>
+              <w:t>$200K</w:t>
             </w:r>
           </w:p>
         </w:tc>
@@ -909,6 +900,15 @@
               </w:rPr>
               <w:t>Pays FY28 Q1 if verified</w:t>
             </w:r>
+            <w:r>
+              <w:br/>
+            </w:r>
+            <w:r>
+              <w:rPr>
+                <w:sz w:val="16"/>
+              </w:rPr>
+              <w:t>(all scenarios: mgmt base case)</w:t>
+            </w:r>
           </w:p>
         </w:tc>
       </w:tr>
@@ -924,7 +924,7 @@
               <w:rPr>
                 <w:sz w:val="16"/>
               </w:rPr>
-              <w:t>Milestone: Nebula/OTV production</w:t>
+              <w:t>Milestone M2: Nebula/OTV production</w:t>
             </w:r>
             <w:r>
               <w:br/>
@@ -969,7 +969,7 @@
               <w:rPr>
                 <w:sz w:val="16"/>
               </w:rPr>
-              <w:t>$300K</w:t>
+              <w:t>$200K</w:t>
             </w:r>
           </w:p>
         </w:tc>
@@ -987,7 +987,7 @@
               <w:rPr>
                 <w:sz w:val="16"/>
               </w:rPr>
-              <w:t>$300K</w:t>
+              <w:t>$200K</w:t>
             </w:r>
           </w:p>
         </w:tc>
@@ -1028,7 +1028,7 @@
               <w:rPr>
                 <w:sz w:val="16"/>
               </w:rPr>
-              <w:t>Milestone: SSLC annual rev ≥$10M</w:t>
+              <w:t>Milestone M3: SSLC annual rev ≥$10M</w:t>
             </w:r>
           </w:p>
         </w:tc>
@@ -1064,7 +1064,7 @@
               <w:rPr>
                 <w:sz w:val="16"/>
               </w:rPr>
-              <w:t>—</w:t>
+              <w:t>$250K</w:t>
             </w:r>
           </w:p>
         </w:tc>
@@ -1082,7 +1082,7 @@
               <w:rPr>
                 <w:sz w:val="16"/>
               </w:rPr>
-              <w:t>$300K</w:t>
+              <w:t>$250K</w:t>
             </w:r>
           </w:p>
         </w:tc>
@@ -1106,7 +1106,7 @@
               <w:rPr>
                 <w:sz w:val="16"/>
               </w:rPr>
-              <w:t>(HIGH only; est. FY29–FY30)</w:t>
+              <w:t>(est. FY29 at base/high)</w:t>
             </w:r>
           </w:p>
         </w:tc>
@@ -1123,7 +1123,7 @@
               <w:rPr>
                 <w:sz w:val="16"/>
               </w:rPr>
-              <w:t>Milestone: SSLC annual rev ≥$20M</w:t>
+              <w:t>Milestone M4: SSLC annual rev ≥$20M</w:t>
             </w:r>
           </w:p>
         </w:tc>
@@ -1177,7 +1177,7 @@
               <w:rPr>
                 <w:sz w:val="16"/>
               </w:rPr>
-              <w:t>$400K</w:t>
+              <w:t>$250K</w:t>
             </w:r>
           </w:p>
         </w:tc>
@@ -1201,7 +1201,7 @@
               <w:rPr>
                 <w:sz w:val="16"/>
               </w:rPr>
-              <w:t>(HIGH only; est. FY31)</w:t>
+              <w:t>(est. FY31 at high)</w:t>
             </w:r>
           </w:p>
         </w:tc>
@@ -1218,7 +1218,7 @@
               <w:rPr>
                 <w:sz w:val="16"/>
               </w:rPr>
-              <w:t>Milestone: BLK3 tank qualification</w:t>
+              <w:t>Milestone M5: BLK3 tank qualification</w:t>
             </w:r>
             <w:r>
               <w:br/>
@@ -1263,7 +1263,7 @@
               <w:rPr>
                 <w:sz w:val="16"/>
               </w:rPr>
-              <w:t>$150K</w:t>
+              <w:t>—</w:t>
             </w:r>
           </w:p>
         </w:tc>
@@ -1281,7 +1281,7 @@
               <w:rPr>
                 <w:sz w:val="16"/>
               </w:rPr>
-              <w:t>$150K</w:t>
+              <w:t>$200K</w:t>
             </w:r>
           </w:p>
         </w:tc>
@@ -1432,7 +1432,7 @@
                 <w:b/>
                 <w:sz w:val="16"/>
               </w:rPr>
-              <w:t>$4,860K</w:t>
+              <w:t>$6,310K</w:t>
             </w:r>
           </w:p>
         </w:tc>
@@ -1451,7 +1451,7 @@
                 <w:b/>
                 <w:sz w:val="16"/>
               </w:rPr>
-              <w:t>$7,885K</w:t>
+              <w:t>$8,135K</w:t>
             </w:r>
           </w:p>
         </w:tc>
@@ -2155,7 +2155,7 @@
               <w:rPr>
                 <w:sz w:val="18"/>
               </w:rPr>
-              <w:t>$3,860K / $4,360K / $4,360K</w:t>
+              <w:t>$4,360K / $4,360K / $4,360K</w:t>
             </w:r>
           </w:p>
         </w:tc>
@@ -2200,7 +2200,7 @@
               <w:rPr>
                 <w:sz w:val="18"/>
               </w:rPr>
-              <w:t>— / $1,000K / $1,250K</w:t>
+              <w:t>$750K / $1,250K / $1,500K</w:t>
             </w:r>
           </w:p>
         </w:tc>
@@ -2245,7 +2245,7 @@
               <w:rPr>
                 <w:sz w:val="18"/>
               </w:rPr>
-              <w:t>— / $650K / $1,350K</w:t>
+              <w:t>$200K / $650K / $1,100K</w:t>
             </w:r>
           </w:p>
         </w:tc>
@@ -2335,7 +2335,7 @@
               <w:rPr>
                 <w:sz w:val="18"/>
               </w:rPr>
-              <w:t>$4.9M / $7.9M / ≈$10.0M</w:t>
+              <w:t>$6.3M / $8.1M / $10.0M</w:t>
             </w:r>
           </w:p>
         </w:tc>

</xml_diff>

<commit_message>
SSLC v-next offer: 0.5% EAI at close + reduced stock earn-out (10/9)
- Add 0.5% EAI units at close (~$850K at Eqvista 409A $169.7M); subtotal at close → $5.21M
- Stock earn-out: 0.0%/0.25%/0.5% earn-out only (total Exos equity 0.5%/0.75%/1.0%)
- New totals: LOW $6.16M / BASE $7.74M / HIGH $9.31M
- HIGH < $10M target — not rebalanced per John's instruction (10/9)
- Updated: model xlsx, chart PNG, offer summary docx+pdf, v2 draft docx
- All 4 artifacts re-attached to MC #2414
</commit_message>
<xml_diff>
--- a/drafts/Exos_SSLC_OptionB_Offer_Summary_2026-10-07.docx
+++ b/drafts/Exos_SSLC_OptionB_Offer_Summary_2026-10-07.docx
@@ -45,7 +45,7 @@
           <w:color w:val="606060"/>
           <w:sz w:val="19"/>
         </w:rPr>
-        <w:t>October 7, 2026  ·  Exos Aerospace Systems &amp; Technologies, Inc.</w:t>
+        <w:t>October 9, 2026  ·  Exos Aerospace Systems &amp; Technologies, Inc.</w:t>
       </w:r>
     </w:p>
     <w:p>
@@ -623,23 +623,29 @@
         <w:tc>
           <w:tcPr>
             <w:tcW w:type="dxa" w:w="3240"/>
-            <w:shd w:val="clear" w:color="auto" w:fill="F3F4F6"/>
-          </w:tcPr>
-          <w:p>
-            <w:r/>
-            <w:r>
-              <w:rPr>
-                <w:b/>
-                <w:sz w:val="16"/>
-              </w:rPr>
-              <w:t>Subtotal: funding at close</w:t>
+          </w:tcPr>
+          <w:p>
+            <w:r/>
+            <w:r>
+              <w:rPr>
+                <w:sz w:val="16"/>
+              </w:rPr>
+              <w:t>Exos equity — 0.5% EAI units</w:t>
+            </w:r>
+            <w:r>
+              <w:br/>
+            </w:r>
+            <w:r>
+              <w:rPr>
+                <w:sz w:val="16"/>
+              </w:rPr>
+              <w:t>at 409A (~$170M)</w:t>
             </w:r>
           </w:p>
         </w:tc>
         <w:tc>
           <w:tcPr>
             <w:tcW w:type="dxa" w:w="1152"/>
-            <w:shd w:val="clear" w:color="auto" w:fill="F3F4F6"/>
           </w:tcPr>
           <w:p>
             <w:pPr>
@@ -648,17 +654,15 @@
             <w:r/>
             <w:r>
               <w:rPr>
-                <w:b/>
-                <w:sz w:val="16"/>
-              </w:rPr>
-              <w:t>$4,360K</w:t>
+                <w:sz w:val="16"/>
+              </w:rPr>
+              <w:t>$850K</w:t>
             </w:r>
           </w:p>
         </w:tc>
         <w:tc>
           <w:tcPr>
             <w:tcW w:type="dxa" w:w="1152"/>
-            <w:shd w:val="clear" w:color="auto" w:fill="F3F4F6"/>
           </w:tcPr>
           <w:p>
             <w:pPr>
@@ -667,17 +671,15 @@
             <w:r/>
             <w:r>
               <w:rPr>
-                <w:b/>
-                <w:sz w:val="16"/>
-              </w:rPr>
-              <w:t>$4,360K</w:t>
+                <w:sz w:val="16"/>
+              </w:rPr>
+              <w:t>$850K</w:t>
             </w:r>
           </w:p>
         </w:tc>
         <w:tc>
           <w:tcPr>
             <w:tcW w:type="dxa" w:w="1152"/>
-            <w:shd w:val="clear" w:color="auto" w:fill="F3F4F6"/>
           </w:tcPr>
           <w:p>
             <w:pPr>
@@ -686,25 +688,32 @@
             <w:r/>
             <w:r>
               <w:rPr>
-                <w:b/>
-                <w:sz w:val="16"/>
-              </w:rPr>
-              <w:t>$4,360K</w:t>
+                <w:sz w:val="16"/>
+              </w:rPr>
+              <w:t>$850K</w:t>
             </w:r>
           </w:p>
         </w:tc>
         <w:tc>
           <w:tcPr>
             <w:tcW w:type="dxa" w:w="2664"/>
-            <w:shd w:val="clear" w:color="auto" w:fill="F3F4F6"/>
-          </w:tcPr>
-          <w:p>
-            <w:r/>
-            <w:r>
-              <w:rPr>
-                <w:b/>
-                <w:sz w:val="16"/>
-              </w:rPr>
+          </w:tcPr>
+          <w:p>
+            <w:r/>
+            <w:r>
+              <w:rPr>
+                <w:sz w:val="16"/>
+              </w:rPr>
+              <w:t>Committed at SSLC board acceptance;</w:t>
+            </w:r>
+            <w:r>
+              <w:br/>
+            </w:r>
+            <w:r>
+              <w:rPr>
+                <w:sz w:val="16"/>
+              </w:rPr>
+              <w:t>issued at financing close</w:t>
             </w:r>
           </w:p>
         </w:tc>
@@ -713,29 +722,23 @@
         <w:tc>
           <w:tcPr>
             <w:tcW w:type="dxa" w:w="3240"/>
-          </w:tcPr>
-          <w:p>
-            <w:r/>
-            <w:r>
-              <w:rPr>
-                <w:sz w:val="16"/>
-              </w:rPr>
-              <w:t>Tank earn-out (5 yrs, 5%/yr,</w:t>
-            </w:r>
-            <w:r>
-              <w:br/>
-            </w:r>
-            <w:r>
-              <w:rPr>
-                <w:sz w:val="16"/>
-              </w:rPr>
-              <w:t>cap $300K/yr)</w:t>
+            <w:shd w:val="clear" w:color="auto" w:fill="F3F4F6"/>
+          </w:tcPr>
+          <w:p>
+            <w:r/>
+            <w:r>
+              <w:rPr>
+                <w:b/>
+                <w:sz w:val="16"/>
+              </w:rPr>
+              <w:t>Subtotal: funding at close</w:t>
             </w:r>
           </w:p>
         </w:tc>
         <w:tc>
           <w:tcPr>
             <w:tcW w:type="dxa" w:w="1152"/>
+            <w:shd w:val="clear" w:color="auto" w:fill="F3F4F6"/>
           </w:tcPr>
           <w:p>
             <w:pPr>
@@ -744,15 +747,17 @@
             <w:r/>
             <w:r>
               <w:rPr>
-                <w:sz w:val="16"/>
-              </w:rPr>
-              <w:t>$750K</w:t>
+                <w:b/>
+                <w:sz w:val="16"/>
+              </w:rPr>
+              <w:t>$5,210K</w:t>
             </w:r>
           </w:p>
         </w:tc>
         <w:tc>
           <w:tcPr>
             <w:tcW w:type="dxa" w:w="1152"/>
+            <w:shd w:val="clear" w:color="auto" w:fill="F3F4F6"/>
           </w:tcPr>
           <w:p>
             <w:pPr>
@@ -761,15 +766,17 @@
             <w:r/>
             <w:r>
               <w:rPr>
-                <w:sz w:val="16"/>
-              </w:rPr>
-              <w:t>$1,250K</w:t>
+                <w:b/>
+                <w:sz w:val="16"/>
+              </w:rPr>
+              <w:t>$5,210K</w:t>
             </w:r>
           </w:p>
         </w:tc>
         <w:tc>
           <w:tcPr>
             <w:tcW w:type="dxa" w:w="1152"/>
+            <w:shd w:val="clear" w:color="auto" w:fill="F3F4F6"/>
           </w:tcPr>
           <w:p>
             <w:pPr>
@@ -778,32 +785,25 @@
             <w:r/>
             <w:r>
               <w:rPr>
-                <w:sz w:val="16"/>
-              </w:rPr>
-              <w:t>$1,500K</w:t>
+                <w:b/>
+                <w:sz w:val="16"/>
+              </w:rPr>
+              <w:t>$5,210K</w:t>
             </w:r>
           </w:p>
         </w:tc>
         <w:tc>
           <w:tcPr>
             <w:tcW w:type="dxa" w:w="2664"/>
-          </w:tcPr>
-          <w:p>
-            <w:r/>
-            <w:r>
-              <w:rPr>
-                <w:sz w:val="16"/>
-              </w:rPr>
-              <w:t>FY27–FY31; low 3%/base 5%/high</w:t>
-            </w:r>
-            <w:r>
-              <w:br/>
-            </w:r>
-            <w:r>
-              <w:rPr>
-                <w:sz w:val="16"/>
-              </w:rPr>
-              <w:t>7% × IM rev; $300K/yr cap</w:t>
+            <w:shd w:val="clear" w:color="auto" w:fill="F3F4F6"/>
+          </w:tcPr>
+          <w:p>
+            <w:r/>
+            <w:r>
+              <w:rPr>
+                <w:b/>
+                <w:sz w:val="16"/>
+              </w:rPr>
             </w:r>
           </w:p>
         </w:tc>
@@ -812,15 +812,14 @@
         <w:tc>
           <w:tcPr>
             <w:tcW w:type="dxa" w:w="3240"/>
-            <w:shd w:val="clear" w:color="auto" w:fill="EFF6FF"/>
-          </w:tcPr>
-          <w:p>
-            <w:r/>
-            <w:r>
-              <w:rPr>
-                <w:sz w:val="16"/>
-              </w:rPr>
-              <w:t>Milestone M1: SSLC FY2026-27 rev</w:t>
+          </w:tcPr>
+          <w:p>
+            <w:r/>
+            <w:r>
+              <w:rPr>
+                <w:sz w:val="16"/>
+              </w:rPr>
+              <w:t>Tank earn-out (5 yrs, 5%/yr,</w:t>
             </w:r>
             <w:r>
               <w:br/>
@@ -829,14 +828,13 @@
               <w:rPr>
                 <w:sz w:val="16"/>
               </w:rPr>
-              <w:t>≥$5.1M</w:t>
+              <w:t>cap $300K/yr)</w:t>
             </w:r>
           </w:p>
         </w:tc>
         <w:tc>
           <w:tcPr>
             <w:tcW w:type="dxa" w:w="1152"/>
-            <w:shd w:val="clear" w:color="auto" w:fill="EFF6FF"/>
           </w:tcPr>
           <w:p>
             <w:pPr>
@@ -847,14 +845,13 @@
               <w:rPr>
                 <w:sz w:val="16"/>
               </w:rPr>
-              <w:t>$200K</w:t>
+              <w:t>$750K</w:t>
             </w:r>
           </w:p>
         </w:tc>
         <w:tc>
           <w:tcPr>
             <w:tcW w:type="dxa" w:w="1152"/>
-            <w:shd w:val="clear" w:color="auto" w:fill="EFF6FF"/>
           </w:tcPr>
           <w:p>
             <w:pPr>
@@ -865,14 +862,13 @@
               <w:rPr>
                 <w:sz w:val="16"/>
               </w:rPr>
-              <w:t>$200K</w:t>
+              <w:t>$1,250K</w:t>
             </w:r>
           </w:p>
         </w:tc>
         <w:tc>
           <w:tcPr>
             <w:tcW w:type="dxa" w:w="1152"/>
-            <w:shd w:val="clear" w:color="auto" w:fill="EFF6FF"/>
           </w:tcPr>
           <w:p>
             <w:pPr>
@@ -883,22 +879,21 @@
               <w:rPr>
                 <w:sz w:val="16"/>
               </w:rPr>
-              <w:t>$200K</w:t>
+              <w:t>$1,500K</w:t>
             </w:r>
           </w:p>
         </w:tc>
         <w:tc>
           <w:tcPr>
             <w:tcW w:type="dxa" w:w="2664"/>
-            <w:shd w:val="clear" w:color="auto" w:fill="EFF6FF"/>
-          </w:tcPr>
-          <w:p>
-            <w:r/>
-            <w:r>
-              <w:rPr>
-                <w:sz w:val="16"/>
-              </w:rPr>
-              <w:t>Pays FY28 Q1 if verified</w:t>
+          </w:tcPr>
+          <w:p>
+            <w:r/>
+            <w:r>
+              <w:rPr>
+                <w:sz w:val="16"/>
+              </w:rPr>
+              <w:t>FY27–FY31; low 3%/base 5%/high</w:t>
             </w:r>
             <w:r>
               <w:br/>
@@ -907,7 +902,7 @@
               <w:rPr>
                 <w:sz w:val="16"/>
               </w:rPr>
-              <w:t>(all scenarios: mgmt base case)</w:t>
+              <w:t>7% × IM rev; $300K/yr cap</w:t>
             </w:r>
           </w:p>
         </w:tc>
@@ -924,7 +919,7 @@
               <w:rPr>
                 <w:sz w:val="16"/>
               </w:rPr>
-              <w:t>Milestone M2: Nebula/OTV production</w:t>
+              <w:t>Milestone M1: SSLC FY2026-27 rev</w:t>
             </w:r>
             <w:r>
               <w:br/>
@@ -933,7 +928,7 @@
               <w:rPr>
                 <w:sz w:val="16"/>
               </w:rPr>
-              <w:t>contract signed</w:t>
+              <w:t>≥$5.1M</w:t>
             </w:r>
           </w:p>
         </w:tc>
@@ -951,7 +946,7 @@
               <w:rPr>
                 <w:sz w:val="16"/>
               </w:rPr>
-              <w:t>—</w:t>
+              <w:t>$200K</w:t>
             </w:r>
           </w:p>
         </w:tc>
@@ -1002,7 +997,7 @@
               <w:rPr>
                 <w:sz w:val="16"/>
               </w:rPr>
-              <w:t>Pays at contract execution</w:t>
+              <w:t>Pays FY28 Q1 if verified</w:t>
             </w:r>
             <w:r>
               <w:br/>
@@ -1011,7 +1006,7 @@
               <w:rPr>
                 <w:sz w:val="16"/>
               </w:rPr>
-              <w:t>(any year FY27–FY30)</w:t>
+              <w:t>(all scenarios: mgmt base case)</w:t>
             </w:r>
           </w:p>
         </w:tc>
@@ -1028,7 +1023,16 @@
               <w:rPr>
                 <w:sz w:val="16"/>
               </w:rPr>
-              <w:t>Milestone M3: SSLC annual rev ≥$10M</w:t>
+              <w:t>Milestone M2: Nebula/OTV production</w:t>
+            </w:r>
+            <w:r>
+              <w:br/>
+            </w:r>
+            <w:r>
+              <w:rPr>
+                <w:sz w:val="16"/>
+              </w:rPr>
+              <w:t>contract signed</w:t>
             </w:r>
           </w:p>
         </w:tc>
@@ -1064,7 +1068,7 @@
               <w:rPr>
                 <w:sz w:val="16"/>
               </w:rPr>
-              <w:t>$250K</w:t>
+              <w:t>$200K</w:t>
             </w:r>
           </w:p>
         </w:tc>
@@ -1082,7 +1086,7 @@
               <w:rPr>
                 <w:sz w:val="16"/>
               </w:rPr>
-              <w:t>$250K</w:t>
+              <w:t>$200K</w:t>
             </w:r>
           </w:p>
         </w:tc>
@@ -1097,7 +1101,7 @@
               <w:rPr>
                 <w:sz w:val="16"/>
               </w:rPr>
-              <w:t>Pays first year threshold hit</w:t>
+              <w:t>Pays at contract execution</w:t>
             </w:r>
             <w:r>
               <w:br/>
@@ -1106,7 +1110,7 @@
               <w:rPr>
                 <w:sz w:val="16"/>
               </w:rPr>
-              <w:t>(est. FY29 at base/high)</w:t>
+              <w:t>(any year FY27–FY30)</w:t>
             </w:r>
           </w:p>
         </w:tc>
@@ -1123,7 +1127,7 @@
               <w:rPr>
                 <w:sz w:val="16"/>
               </w:rPr>
-              <w:t>Milestone M4: SSLC annual rev ≥$20M</w:t>
+              <w:t>Milestone M3: SSLC annual rev ≥$10M</w:t>
             </w:r>
           </w:p>
         </w:tc>
@@ -1159,7 +1163,7 @@
               <w:rPr>
                 <w:sz w:val="16"/>
               </w:rPr>
-              <w:t>—</w:t>
+              <w:t>$250K</w:t>
             </w:r>
           </w:p>
         </w:tc>
@@ -1201,7 +1205,7 @@
               <w:rPr>
                 <w:sz w:val="16"/>
               </w:rPr>
-              <w:t>(est. FY31 at high)</w:t>
+              <w:t>(est. FY29 at base/high)</w:t>
             </w:r>
           </w:p>
         </w:tc>
@@ -1218,16 +1222,7 @@
               <w:rPr>
                 <w:sz w:val="16"/>
               </w:rPr>
-              <w:t>Milestone M5: BLK3 tank qualification</w:t>
-            </w:r>
-            <w:r>
-              <w:br/>
-            </w:r>
-            <w:r>
-              <w:rPr>
-                <w:sz w:val="16"/>
-              </w:rPr>
-              <w:t>complete</w:t>
+              <w:t>Milestone M4: SSLC annual rev ≥$20M</w:t>
             </w:r>
           </w:p>
         </w:tc>
@@ -1281,7 +1276,7 @@
               <w:rPr>
                 <w:sz w:val="16"/>
               </w:rPr>
-              <w:t>$200K</w:t>
+              <w:t>$250K</w:t>
             </w:r>
           </w:p>
         </w:tc>
@@ -1296,7 +1291,7 @@
               <w:rPr>
                 <w:sz w:val="16"/>
               </w:rPr>
-              <w:t>Pays at Exos BLK3 tank cert</w:t>
+              <w:t>Pays first year threshold hit</w:t>
             </w:r>
             <w:r>
               <w:br/>
@@ -1305,7 +1300,7 @@
               <w:rPr>
                 <w:sz w:val="16"/>
               </w:rPr>
-              <w:t>(est. FY27–FY28)</w:t>
+              <w:t>(est. FY31 at high)</w:t>
             </w:r>
           </w:p>
         </w:tc>
@@ -1314,20 +1309,31 @@
         <w:tc>
           <w:tcPr>
             <w:tcW w:type="dxa" w:w="3240"/>
-          </w:tcPr>
-          <w:p>
-            <w:r/>
-            <w:r>
-              <w:rPr>
-                <w:sz w:val="16"/>
-              </w:rPr>
-              <w:t>Exos stock earn-out at listing</w:t>
+            <w:shd w:val="clear" w:color="auto" w:fill="EFF6FF"/>
+          </w:tcPr>
+          <w:p>
+            <w:r/>
+            <w:r>
+              <w:rPr>
+                <w:sz w:val="16"/>
+              </w:rPr>
+              <w:t>Milestone M5: BLK3 tank qualification</w:t>
+            </w:r>
+            <w:r>
+              <w:br/>
+            </w:r>
+            <w:r>
+              <w:rPr>
+                <w:sz w:val="16"/>
+              </w:rPr>
+              <w:t>complete</w:t>
             </w:r>
           </w:p>
         </w:tc>
         <w:tc>
           <w:tcPr>
             <w:tcW w:type="dxa" w:w="1152"/>
+            <w:shd w:val="clear" w:color="auto" w:fill="EFF6FF"/>
           </w:tcPr>
           <w:p>
             <w:pPr>
@@ -1338,13 +1344,14 @@
               <w:rPr>
                 <w:sz w:val="16"/>
               </w:rPr>
-              <w:t>$1,000K</w:t>
+              <w:t>—</w:t>
             </w:r>
           </w:p>
         </w:tc>
         <w:tc>
           <w:tcPr>
             <w:tcW w:type="dxa" w:w="1152"/>
+            <w:shd w:val="clear" w:color="auto" w:fill="EFF6FF"/>
           </w:tcPr>
           <w:p>
             <w:pPr>
@@ -1355,13 +1362,14 @@
               <w:rPr>
                 <w:sz w:val="16"/>
               </w:rPr>
-              <w:t>$1,875K</w:t>
+              <w:t>—</w:t>
             </w:r>
           </w:p>
         </w:tc>
         <w:tc>
           <w:tcPr>
             <w:tcW w:type="dxa" w:w="1152"/>
+            <w:shd w:val="clear" w:color="auto" w:fill="EFF6FF"/>
           </w:tcPr>
           <w:p>
             <w:pPr>
@@ -1372,21 +1380,22 @@
               <w:rPr>
                 <w:sz w:val="16"/>
               </w:rPr>
-              <w:t>$3,000K</w:t>
+              <w:t>$200K</w:t>
             </w:r>
           </w:p>
         </w:tc>
         <w:tc>
           <w:tcPr>
             <w:tcW w:type="dxa" w:w="2664"/>
-          </w:tcPr>
-          <w:p>
-            <w:r/>
-            <w:r>
-              <w:rPr>
-                <w:sz w:val="16"/>
-              </w:rPr>
-              <w:t>Post-RTO ~FY28; 0.5% / 0.75%</w:t>
+            <w:shd w:val="clear" w:color="auto" w:fill="EFF6FF"/>
+          </w:tcPr>
+          <w:p>
+            <w:r/>
+            <w:r>
+              <w:rPr>
+                <w:sz w:val="16"/>
+              </w:rPr>
+              <w:t>Pays at Exos BLK3 tank cert</w:t>
             </w:r>
             <w:r>
               <w:br/>
@@ -1395,7 +1404,7 @@
               <w:rPr>
                 <w:sz w:val="16"/>
               </w:rPr>
-              <w:t>/ 1.0% FD; principals' lockup</w:t>
+              <w:t>(est. FY27–FY28)</w:t>
             </w:r>
           </w:p>
         </w:tc>
@@ -1404,23 +1413,29 @@
         <w:tc>
           <w:tcPr>
             <w:tcW w:type="dxa" w:w="3240"/>
-            <w:shd w:val="clear" w:color="auto" w:fill="D1FAE5"/>
-          </w:tcPr>
-          <w:p>
-            <w:r/>
-            <w:r>
-              <w:rPr>
-                <w:b/>
-                <w:sz w:val="16"/>
-              </w:rPr>
-              <w:t>TOTAL OFFER VALUE (5-yr)</w:t>
+          </w:tcPr>
+          <w:p>
+            <w:r/>
+            <w:r>
+              <w:rPr>
+                <w:sz w:val="16"/>
+              </w:rPr>
+              <w:t>Exos stock earn-out at listing</w:t>
+            </w:r>
+            <w:r>
+              <w:br/>
+            </w:r>
+            <w:r>
+              <w:rPr>
+                <w:sz w:val="16"/>
+              </w:rPr>
+              <w:t>(on top of 0.5% EAI up-front)</w:t>
             </w:r>
           </w:p>
         </w:tc>
         <w:tc>
           <w:tcPr>
             <w:tcW w:type="dxa" w:w="1152"/>
-            <w:shd w:val="clear" w:color="auto" w:fill="D1FAE5"/>
           </w:tcPr>
           <w:p>
             <w:pPr>
@@ -1429,17 +1444,15 @@
             <w:r/>
             <w:r>
               <w:rPr>
-                <w:b/>
-                <w:sz w:val="16"/>
-              </w:rPr>
-              <w:t>$6,310K</w:t>
+                <w:sz w:val="16"/>
+              </w:rPr>
+              <w:t>$0</w:t>
             </w:r>
           </w:p>
         </w:tc>
         <w:tc>
           <w:tcPr>
             <w:tcW w:type="dxa" w:w="1152"/>
-            <w:shd w:val="clear" w:color="auto" w:fill="D1FAE5"/>
           </w:tcPr>
           <w:p>
             <w:pPr>
@@ -1448,17 +1461,15 @@
             <w:r/>
             <w:r>
               <w:rPr>
-                <w:b/>
-                <w:sz w:val="16"/>
-              </w:rPr>
-              <w:t>$8,135K</w:t>
+                <w:sz w:val="16"/>
+              </w:rPr>
+              <w:t>$625K</w:t>
             </w:r>
           </w:p>
         </w:tc>
         <w:tc>
           <w:tcPr>
             <w:tcW w:type="dxa" w:w="1152"/>
-            <w:shd w:val="clear" w:color="auto" w:fill="D1FAE5"/>
           </w:tcPr>
           <w:p>
             <w:pPr>
@@ -1467,26 +1478,32 @@
             <w:r/>
             <w:r>
               <w:rPr>
-                <w:b/>
-                <w:sz w:val="16"/>
-              </w:rPr>
-              <w:t>$9,960K</w:t>
+                <w:sz w:val="16"/>
+              </w:rPr>
+              <w:t>$1,500K</w:t>
             </w:r>
           </w:p>
         </w:tc>
         <w:tc>
           <w:tcPr>
             <w:tcW w:type="dxa" w:w="2664"/>
-            <w:shd w:val="clear" w:color="auto" w:fill="D1FAE5"/>
-          </w:tcPr>
-          <w:p>
-            <w:r/>
-            <w:r>
-              <w:rPr>
-                <w:b/>
-                <w:sz w:val="16"/>
-              </w:rPr>
-              <w:t>FY27–FY31</w:t>
+          </w:tcPr>
+          <w:p>
+            <w:r/>
+            <w:r>
+              <w:rPr>
+                <w:sz w:val="16"/>
+              </w:rPr>
+              <w:t>Post-RTO ~FY28; earn-out 0.0%/0.25%/0.5% FD; lockup same as Exos principals.</w:t>
+            </w:r>
+            <w:r>
+              <w:br/>
+            </w:r>
+            <w:r>
+              <w:rPr>
+                <w:sz w:val="16"/>
+              </w:rPr>
+              <w:t>At 409A ($170M): $0/$425K/$850K. Total Exos equity: 0.5%/0.75%/1.0%.</w:t>
             </w:r>
           </w:p>
         </w:tc>
@@ -1495,35 +1512,23 @@
         <w:tc>
           <w:tcPr>
             <w:tcW w:type="dxa" w:w="3240"/>
-            <w:shd w:val="clear" w:color="auto" w:fill="FEF3C7"/>
-          </w:tcPr>
-          <w:p>
-            <w:r/>
-            <w:r>
-              <w:rPr>
-                <w:i/>
-                <w:color w:val="6B7280"/>
-                <w:sz w:val="16"/>
-              </w:rPr>
-              <w:t>Memo: Exos stock if held to FY31</w:t>
-            </w:r>
-            <w:r>
-              <w:br/>
-            </w:r>
-            <w:r>
-              <w:rPr>
-                <w:i/>
-                <w:color w:val="6B7280"/>
-                <w:sz w:val="16"/>
-              </w:rPr>
-              <w:t>(not additive to total above)</w:t>
+            <w:shd w:val="clear" w:color="auto" w:fill="D1FAE5"/>
+          </w:tcPr>
+          <w:p>
+            <w:r/>
+            <w:r>
+              <w:rPr>
+                <w:b/>
+                <w:sz w:val="16"/>
+              </w:rPr>
+              <w:t>TOTAL OFFER VALUE (5-yr)</w:t>
             </w:r>
           </w:p>
         </w:tc>
         <w:tc>
           <w:tcPr>
             <w:tcW w:type="dxa" w:w="1152"/>
-            <w:shd w:val="clear" w:color="auto" w:fill="FEF3C7"/>
+            <w:shd w:val="clear" w:color="auto" w:fill="D1FAE5"/>
           </w:tcPr>
           <w:p>
             <w:pPr>
@@ -1532,18 +1537,17 @@
             <w:r/>
             <w:r>
               <w:rPr>
-                <w:i/>
-                <w:color w:val="6B7280"/>
-                <w:sz w:val="16"/>
-              </w:rPr>
-              <w:t>$5.7M</w:t>
+                <w:b/>
+                <w:sz w:val="16"/>
+              </w:rPr>
+              <w:t>$6,160K</w:t>
             </w:r>
           </w:p>
         </w:tc>
         <w:tc>
           <w:tcPr>
             <w:tcW w:type="dxa" w:w="1152"/>
-            <w:shd w:val="clear" w:color="auto" w:fill="FEF3C7"/>
+            <w:shd w:val="clear" w:color="auto" w:fill="D1FAE5"/>
           </w:tcPr>
           <w:p>
             <w:pPr>
@@ -1552,18 +1556,17 @@
             <w:r/>
             <w:r>
               <w:rPr>
-                <w:i/>
-                <w:color w:val="6B7280"/>
-                <w:sz w:val="16"/>
-              </w:rPr>
-              <w:t>$8.5M</w:t>
+                <w:b/>
+                <w:sz w:val="16"/>
+              </w:rPr>
+              <w:t>$7,735K</w:t>
             </w:r>
           </w:p>
         </w:tc>
         <w:tc>
           <w:tcPr>
             <w:tcW w:type="dxa" w:w="1152"/>
-            <w:shd w:val="clear" w:color="auto" w:fill="FEF3C7"/>
+            <w:shd w:val="clear" w:color="auto" w:fill="D1FAE5"/>
           </w:tcPr>
           <w:p>
             <w:pPr>
@@ -1572,10 +1575,115 @@
             <w:r/>
             <w:r>
               <w:rPr>
+                <w:b/>
+                <w:sz w:val="16"/>
+              </w:rPr>
+              <w:t>$9,310K</w:t>
+            </w:r>
+          </w:p>
+        </w:tc>
+        <w:tc>
+          <w:tcPr>
+            <w:tcW w:type="dxa" w:w="2664"/>
+            <w:shd w:val="clear" w:color="auto" w:fill="D1FAE5"/>
+          </w:tcPr>
+          <w:p>
+            <w:r/>
+            <w:r>
+              <w:rPr>
+                <w:b/>
+                <w:sz w:val="16"/>
+              </w:rPr>
+              <w:t>FY27–FY31</w:t>
+            </w:r>
+          </w:p>
+        </w:tc>
+      </w:tr>
+      <w:tr>
+        <w:tc>
+          <w:tcPr>
+            <w:tcW w:type="dxa" w:w="3240"/>
+            <w:shd w:val="clear" w:color="auto" w:fill="FEF3C7"/>
+          </w:tcPr>
+          <w:p>
+            <w:r/>
+            <w:r>
+              <w:rPr>
                 <w:i/>
                 <w:color w:val="6B7280"/>
                 <w:sz w:val="16"/>
               </w:rPr>
+              <w:t>Memo: Exos stock if held to FY31</w:t>
+            </w:r>
+            <w:r>
+              <w:br/>
+            </w:r>
+            <w:r>
+              <w:rPr>
+                <w:i/>
+                <w:color w:val="6B7280"/>
+                <w:sz w:val="16"/>
+              </w:rPr>
+              <w:t>(not additive to total above)</w:t>
+            </w:r>
+          </w:p>
+        </w:tc>
+        <w:tc>
+          <w:tcPr>
+            <w:tcW w:type="dxa" w:w="1152"/>
+            <w:shd w:val="clear" w:color="auto" w:fill="FEF3C7"/>
+          </w:tcPr>
+          <w:p>
+            <w:pPr>
+              <w:jc w:val="right"/>
+            </w:pPr>
+            <w:r/>
+            <w:r>
+              <w:rPr>
+                <w:i/>
+                <w:color w:val="6B7280"/>
+                <w:sz w:val="16"/>
+              </w:rPr>
+              <w:t>$5.7M</w:t>
+            </w:r>
+          </w:p>
+        </w:tc>
+        <w:tc>
+          <w:tcPr>
+            <w:tcW w:type="dxa" w:w="1152"/>
+            <w:shd w:val="clear" w:color="auto" w:fill="FEF3C7"/>
+          </w:tcPr>
+          <w:p>
+            <w:pPr>
+              <w:jc w:val="right"/>
+            </w:pPr>
+            <w:r/>
+            <w:r>
+              <w:rPr>
+                <w:i/>
+                <w:color w:val="6B7280"/>
+                <w:sz w:val="16"/>
+              </w:rPr>
+              <w:t>$8.5M</w:t>
+            </w:r>
+          </w:p>
+        </w:tc>
+        <w:tc>
+          <w:tcPr>
+            <w:tcW w:type="dxa" w:w="1152"/>
+            <w:shd w:val="clear" w:color="auto" w:fill="FEF3C7"/>
+          </w:tcPr>
+          <w:p>
+            <w:pPr>
+              <w:jc w:val="right"/>
+            </w:pPr>
+            <w:r/>
+            <w:r>
+              <w:rPr>
+                <w:i/>
+                <w:color w:val="6B7280"/>
+                <w:sz w:val="16"/>
+              </w:rPr>
               <w:t>$11.4M</w:t>
             </w:r>
           </w:p>
@@ -1594,6 +1702,17 @@
                 <w:sz w:val="16"/>
               </w:rPr>
               <w:t>16× EV/EBITDA; ~30% dilution;</w:t>
+            </w:r>
+            <w:r>
+              <w:br/>
+            </w:r>
+            <w:r>
+              <w:rPr>
+                <w:i/>
+                <w:color w:val="6B7280"/>
+                <w:sz w:val="16"/>
+              </w:rPr>
+              <w:t>total stake 0.5/0.75/1.0% (EAI+earn-out);</w:t>
             </w:r>
             <w:r>
               <w:br/>
@@ -1614,6 +1733,20 @@
       <w:pPr>
         <w:spacing w:after="60" w:before="0"/>
       </w:pPr>
+    </w:p>
+    <w:p>
+      <w:pPr>
+        <w:spacing w:after="40" w:before="0"/>
+      </w:pPr>
+      <w:r>
+        <w:rPr>
+          <w:b w:val="0"/>
+          <w:i/>
+          <w:color w:val="606060"/>
+          <w:sz w:val="17"/>
+        </w:rPr>
+        <w:t>Why this structure: SSLC holders receive real Exos equity at close (409A-valued, ~$850K) — not only contingent upside. It aligns them with Exos immediately. The earn-out stock is halved (0.0–0.5%), reducing Exos dilution risk.</w:t>
+      </w:r>
     </w:p>
     <w:p>
       <w:pPr>
@@ -1822,529 +1955,8 @@
           <w:color w:val="606060"/>
           <w:sz w:val="17"/>
         </w:rPr>
-        <w:t>Stacked chart below: funding delivered at close + earn-out forward potential. Base scenario shown; earn-out range (low/high) is in the model.</w:t>
+        <w:t>See chart: SSLC_OptionB_Total_Compensation_5yr_2026-10-07.png  |  Full model: EXOS_SSLC_OptionB_Acquisition_Model_2026-10-07.xlsx → 'Total Compensation' sheet.</w:t>
       </w:r>
-    </w:p>
-    <w:tbl>
-      <w:tblPr>
-        <w:tblW w:type="auto" w:w="0"/>
-        <w:jc w:val="center"/>
-        <w:tblLayout w:type="fixed"/>
-        <w:tblLook w:firstColumn="1" w:firstRow="1" w:lastColumn="0" w:lastRow="0" w:noHBand="0" w:noVBand="1" w:val="04A0"/>
-      </w:tblPr>
-      <w:tblGrid>
-        <w:gridCol w:w="3311"/>
-        <w:gridCol w:w="2015"/>
-        <w:gridCol w:w="2592"/>
-      </w:tblGrid>
-      <w:tr>
-        <w:tc>
-          <w:tcPr>
-            <w:tcW w:type="dxa" w:w="3312"/>
-            <w:shd w:val="clear" w:color="auto" w:fill="1F3A68"/>
-          </w:tcPr>
-          <w:p>
-            <w:r/>
-            <w:r>
-              <w:rPr>
-                <w:b/>
-                <w:color w:val="FFFFFF"/>
-                <w:sz w:val="18"/>
-              </w:rPr>
-              <w:t>Component</w:t>
-            </w:r>
-          </w:p>
-        </w:tc>
-        <w:tc>
-          <w:tcPr>
-            <w:tcW w:type="dxa" w:w="2016"/>
-            <w:shd w:val="clear" w:color="auto" w:fill="1F3A68"/>
-          </w:tcPr>
-          <w:p>
-            <w:r/>
-            <w:r>
-              <w:rPr>
-                <w:b/>
-                <w:color w:val="FFFFFF"/>
-                <w:sz w:val="18"/>
-              </w:rPr>
-              <w:t>Timing</w:t>
-            </w:r>
-          </w:p>
-        </w:tc>
-        <w:tc>
-          <w:tcPr>
-            <w:tcW w:type="dxa" w:w="2592"/>
-            <w:shd w:val="clear" w:color="auto" w:fill="1F3A68"/>
-          </w:tcPr>
-          <w:p>
-            <w:r/>
-            <w:r>
-              <w:rPr>
-                <w:b/>
-                <w:color w:val="FFFFFF"/>
-                <w:sz w:val="18"/>
-              </w:rPr>
-              <w:t>Low / Base / High</w:t>
-            </w:r>
-          </w:p>
-        </w:tc>
-      </w:tr>
-      <w:tr>
-        <w:tc>
-          <w:tcPr>
-            <w:tcW w:type="dxa" w:w="3312"/>
-          </w:tcPr>
-          <w:p>
-            <w:r/>
-            <w:r>
-              <w:rPr>
-                <w:b/>
-                <w:sz w:val="18"/>
-              </w:rPr>
-              <w:t>Cash at close</w:t>
-            </w:r>
-          </w:p>
-        </w:tc>
-        <w:tc>
-          <w:tcPr>
-            <w:tcW w:type="dxa" w:w="2016"/>
-          </w:tcPr>
-          <w:p>
-            <w:r/>
-            <w:r>
-              <w:rPr>
-                <w:sz w:val="18"/>
-              </w:rPr>
-              <w:t>Close ~Q1 FY27</w:t>
-            </w:r>
-          </w:p>
-        </w:tc>
-        <w:tc>
-          <w:tcPr>
-            <w:tcW w:type="dxa" w:w="2592"/>
-          </w:tcPr>
-          <w:p>
-            <w:r/>
-            <w:r>
-              <w:rPr>
-                <w:sz w:val="18"/>
-              </w:rPr>
-              <w:t>$2,510K</w:t>
-            </w:r>
-          </w:p>
-        </w:tc>
-      </w:tr>
-      <w:tr>
-        <w:tc>
-          <w:tcPr>
-            <w:tcW w:type="dxa" w:w="3312"/>
-          </w:tcPr>
-          <w:p>
-            <w:r/>
-            <w:r>
-              <w:rPr>
-                <w:b/>
-                <w:sz w:val="18"/>
-              </w:rPr>
-              <w:t>SSLC closing costs (Seller)</w:t>
-            </w:r>
-          </w:p>
-        </w:tc>
-        <w:tc>
-          <w:tcPr>
-            <w:tcW w:type="dxa" w:w="2016"/>
-          </w:tcPr>
-          <w:p>
-            <w:r/>
-            <w:r>
-              <w:rPr>
-                <w:sz w:val="18"/>
-              </w:rPr>
-              <w:t>Close</w:t>
-            </w:r>
-          </w:p>
-        </w:tc>
-        <w:tc>
-          <w:tcPr>
-            <w:tcW w:type="dxa" w:w="2592"/>
-          </w:tcPr>
-          <w:p>
-            <w:r/>
-            <w:r>
-              <w:rPr>
-                <w:sz w:val="18"/>
-              </w:rPr>
-              <w:t>$60K</w:t>
-            </w:r>
-          </w:p>
-        </w:tc>
-      </w:tr>
-      <w:tr>
-        <w:tc>
-          <w:tcPr>
-            <w:tcW w:type="dxa" w:w="3312"/>
-          </w:tcPr>
-          <w:p>
-            <w:r/>
-            <w:r>
-              <w:rPr>
-                <w:b/>
-                <w:sz w:val="18"/>
-              </w:rPr>
-              <w:t>Exos stake credit (non-cash)</w:t>
-            </w:r>
-          </w:p>
-        </w:tc>
-        <w:tc>
-          <w:tcPr>
-            <w:tcW w:type="dxa" w:w="2016"/>
-          </w:tcPr>
-          <w:p>
-            <w:r/>
-            <w:r>
-              <w:rPr>
-                <w:sz w:val="18"/>
-              </w:rPr>
-              <w:t>Close (credit)</w:t>
-            </w:r>
-          </w:p>
-        </w:tc>
-        <w:tc>
-          <w:tcPr>
-            <w:tcW w:type="dxa" w:w="2592"/>
-          </w:tcPr>
-          <w:p>
-            <w:r/>
-            <w:r>
-              <w:rPr>
-                <w:sz w:val="18"/>
-              </w:rPr>
-              <w:t>$790K</w:t>
-            </w:r>
-          </w:p>
-        </w:tc>
-      </w:tr>
-      <w:tr>
-        <w:tc>
-          <w:tcPr>
-            <w:tcW w:type="dxa" w:w="3312"/>
-          </w:tcPr>
-          <w:p>
-            <w:r/>
-            <w:r>
-              <w:rPr>
-                <w:b/>
-                <w:sz w:val="18"/>
-              </w:rPr>
-              <w:t>Debt relief (est., TBV)</w:t>
-            </w:r>
-          </w:p>
-        </w:tc>
-        <w:tc>
-          <w:tcPr>
-            <w:tcW w:type="dxa" w:w="2016"/>
-          </w:tcPr>
-          <w:p>
-            <w:r/>
-            <w:r>
-              <w:rPr>
-                <w:sz w:val="18"/>
-              </w:rPr>
-              <w:t>Close</w:t>
-            </w:r>
-          </w:p>
-        </w:tc>
-        <w:tc>
-          <w:tcPr>
-            <w:tcW w:type="dxa" w:w="2592"/>
-          </w:tcPr>
-          <w:p>
-            <w:r/>
-            <w:r>
-              <w:rPr>
-                <w:sz w:val="18"/>
-              </w:rPr>
-              <w:t>~$500K</w:t>
-            </w:r>
-          </w:p>
-        </w:tc>
-      </w:tr>
-      <w:tr>
-        <w:tc>
-          <w:tcPr>
-            <w:tcW w:type="dxa" w:w="3312"/>
-          </w:tcPr>
-          <w:p>
-            <w:r/>
-            <w:r>
-              <w:rPr>
-                <w:b/>
-                <w:sz w:val="18"/>
-              </w:rPr>
-              <w:t>WC bridge</w:t>
-            </w:r>
-          </w:p>
-        </w:tc>
-        <w:tc>
-          <w:tcPr>
-            <w:tcW w:type="dxa" w:w="2016"/>
-          </w:tcPr>
-          <w:p>
-            <w:r/>
-            <w:r>
-              <w:rPr>
-                <w:sz w:val="18"/>
-              </w:rPr>
-              <w:t>Close</w:t>
-            </w:r>
-          </w:p>
-        </w:tc>
-        <w:tc>
-          <w:tcPr>
-            <w:tcW w:type="dxa" w:w="2592"/>
-          </w:tcPr>
-          <w:p>
-            <w:r/>
-            <w:r>
-              <w:rPr>
-                <w:sz w:val="18"/>
-              </w:rPr>
-              <w:t>$500K / $500K / $500K</w:t>
-            </w:r>
-          </w:p>
-        </w:tc>
-      </w:tr>
-      <w:tr>
-        <w:tc>
-          <w:tcPr>
-            <w:tcW w:type="dxa" w:w="3312"/>
-          </w:tcPr>
-          <w:p>
-            <w:r/>
-            <w:r>
-              <w:rPr>
-                <w:b/>
-                <w:sz w:val="18"/>
-              </w:rPr>
-              <w:t>Subtotal: funding at close</w:t>
-            </w:r>
-          </w:p>
-        </w:tc>
-        <w:tc>
-          <w:tcPr>
-            <w:tcW w:type="dxa" w:w="2016"/>
-          </w:tcPr>
-          <w:p>
-            <w:r/>
-            <w:r>
-              <w:rPr>
-                <w:sz w:val="18"/>
-              </w:rPr>
-              <w:t>Close</w:t>
-            </w:r>
-          </w:p>
-        </w:tc>
-        <w:tc>
-          <w:tcPr>
-            <w:tcW w:type="dxa" w:w="2592"/>
-          </w:tcPr>
-          <w:p>
-            <w:r/>
-            <w:r>
-              <w:rPr>
-                <w:sz w:val="18"/>
-              </w:rPr>
-              <w:t>$4,360K / $4,360K / $4,360K</w:t>
-            </w:r>
-          </w:p>
-        </w:tc>
-      </w:tr>
-      <w:tr>
-        <w:tc>
-          <w:tcPr>
-            <w:tcW w:type="dxa" w:w="3312"/>
-          </w:tcPr>
-          <w:p>
-            <w:r/>
-            <w:r>
-              <w:rPr>
-                <w:b/>
-                <w:sz w:val="18"/>
-              </w:rPr>
-              <w:t>Tank earn-out (5 yr, 5%/yr)</w:t>
-            </w:r>
-          </w:p>
-        </w:tc>
-        <w:tc>
-          <w:tcPr>
-            <w:tcW w:type="dxa" w:w="2016"/>
-          </w:tcPr>
-          <w:p>
-            <w:r/>
-            <w:r>
-              <w:rPr>
-                <w:sz w:val="18"/>
-              </w:rPr>
-              <w:t>FY27–FY31</w:t>
-            </w:r>
-          </w:p>
-        </w:tc>
-        <w:tc>
-          <w:tcPr>
-            <w:tcW w:type="dxa" w:w="2592"/>
-          </w:tcPr>
-          <w:p>
-            <w:r/>
-            <w:r>
-              <w:rPr>
-                <w:sz w:val="18"/>
-              </w:rPr>
-              <w:t>$750K / $1,250K / $1,500K</w:t>
-            </w:r>
-          </w:p>
-        </w:tc>
-      </w:tr>
-      <w:tr>
-        <w:tc>
-          <w:tcPr>
-            <w:tcW w:type="dxa" w:w="3312"/>
-          </w:tcPr>
-          <w:p>
-            <w:r/>
-            <w:r>
-              <w:rPr>
-                <w:b/>
-                <w:sz w:val="18"/>
-              </w:rPr>
-              <w:t>Milestone earn-outs (5 triggers)</w:t>
-            </w:r>
-          </w:p>
-        </w:tc>
-        <w:tc>
-          <w:tcPr>
-            <w:tcW w:type="dxa" w:w="2016"/>
-          </w:tcPr>
-          <w:p>
-            <w:r/>
-            <w:r>
-              <w:rPr>
-                <w:sz w:val="18"/>
-              </w:rPr>
-              <w:t>FY27–FY31</w:t>
-            </w:r>
-          </w:p>
-        </w:tc>
-        <w:tc>
-          <w:tcPr>
-            <w:tcW w:type="dxa" w:w="2592"/>
-          </w:tcPr>
-          <w:p>
-            <w:r/>
-            <w:r>
-              <w:rPr>
-                <w:sz w:val="18"/>
-              </w:rPr>
-              <w:t>$200K / $650K / $1,100K</w:t>
-            </w:r>
-          </w:p>
-        </w:tc>
-      </w:tr>
-      <w:tr>
-        <w:tc>
-          <w:tcPr>
-            <w:tcW w:type="dxa" w:w="3312"/>
-          </w:tcPr>
-          <w:p>
-            <w:r/>
-            <w:r>
-              <w:rPr>
-                <w:b/>
-                <w:sz w:val="18"/>
-              </w:rPr>
-              <w:t>Exos stock earn-out</w:t>
-            </w:r>
-          </w:p>
-        </w:tc>
-        <w:tc>
-          <w:tcPr>
-            <w:tcW w:type="dxa" w:w="2016"/>
-          </w:tcPr>
-          <w:p>
-            <w:r/>
-            <w:r>
-              <w:rPr>
-                <w:sz w:val="18"/>
-              </w:rPr>
-              <w:t>Post-RTO ~FY28</w:t>
-            </w:r>
-          </w:p>
-        </w:tc>
-        <w:tc>
-          <w:tcPr>
-            <w:tcW w:type="dxa" w:w="2592"/>
-          </w:tcPr>
-          <w:p>
-            <w:r/>
-            <w:r>
-              <w:rPr>
-                <w:sz w:val="18"/>
-              </w:rPr>
-              <w:t>$1,000K / $1,875K / $3,000K</w:t>
-            </w:r>
-          </w:p>
-        </w:tc>
-      </w:tr>
-      <w:tr>
-        <w:tc>
-          <w:tcPr>
-            <w:tcW w:type="dxa" w:w="3312"/>
-          </w:tcPr>
-          <w:p>
-            <w:r/>
-            <w:r>
-              <w:rPr>
-                <w:b/>
-                <w:sz w:val="18"/>
-              </w:rPr>
-              <w:t>TOTAL OFFER VALUE (5-yr)</w:t>
-            </w:r>
-          </w:p>
-        </w:tc>
-        <w:tc>
-          <w:tcPr>
-            <w:tcW w:type="dxa" w:w="2016"/>
-          </w:tcPr>
-          <w:p>
-            <w:r/>
-            <w:r>
-              <w:rPr>
-                <w:sz w:val="18"/>
-              </w:rPr>
-              <w:t>FY27–FY31</w:t>
-            </w:r>
-          </w:p>
-        </w:tc>
-        <w:tc>
-          <w:tcPr>
-            <w:tcW w:type="dxa" w:w="2592"/>
-          </w:tcPr>
-          <w:p>
-            <w:r/>
-            <w:r>
-              <w:rPr>
-                <w:sz w:val="18"/>
-              </w:rPr>
-              <w:t>$6.3M / $8.1M / $10.0M</w:t>
-            </w:r>
-          </w:p>
-        </w:tc>
-      </w:tr>
-    </w:tbl>
-    <w:p>
-      <w:pPr>
-        <w:spacing w:after="60" w:before="0"/>
-      </w:pPr>
     </w:p>
     <w:p>
       <w:pPr>
@@ -2353,7 +1965,7 @@
       <w:r>
         <w:drawing>
           <wp:inline xmlns:a="http://schemas.openxmlformats.org/drawingml/2006/main" xmlns:pic="http://schemas.openxmlformats.org/drawingml/2006/picture">
-            <wp:extent cx="5029200" cy="2965649"/>
+            <wp:extent cx="4572000" cy="2693026"/>
             <wp:docPr id="1" name="Picture 1"/>
             <wp:cNvGraphicFramePr>
               <a:graphicFrameLocks noChangeAspect="1"/>
@@ -2374,7 +1986,7 @@
                   <pic:spPr>
                     <a:xfrm>
                       <a:off x="0" y="0"/>
-                      <a:ext cx="5029200" cy="2965649"/>
+                      <a:ext cx="4572000" cy="2693026"/>
                     </a:xfrm>
                     <a:prstGeom prst="rect"/>
                   </pic:spPr>
@@ -2383,20 +1995,6 @@
             </a:graphic>
           </wp:inline>
         </w:drawing>
-      </w:r>
-    </w:p>
-    <w:p>
-      <w:pPr>
-        <w:spacing w:after="40" w:before="0"/>
-      </w:pPr>
-      <w:r>
-        <w:rPr>
-          <w:b w:val="0"/>
-          <w:i/>
-          <w:color w:val="606060"/>
-          <w:sz w:val="17"/>
-        </w:rPr>
-        <w:t>Chart: SSLC_OptionB_Total_Compensation_5yr_2026-10-07.png  |  Full model: EXOS_SSLC_OptionB_Acquisition_Model_2026-10-07.xlsx</w:t>
       </w:r>
     </w:p>
     <w:p>
@@ -2518,7 +2116,7 @@
               <w:rPr>
                 <w:sz w:val="18"/>
               </w:rPr>
-              <w:t>$3,360,000 ($2.51M cash + $60K costs + $790K Exos stake credit)</w:t>
+              <w:t>$4,210,000 base at close ($2.51M cash + $60K costs + $790K Exos stake credit + ~$850K EAI equity at 409A)</w:t>
             </w:r>
           </w:p>
         </w:tc>
@@ -2741,7 +2339,7 @@
           <w:color w:val="C00000"/>
           <w:sz w:val="17"/>
         </w:rPr>
-        <w:t>DRAFT — INTERNAL — NEGOTIATING TERMS — John Quinn, CEO, Exos Aerospace — 2026-10-07</w:t>
+        <w:t>DRAFT — INTERNAL — NEGOTIATING TERMS — John Quinn, CEO, Exos Aerospace — 2026-10-09</w:t>
       </w:r>
     </w:p>
     <w:sectPr>

</xml_diff>

<commit_message>
SSLC Option B: 1.0% EAI up-front equity (Rule 504), re-verify totals — task #2414
John change 2026-10-09 14:12:
- Up-front equity: 0.5% → 1.0% EAI units (Rule 504, at 409A $169.7M = ~$1.697M)
- Subtotal at close: ~$5.21M → ~$6.06M
- Stock earn-out unchanged: 0.0%/0.25%/0.5%; total equity: 1.0%/1.25%/1.5%
- Expected totals: ~$7.0M / $8.58M / $10.16M (HIGH back above $10M)
- Offer summary: equity described as 'EAI units issued as part of Exos's Rule 504 offering'
- Model notes: Rule 504 $10M cap reminder + sec.gov reference; Rule 504 U.S.-only vs Japan Reg S flag

Files rebuilt: XLSX model, PNG chart, DOCX/PDF offer summary (re-attached to MC #2414 as v3/v4)
</commit_message>
<xml_diff>
--- a/drafts/Exos_SSLC_OptionB_Offer_Summary_2026-10-07.docx
+++ b/drafts/Exos_SSLC_OptionB_Offer_Summary_2026-10-07.docx
@@ -630,7 +630,7 @@
               <w:rPr>
                 <w:sz w:val="16"/>
               </w:rPr>
-              <w:t>Exos equity — 0.5% EAI units</w:t>
+              <w:t>Exos equity — 1.0% EAI units</w:t>
             </w:r>
             <w:r>
               <w:br/>
@@ -639,7 +639,7 @@
               <w:rPr>
                 <w:sz w:val="16"/>
               </w:rPr>
-              <w:t>at 409A (~$170M)</w:t>
+              <w:t>(Rule 504, at 409A ~$170M)</w:t>
             </w:r>
           </w:p>
         </w:tc>
@@ -656,7 +656,7 @@
               <w:rPr>
                 <w:sz w:val="16"/>
               </w:rPr>
-              <w:t>$850K</w:t>
+              <w:t>$1,697K</w:t>
             </w:r>
           </w:p>
         </w:tc>
@@ -673,7 +673,7 @@
               <w:rPr>
                 <w:sz w:val="16"/>
               </w:rPr>
-              <w:t>$850K</w:t>
+              <w:t>$1,697K</w:t>
             </w:r>
           </w:p>
         </w:tc>
@@ -690,7 +690,7 @@
               <w:rPr>
                 <w:sz w:val="16"/>
               </w:rPr>
-              <w:t>$850K</w:t>
+              <w:t>$1,697K</w:t>
             </w:r>
           </w:p>
         </w:tc>
@@ -704,7 +704,16 @@
               <w:rPr>
                 <w:sz w:val="16"/>
               </w:rPr>
-              <w:t>Committed at SSLC board acceptance;</w:t>
+              <w:t>EAI units issued as part of Exos's</w:t>
+            </w:r>
+            <w:r>
+              <w:br/>
+            </w:r>
+            <w:r>
+              <w:rPr>
+                <w:sz w:val="16"/>
+              </w:rPr>
+              <w:t>Rule 504 offering, at the 409A value;</w:t>
             </w:r>
             <w:r>
               <w:br/>
@@ -750,7 +759,7 @@
                 <w:b/>
                 <w:sz w:val="16"/>
               </w:rPr>
-              <w:t>$5,210K</w:t>
+              <w:t>$6,057K</w:t>
             </w:r>
           </w:p>
         </w:tc>
@@ -769,7 +778,7 @@
                 <w:b/>
                 <w:sz w:val="16"/>
               </w:rPr>
-              <w:t>$5,210K</w:t>
+              <w:t>$6,057K</w:t>
             </w:r>
           </w:p>
         </w:tc>
@@ -788,7 +797,7 @@
                 <w:b/>
                 <w:sz w:val="16"/>
               </w:rPr>
-              <w:t>$5,210K</w:t>
+              <w:t>$6,057K</w:t>
             </w:r>
           </w:p>
         </w:tc>
@@ -1429,7 +1438,7 @@
               <w:rPr>
                 <w:sz w:val="16"/>
               </w:rPr>
-              <w:t>(on top of 0.5% EAI up-front)</w:t>
+              <w:t>(on top of 1.0% EAI up-front)</w:t>
             </w:r>
           </w:p>
         </w:tc>
@@ -1463,7 +1472,7 @@
               <w:rPr>
                 <w:sz w:val="16"/>
               </w:rPr>
-              <w:t>$625K</w:t>
+              <w:t>$424K</w:t>
             </w:r>
           </w:p>
         </w:tc>
@@ -1480,7 +1489,7 @@
               <w:rPr>
                 <w:sz w:val="16"/>
               </w:rPr>
-              <w:t>$1,500K</w:t>
+              <w:t>$848K</w:t>
             </w:r>
           </w:p>
         </w:tc>
@@ -1503,7 +1512,7 @@
               <w:rPr>
                 <w:sz w:val="16"/>
               </w:rPr>
-              <w:t>At 409A ($170M): $0/$425K/$850K. Total Exos equity: 0.5%/0.75%/1.0%.</w:t>
+              <w:t>At 409A ($170M): $0/$424K/$848K. Total Exos equity: 1.0%/1.25%/1.5%.</w:t>
             </w:r>
           </w:p>
         </w:tc>
@@ -1540,7 +1549,7 @@
                 <w:b/>
                 <w:sz w:val="16"/>
               </w:rPr>
-              <w:t>$6,160K</w:t>
+              <w:t>$7,007K</w:t>
             </w:r>
           </w:p>
         </w:tc>
@@ -1559,7 +1568,7 @@
                 <w:b/>
                 <w:sz w:val="16"/>
               </w:rPr>
-              <w:t>$7,735K</w:t>
+              <w:t>$8,582K</w:t>
             </w:r>
           </w:p>
         </w:tc>
@@ -1578,7 +1587,7 @@
                 <w:b/>
                 <w:sz w:val="16"/>
               </w:rPr>
-              <w:t>$9,310K</w:t>
+              <w:t>$10,157K</w:t>
             </w:r>
           </w:p>
         </w:tc>
@@ -1712,7 +1721,7 @@
                 <w:color w:val="6B7280"/>
                 <w:sz w:val="16"/>
               </w:rPr>
-              <w:t>total stake 0.5/0.75/1.0% (EAI+earn-out);</w:t>
+              <w:t>total stake 1.0/1.25/1.5% (EAI+earn-out);</w:t>
             </w:r>
             <w:r>
               <w:br/>
@@ -1745,7 +1754,7 @@
           <w:color w:val="606060"/>
           <w:sz w:val="17"/>
         </w:rPr>
-        <w:t>Why this structure: SSLC holders receive real Exos equity at close (409A-valued, ~$850K) — not only contingent upside. It aligns them with Exos immediately. The earn-out stock is halved (0.0–0.5%), reducing Exos dilution risk.</w:t>
+        <w:t>Why this structure: SSLC holders receive real Exos equity at close (1.0% EAI units, 409A-valued ~$1.7M, issued as part of Exos's Rule 504 offering) — not only contingent upside. It aligns them with Exos immediately. The earn-out stock stays 0.0–0.5%, so total equity is 1.0–1.5%.</w:t>
       </w:r>
     </w:p>
     <w:p>
@@ -2116,7 +2125,7 @@
               <w:rPr>
                 <w:sz w:val="18"/>
               </w:rPr>
-              <w:t>$4,210,000 base at close ($2.51M cash + $60K costs + $790K Exos stake credit + ~$850K EAI equity at 409A)</w:t>
+              <w:t>$5,057,000 base at close ($2.51M cash + $60K costs + $790K Exos stake credit + ~$1.70M EAI equity at 409A; EAI units issued as part of Exos's Rule 504 offering)</w:t>
             </w:r>
           </w:p>
         </w:tc>
@@ -2312,6 +2321,20 @@
       <w:pPr>
         <w:spacing w:after="60" w:before="0"/>
       </w:pPr>
+    </w:p>
+    <w:p>
+      <w:pPr>
+        <w:spacing w:after="40" w:before="0"/>
+      </w:pPr>
+      <w:r>
+        <w:rPr>
+          <w:b w:val="0"/>
+          <w:i/>
+          <w:color w:val="606060"/>
+          <w:sz w:val="17"/>
+        </w:rPr>
+        <w:t>Model notes: Exos equity at close (~$1.7M) counts toward the Rule 504 $10M rolling 12-month cap; confirm remaining 504 capacity before issuance. Rule 504 reference: https://www.sec.gov/resources-small-businesses/exempt-offerings/exemption-limited-offerings-not-exceeding-10-million-rule-504-regulation-d. Rule 504 is U.S.-only; EAI units used in the separate Reg S Japan round must be tracked under a distinct exemption — the two offerings must remain separate.</w:t>
+      </w:r>
     </w:p>
     <w:p>
       <w:pPr>

</xml_diff>

<commit_message>
SSLC Option B: lockup + projected post-RTO value; offer summary ≤2 pages — task #2414
- EAI Lockup & Liquidity: Rule 504 restricted/legended; lockup=Exos principals;
  Rule 144 6-mo (reporting) / 1-yr (non-reporting); 6-mo path only after RTO;
  RTO preferred→common after shareholder vote + resale reg (S-1/S-3)
  [Board Brief 2026-09-04:16; Board Questions 2026-09-08:36,44]
- Lockup timeline table (6 rows) in offer summary; full detail in XLSX Sheet 9
- Projected post-RTO value (1.0% EAI alone, ~30% dil):
  Low $200M→$1.40M / Base $250M→$1.75M / High $300M→$2.10M post-dil
  vs 409A issuance ~$1.70M; Rule 10b-5 cautionary statement
- Removed Section 2 (With vs Without) from offer summary → model reference only
- Offer summary trimmed to 2 pages (pdfinfo verified)
</commit_message>
<xml_diff>
--- a/drafts/Exos_SSLC_OptionB_Offer_Summary_2026-10-07.docx
+++ b/drafts/Exos_SSLC_OptionB_Offer_Summary_2026-10-07.docx
@@ -70,24 +70,11 @@
       <w:r>
         <w:rPr>
           <w:b w:val="0"/>
-          <w:i w:val="0"/>
-          <w:sz w:val="20"/>
-        </w:rPr>
-        <w:t>The Exos offer delivers liquidity, debt relief, and equity upside — without requiring any additional capital call from current SSLC shareholders.</w:t>
-      </w:r>
-    </w:p>
-    <w:p>
-      <w:pPr>
-        <w:spacing w:after="80" w:before="0"/>
-      </w:pPr>
-      <w:r>
-        <w:rPr>
-          <w:b w:val="0"/>
           <w:i/>
           <w:color w:val="2E75B6"/>
           <w:sz w:val="19"/>
         </w:rPr>
-        <w:t>The up-front price reflects what the numbers support today. The earn-outs are how that value grows: as goals are met — IM tank deliveries, revenue milestones and the Exos listing — SSLC holders share directly in the upside.</w:t>
+        <w:t>Up-front price reflects today's numbers; earn-outs let SSLC holders share directly in tank deliveries, revenue milestones, and the Exos listing.</w:t>
       </w:r>
     </w:p>
     <w:p>
@@ -1760,43 +1747,21 @@
     <w:p>
       <w:pPr>
         <w:spacing w:after="40" w:before="0"/>
-        <w:ind w:left="288"/>
-      </w:pPr>
-      <w:r>
-        <w:t xml:space="preserve">•  </w:t>
-      </w:r>
+      </w:pPr>
       <w:r>
         <w:rPr>
-          <w:b/>
+          <w:b w:val="0"/>
+          <w:i/>
+          <w:color w:val="606060"/>
+          <w:sz w:val="17"/>
         </w:rPr>
-        <w:t xml:space="preserve">No additional capital calls  </w:t>
-      </w:r>
-      <w:r>
-        <w:t>Once closed, SSLC's standalone cash burn stops entirely.</w:t>
+        <w:t>Chart: SSLC_OptionB_Total_Compensation_5yr_2026-10-07.png  ·  Full model: EXOS_SSLC_OptionB_Acquisition_Model_2026-10-07.xlsx → 'Total Compensation' sheet  ·  IM program continuity: Exos-SSLC continues the Intuitive Machines contract with no delivery interruption.</w:t>
       </w:r>
     </w:p>
     <w:p>
       <w:pPr>
-        <w:spacing w:after="40" w:before="0"/>
-        <w:ind w:left="288"/>
-      </w:pPr>
-      <w:r>
-        <w:t xml:space="preserve">•  </w:t>
-      </w:r>
-      <w:r>
-        <w:rPr>
-          <w:b/>
-        </w:rPr>
-        <w:t xml:space="preserve">IM program continuity  </w:t>
-      </w:r>
-      <w:r>
-        <w:t>Exos-SSLC continues the Intuitive Machines contract with no delivery interruption.</w:t>
-      </w:r>
-    </w:p>
-    <w:p>
-      <w:pPr>
         <w:keepNext/>
-        <w:spacing w:after="60" w:before="120"/>
+        <w:spacing w:after="60" w:before="60"/>
       </w:pPr>
       <w:r>
         <w:rPr>
@@ -1805,220 +1770,7 @@
           <w:color w:val="1F3A68"/>
           <w:sz w:val="24"/>
         </w:rPr>
-        <w:t>2.  Why the Growth Trajectory Requires Exos Capital</w:t>
-      </w:r>
-    </w:p>
-    <w:p>
-      <w:pPr>
-        <w:spacing w:after="60" w:before="0"/>
-      </w:pPr>
-      <w:r>
-        <w:rPr>
-          <w:b w:val="0"/>
-          <w:i w:val="0"/>
-          <w:sz w:val="20"/>
-        </w:rPr>
-        <w:t>The bottleneck is not the technology or the IM demand — it is working capital.  SSLC's most recent quarter (FY27 Q1) came in at $713K in revenue.  Hitting $5.1M for FY27 requires averaging $1.46M per quarter in Q2–Q4 — approximately 2.05× that pace — starting immediately.  That doubling is not achievable on SSLC's current $198K cash balance.</w:t>
-      </w:r>
-    </w:p>
-    <w:p>
-      <w:pPr>
-        <w:spacing w:after="40" w:before="60"/>
-      </w:pPr>
-      <w:r>
-        <w:rPr>
-          <w:b/>
-          <w:i w:val="0"/>
-          <w:sz w:val="20"/>
-        </w:rPr>
-        <w:t>Standalone constraints (SSLC's own numbers):</w:t>
-      </w:r>
-    </w:p>
-    <w:p>
-      <w:pPr>
-        <w:spacing w:after="40" w:before="0"/>
-        <w:ind w:left="288"/>
-      </w:pPr>
-      <w:r>
-        <w:t xml:space="preserve">•  </w:t>
-      </w:r>
-      <w:r>
-        <w:rPr>
-          <w:b/>
-        </w:rPr>
-        <w:t xml:space="preserve">Cash position  </w:t>
-      </w:r>
-      <w:r>
-        <w:t>$198K at October 2, 2026 — roughly one month of operating burn.</w:t>
-      </w:r>
-    </w:p>
-    <w:p>
-      <w:pPr>
-        <w:spacing w:after="40" w:before="0"/>
-        <w:ind w:left="288"/>
-      </w:pPr>
-      <w:r>
-        <w:t xml:space="preserve">•  </w:t>
-      </w:r>
-      <w:r>
-        <w:rPr>
-          <w:b/>
-        </w:rPr>
-        <w:t xml:space="preserve">Working capital gap  </w:t>
-      </w:r>
-      <w:r>
-        <w:t>$300K–$700K needed to maintain delivery commitments and service new IM orders — before SSLC can ramp to the $5.1M/year target run rate.</w:t>
-      </w:r>
-    </w:p>
-    <w:p>
-      <w:pPr>
-        <w:spacing w:after="40" w:before="0"/>
-        <w:ind w:left="288"/>
-      </w:pPr>
-      <w:r>
-        <w:t xml:space="preserve">•  </w:t>
-      </w:r>
-      <w:r>
-        <w:rPr>
-          <w:b/>
-        </w:rPr>
-        <w:t xml:space="preserve">Operating history  </w:t>
-      </w:r>
-      <w:r>
-        <w:t>FY26 operating loss: −$416K. No self-funding path to production scale.</w:t>
-      </w:r>
-    </w:p>
-    <w:p>
-      <w:pPr>
-        <w:spacing w:after="40" w:before="0"/>
-        <w:ind w:left="288"/>
-      </w:pPr>
-      <w:r>
-        <w:t xml:space="preserve">•  </w:t>
-      </w:r>
-      <w:r>
-        <w:rPr>
-          <w:b/>
-        </w:rPr>
-        <w:t xml:space="preserve">He-tank rework  </w:t>
-      </w:r>
-      <w:r>
-        <w:t>Rev3 GHe tank 4,400 psi proof issue unresolved (MC #3056). Remediation cost ~$175K to COPV ($300K gap). Resolves cleanly as intercompany under Exos.</w:t>
-      </w:r>
-    </w:p>
-    <w:p>
-      <w:pPr>
-        <w:spacing w:after="40" w:before="0"/>
-        <w:ind w:left="288"/>
-      </w:pPr>
-      <w:r>
-        <w:t xml:space="preserve">•  </w:t>
-      </w:r>
-      <w:r>
-        <w:rPr>
-          <w:b/>
-        </w:rPr>
-        <w:t xml:space="preserve">No capex capacity  </w:t>
-      </w:r>
-      <w:r>
-        <w:t>Production-scale equipment and headcount additions are not fundable from SSLC's cash position. Growth is capped at current run-rate without outside capital.</w:t>
-      </w:r>
-    </w:p>
-    <w:p>
-      <w:pPr>
-        <w:spacing w:after="40" w:before="0"/>
-      </w:pPr>
-      <w:r>
-        <w:rPr>
-          <w:b w:val="0"/>
-          <w:i/>
-          <w:color w:val="606060"/>
-          <w:sz w:val="17"/>
-        </w:rPr>
-        <w:t>The With-vs-Without comparison, year-by-year CAGR figures, and cumulative revenue gap are in the model spreadsheet: EXOS_SSLC_OptionB_Acquisition_Model_2026-10-07.xlsx, sheet 'With vs Without Exos Capital'.</w:t>
-      </w:r>
-    </w:p>
-    <w:p>
-      <w:pPr>
-        <w:keepNext/>
-        <w:spacing w:after="60" w:before="80"/>
-      </w:pPr>
-      <w:r>
-        <w:rPr>
-          <w:b/>
-          <w:i w:val="0"/>
-          <w:color w:val="1F3A68"/>
-          <w:sz w:val="24"/>
-        </w:rPr>
-        <w:t>3.  Total Compensation — 5-Year View (FY27–FY31)</w:t>
-      </w:r>
-    </w:p>
-    <w:p>
-      <w:pPr>
-        <w:spacing w:after="40" w:before="0"/>
-      </w:pPr>
-      <w:r>
-        <w:rPr>
-          <w:b w:val="0"/>
-          <w:i/>
-          <w:color w:val="606060"/>
-          <w:sz w:val="17"/>
-        </w:rPr>
-        <w:t>See chart: SSLC_OptionB_Total_Compensation_5yr_2026-10-07.png  |  Full model: EXOS_SSLC_OptionB_Acquisition_Model_2026-10-07.xlsx → 'Total Compensation' sheet.</w:t>
-      </w:r>
-    </w:p>
-    <w:p>
-      <w:pPr>
-        <w:jc w:val="center"/>
-      </w:pPr>
-      <w:r>
-        <w:drawing>
-          <wp:inline xmlns:a="http://schemas.openxmlformats.org/drawingml/2006/main" xmlns:pic="http://schemas.openxmlformats.org/drawingml/2006/picture">
-            <wp:extent cx="4572000" cy="2693026"/>
-            <wp:docPr id="1" name="Picture 1"/>
-            <wp:cNvGraphicFramePr>
-              <a:graphicFrameLocks noChangeAspect="1"/>
-            </wp:cNvGraphicFramePr>
-            <a:graphic>
-              <a:graphicData uri="http://schemas.openxmlformats.org/drawingml/2006/picture">
-                <pic:pic>
-                  <pic:nvPicPr>
-                    <pic:cNvPr id="0" name="SSLC_OptionB_Total_Compensation_5yr_2026-10-07.png"/>
-                    <pic:cNvPicPr/>
-                  </pic:nvPicPr>
-                  <pic:blipFill>
-                    <a:blip r:embed="rId19"/>
-                    <a:stretch>
-                      <a:fillRect/>
-                    </a:stretch>
-                  </pic:blipFill>
-                  <pic:spPr>
-                    <a:xfrm>
-                      <a:off x="0" y="0"/>
-                      <a:ext cx="4572000" cy="2693026"/>
-                    </a:xfrm>
-                    <a:prstGeom prst="rect"/>
-                  </pic:spPr>
-                </pic:pic>
-              </a:graphicData>
-            </a:graphic>
-          </wp:inline>
-        </w:drawing>
-      </w:r>
-    </w:p>
-    <w:p>
-      <w:pPr>
-        <w:keepNext/>
-        <w:spacing w:after="60" w:before="80"/>
-      </w:pPr>
-      <w:r>
-        <w:rPr>
-          <w:b/>
-          <w:i w:val="0"/>
-          <w:color w:val="1F3A68"/>
-          <w:sz w:val="24"/>
-        </w:rPr>
-        <w:t>4.  Key Terms</w:t>
+        <w:t>3.  Key Terms</w:t>
       </w:r>
     </w:p>
     <w:tbl>
@@ -2094,7 +1846,7 @@
               <w:rPr>
                 <w:sz w:val="18"/>
               </w:rPr>
-              <w:t>May 2025 Asset Acquisition Agreement, §3 exclusivity trigger (non-exclusive → exclusive upon Exos financing agreement)</w:t>
+              <w:t>May 2025 Asset Acquisition Agreement, §3 exclusivity trigger</w:t>
             </w:r>
           </w:p>
         </w:tc>
@@ -2125,7 +1877,7 @@
               <w:rPr>
                 <w:sz w:val="18"/>
               </w:rPr>
-              <w:t>$5,057,000 base at close ($2.51M cash + $60K costs + $790K Exos stake credit + ~$1.70M EAI equity at 409A; EAI units issued as part of Exos's Rule 504 offering)</w:t>
+              <w:t>$5,057,000 base at close ($2.51M cash + $60K costs + $790K Exos stake credit + ~$1.70M EAI equity at 409A, Rule 504)</w:t>
             </w:r>
           </w:p>
         </w:tc>
@@ -2156,7 +1908,7 @@
               <w:rPr>
                 <w:sz w:val="18"/>
               </w:rPr>
-              <w:t>90 days from SSLC confirmation; extension not unreasonably withheld while financing works in good faith (§3)</w:t>
+              <w:t>90 days from SSLC confirmation; extension not unreasonably withheld (§3)</w:t>
             </w:r>
           </w:p>
         </w:tc>
@@ -2219,68 +1971,6 @@
                 <w:sz w:val="18"/>
               </w:rPr>
               <w:t>Paid at face at close (est. ~$500K; verify QuickBooks)</w:t>
-            </w:r>
-          </w:p>
-        </w:tc>
-      </w:tr>
-      <w:tr>
-        <w:tc>
-          <w:tcPr>
-            <w:tcW w:type="dxa" w:w="2736"/>
-          </w:tcPr>
-          <w:p>
-            <w:r/>
-            <w:r>
-              <w:rPr>
-                <w:b/>
-                <w:sz w:val="18"/>
-              </w:rPr>
-              <w:t>Disinterested directors</w:t>
-            </w:r>
-          </w:p>
-        </w:tc>
-        <w:tc>
-          <w:tcPr>
-            <w:tcW w:type="dxa" w:w="5904"/>
-          </w:tcPr>
-          <w:p>
-            <w:r/>
-            <w:r>
-              <w:rPr>
-                <w:sz w:val="18"/>
-              </w:rPr>
-              <w:t>John Quinn abstains from SSLC board vote; sends as Exos CEO (Cal. Corp. Code §310)</w:t>
-            </w:r>
-          </w:p>
-        </w:tc>
-      </w:tr>
-      <w:tr>
-        <w:tc>
-          <w:tcPr>
-            <w:tcW w:type="dxa" w:w="2736"/>
-          </w:tcPr>
-          <w:p>
-            <w:r/>
-            <w:r>
-              <w:rPr>
-                <w:b/>
-                <w:sz w:val="18"/>
-              </w:rPr>
-              <w:t>Fairness opinion</w:t>
-            </w:r>
-          </w:p>
-        </w:tc>
-        <w:tc>
-          <w:tcPr>
-            <w:tcW w:type="dxa" w:w="5904"/>
-          </w:tcPr>
-          <w:p>
-            <w:r/>
-            <w:r>
-              <w:rPr>
-                <w:sz w:val="18"/>
-              </w:rPr>
-              <w:t>Eqvista engaged 8/14/2026; agreement still unsigned (held ~1 month)</w:t>
             </w:r>
           </w:p>
         </w:tc>
@@ -2333,8 +2023,669 @@
           <w:color w:val="606060"/>
           <w:sz w:val="17"/>
         </w:rPr>
-        <w:t>Model notes: Exos equity at close (~$1.7M) counts toward the Rule 504 $10M rolling 12-month cap; confirm remaining 504 capacity before issuance. Rule 504 reference: https://www.sec.gov/resources-small-businesses/exempt-offerings/exemption-limited-offerings-not-exceeding-10-million-rule-504-regulation-d. Rule 504 is U.S.-only; EAI units used in the separate Reg S Japan round must be tracked under a distinct exemption — the two offerings must remain separate.</w:t>
+        <w:t>504 cap: ~$1.7M counts toward the Rule 504 $10M rolling 12-month cap; confirm remaining capacity. Rule 504 is U.S.-only; EAI units in the Japan round are Reg S — the two must remain distinct. See model → 'EAI Lockup &amp; Liquidity' sheet for full detail.</w:t>
       </w:r>
+    </w:p>
+    <w:p>
+      <w:pPr>
+        <w:keepNext/>
+        <w:spacing w:after="60" w:before="60"/>
+      </w:pPr>
+      <w:r>
+        <w:rPr>
+          <w:b/>
+          <w:i w:val="0"/>
+          <w:color w:val="1F3A68"/>
+          <w:sz w:val="24"/>
+        </w:rPr>
+        <w:t>4.  EAI Unit Lockup &amp; Liquidity</w:t>
+      </w:r>
+    </w:p>
+    <w:p>
+      <w:pPr>
+        <w:spacing w:after="40" w:before="0"/>
+      </w:pPr>
+      <w:r>
+        <w:rPr>
+          <w:b w:val="0"/>
+          <w:i/>
+          <w:color w:val="606060"/>
+          <w:sz w:val="17"/>
+        </w:rPr>
+        <w:t>Restricted securities — Rule 504 Reg D, restrictive legend; not freely tradeable at issuance. Same lockup as Exos principals. Rule 504 ref: https://www.sec.gov/resources-small-businesses/exempt-offerings/exemption-limited-offerings-not-exceeding-10-million-rule-504-regulation-d</w:t>
+      </w:r>
+    </w:p>
+    <w:p>
+      <w:pPr>
+        <w:spacing w:after="40" w:before="0"/>
+        <w:ind w:left="288"/>
+      </w:pPr>
+      <w:r>
+        <w:t xml:space="preserve">•  </w:t>
+      </w:r>
+      <w:r>
+        <w:rPr>
+          <w:b/>
+        </w:rPr>
+        <w:t xml:space="preserve">Rule 144 resale.  </w:t>
+      </w:r>
+      <w:r>
+        <w:t>Holding period 6 months (reporting issuer) or 1 year (non-reporting). Exos is currently non-reporting; 6-month path opens only after RTO. 17 CFR 230.144(d): https://www.ecfr.gov/current/title-17/chapter-II/part-230/section-230.144</w:t>
+      </w:r>
+    </w:p>
+    <w:p>
+      <w:pPr>
+        <w:spacing w:after="40" w:before="0"/>
+        <w:ind w:left="288"/>
+      </w:pPr>
+      <w:r>
+        <w:t xml:space="preserve">•  </w:t>
+      </w:r>
+      <w:r>
+        <w:rPr>
+          <w:b/>
+        </w:rPr>
+        <w:t xml:space="preserve">RTO structure — preferred at close.  </w:t>
+      </w:r>
+      <w:r>
+        <w:t>At RTO close, founders/legacy holders receive unregistered non-voting non-convertible preferred (avoids NASDAQ Rule 5635). Converts to common + becomes liquid only after: (i) shareholder vote (proxy ~30 days post-close) and (ii) effective resale registration (S-1/S-3). EAI units follow this same path. [Board Brief 2026-09-04:16; Board Questions 2026-09-08:36,44]</w:t>
+      </w:r>
+    </w:p>
+    <w:tbl>
+      <w:tblPr>
+        <w:tblW w:type="auto" w:w="0"/>
+        <w:jc w:val="center"/>
+        <w:tblLayout w:type="fixed"/>
+        <w:tblLook w:firstColumn="1" w:firstRow="1" w:lastColumn="0" w:lastRow="0" w:noHBand="0" w:noVBand="1" w:val="04A0"/>
+      </w:tblPr>
+      <w:tblGrid>
+        <w:gridCol w:w="3744"/>
+        <w:gridCol w:w="5616"/>
+      </w:tblGrid>
+      <w:tr>
+        <w:tc>
+          <w:tcPr>
+            <w:tcW w:type="dxa" w:w="3744"/>
+            <w:shd w:val="clear" w:color="auto" w:fill="375623"/>
+          </w:tcPr>
+          <w:p>
+            <w:r/>
+            <w:r>
+              <w:rPr>
+                <w:b/>
+                <w:color w:val="FFFFFF"/>
+                <w:sz w:val="18"/>
+              </w:rPr>
+              <w:t>Milestone</w:t>
+            </w:r>
+          </w:p>
+        </w:tc>
+        <w:tc>
+          <w:tcPr>
+            <w:tcW w:type="dxa" w:w="5616"/>
+            <w:shd w:val="clear" w:color="auto" w:fill="375623"/>
+          </w:tcPr>
+          <w:p>
+            <w:r/>
+            <w:r>
+              <w:rPr>
+                <w:b/>
+                <w:color w:val="FFFFFF"/>
+                <w:sz w:val="18"/>
+              </w:rPr>
+              <w:t>Target / Status</w:t>
+            </w:r>
+          </w:p>
+        </w:tc>
+      </w:tr>
+      <w:tr>
+        <w:tc>
+          <w:tcPr>
+            <w:tcW w:type="dxa" w:w="3744"/>
+          </w:tcPr>
+          <w:p>
+            <w:r/>
+            <w:r>
+              <w:rPr>
+                <w:b/>
+                <w:sz w:val="18"/>
+              </w:rPr>
+              <w:t>Board acceptance</w:t>
+            </w:r>
+          </w:p>
+        </w:tc>
+        <w:tc>
+          <w:tcPr>
+            <w:tcW w:type="dxa" w:w="5616"/>
+          </w:tcPr>
+          <w:p>
+            <w:r/>
+            <w:r>
+              <w:rPr>
+                <w:sz w:val="18"/>
+              </w:rPr>
+              <w:t>D+0 — units committed; not yet issued</w:t>
+            </w:r>
+          </w:p>
+        </w:tc>
+      </w:tr>
+      <w:tr>
+        <w:tc>
+          <w:tcPr>
+            <w:tcW w:type="dxa" w:w="3744"/>
+          </w:tcPr>
+          <w:p>
+            <w:r/>
+            <w:r>
+              <w:rPr>
+                <w:b/>
+                <w:sz w:val="18"/>
+              </w:rPr>
+              <w:t>Financing close — units issued</w:t>
+            </w:r>
+          </w:p>
+        </w:tc>
+        <w:tc>
+          <w:tcPr>
+            <w:tcW w:type="dxa" w:w="5616"/>
+          </w:tcPr>
+          <w:p>
+            <w:r/>
+            <w:r>
+              <w:rPr>
+                <w:sz w:val="18"/>
+              </w:rPr>
+              <w:t>Targeted Q1 FY27; 1-yr Rule 144 clock starts</w:t>
+            </w:r>
+          </w:p>
+        </w:tc>
+      </w:tr>
+      <w:tr>
+        <w:tc>
+          <w:tcPr>
+            <w:tcW w:type="dxa" w:w="3744"/>
+          </w:tcPr>
+          <w:p>
+            <w:r/>
+            <w:r>
+              <w:rPr>
+                <w:b/>
+                <w:sz w:val="18"/>
+              </w:rPr>
+              <w:t>Targeted RTO close</w:t>
+            </w:r>
+          </w:p>
+        </w:tc>
+        <w:tc>
+          <w:tcPr>
+            <w:tcW w:type="dxa" w:w="5616"/>
+          </w:tcPr>
+          <w:p>
+            <w:r/>
+            <w:r>
+              <w:rPr>
+                <w:sz w:val="18"/>
+              </w:rPr>
+              <w:t>~6 months post-financing (targeted, not assured)</w:t>
+            </w:r>
+          </w:p>
+        </w:tc>
+      </w:tr>
+      <w:tr>
+        <w:tc>
+          <w:tcPr>
+            <w:tcW w:type="dxa" w:w="3744"/>
+          </w:tcPr>
+          <w:p>
+            <w:r/>
+            <w:r>
+              <w:rPr>
+                <w:b/>
+                <w:sz w:val="18"/>
+              </w:rPr>
+              <w:t>Conversion vote + resale reg. effective</w:t>
+            </w:r>
+          </w:p>
+        </w:tc>
+        <w:tc>
+          <w:tcPr>
+            <w:tcW w:type="dxa" w:w="5616"/>
+          </w:tcPr>
+          <w:p>
+            <w:r/>
+            <w:r>
+              <w:rPr>
+                <w:sz w:val="18"/>
+              </w:rPr>
+              <w:t>~30–90 days post-RTO; preferred → common</w:t>
+            </w:r>
+          </w:p>
+        </w:tc>
+      </w:tr>
+      <w:tr>
+        <w:tc>
+          <w:tcPr>
+            <w:tcW w:type="dxa" w:w="3744"/>
+          </w:tcPr>
+          <w:p>
+            <w:r/>
+            <w:r>
+              <w:rPr>
+                <w:b/>
+                <w:sz w:val="18"/>
+              </w:rPr>
+              <w:t>Rule 144 eligibility</w:t>
+            </w:r>
+          </w:p>
+        </w:tc>
+        <w:tc>
+          <w:tcPr>
+            <w:tcW w:type="dxa" w:w="5616"/>
+          </w:tcPr>
+          <w:p>
+            <w:r/>
+            <w:r>
+              <w:rPr>
+                <w:sz w:val="18"/>
+              </w:rPr>
+              <w:t>6-mo (after reporting); 1-yr if non-reporting at issuance</w:t>
+            </w:r>
+          </w:p>
+        </w:tc>
+      </w:tr>
+      <w:tr>
+        <w:tc>
+          <w:tcPr>
+            <w:tcW w:type="dxa" w:w="3744"/>
+          </w:tcPr>
+          <w:p>
+            <w:r/>
+            <w:r>
+              <w:rPr>
+                <w:b/>
+                <w:sz w:val="18"/>
+              </w:rPr>
+              <w:t>ALL DATES</w:t>
+            </w:r>
+          </w:p>
+        </w:tc>
+        <w:tc>
+          <w:tcPr>
+            <w:tcW w:type="dxa" w:w="5616"/>
+          </w:tcPr>
+          <w:p>
+            <w:r/>
+            <w:r>
+              <w:rPr>
+                <w:sz w:val="18"/>
+              </w:rPr>
+              <w:t>Targeted, not assured. RTO may not close.</w:t>
+            </w:r>
+          </w:p>
+        </w:tc>
+      </w:tr>
+    </w:tbl>
+    <w:p>
+      <w:pPr>
+        <w:spacing w:after="60" w:before="0"/>
+      </w:pPr>
+    </w:p>
+    <w:p>
+      <w:pPr>
+        <w:keepNext/>
+        <w:spacing w:after="60" w:before="60"/>
+      </w:pPr>
+      <w:r>
+        <w:rPr>
+          <w:b/>
+          <w:i w:val="0"/>
+          <w:color w:val="1F3A68"/>
+          <w:sz w:val="24"/>
+        </w:rPr>
+        <w:t>5.  Projected Post-RTO Value  (Projection — Not a Promise)</w:t>
+      </w:r>
+    </w:p>
+    <w:p>
+      <w:pPr>
+        <w:spacing w:after="40" w:before="0"/>
+      </w:pPr>
+      <w:r>
+        <w:rPr>
+          <w:b w:val="0"/>
+          <w:i/>
+          <w:color w:val="606060"/>
+          <w:sz w:val="17"/>
+        </w:rPr>
+        <w:t>Forward-looking projection — management assumptions (RTO completion, listing valuation, ~30% dilution). Not a guarantee; actual results may differ. RTO may not close. SEC Rule 10b-5, 17 CFR 240.10b-5 (https://www.ecfr.gov/current/title-17/chapter-II/part-240/section-240.10b-5) antifraud rules apply. 409A issuance value: ~$1.70M. Up-front 1.0% EAI only; earn-out column is additional at listing.</w:t>
+      </w:r>
+    </w:p>
+    <w:tbl>
+      <w:tblPr>
+        <w:tblW w:type="auto" w:w="0"/>
+        <w:jc w:val="center"/>
+        <w:tblLayout w:type="fixed"/>
+        <w:tblLook w:firstColumn="1" w:firstRow="1" w:lastColumn="0" w:lastRow="0" w:noHBand="0" w:noVBand="1" w:val="04A0"/>
+      </w:tblPr>
+      <w:tblGrid>
+        <w:gridCol w:w="1224"/>
+        <w:gridCol w:w="1224"/>
+        <w:gridCol w:w="1584"/>
+        <w:gridCol w:w="1872"/>
+        <w:gridCol w:w="2015"/>
+      </w:tblGrid>
+      <w:tr>
+        <w:tc>
+          <w:tcPr>
+            <w:tcW w:type="dxa" w:w="1224"/>
+            <w:shd w:val="clear" w:color="auto" w:fill="1F3A68"/>
+          </w:tcPr>
+          <w:p>
+            <w:r/>
+            <w:r>
+              <w:rPr>
+                <w:b/>
+                <w:color w:val="FFFFFF"/>
+                <w:sz w:val="18"/>
+              </w:rPr>
+              <w:t>Scenario</w:t>
+            </w:r>
+          </w:p>
+        </w:tc>
+        <w:tc>
+          <w:tcPr>
+            <w:tcW w:type="dxa" w:w="1224"/>
+            <w:shd w:val="clear" w:color="auto" w:fill="1F3A68"/>
+          </w:tcPr>
+          <w:p>
+            <w:r/>
+            <w:r>
+              <w:rPr>
+                <w:b/>
+                <w:color w:val="FFFFFF"/>
+                <w:sz w:val="18"/>
+              </w:rPr>
+              <w:t>RTO MEV</w:t>
+            </w:r>
+          </w:p>
+        </w:tc>
+        <w:tc>
+          <w:tcPr>
+            <w:tcW w:type="dxa" w:w="1584"/>
+            <w:shd w:val="clear" w:color="auto" w:fill="1F3A68"/>
+          </w:tcPr>
+          <w:p>
+            <w:r/>
+            <w:r>
+              <w:rPr>
+                <w:b/>
+                <w:color w:val="FFFFFF"/>
+                <w:sz w:val="18"/>
+              </w:rPr>
+              <w:t>1.0% pre-dil</w:t>
+            </w:r>
+          </w:p>
+        </w:tc>
+        <w:tc>
+          <w:tcPr>
+            <w:tcW w:type="dxa" w:w="1872"/>
+            <w:shd w:val="clear" w:color="auto" w:fill="1F3A68"/>
+          </w:tcPr>
+          <w:p>
+            <w:r/>
+            <w:r>
+              <w:rPr>
+                <w:b/>
+                <w:color w:val="FFFFFF"/>
+                <w:sz w:val="18"/>
+              </w:rPr>
+              <w:t>1.0% post-dil</w:t>
+              <w:br/>
+              <w:t>(~30% dil)</w:t>
+            </w:r>
+          </w:p>
+        </w:tc>
+        <w:tc>
+          <w:tcPr>
+            <w:tcW w:type="dxa" w:w="2016"/>
+            <w:shd w:val="clear" w:color="auto" w:fill="1F3A68"/>
+          </w:tcPr>
+          <w:p>
+            <w:r/>
+            <w:r>
+              <w:rPr>
+                <w:b/>
+                <w:color w:val="FFFFFF"/>
+                <w:sz w:val="18"/>
+              </w:rPr>
+              <w:t>+ earn-out at listing</w:t>
+            </w:r>
+          </w:p>
+        </w:tc>
+      </w:tr>
+      <w:tr>
+        <w:tc>
+          <w:tcPr>
+            <w:tcW w:type="dxa" w:w="1224"/>
+          </w:tcPr>
+          <w:p>
+            <w:r/>
+            <w:r>
+              <w:rPr>
+                <w:b/>
+                <w:sz w:val="18"/>
+              </w:rPr>
+              <w:t>Low</w:t>
+            </w:r>
+          </w:p>
+        </w:tc>
+        <w:tc>
+          <w:tcPr>
+            <w:tcW w:type="dxa" w:w="1224"/>
+          </w:tcPr>
+          <w:p>
+            <w:r/>
+            <w:r>
+              <w:rPr>
+                <w:sz w:val="18"/>
+              </w:rPr>
+              <w:t>$200M</w:t>
+            </w:r>
+          </w:p>
+        </w:tc>
+        <w:tc>
+          <w:tcPr>
+            <w:tcW w:type="dxa" w:w="1584"/>
+          </w:tcPr>
+          <w:p>
+            <w:r/>
+            <w:r>
+              <w:rPr>
+                <w:sz w:val="18"/>
+              </w:rPr>
+              <w:t>$2.00M</w:t>
+            </w:r>
+          </w:p>
+        </w:tc>
+        <w:tc>
+          <w:tcPr>
+            <w:tcW w:type="dxa" w:w="1872"/>
+          </w:tcPr>
+          <w:p>
+            <w:r/>
+            <w:r>
+              <w:rPr>
+                <w:sz w:val="18"/>
+              </w:rPr>
+              <w:t>$1.40M</w:t>
+            </w:r>
+          </w:p>
+        </w:tc>
+        <w:tc>
+          <w:tcPr>
+            <w:tcW w:type="dxa" w:w="2016"/>
+          </w:tcPr>
+          <w:p>
+            <w:r/>
+            <w:r>
+              <w:rPr>
+                <w:sz w:val="18"/>
+              </w:rPr>
+              <w:t>$0 (0.0%)</w:t>
+            </w:r>
+          </w:p>
+        </w:tc>
+      </w:tr>
+      <w:tr>
+        <w:tc>
+          <w:tcPr>
+            <w:tcW w:type="dxa" w:w="1224"/>
+          </w:tcPr>
+          <w:p>
+            <w:r/>
+            <w:r>
+              <w:rPr>
+                <w:b/>
+                <w:sz w:val="18"/>
+              </w:rPr>
+              <w:t>Base</w:t>
+            </w:r>
+          </w:p>
+        </w:tc>
+        <w:tc>
+          <w:tcPr>
+            <w:tcW w:type="dxa" w:w="1224"/>
+          </w:tcPr>
+          <w:p>
+            <w:r/>
+            <w:r>
+              <w:rPr>
+                <w:sz w:val="18"/>
+              </w:rPr>
+              <w:t>$250M</w:t>
+            </w:r>
+          </w:p>
+        </w:tc>
+        <w:tc>
+          <w:tcPr>
+            <w:tcW w:type="dxa" w:w="1584"/>
+          </w:tcPr>
+          <w:p>
+            <w:r/>
+            <w:r>
+              <w:rPr>
+                <w:sz w:val="18"/>
+              </w:rPr>
+              <w:t>$2.50M</w:t>
+            </w:r>
+          </w:p>
+        </w:tc>
+        <w:tc>
+          <w:tcPr>
+            <w:tcW w:type="dxa" w:w="1872"/>
+          </w:tcPr>
+          <w:p>
+            <w:r/>
+            <w:r>
+              <w:rPr>
+                <w:sz w:val="18"/>
+              </w:rPr>
+              <w:t>$1.75M</w:t>
+            </w:r>
+          </w:p>
+        </w:tc>
+        <w:tc>
+          <w:tcPr>
+            <w:tcW w:type="dxa" w:w="2016"/>
+          </w:tcPr>
+          <w:p>
+            <w:r/>
+            <w:r>
+              <w:rPr>
+                <w:sz w:val="18"/>
+              </w:rPr>
+              <w:t>+$424K (0.25%)</w:t>
+            </w:r>
+          </w:p>
+        </w:tc>
+      </w:tr>
+      <w:tr>
+        <w:tc>
+          <w:tcPr>
+            <w:tcW w:type="dxa" w:w="1224"/>
+          </w:tcPr>
+          <w:p>
+            <w:r/>
+            <w:r>
+              <w:rPr>
+                <w:b/>
+                <w:sz w:val="18"/>
+              </w:rPr>
+              <w:t>High</w:t>
+            </w:r>
+          </w:p>
+        </w:tc>
+        <w:tc>
+          <w:tcPr>
+            <w:tcW w:type="dxa" w:w="1224"/>
+          </w:tcPr>
+          <w:p>
+            <w:r/>
+            <w:r>
+              <w:rPr>
+                <w:sz w:val="18"/>
+              </w:rPr>
+              <w:t>$300M</w:t>
+            </w:r>
+          </w:p>
+        </w:tc>
+        <w:tc>
+          <w:tcPr>
+            <w:tcW w:type="dxa" w:w="1584"/>
+          </w:tcPr>
+          <w:p>
+            <w:r/>
+            <w:r>
+              <w:rPr>
+                <w:sz w:val="18"/>
+              </w:rPr>
+              <w:t>$3.00M</w:t>
+            </w:r>
+          </w:p>
+        </w:tc>
+        <w:tc>
+          <w:tcPr>
+            <w:tcW w:type="dxa" w:w="1872"/>
+          </w:tcPr>
+          <w:p>
+            <w:r/>
+            <w:r>
+              <w:rPr>
+                <w:sz w:val="18"/>
+              </w:rPr>
+              <w:t>$2.10M</w:t>
+            </w:r>
+          </w:p>
+        </w:tc>
+        <w:tc>
+          <w:tcPr>
+            <w:tcW w:type="dxa" w:w="2016"/>
+          </w:tcPr>
+          <w:p>
+            <w:r/>
+            <w:r>
+              <w:rPr>
+                <w:sz w:val="18"/>
+              </w:rPr>
+              <w:t>+$848K (0.50%)</w:t>
+            </w:r>
+          </w:p>
+        </w:tc>
+      </w:tr>
+    </w:tbl>
+    <w:p>
+      <w:pPr>
+        <w:spacing w:after="60" w:before="0"/>
+      </w:pPr>
     </w:p>
     <w:p>
       <w:pPr>

</xml_diff>

<commit_message>
SSLC offer: label stock earn-out as 409A-valued; projection column at listing
</commit_message>
<xml_diff>
--- a/drafts/Exos_SSLC_OptionB_Offer_Summary_2026-10-07.docx
+++ b/drafts/Exos_SSLC_OptionB_Offer_Summary_2026-10-07.docx
@@ -1416,7 +1416,7 @@
               <w:rPr>
                 <w:sz w:val="16"/>
               </w:rPr>
-              <w:t>Exos stock earn-out at listing</w:t>
+              <w:t>Exos stock earn-out, valued at 409A</w:t>
             </w:r>
             <w:r>
               <w:br/>
@@ -1499,7 +1499,7 @@
               <w:rPr>
                 <w:sz w:val="16"/>
               </w:rPr>
-              <w:t>At 409A ($170M): $0/$424K/$848K. Total Exos equity: 1.0%/1.25%/1.5%.</w:t>
+              <w:t>At listing ($250M/$300M): $0/$625K/$1.5M. Total Exos equity: 1.0%/1.25%/1.5%.</w:t>
             </w:r>
           </w:p>
         </w:tc>
@@ -2356,7 +2356,7 @@
           <w:color w:val="606060"/>
           <w:sz w:val="17"/>
         </w:rPr>
-        <w:t>Forward-looking projection — management assumptions (RTO completion, listing valuation, ~30% dilution). Not a guarantee; actual results may differ. RTO may not close. SEC Rule 10b-5, 17 CFR 240.10b-5 (https://www.ecfr.gov/current/title-17/chapter-II/part-240/section-240.10b-5) antifraud rules apply. 409A issuance value: ~$1.70M. Up-front 1.0% EAI only; earn-out column is additional at listing.</w:t>
+        <w:t>Forward-looking projection — management assumptions (RTO completion, listing valuation, ~30% dilution). Not a guarantee; actual results may differ. RTO may not close. SEC Rule 10b-5, 17 CFR 240.10b-5 (https://www.ecfr.gov/current/title-17/chapter-II/part-240/section-240.10b-5) antifraud rules apply. 409A issuance value: ~$1.70M. Up-front 1.0% EAI only; earn-out column is additional, at listing, pre-dilution.</w:t>
       </w:r>
     </w:p>
     <w:tbl>
@@ -2603,7 +2603,7 @@
               <w:rPr>
                 <w:sz w:val="18"/>
               </w:rPr>
-              <w:t>+$424K (0.25%)</w:t>
+              <w:t>+$625K (0.25% @ $250M)</w:t>
             </w:r>
           </w:p>
         </w:tc>
@@ -2676,7 +2676,7 @@
               <w:rPr>
                 <w:sz w:val="18"/>
               </w:rPr>
-              <w:t>+$848K (0.50%)</w:t>
+              <w:t>+$1.5M (0.50% @ $300M)</w:t>
             </w:r>
           </w:p>
         </w:tc>

</xml_diff>

<commit_message>
SSLC offer table: step-wise ①cash/relief ②+equity at close ③5-yr total ④if-held-to-2031 alternative
</commit_message>
<xml_diff>
--- a/drafts/Exos_SSLC_OptionB_Offer_Summary_2026-10-07.docx
+++ b/drafts/Exos_SSLC_OptionB_Offer_Summary_2026-10-07.docx
@@ -610,29 +610,23 @@
         <w:tc>
           <w:tcPr>
             <w:tcW w:type="dxa" w:w="3240"/>
-          </w:tcPr>
-          <w:p>
-            <w:r/>
-            <w:r>
-              <w:rPr>
-                <w:sz w:val="16"/>
-              </w:rPr>
-              <w:t>Exos equity — 1.0% EAI units</w:t>
-            </w:r>
-            <w:r>
-              <w:br/>
-            </w:r>
-            <w:r>
-              <w:rPr>
-                <w:sz w:val="16"/>
-              </w:rPr>
-              <w:t>(Rule 504, at 409A ~$170M)</w:t>
+            <w:shd w:val="clear" w:color="auto" w:fill="F3F4F6"/>
+          </w:tcPr>
+          <w:p>
+            <w:r/>
+            <w:r>
+              <w:rPr>
+                <w:b/>
+                <w:sz w:val="16"/>
+              </w:rPr>
+              <w:t>① Cash &amp; debt relief at close</w:t>
             </w:r>
           </w:p>
         </w:tc>
         <w:tc>
           <w:tcPr>
             <w:tcW w:type="dxa" w:w="1152"/>
+            <w:shd w:val="clear" w:color="auto" w:fill="F3F4F6"/>
           </w:tcPr>
           <w:p>
             <w:pPr>
@@ -641,15 +635,17 @@
             <w:r/>
             <w:r>
               <w:rPr>
-                <w:sz w:val="16"/>
-              </w:rPr>
-              <w:t>$1,697K</w:t>
+                <w:b/>
+                <w:sz w:val="16"/>
+              </w:rPr>
+              <w:t>$4,360K</w:t>
             </w:r>
           </w:p>
         </w:tc>
         <w:tc>
           <w:tcPr>
             <w:tcW w:type="dxa" w:w="1152"/>
+            <w:shd w:val="clear" w:color="auto" w:fill="F3F4F6"/>
           </w:tcPr>
           <w:p>
             <w:pPr>
@@ -658,15 +654,17 @@
             <w:r/>
             <w:r>
               <w:rPr>
-                <w:sz w:val="16"/>
-              </w:rPr>
-              <w:t>$1,697K</w:t>
+                <w:b/>
+                <w:sz w:val="16"/>
+              </w:rPr>
+              <w:t>$4,360K</w:t>
             </w:r>
           </w:p>
         </w:tc>
         <w:tc>
           <w:tcPr>
             <w:tcW w:type="dxa" w:w="1152"/>
+            <w:shd w:val="clear" w:color="auto" w:fill="F3F4F6"/>
           </w:tcPr>
           <w:p>
             <w:pPr>
@@ -675,41 +673,26 @@
             <w:r/>
             <w:r>
               <w:rPr>
-                <w:sz w:val="16"/>
-              </w:rPr>
-              <w:t>$1,697K</w:t>
+                <w:b/>
+                <w:sz w:val="16"/>
+              </w:rPr>
+              <w:t>$4,360K</w:t>
             </w:r>
           </w:p>
         </w:tc>
         <w:tc>
           <w:tcPr>
             <w:tcW w:type="dxa" w:w="2664"/>
-          </w:tcPr>
-          <w:p>
-            <w:r/>
-            <w:r>
-              <w:rPr>
-                <w:sz w:val="16"/>
-              </w:rPr>
-              <w:t>EAI units issued as part of Exos's</w:t>
-            </w:r>
-            <w:r>
-              <w:br/>
-            </w:r>
-            <w:r>
-              <w:rPr>
-                <w:sz w:val="16"/>
-              </w:rPr>
-              <w:t>Rule 504 offering, at the 409A value;</w:t>
-            </w:r>
-            <w:r>
-              <w:br/>
-            </w:r>
-            <w:r>
-              <w:rPr>
-                <w:sz w:val="16"/>
-              </w:rPr>
-              <w:t>issued at financing close</w:t>
+            <w:shd w:val="clear" w:color="auto" w:fill="F3F4F6"/>
+          </w:tcPr>
+          <w:p>
+            <w:r/>
+            <w:r>
+              <w:rPr>
+                <w:b/>
+                <w:sz w:val="16"/>
+              </w:rPr>
+              <w:t>Cash + costs + stake credit + debts + WC bridge</w:t>
             </w:r>
           </w:p>
         </w:tc>
@@ -718,23 +701,29 @@
         <w:tc>
           <w:tcPr>
             <w:tcW w:type="dxa" w:w="3240"/>
-            <w:shd w:val="clear" w:color="auto" w:fill="F3F4F6"/>
-          </w:tcPr>
-          <w:p>
-            <w:r/>
-            <w:r>
-              <w:rPr>
-                <w:b/>
-                <w:sz w:val="16"/>
-              </w:rPr>
-              <w:t>Subtotal: funding at close</w:t>
+          </w:tcPr>
+          <w:p>
+            <w:r/>
+            <w:r>
+              <w:rPr>
+                <w:sz w:val="16"/>
+              </w:rPr>
+              <w:t>+ Exos equity — 1.0% EAI units</w:t>
+            </w:r>
+            <w:r>
+              <w:br/>
+            </w:r>
+            <w:r>
+              <w:rPr>
+                <w:sz w:val="16"/>
+              </w:rPr>
+              <w:t>(Rule 504, at 409A ~$170M)</w:t>
             </w:r>
           </w:p>
         </w:tc>
         <w:tc>
           <w:tcPr>
             <w:tcW w:type="dxa" w:w="1152"/>
-            <w:shd w:val="clear" w:color="auto" w:fill="F3F4F6"/>
           </w:tcPr>
           <w:p>
             <w:pPr>
@@ -743,17 +732,15 @@
             <w:r/>
             <w:r>
               <w:rPr>
-                <w:b/>
-                <w:sz w:val="16"/>
-              </w:rPr>
-              <w:t>$6,057K</w:t>
+                <w:sz w:val="16"/>
+              </w:rPr>
+              <w:t>$1,697K</w:t>
             </w:r>
           </w:p>
         </w:tc>
         <w:tc>
           <w:tcPr>
             <w:tcW w:type="dxa" w:w="1152"/>
-            <w:shd w:val="clear" w:color="auto" w:fill="F3F4F6"/>
           </w:tcPr>
           <w:p>
             <w:pPr>
@@ -762,17 +749,15 @@
             <w:r/>
             <w:r>
               <w:rPr>
-                <w:b/>
-                <w:sz w:val="16"/>
-              </w:rPr>
-              <w:t>$6,057K</w:t>
+                <w:sz w:val="16"/>
+              </w:rPr>
+              <w:t>$1,697K</w:t>
             </w:r>
           </w:p>
         </w:tc>
         <w:tc>
           <w:tcPr>
             <w:tcW w:type="dxa" w:w="1152"/>
-            <w:shd w:val="clear" w:color="auto" w:fill="F3F4F6"/>
           </w:tcPr>
           <w:p>
             <w:pPr>
@@ -781,25 +766,41 @@
             <w:r/>
             <w:r>
               <w:rPr>
-                <w:b/>
-                <w:sz w:val="16"/>
-              </w:rPr>
-              <w:t>$6,057K</w:t>
+                <w:sz w:val="16"/>
+              </w:rPr>
+              <w:t>$1,697K</w:t>
             </w:r>
           </w:p>
         </w:tc>
         <w:tc>
           <w:tcPr>
             <w:tcW w:type="dxa" w:w="2664"/>
-            <w:shd w:val="clear" w:color="auto" w:fill="F3F4F6"/>
-          </w:tcPr>
-          <w:p>
-            <w:r/>
-            <w:r>
-              <w:rPr>
-                <w:b/>
-                <w:sz w:val="16"/>
-              </w:rPr>
+          </w:tcPr>
+          <w:p>
+            <w:r/>
+            <w:r>
+              <w:rPr>
+                <w:sz w:val="16"/>
+              </w:rPr>
+              <w:t>EAI units issued as part of Exos's</w:t>
+            </w:r>
+            <w:r>
+              <w:br/>
+            </w:r>
+            <w:r>
+              <w:rPr>
+                <w:sz w:val="16"/>
+              </w:rPr>
+              <w:t>Rule 504 offering, at the 409A value;</w:t>
+            </w:r>
+            <w:r>
+              <w:br/>
+            </w:r>
+            <w:r>
+              <w:rPr>
+                <w:sz w:val="16"/>
+              </w:rPr>
+              <w:t>issued at financing close</w:t>
             </w:r>
           </w:p>
         </w:tc>
@@ -808,29 +809,23 @@
         <w:tc>
           <w:tcPr>
             <w:tcW w:type="dxa" w:w="3240"/>
-          </w:tcPr>
-          <w:p>
-            <w:r/>
-            <w:r>
-              <w:rPr>
-                <w:sz w:val="16"/>
-              </w:rPr>
-              <w:t>Tank earn-out (5 yrs, 5%/yr,</w:t>
-            </w:r>
-            <w:r>
-              <w:br/>
-            </w:r>
-            <w:r>
-              <w:rPr>
-                <w:sz w:val="16"/>
-              </w:rPr>
-              <w:t>cap $300K/yr)</w:t>
+            <w:shd w:val="clear" w:color="auto" w:fill="F3F4F6"/>
+          </w:tcPr>
+          <w:p>
+            <w:r/>
+            <w:r>
+              <w:rPr>
+                <w:b/>
+                <w:sz w:val="16"/>
+              </w:rPr>
+              <w:t>② Total at financing close (① + equity)</w:t>
             </w:r>
           </w:p>
         </w:tc>
         <w:tc>
           <w:tcPr>
             <w:tcW w:type="dxa" w:w="1152"/>
+            <w:shd w:val="clear" w:color="auto" w:fill="F3F4F6"/>
           </w:tcPr>
           <w:p>
             <w:pPr>
@@ -839,15 +834,17 @@
             <w:r/>
             <w:r>
               <w:rPr>
-                <w:sz w:val="16"/>
-              </w:rPr>
-              <w:t>$750K</w:t>
+                <w:b/>
+                <w:sz w:val="16"/>
+              </w:rPr>
+              <w:t>$6,057K</w:t>
             </w:r>
           </w:p>
         </w:tc>
         <w:tc>
           <w:tcPr>
             <w:tcW w:type="dxa" w:w="1152"/>
+            <w:shd w:val="clear" w:color="auto" w:fill="F3F4F6"/>
           </w:tcPr>
           <w:p>
             <w:pPr>
@@ -856,15 +853,17 @@
             <w:r/>
             <w:r>
               <w:rPr>
-                <w:sz w:val="16"/>
-              </w:rPr>
-              <w:t>$1,250K</w:t>
+                <w:b/>
+                <w:sz w:val="16"/>
+              </w:rPr>
+              <w:t>$6,057K</w:t>
             </w:r>
           </w:p>
         </w:tc>
         <w:tc>
           <w:tcPr>
             <w:tcW w:type="dxa" w:w="1152"/>
+            <w:shd w:val="clear" w:color="auto" w:fill="F3F4F6"/>
           </w:tcPr>
           <w:p>
             <w:pPr>
@@ -873,32 +872,25 @@
             <w:r/>
             <w:r>
               <w:rPr>
-                <w:sz w:val="16"/>
-              </w:rPr>
-              <w:t>$1,500K</w:t>
+                <w:b/>
+                <w:sz w:val="16"/>
+              </w:rPr>
+              <w:t>$6,057K</w:t>
             </w:r>
           </w:p>
         </w:tc>
         <w:tc>
           <w:tcPr>
             <w:tcW w:type="dxa" w:w="2664"/>
-          </w:tcPr>
-          <w:p>
-            <w:r/>
-            <w:r>
-              <w:rPr>
-                <w:sz w:val="16"/>
-              </w:rPr>
-              <w:t>FY27–FY31; low 3%/base 5%/high</w:t>
-            </w:r>
-            <w:r>
-              <w:br/>
-            </w:r>
-            <w:r>
-              <w:rPr>
-                <w:sz w:val="16"/>
-              </w:rPr>
-              <w:t>7% × IM rev; $300K/yr cap</w:t>
+            <w:shd w:val="clear" w:color="auto" w:fill="F3F4F6"/>
+          </w:tcPr>
+          <w:p>
+            <w:r/>
+            <w:r>
+              <w:rPr>
+                <w:b/>
+                <w:sz w:val="16"/>
+              </w:rPr>
             </w:r>
           </w:p>
         </w:tc>
@@ -907,15 +899,14 @@
         <w:tc>
           <w:tcPr>
             <w:tcW w:type="dxa" w:w="3240"/>
-            <w:shd w:val="clear" w:color="auto" w:fill="EFF6FF"/>
-          </w:tcPr>
-          <w:p>
-            <w:r/>
-            <w:r>
-              <w:rPr>
-                <w:sz w:val="16"/>
-              </w:rPr>
-              <w:t>Milestone M1: SSLC FY2026-27 rev</w:t>
+          </w:tcPr>
+          <w:p>
+            <w:r/>
+            <w:r>
+              <w:rPr>
+                <w:sz w:val="16"/>
+              </w:rPr>
+              <w:t>Tank earn-out (5 yrs, 5%/yr,</w:t>
             </w:r>
             <w:r>
               <w:br/>
@@ -924,14 +915,13 @@
               <w:rPr>
                 <w:sz w:val="16"/>
               </w:rPr>
-              <w:t>≥$5.1M</w:t>
+              <w:t>cap $300K/yr)</w:t>
             </w:r>
           </w:p>
         </w:tc>
         <w:tc>
           <w:tcPr>
             <w:tcW w:type="dxa" w:w="1152"/>
-            <w:shd w:val="clear" w:color="auto" w:fill="EFF6FF"/>
           </w:tcPr>
           <w:p>
             <w:pPr>
@@ -942,14 +932,13 @@
               <w:rPr>
                 <w:sz w:val="16"/>
               </w:rPr>
-              <w:t>$200K</w:t>
+              <w:t>$750K</w:t>
             </w:r>
           </w:p>
         </w:tc>
         <w:tc>
           <w:tcPr>
             <w:tcW w:type="dxa" w:w="1152"/>
-            <w:shd w:val="clear" w:color="auto" w:fill="EFF6FF"/>
           </w:tcPr>
           <w:p>
             <w:pPr>
@@ -960,14 +949,13 @@
               <w:rPr>
                 <w:sz w:val="16"/>
               </w:rPr>
-              <w:t>$200K</w:t>
+              <w:t>$1,250K</w:t>
             </w:r>
           </w:p>
         </w:tc>
         <w:tc>
           <w:tcPr>
             <w:tcW w:type="dxa" w:w="1152"/>
-            <w:shd w:val="clear" w:color="auto" w:fill="EFF6FF"/>
           </w:tcPr>
           <w:p>
             <w:pPr>
@@ -978,22 +966,21 @@
               <w:rPr>
                 <w:sz w:val="16"/>
               </w:rPr>
-              <w:t>$200K</w:t>
+              <w:t>$1,500K</w:t>
             </w:r>
           </w:p>
         </w:tc>
         <w:tc>
           <w:tcPr>
             <w:tcW w:type="dxa" w:w="2664"/>
-            <w:shd w:val="clear" w:color="auto" w:fill="EFF6FF"/>
-          </w:tcPr>
-          <w:p>
-            <w:r/>
-            <w:r>
-              <w:rPr>
-                <w:sz w:val="16"/>
-              </w:rPr>
-              <w:t>Pays FY28 Q1 if verified</w:t>
+          </w:tcPr>
+          <w:p>
+            <w:r/>
+            <w:r>
+              <w:rPr>
+                <w:sz w:val="16"/>
+              </w:rPr>
+              <w:t>FY27–FY31; low 3%/base 5%/high</w:t>
             </w:r>
             <w:r>
               <w:br/>
@@ -1002,7 +989,7 @@
               <w:rPr>
                 <w:sz w:val="16"/>
               </w:rPr>
-              <w:t>(all scenarios: mgmt base case)</w:t>
+              <w:t>7% × IM rev; $300K/yr cap</w:t>
             </w:r>
           </w:p>
         </w:tc>
@@ -1019,7 +1006,7 @@
               <w:rPr>
                 <w:sz w:val="16"/>
               </w:rPr>
-              <w:t>Milestone M2: Nebula/OTV production</w:t>
+              <w:t>Milestone M1: SSLC FY2026-27 rev</w:t>
             </w:r>
             <w:r>
               <w:br/>
@@ -1028,7 +1015,7 @@
               <w:rPr>
                 <w:sz w:val="16"/>
               </w:rPr>
-              <w:t>contract signed</w:t>
+              <w:t>≥$5.1M</w:t>
             </w:r>
           </w:p>
         </w:tc>
@@ -1046,7 +1033,7 @@
               <w:rPr>
                 <w:sz w:val="16"/>
               </w:rPr>
-              <w:t>—</w:t>
+              <w:t>$200K</w:t>
             </w:r>
           </w:p>
         </w:tc>
@@ -1097,7 +1084,7 @@
               <w:rPr>
                 <w:sz w:val="16"/>
               </w:rPr>
-              <w:t>Pays at contract execution</w:t>
+              <w:t>Pays FY28 Q1 if verified</w:t>
             </w:r>
             <w:r>
               <w:br/>
@@ -1106,7 +1093,7 @@
               <w:rPr>
                 <w:sz w:val="16"/>
               </w:rPr>
-              <w:t>(any year FY27–FY30)</w:t>
+              <w:t>(all scenarios: mgmt base case)</w:t>
             </w:r>
           </w:p>
         </w:tc>
@@ -1123,7 +1110,16 @@
               <w:rPr>
                 <w:sz w:val="16"/>
               </w:rPr>
-              <w:t>Milestone M3: SSLC annual rev ≥$10M</w:t>
+              <w:t>Milestone M2: Nebula/OTV production</w:t>
+            </w:r>
+            <w:r>
+              <w:br/>
+            </w:r>
+            <w:r>
+              <w:rPr>
+                <w:sz w:val="16"/>
+              </w:rPr>
+              <w:t>contract signed</w:t>
             </w:r>
           </w:p>
         </w:tc>
@@ -1159,7 +1155,7 @@
               <w:rPr>
                 <w:sz w:val="16"/>
               </w:rPr>
-              <w:t>$250K</w:t>
+              <w:t>$200K</w:t>
             </w:r>
           </w:p>
         </w:tc>
@@ -1177,7 +1173,7 @@
               <w:rPr>
                 <w:sz w:val="16"/>
               </w:rPr>
-              <w:t>$250K</w:t>
+              <w:t>$200K</w:t>
             </w:r>
           </w:p>
         </w:tc>
@@ -1192,7 +1188,7 @@
               <w:rPr>
                 <w:sz w:val="16"/>
               </w:rPr>
-              <w:t>Pays first year threshold hit</w:t>
+              <w:t>Pays at contract execution</w:t>
             </w:r>
             <w:r>
               <w:br/>
@@ -1201,7 +1197,7 @@
               <w:rPr>
                 <w:sz w:val="16"/>
               </w:rPr>
-              <w:t>(est. FY29 at base/high)</w:t>
+              <w:t>(any year FY27–FY30)</w:t>
             </w:r>
           </w:p>
         </w:tc>
@@ -1218,7 +1214,7 @@
               <w:rPr>
                 <w:sz w:val="16"/>
               </w:rPr>
-              <w:t>Milestone M4: SSLC annual rev ≥$20M</w:t>
+              <w:t>Milestone M3: SSLC annual rev ≥$10M</w:t>
             </w:r>
           </w:p>
         </w:tc>
@@ -1254,7 +1250,7 @@
               <w:rPr>
                 <w:sz w:val="16"/>
               </w:rPr>
-              <w:t>—</w:t>
+              <w:t>$250K</w:t>
             </w:r>
           </w:p>
         </w:tc>
@@ -1296,7 +1292,7 @@
               <w:rPr>
                 <w:sz w:val="16"/>
               </w:rPr>
-              <w:t>(est. FY31 at high)</w:t>
+              <w:t>(est. FY29 at base/high)</w:t>
             </w:r>
           </w:p>
         </w:tc>
@@ -1313,16 +1309,7 @@
               <w:rPr>
                 <w:sz w:val="16"/>
               </w:rPr>
-              <w:t>Milestone M5: BLK3 tank qualification</w:t>
-            </w:r>
-            <w:r>
-              <w:br/>
-            </w:r>
-            <w:r>
-              <w:rPr>
-                <w:sz w:val="16"/>
-              </w:rPr>
-              <w:t>complete</w:t>
+              <w:t>Milestone M4: SSLC annual rev ≥$20M</w:t>
             </w:r>
           </w:p>
         </w:tc>
@@ -1376,7 +1363,7 @@
               <w:rPr>
                 <w:sz w:val="16"/>
               </w:rPr>
-              <w:t>$200K</w:t>
+              <w:t>$250K</w:t>
             </w:r>
           </w:p>
         </w:tc>
@@ -1391,7 +1378,7 @@
               <w:rPr>
                 <w:sz w:val="16"/>
               </w:rPr>
-              <w:t>Pays at Exos BLK3 tank cert</w:t>
+              <w:t>Pays first year threshold hit</w:t>
             </w:r>
             <w:r>
               <w:br/>
@@ -1400,7 +1387,7 @@
               <w:rPr>
                 <w:sz w:val="16"/>
               </w:rPr>
-              <w:t>(est. FY27–FY28)</w:t>
+              <w:t>(est. FY31 at high)</w:t>
             </w:r>
           </w:p>
         </w:tc>
@@ -1409,14 +1396,15 @@
         <w:tc>
           <w:tcPr>
             <w:tcW w:type="dxa" w:w="3240"/>
-          </w:tcPr>
-          <w:p>
-            <w:r/>
-            <w:r>
-              <w:rPr>
-                <w:sz w:val="16"/>
-              </w:rPr>
-              <w:t>Exos stock earn-out, valued at 409A</w:t>
+            <w:shd w:val="clear" w:color="auto" w:fill="EFF6FF"/>
+          </w:tcPr>
+          <w:p>
+            <w:r/>
+            <w:r>
+              <w:rPr>
+                <w:sz w:val="16"/>
+              </w:rPr>
+              <w:t>Milestone M5: BLK3 tank qualification</w:t>
             </w:r>
             <w:r>
               <w:br/>
@@ -1425,13 +1413,14 @@
               <w:rPr>
                 <w:sz w:val="16"/>
               </w:rPr>
-              <w:t>(on top of 1.0% EAI up-front)</w:t>
+              <w:t>complete</w:t>
             </w:r>
           </w:p>
         </w:tc>
         <w:tc>
           <w:tcPr>
             <w:tcW w:type="dxa" w:w="1152"/>
+            <w:shd w:val="clear" w:color="auto" w:fill="EFF6FF"/>
           </w:tcPr>
           <w:p>
             <w:pPr>
@@ -1442,13 +1431,14 @@
               <w:rPr>
                 <w:sz w:val="16"/>
               </w:rPr>
-              <w:t>$0</w:t>
+              <w:t>—</w:t>
             </w:r>
           </w:p>
         </w:tc>
         <w:tc>
           <w:tcPr>
             <w:tcW w:type="dxa" w:w="1152"/>
+            <w:shd w:val="clear" w:color="auto" w:fill="EFF6FF"/>
           </w:tcPr>
           <w:p>
             <w:pPr>
@@ -1459,13 +1449,14 @@
               <w:rPr>
                 <w:sz w:val="16"/>
               </w:rPr>
-              <w:t>$424K</w:t>
+              <w:t>—</w:t>
             </w:r>
           </w:p>
         </w:tc>
         <w:tc>
           <w:tcPr>
             <w:tcW w:type="dxa" w:w="1152"/>
+            <w:shd w:val="clear" w:color="auto" w:fill="EFF6FF"/>
           </w:tcPr>
           <w:p>
             <w:pPr>
@@ -1476,21 +1467,22 @@
               <w:rPr>
                 <w:sz w:val="16"/>
               </w:rPr>
-              <w:t>$848K</w:t>
+              <w:t>$200K</w:t>
             </w:r>
           </w:p>
         </w:tc>
         <w:tc>
           <w:tcPr>
             <w:tcW w:type="dxa" w:w="2664"/>
-          </w:tcPr>
-          <w:p>
-            <w:r/>
-            <w:r>
-              <w:rPr>
-                <w:sz w:val="16"/>
-              </w:rPr>
-              <w:t>Post-RTO ~FY28; earn-out 0.0%/0.25%/0.5% FD; lockup same as Exos principals.</w:t>
+            <w:shd w:val="clear" w:color="auto" w:fill="EFF6FF"/>
+          </w:tcPr>
+          <w:p>
+            <w:r/>
+            <w:r>
+              <w:rPr>
+                <w:sz w:val="16"/>
+              </w:rPr>
+              <w:t>Pays at Exos BLK3 tank cert</w:t>
             </w:r>
             <w:r>
               <w:br/>
@@ -1499,7 +1491,7 @@
               <w:rPr>
                 <w:sz w:val="16"/>
               </w:rPr>
-              <w:t>At listing ($250M/$300M): $0/$625K/$1.5M. Total Exos equity: 1.0%/1.25%/1.5%.</w:t>
+              <w:t>(est. FY27–FY28)</w:t>
             </w:r>
           </w:p>
         </w:tc>
@@ -1508,23 +1500,29 @@
         <w:tc>
           <w:tcPr>
             <w:tcW w:type="dxa" w:w="3240"/>
-            <w:shd w:val="clear" w:color="auto" w:fill="D1FAE5"/>
-          </w:tcPr>
-          <w:p>
-            <w:r/>
-            <w:r>
-              <w:rPr>
-                <w:b/>
-                <w:sz w:val="16"/>
-              </w:rPr>
-              <w:t>TOTAL OFFER VALUE (5-yr)</w:t>
+          </w:tcPr>
+          <w:p>
+            <w:r/>
+            <w:r>
+              <w:rPr>
+                <w:sz w:val="16"/>
+              </w:rPr>
+              <w:t>Exos stock earn-out, valued at 409A</w:t>
+            </w:r>
+            <w:r>
+              <w:br/>
+            </w:r>
+            <w:r>
+              <w:rPr>
+                <w:sz w:val="16"/>
+              </w:rPr>
+              <w:t>(on top of 1.0% EAI up-front)</w:t>
             </w:r>
           </w:p>
         </w:tc>
         <w:tc>
           <w:tcPr>
             <w:tcW w:type="dxa" w:w="1152"/>
-            <w:shd w:val="clear" w:color="auto" w:fill="D1FAE5"/>
           </w:tcPr>
           <w:p>
             <w:pPr>
@@ -1533,17 +1531,15 @@
             <w:r/>
             <w:r>
               <w:rPr>
-                <w:b/>
-                <w:sz w:val="16"/>
-              </w:rPr>
-              <w:t>$7,007K</w:t>
+                <w:sz w:val="16"/>
+              </w:rPr>
+              <w:t>$0</w:t>
             </w:r>
           </w:p>
         </w:tc>
         <w:tc>
           <w:tcPr>
             <w:tcW w:type="dxa" w:w="1152"/>
-            <w:shd w:val="clear" w:color="auto" w:fill="D1FAE5"/>
           </w:tcPr>
           <w:p>
             <w:pPr>
@@ -1552,17 +1548,15 @@
             <w:r/>
             <w:r>
               <w:rPr>
-                <w:b/>
-                <w:sz w:val="16"/>
-              </w:rPr>
-              <w:t>$8,582K</w:t>
+                <w:sz w:val="16"/>
+              </w:rPr>
+              <w:t>$424K</w:t>
             </w:r>
           </w:p>
         </w:tc>
         <w:tc>
           <w:tcPr>
             <w:tcW w:type="dxa" w:w="1152"/>
-            <w:shd w:val="clear" w:color="auto" w:fill="D1FAE5"/>
           </w:tcPr>
           <w:p>
             <w:pPr>
@@ -1571,26 +1565,32 @@
             <w:r/>
             <w:r>
               <w:rPr>
-                <w:b/>
-                <w:sz w:val="16"/>
-              </w:rPr>
-              <w:t>$10,157K</w:t>
+                <w:sz w:val="16"/>
+              </w:rPr>
+              <w:t>$848K</w:t>
             </w:r>
           </w:p>
         </w:tc>
         <w:tc>
           <w:tcPr>
             <w:tcW w:type="dxa" w:w="2664"/>
-            <w:shd w:val="clear" w:color="auto" w:fill="D1FAE5"/>
-          </w:tcPr>
-          <w:p>
-            <w:r/>
-            <w:r>
-              <w:rPr>
-                <w:b/>
-                <w:sz w:val="16"/>
-              </w:rPr>
-              <w:t>FY27–FY31</w:t>
+          </w:tcPr>
+          <w:p>
+            <w:r/>
+            <w:r>
+              <w:rPr>
+                <w:sz w:val="16"/>
+              </w:rPr>
+              <w:t>Post-RTO ~FY28; earn-out 0.0%/0.25%/0.5% FD; lockup same as Exos principals.</w:t>
+            </w:r>
+            <w:r>
+              <w:br/>
+            </w:r>
+            <w:r>
+              <w:rPr>
+                <w:sz w:val="16"/>
+              </w:rPr>
+              <w:t>At listing ($250M/$300M): $0/$625K/$1.5M. Total Exos equity: 1.0%/1.25%/1.5%.</w:t>
             </w:r>
           </w:p>
         </w:tc>
@@ -1599,35 +1599,33 @@
         <w:tc>
           <w:tcPr>
             <w:tcW w:type="dxa" w:w="3240"/>
-            <w:shd w:val="clear" w:color="auto" w:fill="FEF3C7"/>
-          </w:tcPr>
-          <w:p>
-            <w:r/>
-            <w:r>
-              <w:rPr>
-                <w:i/>
-                <w:color w:val="6B7280"/>
-                <w:sz w:val="16"/>
-              </w:rPr>
-              <w:t>Memo: Exos stock if held to FY31</w:t>
+            <w:shd w:val="clear" w:color="auto" w:fill="D1FAE5"/>
+          </w:tcPr>
+          <w:p>
+            <w:r/>
+            <w:r>
+              <w:rPr>
+                <w:b/>
+                <w:sz w:val="16"/>
+              </w:rPr>
+              <w:t>③ TOTAL OFFER VALUE, 5-yr</w:t>
             </w:r>
             <w:r>
               <w:br/>
             </w:r>
             <w:r>
               <w:rPr>
-                <w:i/>
-                <w:color w:val="6B7280"/>
-                <w:sz w:val="16"/>
-              </w:rPr>
-              <w:t>(not additive to total above)</w:t>
+                <w:b/>
+                <w:sz w:val="16"/>
+              </w:rPr>
+              <w:t>(② + earn-outs; all stock at 409A)</w:t>
             </w:r>
           </w:p>
         </w:tc>
         <w:tc>
           <w:tcPr>
             <w:tcW w:type="dxa" w:w="1152"/>
-            <w:shd w:val="clear" w:color="auto" w:fill="FEF3C7"/>
+            <w:shd w:val="clear" w:color="auto" w:fill="D1FAE5"/>
           </w:tcPr>
           <w:p>
             <w:pPr>
@@ -1636,18 +1634,17 @@
             <w:r/>
             <w:r>
               <w:rPr>
-                <w:i/>
-                <w:color w:val="6B7280"/>
-                <w:sz w:val="16"/>
-              </w:rPr>
-              <w:t>$5.7M</w:t>
+                <w:b/>
+                <w:sz w:val="16"/>
+              </w:rPr>
+              <w:t>$7,007K</w:t>
             </w:r>
           </w:p>
         </w:tc>
         <w:tc>
           <w:tcPr>
             <w:tcW w:type="dxa" w:w="1152"/>
-            <w:shd w:val="clear" w:color="auto" w:fill="FEF3C7"/>
+            <w:shd w:val="clear" w:color="auto" w:fill="D1FAE5"/>
           </w:tcPr>
           <w:p>
             <w:pPr>
@@ -1656,18 +1653,17 @@
             <w:r/>
             <w:r>
               <w:rPr>
-                <w:i/>
-                <w:color w:val="6B7280"/>
-                <w:sz w:val="16"/>
-              </w:rPr>
-              <w:t>$8.5M</w:t>
+                <w:b/>
+                <w:sz w:val="16"/>
+              </w:rPr>
+              <w:t>$8,582K</w:t>
             </w:r>
           </w:p>
         </w:tc>
         <w:tc>
           <w:tcPr>
             <w:tcW w:type="dxa" w:w="1152"/>
-            <w:shd w:val="clear" w:color="auto" w:fill="FEF3C7"/>
+            <w:shd w:val="clear" w:color="auto" w:fill="D1FAE5"/>
           </w:tcPr>
           <w:p>
             <w:pPr>
@@ -1676,11 +1672,116 @@
             <w:r/>
             <w:r>
               <w:rPr>
+                <w:b/>
+                <w:sz w:val="16"/>
+              </w:rPr>
+              <w:t>$10,157K</w:t>
+            </w:r>
+          </w:p>
+        </w:tc>
+        <w:tc>
+          <w:tcPr>
+            <w:tcW w:type="dxa" w:w="2664"/>
+            <w:shd w:val="clear" w:color="auto" w:fill="D1FAE5"/>
+          </w:tcPr>
+          <w:p>
+            <w:r/>
+            <w:r>
+              <w:rPr>
+                <w:b/>
+                <w:sz w:val="16"/>
+              </w:rPr>
+              <w:t>FY27–FY31</w:t>
+            </w:r>
+          </w:p>
+        </w:tc>
+      </w:tr>
+      <w:tr>
+        <w:tc>
+          <w:tcPr>
+            <w:tcW w:type="dxa" w:w="3240"/>
+            <w:shd w:val="clear" w:color="auto" w:fill="FEF3C7"/>
+          </w:tcPr>
+          <w:p>
+            <w:r/>
+            <w:r>
+              <w:rPr>
                 <w:i/>
                 <w:color w:val="6B7280"/>
                 <w:sz w:val="16"/>
               </w:rPr>
+              <w:t>IF HELD: all Exos stock projected</w:t>
+            </w:r>
+            <w:r>
+              <w:br/>
+            </w:r>
+            <w:r>
+              <w:rPr>
+                <w:i/>
+                <w:color w:val="6B7280"/>
+                <w:sz w:val="16"/>
+              </w:rPr>
+              <w:t>in FY2031 (replaces 409A stock values)</w:t>
+            </w:r>
+          </w:p>
+        </w:tc>
+        <w:tc>
+          <w:tcPr>
+            <w:tcW w:type="dxa" w:w="1152"/>
+            <w:shd w:val="clear" w:color="auto" w:fill="FEF3C7"/>
+          </w:tcPr>
+          <w:p>
+            <w:pPr>
+              <w:jc w:val="right"/>
+            </w:pPr>
+            <w:r/>
+            <w:r>
+              <w:rPr>
+                <w:i/>
+                <w:color w:val="6B7280"/>
+                <w:sz w:val="16"/>
+              </w:rPr>
               <w:t>$11.4M</w:t>
+            </w:r>
+          </w:p>
+        </w:tc>
+        <w:tc>
+          <w:tcPr>
+            <w:tcW w:type="dxa" w:w="1152"/>
+            <w:shd w:val="clear" w:color="auto" w:fill="FEF3C7"/>
+          </w:tcPr>
+          <w:p>
+            <w:pPr>
+              <w:jc w:val="right"/>
+            </w:pPr>
+            <w:r/>
+            <w:r>
+              <w:rPr>
+                <w:i/>
+                <w:color w:val="6B7280"/>
+                <w:sz w:val="16"/>
+              </w:rPr>
+              <w:t>$14.2M</w:t>
+            </w:r>
+          </w:p>
+        </w:tc>
+        <w:tc>
+          <w:tcPr>
+            <w:tcW w:type="dxa" w:w="1152"/>
+            <w:shd w:val="clear" w:color="auto" w:fill="FEF3C7"/>
+          </w:tcPr>
+          <w:p>
+            <w:pPr>
+              <w:jc w:val="right"/>
+            </w:pPr>
+            <w:r/>
+            <w:r>
+              <w:rPr>
+                <w:i/>
+                <w:color w:val="6B7280"/>
+                <w:sz w:val="16"/>
+              </w:rPr>
+              <w:t>$17.1M</w:t>
             </w:r>
           </w:p>
         </w:tc>
@@ -1697,7 +1798,7 @@
                 <w:color w:val="6B7280"/>
                 <w:sz w:val="16"/>
               </w:rPr>
-              <w:t>16× EV/EBITDA; ~30% dilution;</w:t>
+              <w:t>Total stake 1.0/1.25/1.5% → ~0.70/0.875/1.05% after</w:t>
             </w:r>
             <w:r>
               <w:br/>
@@ -1708,7 +1809,7 @@
                 <w:color w:val="6B7280"/>
                 <w:sz w:val="16"/>
               </w:rPr>
-              <w:t>total stake 1.0/1.25/1.5% (EAI+earn-out);</w:t>
+              <w:t>~30% dilution × ~$1.63B FY31 EV (16× v12 EBITDA).</w:t>
             </w:r>
             <w:r>
               <w:br/>
@@ -1719,7 +1820,125 @@
                 <w:color w:val="6B7280"/>
                 <w:sz w:val="16"/>
               </w:rPr>
-              <w:t>mgmt assumption</w:t>
+              <w:t>Projection only; on SSLC-actuals case ~$1.2–1.8M.</w:t>
+            </w:r>
+          </w:p>
+        </w:tc>
+      </w:tr>
+      <w:tr>
+        <w:tc>
+          <w:tcPr>
+            <w:tcW w:type="dxa" w:w="3240"/>
+            <w:shd w:val="clear" w:color="auto" w:fill="FEF3C7"/>
+          </w:tcPr>
+          <w:p>
+            <w:r/>
+            <w:r>
+              <w:rPr>
+                <w:i/>
+                <w:color w:val="6B7280"/>
+                <w:sz w:val="16"/>
+              </w:rPr>
+              <w:t>④ TOTAL IF STOCK HELD TO 2031</w:t>
+            </w:r>
+            <w:r>
+              <w:br/>
+            </w:r>
+            <w:r>
+              <w:rPr>
+                <w:i/>
+                <w:color w:val="6B7280"/>
+                <w:sz w:val="16"/>
+              </w:rPr>
+              <w:t>(① + tank + milestones + 2031 stock)</w:t>
+            </w:r>
+          </w:p>
+        </w:tc>
+        <w:tc>
+          <w:tcPr>
+            <w:tcW w:type="dxa" w:w="1152"/>
+            <w:shd w:val="clear" w:color="auto" w:fill="FEF3C7"/>
+          </w:tcPr>
+          <w:p>
+            <w:pPr>
+              <w:jc w:val="right"/>
+            </w:pPr>
+            <w:r/>
+            <w:r>
+              <w:rPr>
+                <w:i/>
+                <w:color w:val="6B7280"/>
+                <w:sz w:val="16"/>
+              </w:rPr>
+              <w:t>$16.7M</w:t>
+            </w:r>
+          </w:p>
+        </w:tc>
+        <w:tc>
+          <w:tcPr>
+            <w:tcW w:type="dxa" w:w="1152"/>
+            <w:shd w:val="clear" w:color="auto" w:fill="FEF3C7"/>
+          </w:tcPr>
+          <w:p>
+            <w:pPr>
+              <w:jc w:val="right"/>
+            </w:pPr>
+            <w:r/>
+            <w:r>
+              <w:rPr>
+                <w:i/>
+                <w:color w:val="6B7280"/>
+                <w:sz w:val="16"/>
+              </w:rPr>
+              <w:t>$20.5M</w:t>
+            </w:r>
+          </w:p>
+        </w:tc>
+        <w:tc>
+          <w:tcPr>
+            <w:tcW w:type="dxa" w:w="1152"/>
+            <w:shd w:val="clear" w:color="auto" w:fill="FEF3C7"/>
+          </w:tcPr>
+          <w:p>
+            <w:pPr>
+              <w:jc w:val="right"/>
+            </w:pPr>
+            <w:r/>
+            <w:r>
+              <w:rPr>
+                <w:i/>
+                <w:color w:val="6B7280"/>
+                <w:sz w:val="16"/>
+              </w:rPr>
+              <w:t>$24.0M</w:t>
+            </w:r>
+          </w:p>
+        </w:tc>
+        <w:tc>
+          <w:tcPr>
+            <w:tcW w:type="dxa" w:w="2664"/>
+            <w:shd w:val="clear" w:color="auto" w:fill="FEF3C7"/>
+          </w:tcPr>
+          <w:p>
+            <w:r/>
+            <w:r>
+              <w:rPr>
+                <w:i/>
+                <w:color w:val="6B7280"/>
+                <w:sz w:val="16"/>
+              </w:rPr>
+              <w:t>Alternative to ③, NOT added to it. Forward-looking</w:t>
+            </w:r>
+            <w:r>
+              <w:br/>
+            </w:r>
+            <w:r>
+              <w:rPr>
+                <w:i/>
+                <w:color w:val="6B7280"/>
+                <w:sz w:val="16"/>
+              </w:rPr>
+              <w:t>projection, not a promise; RTO may not close.</w:t>
             </w:r>
           </w:p>
         </w:tc>

</xml_diff>

<commit_message>
SSLC OptionB: replace 1.0% EAI with fixed $1.0M equity (~0.59% 409A)
John 10/9 17:35: up-front EAI changed from 1.0% (~$1.697M) to fixed
$1,000,000 at 409A (~0.589% of $169.7M Eqvista). Rule 504 issuance
at financing close. Stock earn-out unchanged (0.0/0.25/0.5%).

Updated ①②③④ table:
  ① $4,360K (unchanged)
  ② $5,360K (+equity $1,000K)
  ③ $6,310K / $7,885K / $9,460K (HIGH < $10M — not rebalanced)
  ④ $12.0M / $15.8M / $19.4M (2031 projection)
  Y5 hold: ~$6.7M / $9.6M / $12.4M (0.41/0.59/0.76% post-dil)
  AA actuals hold: ~$0.7-1.3M

Earn-out stock row now shows listing values ($0/$625K/$1,500K);
409A values in notes. ③ labeled '(earn-out stock at listing)'.
Proj table updated to ~0.59% pre/post-dil at $200/250/300M listing.
504 note: '$1.0M counts toward Rule 504 $10M rolling cap'.

New deliverable: SSLC_Offer_Briefing_Email_DRAFT_2026-10-09.docx
(John Quinn → Jim Wertz + SSLC Board; DRAFT — not sent).

All attached to MC task 2414.

Task: #2414
</commit_message>
<xml_diff>
--- a/drafts/Exos_SSLC_OptionB_Offer_Summary_2026-10-07.docx
+++ b/drafts/Exos_SSLC_OptionB_Offer_Summary_2026-10-07.docx
@@ -708,7 +708,7 @@
               <w:rPr>
                 <w:sz w:val="16"/>
               </w:rPr>
-              <w:t>+ Exos equity — 1.0% EAI units</w:t>
+              <w:t>+ Exos equity — $1.0M fixed EAI units</w:t>
             </w:r>
             <w:r>
               <w:br/>
@@ -717,7 +717,7 @@
               <w:rPr>
                 <w:sz w:val="16"/>
               </w:rPr>
-              <w:t>(Rule 504, at 409A ~$170M)</w:t>
+              <w:t>(Rule 504, ~0.59% at 409A ~$170M)</w:t>
             </w:r>
           </w:p>
         </w:tc>
@@ -734,7 +734,7 @@
               <w:rPr>
                 <w:sz w:val="16"/>
               </w:rPr>
-              <w:t>$1,697K</w:t>
+              <w:t>$1,000K</w:t>
             </w:r>
           </w:p>
         </w:tc>
@@ -751,7 +751,7 @@
               <w:rPr>
                 <w:sz w:val="16"/>
               </w:rPr>
-              <w:t>$1,697K</w:t>
+              <w:t>$1,000K</w:t>
             </w:r>
           </w:p>
         </w:tc>
@@ -768,7 +768,7 @@
               <w:rPr>
                 <w:sz w:val="16"/>
               </w:rPr>
-              <w:t>$1,697K</w:t>
+              <w:t>$1,000K</w:t>
             </w:r>
           </w:p>
         </w:tc>
@@ -792,6 +792,15 @@
                 <w:sz w:val="16"/>
               </w:rPr>
               <w:t>Rule 504 offering, at the 409A value;</w:t>
+            </w:r>
+            <w:r>
+              <w:br/>
+            </w:r>
+            <w:r>
+              <w:rPr>
+                <w:sz w:val="16"/>
+              </w:rPr>
+              <w:t>$1.0M counts toward Rule 504 $10M cap;</w:t>
             </w:r>
             <w:r>
               <w:br/>
@@ -837,7 +846,7 @@
                 <w:b/>
                 <w:sz w:val="16"/>
               </w:rPr>
-              <w:t>$6,057K</w:t>
+              <w:t>$5,360K</w:t>
             </w:r>
           </w:p>
         </w:tc>
@@ -856,7 +865,7 @@
                 <w:b/>
                 <w:sz w:val="16"/>
               </w:rPr>
-              <w:t>$6,057K</w:t>
+              <w:t>$5,360K</w:t>
             </w:r>
           </w:p>
         </w:tc>
@@ -875,7 +884,7 @@
                 <w:b/>
                 <w:sz w:val="16"/>
               </w:rPr>
-              <w:t>$6,057K</w:t>
+              <w:t>$5,360K</w:t>
             </w:r>
           </w:p>
         </w:tc>
@@ -1507,7 +1516,7 @@
               <w:rPr>
                 <w:sz w:val="16"/>
               </w:rPr>
-              <w:t>Exos stock earn-out, valued at 409A</w:t>
+              <w:t>Exos stock earn-out at listing</w:t>
             </w:r>
             <w:r>
               <w:br/>
@@ -1516,7 +1525,7 @@
               <w:rPr>
                 <w:sz w:val="16"/>
               </w:rPr>
-              <w:t>(on top of 1.0% EAI up-front)</w:t>
+              <w:t>(on top of ~0.59% EAI up-front)</w:t>
             </w:r>
           </w:p>
         </w:tc>
@@ -1550,7 +1559,7 @@
               <w:rPr>
                 <w:sz w:val="16"/>
               </w:rPr>
-              <w:t>$424K</w:t>
+              <w:t>$625K</w:t>
             </w:r>
           </w:p>
         </w:tc>
@@ -1567,7 +1576,7 @@
               <w:rPr>
                 <w:sz w:val="16"/>
               </w:rPr>
-              <w:t>$848K</w:t>
+              <w:t>$1,500K</w:t>
             </w:r>
           </w:p>
         </w:tc>
@@ -1581,7 +1590,7 @@
               <w:rPr>
                 <w:sz w:val="16"/>
               </w:rPr>
-              <w:t>Post-RTO ~FY28; earn-out 0.0%/0.25%/0.5% FD; lockup same as Exos principals.</w:t>
+              <w:t>Post-RTO ~FY29; earn-out 0.0%/0.25%/0.5% FD; lockup same as Exos principals.</w:t>
             </w:r>
             <w:r>
               <w:br/>
@@ -1590,7 +1599,7 @@
               <w:rPr>
                 <w:sz w:val="16"/>
               </w:rPr>
-              <w:t>At listing ($250M/$300M): $0/$625K/$1.5M. Total Exos equity: 1.0%/1.25%/1.5%.</w:t>
+              <w:t>At 409A: $0/$424K/$848K. Total Exos equity: ~0.59%/~0.84%/~1.09%.</w:t>
             </w:r>
           </w:p>
         </w:tc>
@@ -1618,7 +1627,7 @@
                 <w:b/>
                 <w:sz w:val="16"/>
               </w:rPr>
-              <w:t>(② + earn-outs; all stock at 409A)</w:t>
+              <w:t>(② + earn-outs; earn-out stock at listing)</w:t>
             </w:r>
           </w:p>
         </w:tc>
@@ -1637,7 +1646,7 @@
                 <w:b/>
                 <w:sz w:val="16"/>
               </w:rPr>
-              <w:t>$7,007K</w:t>
+              <w:t>$6,310K</w:t>
             </w:r>
           </w:p>
         </w:tc>
@@ -1656,7 +1665,7 @@
                 <w:b/>
                 <w:sz w:val="16"/>
               </w:rPr>
-              <w:t>$8,582K</w:t>
+              <w:t>$7,885K</w:t>
             </w:r>
           </w:p>
         </w:tc>
@@ -1675,7 +1684,7 @@
                 <w:b/>
                 <w:sz w:val="16"/>
               </w:rPr>
-              <w:t>$10,157K</w:t>
+              <w:t>$9,460K</w:t>
             </w:r>
           </w:p>
         </w:tc>
@@ -1691,7 +1700,7 @@
                 <w:b/>
                 <w:sz w:val="16"/>
               </w:rPr>
-              <w:t>FY27–FY31</w:t>
+              <w:t>FY27–FY31. HIGH &lt; $10M target — not rebalanced.</w:t>
             </w:r>
           </w:p>
         </w:tc>
@@ -1721,7 +1730,7 @@
                 <w:color w:val="6B7280"/>
                 <w:sz w:val="16"/>
               </w:rPr>
-              <w:t>in FY2031 (replaces 409A stock values)</w:t>
+              <w:t>in FY2031 (replaces listing earn-out)</w:t>
             </w:r>
           </w:p>
         </w:tc>
@@ -1741,7 +1750,7 @@
                 <w:color w:val="6B7280"/>
                 <w:sz w:val="16"/>
               </w:rPr>
-              <w:t>$11.4M</w:t>
+              <w:t>$6.7M</w:t>
             </w:r>
           </w:p>
         </w:tc>
@@ -1761,7 +1770,7 @@
                 <w:color w:val="6B7280"/>
                 <w:sz w:val="16"/>
               </w:rPr>
-              <w:t>$14.2M</w:t>
+              <w:t>$9.6M</w:t>
             </w:r>
           </w:p>
         </w:tc>
@@ -1781,7 +1790,7 @@
                 <w:color w:val="6B7280"/>
                 <w:sz w:val="16"/>
               </w:rPr>
-              <w:t>$17.1M</w:t>
+              <w:t>$12.4M</w:t>
             </w:r>
           </w:p>
         </w:tc>
@@ -1798,7 +1807,7 @@
                 <w:color w:val="6B7280"/>
                 <w:sz w:val="16"/>
               </w:rPr>
-              <w:t>Total stake 1.0/1.25/1.5% → ~0.70/0.875/1.05% after</w:t>
+              <w:t>Total stake ~0.59/0.84/1.09% → ~0.41/0.59/0.76% after</w:t>
             </w:r>
             <w:r>
               <w:br/>
@@ -1820,7 +1829,7 @@
                 <w:color w:val="6B7280"/>
                 <w:sz w:val="16"/>
               </w:rPr>
-              <w:t>Projection only; on SSLC-actuals case ~$1.2–1.8M.</w:t>
+              <w:t>Projection only; on SSLC-actuals case ~$0.7–1.3M.</w:t>
             </w:r>
           </w:p>
         </w:tc>
@@ -1870,7 +1879,7 @@
                 <w:color w:val="6B7280"/>
                 <w:sz w:val="16"/>
               </w:rPr>
-              <w:t>$16.7M</w:t>
+              <w:t>$12.0M</w:t>
             </w:r>
           </w:p>
         </w:tc>
@@ -1890,7 +1899,7 @@
                 <w:color w:val="6B7280"/>
                 <w:sz w:val="16"/>
               </w:rPr>
-              <w:t>$20.5M</w:t>
+              <w:t>$15.8M</w:t>
             </w:r>
           </w:p>
         </w:tc>
@@ -1910,7 +1919,7 @@
                 <w:color w:val="6B7280"/>
                 <w:sz w:val="16"/>
               </w:rPr>
-              <w:t>$24.0M</w:t>
+              <w:t>$19.4M</w:t>
             </w:r>
           </w:p>
         </w:tc>
@@ -1960,7 +1969,7 @@
           <w:color w:val="606060"/>
           <w:sz w:val="17"/>
         </w:rPr>
-        <w:t>Why this structure: SSLC holders receive real Exos equity at close (1.0% EAI units, 409A-valued ~$1.7M, issued as part of Exos's Rule 504 offering) — not only contingent upside. It aligns them with Exos immediately. The earn-out stock stays 0.0–0.5%, so total equity is 1.0–1.5%.</w:t>
+        <w:t>Why this structure: SSLC holders receive real Exos equity at close ($1.0M EAI units, ~0.59% of $169.7M 409A, issued as part of Exos's Rule 504 offering) — not only contingent upside. It aligns them with Exos immediately. The earn-out stock stays 0.0–0.5%, so total equity is ~0.59–1.09%.</w:t>
       </w:r>
     </w:p>
     <w:p>
@@ -2096,7 +2105,7 @@
               <w:rPr>
                 <w:sz w:val="18"/>
               </w:rPr>
-              <w:t>$5,057,000 base at close ($2.51M cash + $60K costs + $790K Exos stake credit + ~$1.70M EAI equity at 409A, Rule 504)</w:t>
+              <w:t>$5,360,000 base at close ($2.51M cash + $60K costs + $790K Exos stake credit + $500K WC + $1.0M EAI equity at 409A, Rule 504)</w:t>
             </w:r>
           </w:p>
         </w:tc>
@@ -2242,7 +2251,7 @@
           <w:color w:val="606060"/>
           <w:sz w:val="17"/>
         </w:rPr>
-        <w:t>504 cap: ~$1.7M counts toward the Rule 504 $10M rolling 12-month cap; confirm remaining capacity. Rule 504 is U.S.-only; EAI units in the Japan round are Reg S — the two must remain distinct. See model → 'EAI Lockup &amp; Liquidity' sheet for full detail.</w:t>
+        <w:t>504 cap: $1.0M counts toward the Rule 504 $10M rolling 12-month cap; confirm remaining capacity. Rule 504 is U.S.-only; EAI units in the Japan round are Reg S — the two must remain distinct. See model → 'EAI Lockup &amp; Liquidity' sheet for full detail.</w:t>
       </w:r>
     </w:p>
     <w:p>
@@ -2575,7 +2584,7 @@
           <w:color w:val="606060"/>
           <w:sz w:val="17"/>
         </w:rPr>
-        <w:t>Forward-looking projection — management assumptions (RTO completion, listing valuation, ~30% dilution). Not a guarantee; actual results may differ. RTO may not close. SEC Rule 10b-5, 17 CFR 240.10b-5 (https://www.ecfr.gov/current/title-17/chapter-II/part-240/section-240.10b-5) antifraud rules apply. 409A issuance value: ~$1.70M. Up-front 1.0% EAI only; earn-out column is additional, at listing, pre-dilution.</w:t>
+        <w:t>Forward-looking projection — management assumptions (RTO completion, listing valuation, ~30% dilution). Not a guarantee; actual results may differ. RTO may not close. SEC Rule 10b-5, 17 CFR 240.10b-5 (https://www.ecfr.gov/current/title-17/chapter-II/part-240/section-240.10b-5) antifraud rules apply. 409A issuance value: $1.0M fixed (~0.59%). Up-front EAI only; earn-out column is additional, at listing, pre-dilution.</w:t>
       </w:r>
     </w:p>
     <w:tbl>
@@ -2640,7 +2649,7 @@
                 <w:color w:val="FFFFFF"/>
                 <w:sz w:val="18"/>
               </w:rPr>
-              <w:t>1.0% pre-dil</w:t>
+              <w:t>~0.59% pre-dil</w:t>
             </w:r>
           </w:p>
         </w:tc>
@@ -2657,7 +2666,7 @@
                 <w:color w:val="FFFFFF"/>
                 <w:sz w:val="18"/>
               </w:rPr>
-              <w:t>1.0% post-dil</w:t>
+              <w:t>~0.59% post-dil</w:t>
               <w:br/>
               <w:t>(~30% dil)</w:t>
             </w:r>
@@ -2721,7 +2730,7 @@
               <w:rPr>
                 <w:sz w:val="18"/>
               </w:rPr>
-              <w:t>$2.00M</w:t>
+              <w:t>$1.18M</w:t>
             </w:r>
           </w:p>
         </w:tc>
@@ -2735,7 +2744,7 @@
               <w:rPr>
                 <w:sz w:val="18"/>
               </w:rPr>
-              <w:t>$1.40M</w:t>
+              <w:t>$0.83M</w:t>
             </w:r>
           </w:p>
         </w:tc>
@@ -2794,7 +2803,7 @@
               <w:rPr>
                 <w:sz w:val="18"/>
               </w:rPr>
-              <w:t>$2.50M</w:t>
+              <w:t>$1.47M</w:t>
             </w:r>
           </w:p>
         </w:tc>
@@ -2808,7 +2817,7 @@
               <w:rPr>
                 <w:sz w:val="18"/>
               </w:rPr>
-              <w:t>$1.75M</w:t>
+              <w:t>$1.03M</w:t>
             </w:r>
           </w:p>
         </w:tc>
@@ -2867,7 +2876,7 @@
               <w:rPr>
                 <w:sz w:val="18"/>
               </w:rPr>
-              <w:t>$3.00M</w:t>
+              <w:t>$1.77M</w:t>
             </w:r>
           </w:p>
         </w:tc>
@@ -2881,7 +2890,7 @@
               <w:rPr>
                 <w:sz w:val="18"/>
               </w:rPr>
-              <w:t>$2.10M</w:t>
+              <w:t>$1.24M</w:t>
             </w:r>
           </w:p>
         </w:tc>
@@ -2895,7 +2904,7 @@
               <w:rPr>
                 <w:sz w:val="18"/>
               </w:rPr>
-              <w:t>+$1.5M (0.50% @ $300M)</w:t>
+              <w:t>+$1,500K (0.50% @ $300M)</w:t>
             </w:r>
           </w:p>
         </w:tc>

</xml_diff>

<commit_message>
SSLC offer: float/tradeable-at-going-public lockup, orange IF-HELD rows, DIV/0 fix
</commit_message>
<xml_diff>
--- a/drafts/Exos_SSLC_OptionB_Offer_Summary_2026-10-07.docx
+++ b/drafts/Exos_SSLC_OptionB_Offer_Summary_2026-10-07.docx
@@ -1709,14 +1709,14 @@
         <w:tc>
           <w:tcPr>
             <w:tcW w:type="dxa" w:w="3240"/>
-            <w:shd w:val="clear" w:color="auto" w:fill="FEF3C7"/>
-          </w:tcPr>
-          <w:p>
-            <w:r/>
-            <w:r>
-              <w:rPr>
-                <w:i/>
-                <w:color w:val="6B7280"/>
+            <w:shd w:val="clear" w:color="auto" w:fill="FBD2BC"/>
+          </w:tcPr>
+          <w:p>
+            <w:r/>
+            <w:r>
+              <w:rPr>
+                <w:b/>
+                <w:color w:val="1F3A68"/>
                 <w:sz w:val="16"/>
               </w:rPr>
               <w:t>IF HELD: all Exos stock projected</w:t>
@@ -1726,8 +1726,8 @@
             </w:r>
             <w:r>
               <w:rPr>
-                <w:i/>
-                <w:color w:val="6B7280"/>
+                <w:b/>
+                <w:color w:val="1F3A68"/>
                 <w:sz w:val="16"/>
               </w:rPr>
               <w:t>in FY2031 (replaces listing earn-out)</w:t>
@@ -1737,7 +1737,7 @@
         <w:tc>
           <w:tcPr>
             <w:tcW w:type="dxa" w:w="1152"/>
-            <w:shd w:val="clear" w:color="auto" w:fill="FEF3C7"/>
+            <w:shd w:val="clear" w:color="auto" w:fill="FBD2BC"/>
           </w:tcPr>
           <w:p>
             <w:pPr>
@@ -1746,8 +1746,8 @@
             <w:r/>
             <w:r>
               <w:rPr>
-                <w:i/>
-                <w:color w:val="6B7280"/>
+                <w:b/>
+                <w:color w:val="1F3A68"/>
                 <w:sz w:val="16"/>
               </w:rPr>
               <w:t>$6.7M</w:t>
@@ -1757,7 +1757,7 @@
         <w:tc>
           <w:tcPr>
             <w:tcW w:type="dxa" w:w="1152"/>
-            <w:shd w:val="clear" w:color="auto" w:fill="FEF3C7"/>
+            <w:shd w:val="clear" w:color="auto" w:fill="FBD2BC"/>
           </w:tcPr>
           <w:p>
             <w:pPr>
@@ -1766,8 +1766,8 @@
             <w:r/>
             <w:r>
               <w:rPr>
-                <w:i/>
-                <w:color w:val="6B7280"/>
+                <w:b/>
+                <w:color w:val="1F3A68"/>
                 <w:sz w:val="16"/>
               </w:rPr>
               <w:t>$9.6M</w:t>
@@ -1777,7 +1777,7 @@
         <w:tc>
           <w:tcPr>
             <w:tcW w:type="dxa" w:w="1152"/>
-            <w:shd w:val="clear" w:color="auto" w:fill="FEF3C7"/>
+            <w:shd w:val="clear" w:color="auto" w:fill="FBD2BC"/>
           </w:tcPr>
           <w:p>
             <w:pPr>
@@ -1786,8 +1786,8 @@
             <w:r/>
             <w:r>
               <w:rPr>
-                <w:i/>
-                <w:color w:val="6B7280"/>
+                <w:b/>
+                <w:color w:val="1F3A68"/>
                 <w:sz w:val="16"/>
               </w:rPr>
               <w:t>$12.4M</w:t>
@@ -1797,14 +1797,14 @@
         <w:tc>
           <w:tcPr>
             <w:tcW w:type="dxa" w:w="2664"/>
-            <w:shd w:val="clear" w:color="auto" w:fill="FEF3C7"/>
-          </w:tcPr>
-          <w:p>
-            <w:r/>
-            <w:r>
-              <w:rPr>
-                <w:i/>
-                <w:color w:val="6B7280"/>
+            <w:shd w:val="clear" w:color="auto" w:fill="FBD2BC"/>
+          </w:tcPr>
+          <w:p>
+            <w:r/>
+            <w:r>
+              <w:rPr>
+                <w:b/>
+                <w:color w:val="1F3A68"/>
                 <w:sz w:val="16"/>
               </w:rPr>
               <w:t>Total stake ~0.59/0.84/1.09% → ~0.41/0.59/0.76% after</w:t>
@@ -1814,8 +1814,8 @@
             </w:r>
             <w:r>
               <w:rPr>
-                <w:i/>
-                <w:color w:val="6B7280"/>
+                <w:b/>
+                <w:color w:val="1F3A68"/>
                 <w:sz w:val="16"/>
               </w:rPr>
               <w:t>~30% dilution × ~$1.63B FY31 EV (16× v12 EBITDA).</w:t>
@@ -1825,8 +1825,8 @@
             </w:r>
             <w:r>
               <w:rPr>
-                <w:i/>
-                <w:color w:val="6B7280"/>
+                <w:b/>
+                <w:color w:val="1F3A68"/>
                 <w:sz w:val="16"/>
               </w:rPr>
               <w:t>Projection only; on SSLC-actuals case ~$0.7–1.3M.</w:t>
@@ -1838,14 +1838,14 @@
         <w:tc>
           <w:tcPr>
             <w:tcW w:type="dxa" w:w="3240"/>
-            <w:shd w:val="clear" w:color="auto" w:fill="FEF3C7"/>
-          </w:tcPr>
-          <w:p>
-            <w:r/>
-            <w:r>
-              <w:rPr>
-                <w:i/>
-                <w:color w:val="6B7280"/>
+            <w:shd w:val="clear" w:color="auto" w:fill="F26A21"/>
+          </w:tcPr>
+          <w:p>
+            <w:r/>
+            <w:r>
+              <w:rPr>
+                <w:b/>
+                <w:color w:val="FFFFFF"/>
                 <w:sz w:val="16"/>
               </w:rPr>
               <w:t>④ TOTAL IF STOCK HELD TO 2031</w:t>
@@ -1855,8 +1855,8 @@
             </w:r>
             <w:r>
               <w:rPr>
-                <w:i/>
-                <w:color w:val="6B7280"/>
+                <w:b/>
+                <w:color w:val="FFFFFF"/>
                 <w:sz w:val="16"/>
               </w:rPr>
               <w:t>(① + tank + milestones + 2031 stock)</w:t>
@@ -1866,7 +1866,7 @@
         <w:tc>
           <w:tcPr>
             <w:tcW w:type="dxa" w:w="1152"/>
-            <w:shd w:val="clear" w:color="auto" w:fill="FEF3C7"/>
+            <w:shd w:val="clear" w:color="auto" w:fill="F26A21"/>
           </w:tcPr>
           <w:p>
             <w:pPr>
@@ -1875,8 +1875,8 @@
             <w:r/>
             <w:r>
               <w:rPr>
-                <w:i/>
-                <w:color w:val="6B7280"/>
+                <w:b/>
+                <w:color w:val="FFFFFF"/>
                 <w:sz w:val="16"/>
               </w:rPr>
               <w:t>$12.0M</w:t>
@@ -1886,7 +1886,7 @@
         <w:tc>
           <w:tcPr>
             <w:tcW w:type="dxa" w:w="1152"/>
-            <w:shd w:val="clear" w:color="auto" w:fill="FEF3C7"/>
+            <w:shd w:val="clear" w:color="auto" w:fill="F26A21"/>
           </w:tcPr>
           <w:p>
             <w:pPr>
@@ -1895,8 +1895,8 @@
             <w:r/>
             <w:r>
               <w:rPr>
-                <w:i/>
-                <w:color w:val="6B7280"/>
+                <w:b/>
+                <w:color w:val="FFFFFF"/>
                 <w:sz w:val="16"/>
               </w:rPr>
               <w:t>$15.8M</w:t>
@@ -1906,7 +1906,7 @@
         <w:tc>
           <w:tcPr>
             <w:tcW w:type="dxa" w:w="1152"/>
-            <w:shd w:val="clear" w:color="auto" w:fill="FEF3C7"/>
+            <w:shd w:val="clear" w:color="auto" w:fill="F26A21"/>
           </w:tcPr>
           <w:p>
             <w:pPr>
@@ -1915,8 +1915,8 @@
             <w:r/>
             <w:r>
               <w:rPr>
-                <w:i/>
-                <w:color w:val="6B7280"/>
+                <w:b/>
+                <w:color w:val="FFFFFF"/>
                 <w:sz w:val="16"/>
               </w:rPr>
               <w:t>$19.4M</w:t>
@@ -1926,14 +1926,14 @@
         <w:tc>
           <w:tcPr>
             <w:tcW w:type="dxa" w:w="2664"/>
-            <w:shd w:val="clear" w:color="auto" w:fill="FEF3C7"/>
-          </w:tcPr>
-          <w:p>
-            <w:r/>
-            <w:r>
-              <w:rPr>
-                <w:i/>
-                <w:color w:val="6B7280"/>
+            <w:shd w:val="clear" w:color="auto" w:fill="F26A21"/>
+          </w:tcPr>
+          <w:p>
+            <w:r/>
+            <w:r>
+              <w:rPr>
+                <w:b/>
+                <w:color w:val="FFFFFF"/>
                 <w:sz w:val="16"/>
               </w:rPr>
               <w:t>Alternative to ③, NOT added to it. Forward-looking</w:t>
@@ -1943,8 +1943,8 @@
             </w:r>
             <w:r>
               <w:rPr>
-                <w:i/>
-                <w:color w:val="6B7280"/>
+                <w:b/>
+                <w:color w:val="FFFFFF"/>
                 <w:sz w:val="16"/>
               </w:rPr>
               <w:t>projection, not a promise; RTO may not close.</w:t>
@@ -2272,20 +2272,6 @@
     <w:p>
       <w:pPr>
         <w:spacing w:after="40" w:before="0"/>
-      </w:pPr>
-      <w:r>
-        <w:rPr>
-          <w:b w:val="0"/>
-          <w:i/>
-          <w:color w:val="606060"/>
-          <w:sz w:val="17"/>
-        </w:rPr>
-        <w:t>Restricted securities — Rule 504 Reg D, restrictive legend; not freely tradeable at issuance. Same lockup as Exos principals. Rule 504 ref: https://www.sec.gov/resources-small-businesses/exempt-offerings/exemption-limited-offerings-not-exceeding-10-million-rule-504-regulation-d</w:t>
-      </w:r>
-    </w:p>
-    <w:p>
-      <w:pPr>
-        <w:spacing w:after="40" w:before="0"/>
         <w:ind w:left="288"/>
       </w:pPr>
       <w:r>
@@ -2295,10 +2281,10 @@
         <w:rPr>
           <w:b/>
         </w:rPr>
-        <w:t xml:space="preserve">Rule 144 resale.  </w:t>
+        <w:t xml:space="preserve">Part of the public float at going public.  </w:t>
       </w:r>
       <w:r>
-        <w:t>Holding period 6 months (reporting issuer) or 1 year (non-reporting). Exos is currently non-reporting; 6-month path opens only after RTO. 17 CFR 230.144(d): https://www.ecfr.gov/current/title-17/chapter-II/part-230/section-230.144</w:t>
+        <w:t>The $1.0M EAI units are structured to provide part of the float for the Exos RTO and become tradeable at going public (the RTO listing), subject to the same lockup as Exos principals. Specific lock terms are set in the RTO definitive agreement.</w:t>
       </w:r>
     </w:p>
     <w:p>
@@ -2313,10 +2299,10 @@
         <w:rPr>
           <w:b/>
         </w:rPr>
-        <w:t xml:space="preserve">RTO structure — preferred at close.  </w:t>
+        <w:t xml:space="preserve">Restricted at issuance — Rule 504 Reg D.  </w:t>
       </w:r>
       <w:r>
-        <w:t>At RTO close, founders/legacy holders receive unregistered non-voting non-convertible preferred (avoids NASDAQ Rule 5635). Converts to common + becomes liquid only after: (i) shareholder vote (proxy ~30 days post-close) and (ii) effective resale registration (S-1/S-3). EAI units follow this same path. [Board Brief 2026-09-04:16; Board Questions 2026-09-08:36,44]</w:t>
+        <w:t>Units carry a restrictive legend at issuance and are not freely tradeable prior to the RTO listing. Rule 504 ref: https://www.sec.gov/resources-small-businesses/exempt-offerings/exemption-limited-offerings-not-exceeding-10-million-rule-504-regulation-d</w:t>
       </w:r>
     </w:p>
     <w:tbl>
@@ -2423,7 +2409,7 @@
               <w:rPr>
                 <w:sz w:val="18"/>
               </w:rPr>
-              <w:t>Targeted Q1 FY27; 1-yr Rule 144 clock starts</w:t>
+              <w:t>Targeted Q1 FY27; units issued as restricted/legended securities</w:t>
             </w:r>
           </w:p>
         </w:tc>
@@ -2471,7 +2457,7 @@
                 <w:b/>
                 <w:sz w:val="18"/>
               </w:rPr>
-              <w:t>Conversion vote + resale reg. effective</w:t>
+              <w:t>Units tradeable at going public</w:t>
             </w:r>
           </w:p>
         </w:tc>
@@ -2485,38 +2471,7 @@
               <w:rPr>
                 <w:sz w:val="18"/>
               </w:rPr>
-              <w:t>~30–90 days post-RTO; preferred → common</w:t>
-            </w:r>
-          </w:p>
-        </w:tc>
-      </w:tr>
-      <w:tr>
-        <w:tc>
-          <w:tcPr>
-            <w:tcW w:type="dxa" w:w="3744"/>
-          </w:tcPr>
-          <w:p>
-            <w:r/>
-            <w:r>
-              <w:rPr>
-                <w:b/>
-                <w:sz w:val="18"/>
-              </w:rPr>
-              <w:t>Rule 144 eligibility</w:t>
-            </w:r>
-          </w:p>
-        </w:tc>
-        <w:tc>
-          <w:tcPr>
-            <w:tcW w:type="dxa" w:w="5616"/>
-          </w:tcPr>
-          <w:p>
-            <w:r/>
-            <w:r>
-              <w:rPr>
-                <w:sz w:val="18"/>
-              </w:rPr>
-              <w:t>6-mo (after reporting); 1-yr if non-reporting at issuance</w:t>
+              <w:t>At RTO listing, units part of public float; tradeable subject to principals' lockup</w:t>
             </w:r>
           </w:p>
         </w:tc>

</xml_diff>

<commit_message>
SSLC offer: EAI up-front units = float, no lockup at listing (John opt 2); employee term in summary
</commit_message>
<xml_diff>
--- a/drafts/Exos_SSLC_OptionB_Offer_Summary_2026-10-07.docx
+++ b/drafts/Exos_SSLC_OptionB_Offer_Summary_2026-10-07.docx
@@ -2215,6 +2215,37 @@
                 <w:b/>
                 <w:sz w:val="18"/>
               </w:rPr>
+              <w:t>SSLC employees</w:t>
+            </w:r>
+          </w:p>
+        </w:tc>
+        <w:tc>
+          <w:tcPr>
+            <w:tcW w:type="dxa" w:w="5904"/>
+          </w:tcPr>
+          <w:p>
+            <w:r/>
+            <w:r>
+              <w:rPr>
+                <w:sz w:val="18"/>
+              </w:rPr>
+              <w:t>Exos offers employment to SSLC employees on terms no less favorable than current (incl. comp &amp; benefits), subject to Exos hiring policies + confirmatory diligence; key-employee option pool set in the Definitive Agreement</w:t>
+            </w:r>
+          </w:p>
+        </w:tc>
+      </w:tr>
+      <w:tr>
+        <w:tc>
+          <w:tcPr>
+            <w:tcW w:type="dxa" w:w="2736"/>
+          </w:tcPr>
+          <w:p>
+            <w:r/>
+            <w:r>
+              <w:rPr>
+                <w:b/>
+                <w:sz w:val="18"/>
+              </w:rPr>
               <w:t>Status</w:t>
             </w:r>
           </w:p>
@@ -2284,7 +2315,7 @@
         <w:t xml:space="preserve">Part of the public float at going public.  </w:t>
       </w:r>
       <w:r>
-        <w:t>The $1.0M EAI units are structured to provide part of the float for the Exos RTO and become tradeable at going public (the RTO listing), subject to the same lockup as Exos principals. Specific lock terms are set in the RTO definitive agreement.</w:t>
+        <w:t>The $1.0M EAI units are structured to provide part of the float for the Exos RTO and become freely tradeable at going public (the RTO listing). No principals' lockup applies: locked-up shares would not count as public float. Requires the RTO resale registration to include the units.</w:t>
       </w:r>
     </w:p>
     <w:p>
@@ -2471,7 +2502,7 @@
               <w:rPr>
                 <w:sz w:val="18"/>
               </w:rPr>
-              <w:t>At RTO listing, units part of public float; tradeable subject to principals' lockup</w:t>
+              <w:t>At RTO listing: part of the public float, freely tradeable (no lockup); covered by RTO resale registration</w:t>
             </w:r>
           </w:p>
         </w:tc>

</xml_diff>

<commit_message>
SSLC earn-out: reframe as single 5% rate + performance targets (Low $3M/Base $5M/High $6M+)
- Offer summary: replace 3%/5%/7% wording with target framing; add Earn-Out
  Targets FY27-31 table (tank + M1-M5 + stock + totals with check/dash marks);
  tighten to 2 pages
- Board deck slide 5: rebuild around 6-column targets table (Earn-out | Target |
  Low | Base | High | Pays) with per-year revenue targets and check/dash marks
- xlsx model Assumptions rows 23-25: change from rate inputs (0.03/0.05/0.07) to
  revenue target inputs ($3M/$5M/$6M); Total Compensation formulas updated to
  MIN(0.05*revTarget, cap); verified Low $150K/Base $250K/High $300K per yr
- build_sslc_option_b_model.py: same input changes applied (no regression)
- Totals verified: Low $950K / Base $2,525K / High $4,100K = III minus II
</commit_message>
<xml_diff>
--- a/drafts/Exos_SSLC_OptionB_Offer_Summary_2026-10-07.docx
+++ b/drafts/Exos_SSLC_OptionB_Offer_Summary_2026-10-07.docx
@@ -915,7 +915,7 @@
               <w:rPr>
                 <w:sz w:val="16"/>
               </w:rPr>
-              <w:t>Tank earn-out (5 yrs, 5%/yr,</w:t>
+              <w:t>Tank earn-out: 5% of SSLC's IM tank</w:t>
             </w:r>
             <w:r>
               <w:br/>
@@ -924,7 +924,7 @@
               <w:rPr>
                 <w:sz w:val="16"/>
               </w:rPr>
-              <w:t>cap $300K/yr)</w:t>
+              <w:t>revenue/yr, cap $300K/yr, FY27–FY31</w:t>
             </w:r>
           </w:p>
         </w:tc>
@@ -989,7 +989,7 @@
               <w:rPr>
                 <w:sz w:val="16"/>
               </w:rPr>
-              <w:t>FY27–FY31; low 3%/base 5%/high</w:t>
+              <w:t>Single 5% rate; scenario = revenue</w:t>
             </w:r>
             <w:r>
               <w:br/>
@@ -998,7 +998,25 @@
               <w:rPr>
                 <w:sz w:val="16"/>
               </w:rPr>
-              <w:t>7% × IM rev; $300K/yr cap</w:t>
+              <w:t>SSLC achieves: Low $3M/yr → $150K/yr;</w:t>
+            </w:r>
+            <w:r>
+              <w:br/>
+            </w:r>
+            <w:r>
+              <w:rPr>
+                <w:sz w:val="16"/>
+              </w:rPr>
+              <w:t>Base $5M/yr → $250K/yr;</w:t>
+            </w:r>
+            <w:r>
+              <w:br/>
+            </w:r>
+            <w:r>
+              <w:rPr>
+                <w:sz w:val="16"/>
+              </w:rPr>
+              <w:t>High $6M+/yr → $300K/yr (cap)</w:t>
             </w:r>
           </w:p>
         </w:tc>
@@ -1956,6 +1974,1205 @@
     <w:p>
       <w:pPr>
         <w:spacing w:after="60" w:before="0"/>
+      </w:pPr>
+    </w:p>
+    <w:p>
+      <w:pPr>
+        <w:keepNext/>
+        <w:spacing w:after="40" w:before="60"/>
+      </w:pPr>
+      <w:r>
+        <w:rPr>
+          <w:b/>
+          <w:i w:val="0"/>
+          <w:color w:val="2E75B6"/>
+          <w:sz w:val="21"/>
+        </w:rPr>
+        <w:t>Earn-Out Targets: FY27–FY31</w:t>
+      </w:r>
+    </w:p>
+    <w:tbl>
+      <w:tblPr>
+        <w:tblW w:type="auto" w:w="0"/>
+        <w:jc w:val="center"/>
+        <w:tblLayout w:type="fixed"/>
+        <w:tblLook w:firstColumn="1" w:firstRow="1" w:lastColumn="0" w:lastRow="0" w:noHBand="0" w:noVBand="1" w:val="04A0"/>
+      </w:tblPr>
+      <w:tblGrid>
+        <w:gridCol w:w="2664"/>
+        <w:gridCol w:w="2232"/>
+        <w:gridCol w:w="1224"/>
+        <w:gridCol w:w="1224"/>
+        <w:gridCol w:w="1224"/>
+        <w:gridCol w:w="1224"/>
+      </w:tblGrid>
+      <w:tr>
+        <w:tc>
+          <w:tcPr>
+            <w:tcW w:type="dxa" w:w="2664"/>
+            <w:shd w:val="clear" w:color="auto" w:fill="1F3A68"/>
+          </w:tcPr>
+          <w:p>
+            <w:r/>
+            <w:r>
+              <w:rPr>
+                <w:b/>
+                <w:color w:val="FFFFFF"/>
+                <w:sz w:val="16"/>
+              </w:rPr>
+              <w:t>Earn-out</w:t>
+            </w:r>
+          </w:p>
+        </w:tc>
+        <w:tc>
+          <w:tcPr>
+            <w:tcW w:type="dxa" w:w="2232"/>
+            <w:shd w:val="clear" w:color="auto" w:fill="1F3A68"/>
+          </w:tcPr>
+          <w:p>
+            <w:r/>
+            <w:r>
+              <w:rPr>
+                <w:b/>
+                <w:color w:val="FFFFFF"/>
+                <w:sz w:val="16"/>
+              </w:rPr>
+              <w:t>Target SSLC must hit</w:t>
+            </w:r>
+          </w:p>
+        </w:tc>
+        <w:tc>
+          <w:tcPr>
+            <w:tcW w:type="dxa" w:w="1224"/>
+            <w:shd w:val="clear" w:color="auto" w:fill="1F3A68"/>
+          </w:tcPr>
+          <w:p>
+            <w:pPr>
+              <w:jc w:val="center"/>
+            </w:pPr>
+            <w:r/>
+            <w:r>
+              <w:rPr>
+                <w:b/>
+                <w:color w:val="FFFFFF"/>
+                <w:sz w:val="16"/>
+              </w:rPr>
+              <w:t>Low</w:t>
+            </w:r>
+          </w:p>
+        </w:tc>
+        <w:tc>
+          <w:tcPr>
+            <w:tcW w:type="dxa" w:w="1224"/>
+            <w:shd w:val="clear" w:color="auto" w:fill="1F3A68"/>
+          </w:tcPr>
+          <w:p>
+            <w:pPr>
+              <w:jc w:val="center"/>
+            </w:pPr>
+            <w:r/>
+            <w:r>
+              <w:rPr>
+                <w:b/>
+                <w:color w:val="FFFFFF"/>
+                <w:sz w:val="16"/>
+              </w:rPr>
+              <w:t>Base</w:t>
+            </w:r>
+          </w:p>
+        </w:tc>
+        <w:tc>
+          <w:tcPr>
+            <w:tcW w:type="dxa" w:w="1224"/>
+            <w:shd w:val="clear" w:color="auto" w:fill="1F3A68"/>
+          </w:tcPr>
+          <w:p>
+            <w:pPr>
+              <w:jc w:val="center"/>
+            </w:pPr>
+            <w:r/>
+            <w:r>
+              <w:rPr>
+                <w:b/>
+                <w:color w:val="FFFFFF"/>
+                <w:sz w:val="16"/>
+              </w:rPr>
+              <w:t>High</w:t>
+            </w:r>
+          </w:p>
+        </w:tc>
+        <w:tc>
+          <w:tcPr>
+            <w:tcW w:type="dxa" w:w="1224"/>
+            <w:shd w:val="clear" w:color="auto" w:fill="1F3A68"/>
+          </w:tcPr>
+          <w:p>
+            <w:pPr>
+              <w:jc w:val="center"/>
+            </w:pPr>
+            <w:r/>
+            <w:r>
+              <w:rPr>
+                <w:b/>
+                <w:color w:val="FFFFFF"/>
+                <w:sz w:val="16"/>
+              </w:rPr>
+              <w:t>Pays</w:t>
+            </w:r>
+          </w:p>
+        </w:tc>
+      </w:tr>
+      <w:tr>
+        <w:tc>
+          <w:tcPr>
+            <w:tcW w:type="dxa" w:w="2664"/>
+          </w:tcPr>
+          <w:p>
+            <w:r/>
+            <w:r>
+              <w:rPr>
+                <w:sz w:val="16"/>
+              </w:rPr>
+              <w:t>Tank earn-out</w:t>
+            </w:r>
+            <w:r>
+              <w:br/>
+            </w:r>
+            <w:r>
+              <w:rPr>
+                <w:sz w:val="16"/>
+              </w:rPr>
+              <w:t>5% of IM tank revenue/yr,</w:t>
+            </w:r>
+            <w:r>
+              <w:br/>
+            </w:r>
+            <w:r>
+              <w:rPr>
+                <w:sz w:val="16"/>
+              </w:rPr>
+              <w:t>cap $300K/yr, FY27–FY31</w:t>
+            </w:r>
+          </w:p>
+        </w:tc>
+        <w:tc>
+          <w:tcPr>
+            <w:tcW w:type="dxa" w:w="2232"/>
+          </w:tcPr>
+          <w:p>
+            <w:r/>
+            <w:r>
+              <w:rPr>
+                <w:sz w:val="16"/>
+              </w:rPr>
+              <w:t>Revenue SSLC achieves</w:t>
+            </w:r>
+            <w:r>
+              <w:br/>
+            </w:r>
+            <w:r>
+              <w:rPr>
+                <w:sz w:val="16"/>
+              </w:rPr>
+              <w:t>each year FY27–FY31</w:t>
+            </w:r>
+          </w:p>
+        </w:tc>
+        <w:tc>
+          <w:tcPr>
+            <w:tcW w:type="dxa" w:w="1224"/>
+          </w:tcPr>
+          <w:p>
+            <w:pPr>
+              <w:jc w:val="center"/>
+            </w:pPr>
+            <w:r/>
+            <w:r>
+              <w:rPr>
+                <w:sz w:val="16"/>
+              </w:rPr>
+              <w:t>$3.0M/yr</w:t>
+            </w:r>
+            <w:r>
+              <w:br/>
+            </w:r>
+            <w:r>
+              <w:rPr>
+                <w:sz w:val="16"/>
+              </w:rPr>
+              <w:t>→ $150K/yr</w:t>
+            </w:r>
+            <w:r>
+              <w:br/>
+            </w:r>
+            <w:r>
+              <w:rPr>
+                <w:sz w:val="16"/>
+              </w:rPr>
+              <w:t>→ $750K total</w:t>
+            </w:r>
+          </w:p>
+        </w:tc>
+        <w:tc>
+          <w:tcPr>
+            <w:tcW w:type="dxa" w:w="1224"/>
+          </w:tcPr>
+          <w:p>
+            <w:pPr>
+              <w:jc w:val="center"/>
+            </w:pPr>
+            <w:r/>
+            <w:r>
+              <w:rPr>
+                <w:sz w:val="16"/>
+              </w:rPr>
+              <w:t>$5.0M/yr</w:t>
+            </w:r>
+            <w:r>
+              <w:br/>
+            </w:r>
+            <w:r>
+              <w:rPr>
+                <w:sz w:val="16"/>
+              </w:rPr>
+              <w:t>→ $250K/yr</w:t>
+            </w:r>
+            <w:r>
+              <w:br/>
+            </w:r>
+            <w:r>
+              <w:rPr>
+                <w:sz w:val="16"/>
+              </w:rPr>
+              <w:t>→ $1.25M total</w:t>
+            </w:r>
+          </w:p>
+        </w:tc>
+        <w:tc>
+          <w:tcPr>
+            <w:tcW w:type="dxa" w:w="1224"/>
+          </w:tcPr>
+          <w:p>
+            <w:pPr>
+              <w:jc w:val="center"/>
+            </w:pPr>
+            <w:r/>
+            <w:r>
+              <w:rPr>
+                <w:sz w:val="16"/>
+              </w:rPr>
+              <w:t>$6.0M+/yr</w:t>
+            </w:r>
+            <w:r>
+              <w:br/>
+            </w:r>
+            <w:r>
+              <w:rPr>
+                <w:sz w:val="16"/>
+              </w:rPr>
+              <w:t>→ $300K/yr (cap)</w:t>
+            </w:r>
+            <w:r>
+              <w:br/>
+            </w:r>
+            <w:r>
+              <w:rPr>
+                <w:sz w:val="16"/>
+              </w:rPr>
+              <w:t>→ $1.5M total</w:t>
+            </w:r>
+          </w:p>
+        </w:tc>
+        <w:tc>
+          <w:tcPr>
+            <w:tcW w:type="dxa" w:w="1224"/>
+          </w:tcPr>
+          <w:p>
+            <w:pPr>
+              <w:jc w:val="center"/>
+            </w:pPr>
+            <w:r/>
+            <w:r>
+              <w:rPr>
+                <w:sz w:val="16"/>
+              </w:rPr>
+              <w:t>Annual,</w:t>
+            </w:r>
+            <w:r>
+              <w:br/>
+            </w:r>
+            <w:r>
+              <w:rPr>
+                <w:sz w:val="16"/>
+              </w:rPr>
+              <w:t>FY27–FY31</w:t>
+            </w:r>
+          </w:p>
+        </w:tc>
+      </w:tr>
+      <w:tr>
+        <w:tc>
+          <w:tcPr>
+            <w:tcW w:type="dxa" w:w="2664"/>
+            <w:shd w:val="clear" w:color="auto" w:fill="EFF6FF"/>
+          </w:tcPr>
+          <w:p>
+            <w:r/>
+            <w:r>
+              <w:rPr>
+                <w:sz w:val="16"/>
+              </w:rPr>
+              <w:t>M1: SSLC FY2026-27 rev ≥ $5.1M → $200K</w:t>
+            </w:r>
+          </w:p>
+        </w:tc>
+        <w:tc>
+          <w:tcPr>
+            <w:tcW w:type="dxa" w:w="2232"/>
+            <w:shd w:val="clear" w:color="auto" w:fill="EFF6FF"/>
+          </w:tcPr>
+          <w:p>
+            <w:r/>
+            <w:r>
+              <w:rPr>
+                <w:sz w:val="16"/>
+              </w:rPr>
+              <w:t>SSLC FY27 annual revenue ≥ $5.1M</w:t>
+            </w:r>
+          </w:p>
+        </w:tc>
+        <w:tc>
+          <w:tcPr>
+            <w:tcW w:type="dxa" w:w="1224"/>
+            <w:shd w:val="clear" w:color="auto" w:fill="EFF6FF"/>
+          </w:tcPr>
+          <w:p>
+            <w:pPr>
+              <w:jc w:val="center"/>
+            </w:pPr>
+            <w:r/>
+            <w:r>
+              <w:rPr>
+                <w:color w:val="000000"/>
+                <w:sz w:val="16"/>
+              </w:rPr>
+              <w:t>✓</w:t>
+            </w:r>
+          </w:p>
+        </w:tc>
+        <w:tc>
+          <w:tcPr>
+            <w:tcW w:type="dxa" w:w="1224"/>
+            <w:shd w:val="clear" w:color="auto" w:fill="EFF6FF"/>
+          </w:tcPr>
+          <w:p>
+            <w:pPr>
+              <w:jc w:val="center"/>
+            </w:pPr>
+            <w:r/>
+            <w:r>
+              <w:rPr>
+                <w:color w:val="000000"/>
+                <w:sz w:val="16"/>
+              </w:rPr>
+              <w:t>✓</w:t>
+            </w:r>
+          </w:p>
+        </w:tc>
+        <w:tc>
+          <w:tcPr>
+            <w:tcW w:type="dxa" w:w="1224"/>
+            <w:shd w:val="clear" w:color="auto" w:fill="EFF6FF"/>
+          </w:tcPr>
+          <w:p>
+            <w:pPr>
+              <w:jc w:val="center"/>
+            </w:pPr>
+            <w:r/>
+            <w:r>
+              <w:rPr>
+                <w:color w:val="000000"/>
+                <w:sz w:val="16"/>
+              </w:rPr>
+              <w:t>✓</w:t>
+            </w:r>
+          </w:p>
+        </w:tc>
+        <w:tc>
+          <w:tcPr>
+            <w:tcW w:type="dxa" w:w="1224"/>
+            <w:shd w:val="clear" w:color="auto" w:fill="EFF6FF"/>
+          </w:tcPr>
+          <w:p>
+            <w:pPr>
+              <w:jc w:val="center"/>
+            </w:pPr>
+            <w:r/>
+            <w:r>
+              <w:rPr>
+                <w:color w:val="000000"/>
+                <w:sz w:val="16"/>
+              </w:rPr>
+              <w:t>FY28 Q1</w:t>
+            </w:r>
+            <w:r>
+              <w:br/>
+            </w:r>
+            <w:r>
+              <w:rPr>
+                <w:color w:val="000000"/>
+                <w:sz w:val="16"/>
+              </w:rPr>
+              <w:t>(if verified)</w:t>
+            </w:r>
+          </w:p>
+        </w:tc>
+      </w:tr>
+      <w:tr>
+        <w:tc>
+          <w:tcPr>
+            <w:tcW w:type="dxa" w:w="2664"/>
+            <w:shd w:val="clear" w:color="auto" w:fill="EFF6FF"/>
+          </w:tcPr>
+          <w:p>
+            <w:r/>
+            <w:r>
+              <w:rPr>
+                <w:sz w:val="16"/>
+              </w:rPr>
+              <w:t>M2: Nebula/OTV production contract → $200K</w:t>
+            </w:r>
+          </w:p>
+        </w:tc>
+        <w:tc>
+          <w:tcPr>
+            <w:tcW w:type="dxa" w:w="2232"/>
+            <w:shd w:val="clear" w:color="auto" w:fill="EFF6FF"/>
+          </w:tcPr>
+          <w:p>
+            <w:r/>
+            <w:r>
+              <w:rPr>
+                <w:sz w:val="16"/>
+              </w:rPr>
+              <w:t>Nebula/OTV production</w:t>
+            </w:r>
+            <w:r>
+              <w:br/>
+            </w:r>
+            <w:r>
+              <w:rPr>
+                <w:sz w:val="16"/>
+              </w:rPr>
+              <w:t>contract signed</w:t>
+            </w:r>
+          </w:p>
+        </w:tc>
+        <w:tc>
+          <w:tcPr>
+            <w:tcW w:type="dxa" w:w="1224"/>
+            <w:shd w:val="clear" w:color="auto" w:fill="EFF6FF"/>
+          </w:tcPr>
+          <w:p>
+            <w:pPr>
+              <w:jc w:val="center"/>
+            </w:pPr>
+            <w:r/>
+            <w:r>
+              <w:rPr>
+                <w:color w:val="6B7280"/>
+                <w:sz w:val="16"/>
+              </w:rPr>
+              <w:t>—</w:t>
+            </w:r>
+          </w:p>
+        </w:tc>
+        <w:tc>
+          <w:tcPr>
+            <w:tcW w:type="dxa" w:w="1224"/>
+            <w:shd w:val="clear" w:color="auto" w:fill="EFF6FF"/>
+          </w:tcPr>
+          <w:p>
+            <w:pPr>
+              <w:jc w:val="center"/>
+            </w:pPr>
+            <w:r/>
+            <w:r>
+              <w:rPr>
+                <w:color w:val="000000"/>
+                <w:sz w:val="16"/>
+              </w:rPr>
+              <w:t>✓</w:t>
+            </w:r>
+          </w:p>
+        </w:tc>
+        <w:tc>
+          <w:tcPr>
+            <w:tcW w:type="dxa" w:w="1224"/>
+            <w:shd w:val="clear" w:color="auto" w:fill="EFF6FF"/>
+          </w:tcPr>
+          <w:p>
+            <w:pPr>
+              <w:jc w:val="center"/>
+            </w:pPr>
+            <w:r/>
+            <w:r>
+              <w:rPr>
+                <w:color w:val="000000"/>
+                <w:sz w:val="16"/>
+              </w:rPr>
+              <w:t>✓</w:t>
+            </w:r>
+          </w:p>
+        </w:tc>
+        <w:tc>
+          <w:tcPr>
+            <w:tcW w:type="dxa" w:w="1224"/>
+            <w:shd w:val="clear" w:color="auto" w:fill="EFF6FF"/>
+          </w:tcPr>
+          <w:p>
+            <w:pPr>
+              <w:jc w:val="center"/>
+            </w:pPr>
+            <w:r/>
+            <w:r>
+              <w:rPr>
+                <w:color w:val="000000"/>
+                <w:sz w:val="16"/>
+              </w:rPr>
+              <w:t>At contract</w:t>
+            </w:r>
+            <w:r>
+              <w:br/>
+            </w:r>
+            <w:r>
+              <w:rPr>
+                <w:color w:val="000000"/>
+                <w:sz w:val="16"/>
+              </w:rPr>
+              <w:t>execution</w:t>
+            </w:r>
+          </w:p>
+        </w:tc>
+      </w:tr>
+      <w:tr>
+        <w:tc>
+          <w:tcPr>
+            <w:tcW w:type="dxa" w:w="2664"/>
+            <w:shd w:val="clear" w:color="auto" w:fill="EFF6FF"/>
+          </w:tcPr>
+          <w:p>
+            <w:r/>
+            <w:r>
+              <w:rPr>
+                <w:sz w:val="16"/>
+              </w:rPr>
+              <w:t>M3: SSLC annual rev ≥ $10M → $250K</w:t>
+            </w:r>
+          </w:p>
+        </w:tc>
+        <w:tc>
+          <w:tcPr>
+            <w:tcW w:type="dxa" w:w="2232"/>
+            <w:shd w:val="clear" w:color="auto" w:fill="EFF6FF"/>
+          </w:tcPr>
+          <w:p>
+            <w:r/>
+            <w:r>
+              <w:rPr>
+                <w:sz w:val="16"/>
+              </w:rPr>
+              <w:t>SSLC annual revenue ≥ $10M</w:t>
+            </w:r>
+          </w:p>
+        </w:tc>
+        <w:tc>
+          <w:tcPr>
+            <w:tcW w:type="dxa" w:w="1224"/>
+            <w:shd w:val="clear" w:color="auto" w:fill="EFF6FF"/>
+          </w:tcPr>
+          <w:p>
+            <w:pPr>
+              <w:jc w:val="center"/>
+            </w:pPr>
+            <w:r/>
+            <w:r>
+              <w:rPr>
+                <w:color w:val="6B7280"/>
+                <w:sz w:val="16"/>
+              </w:rPr>
+              <w:t>—</w:t>
+            </w:r>
+          </w:p>
+        </w:tc>
+        <w:tc>
+          <w:tcPr>
+            <w:tcW w:type="dxa" w:w="1224"/>
+            <w:shd w:val="clear" w:color="auto" w:fill="EFF6FF"/>
+          </w:tcPr>
+          <w:p>
+            <w:pPr>
+              <w:jc w:val="center"/>
+            </w:pPr>
+            <w:r/>
+            <w:r>
+              <w:rPr>
+                <w:color w:val="000000"/>
+                <w:sz w:val="16"/>
+              </w:rPr>
+              <w:t>✓</w:t>
+            </w:r>
+          </w:p>
+        </w:tc>
+        <w:tc>
+          <w:tcPr>
+            <w:tcW w:type="dxa" w:w="1224"/>
+            <w:shd w:val="clear" w:color="auto" w:fill="EFF6FF"/>
+          </w:tcPr>
+          <w:p>
+            <w:pPr>
+              <w:jc w:val="center"/>
+            </w:pPr>
+            <w:r/>
+            <w:r>
+              <w:rPr>
+                <w:color w:val="000000"/>
+                <w:sz w:val="16"/>
+              </w:rPr>
+              <w:t>✓</w:t>
+            </w:r>
+          </w:p>
+        </w:tc>
+        <w:tc>
+          <w:tcPr>
+            <w:tcW w:type="dxa" w:w="1224"/>
+            <w:shd w:val="clear" w:color="auto" w:fill="EFF6FF"/>
+          </w:tcPr>
+          <w:p>
+            <w:pPr>
+              <w:jc w:val="center"/>
+            </w:pPr>
+            <w:r/>
+            <w:r>
+              <w:rPr>
+                <w:color w:val="000000"/>
+                <w:sz w:val="16"/>
+              </w:rPr>
+              <w:t>First yr hit</w:t>
+            </w:r>
+            <w:r>
+              <w:br/>
+            </w:r>
+            <w:r>
+              <w:rPr>
+                <w:color w:val="000000"/>
+                <w:sz w:val="16"/>
+              </w:rPr>
+              <w:t>(est. FY29)</w:t>
+            </w:r>
+          </w:p>
+        </w:tc>
+      </w:tr>
+      <w:tr>
+        <w:tc>
+          <w:tcPr>
+            <w:tcW w:type="dxa" w:w="2664"/>
+            <w:shd w:val="clear" w:color="auto" w:fill="EFF6FF"/>
+          </w:tcPr>
+          <w:p>
+            <w:r/>
+            <w:r>
+              <w:rPr>
+                <w:sz w:val="16"/>
+              </w:rPr>
+              <w:t>M4: SSLC annual rev ≥ $20M → $250K</w:t>
+            </w:r>
+          </w:p>
+        </w:tc>
+        <w:tc>
+          <w:tcPr>
+            <w:tcW w:type="dxa" w:w="2232"/>
+            <w:shd w:val="clear" w:color="auto" w:fill="EFF6FF"/>
+          </w:tcPr>
+          <w:p>
+            <w:r/>
+            <w:r>
+              <w:rPr>
+                <w:sz w:val="16"/>
+              </w:rPr>
+              <w:t>SSLC annual revenue ≥ $20M</w:t>
+            </w:r>
+          </w:p>
+        </w:tc>
+        <w:tc>
+          <w:tcPr>
+            <w:tcW w:type="dxa" w:w="1224"/>
+            <w:shd w:val="clear" w:color="auto" w:fill="EFF6FF"/>
+          </w:tcPr>
+          <w:p>
+            <w:pPr>
+              <w:jc w:val="center"/>
+            </w:pPr>
+            <w:r/>
+            <w:r>
+              <w:rPr>
+                <w:color w:val="6B7280"/>
+                <w:sz w:val="16"/>
+              </w:rPr>
+              <w:t>—</w:t>
+            </w:r>
+          </w:p>
+        </w:tc>
+        <w:tc>
+          <w:tcPr>
+            <w:tcW w:type="dxa" w:w="1224"/>
+            <w:shd w:val="clear" w:color="auto" w:fill="EFF6FF"/>
+          </w:tcPr>
+          <w:p>
+            <w:pPr>
+              <w:jc w:val="center"/>
+            </w:pPr>
+            <w:r/>
+            <w:r>
+              <w:rPr>
+                <w:color w:val="6B7280"/>
+                <w:sz w:val="16"/>
+              </w:rPr>
+              <w:t>—</w:t>
+            </w:r>
+          </w:p>
+        </w:tc>
+        <w:tc>
+          <w:tcPr>
+            <w:tcW w:type="dxa" w:w="1224"/>
+            <w:shd w:val="clear" w:color="auto" w:fill="EFF6FF"/>
+          </w:tcPr>
+          <w:p>
+            <w:pPr>
+              <w:jc w:val="center"/>
+            </w:pPr>
+            <w:r/>
+            <w:r>
+              <w:rPr>
+                <w:color w:val="000000"/>
+                <w:sz w:val="16"/>
+              </w:rPr>
+              <w:t>✓</w:t>
+            </w:r>
+          </w:p>
+        </w:tc>
+        <w:tc>
+          <w:tcPr>
+            <w:tcW w:type="dxa" w:w="1224"/>
+            <w:shd w:val="clear" w:color="auto" w:fill="EFF6FF"/>
+          </w:tcPr>
+          <w:p>
+            <w:pPr>
+              <w:jc w:val="center"/>
+            </w:pPr>
+            <w:r/>
+            <w:r>
+              <w:rPr>
+                <w:color w:val="000000"/>
+                <w:sz w:val="16"/>
+              </w:rPr>
+              <w:t>First yr hit</w:t>
+            </w:r>
+            <w:r>
+              <w:br/>
+            </w:r>
+            <w:r>
+              <w:rPr>
+                <w:color w:val="000000"/>
+                <w:sz w:val="16"/>
+              </w:rPr>
+              <w:t>(est. FY31)</w:t>
+            </w:r>
+          </w:p>
+        </w:tc>
+      </w:tr>
+      <w:tr>
+        <w:tc>
+          <w:tcPr>
+            <w:tcW w:type="dxa" w:w="2664"/>
+            <w:shd w:val="clear" w:color="auto" w:fill="EFF6FF"/>
+          </w:tcPr>
+          <w:p>
+            <w:r/>
+            <w:r>
+              <w:rPr>
+                <w:sz w:val="16"/>
+              </w:rPr>
+              <w:t>M5: BLK3 tank qualification → $200K</w:t>
+            </w:r>
+          </w:p>
+        </w:tc>
+        <w:tc>
+          <w:tcPr>
+            <w:tcW w:type="dxa" w:w="2232"/>
+            <w:shd w:val="clear" w:color="auto" w:fill="EFF6FF"/>
+          </w:tcPr>
+          <w:p>
+            <w:r/>
+            <w:r>
+              <w:rPr>
+                <w:sz w:val="16"/>
+              </w:rPr>
+              <w:t>Exos BLK3 tank</w:t>
+            </w:r>
+            <w:r>
+              <w:br/>
+            </w:r>
+            <w:r>
+              <w:rPr>
+                <w:sz w:val="16"/>
+              </w:rPr>
+              <w:t>qualification complete</w:t>
+            </w:r>
+          </w:p>
+        </w:tc>
+        <w:tc>
+          <w:tcPr>
+            <w:tcW w:type="dxa" w:w="1224"/>
+            <w:shd w:val="clear" w:color="auto" w:fill="EFF6FF"/>
+          </w:tcPr>
+          <w:p>
+            <w:pPr>
+              <w:jc w:val="center"/>
+            </w:pPr>
+            <w:r/>
+            <w:r>
+              <w:rPr>
+                <w:color w:val="6B7280"/>
+                <w:sz w:val="16"/>
+              </w:rPr>
+              <w:t>—</w:t>
+            </w:r>
+          </w:p>
+        </w:tc>
+        <w:tc>
+          <w:tcPr>
+            <w:tcW w:type="dxa" w:w="1224"/>
+            <w:shd w:val="clear" w:color="auto" w:fill="EFF6FF"/>
+          </w:tcPr>
+          <w:p>
+            <w:pPr>
+              <w:jc w:val="center"/>
+            </w:pPr>
+            <w:r/>
+            <w:r>
+              <w:rPr>
+                <w:color w:val="6B7280"/>
+                <w:sz w:val="16"/>
+              </w:rPr>
+              <w:t>—</w:t>
+            </w:r>
+          </w:p>
+        </w:tc>
+        <w:tc>
+          <w:tcPr>
+            <w:tcW w:type="dxa" w:w="1224"/>
+            <w:shd w:val="clear" w:color="auto" w:fill="EFF6FF"/>
+          </w:tcPr>
+          <w:p>
+            <w:pPr>
+              <w:jc w:val="center"/>
+            </w:pPr>
+            <w:r/>
+            <w:r>
+              <w:rPr>
+                <w:color w:val="000000"/>
+                <w:sz w:val="16"/>
+              </w:rPr>
+              <w:t>✓</w:t>
+            </w:r>
+          </w:p>
+        </w:tc>
+        <w:tc>
+          <w:tcPr>
+            <w:tcW w:type="dxa" w:w="1224"/>
+            <w:shd w:val="clear" w:color="auto" w:fill="EFF6FF"/>
+          </w:tcPr>
+          <w:p>
+            <w:pPr>
+              <w:jc w:val="center"/>
+            </w:pPr>
+            <w:r/>
+            <w:r>
+              <w:rPr>
+                <w:color w:val="000000"/>
+                <w:sz w:val="16"/>
+              </w:rPr>
+              <w:t>At BLK3 cert</w:t>
+            </w:r>
+            <w:r>
+              <w:br/>
+            </w:r>
+            <w:r>
+              <w:rPr>
+                <w:color w:val="000000"/>
+                <w:sz w:val="16"/>
+              </w:rPr>
+              <w:t>(est. FY27–28)</w:t>
+            </w:r>
+          </w:p>
+        </w:tc>
+      </w:tr>
+      <w:tr>
+        <w:tc>
+          <w:tcPr>
+            <w:tcW w:type="dxa" w:w="2664"/>
+          </w:tcPr>
+          <w:p>
+            <w:r/>
+            <w:r>
+              <w:rPr>
+                <w:sz w:val="16"/>
+              </w:rPr>
+              <w:t>Exos stock earn-out at RTO listing</w:t>
+            </w:r>
+            <w:r>
+              <w:br/>
+            </w:r>
+            <w:r>
+              <w:rPr>
+                <w:sz w:val="16"/>
+              </w:rPr>
+              <w:t>(additional to ~0.59% EAI up-front)</w:t>
+            </w:r>
+          </w:p>
+        </w:tc>
+        <w:tc>
+          <w:tcPr>
+            <w:tcW w:type="dxa" w:w="2232"/>
+          </w:tcPr>
+          <w:p>
+            <w:r/>
+            <w:r>
+              <w:rPr>
+                <w:sz w:val="16"/>
+              </w:rPr>
+              <w:t>Issued at RTO listing</w:t>
+            </w:r>
+          </w:p>
+        </w:tc>
+        <w:tc>
+          <w:tcPr>
+            <w:tcW w:type="dxa" w:w="1224"/>
+          </w:tcPr>
+          <w:p>
+            <w:pPr>
+              <w:jc w:val="center"/>
+            </w:pPr>
+            <w:r/>
+            <w:r>
+              <w:rPr>
+                <w:sz w:val="16"/>
+              </w:rPr>
+              <w:t>$0</w:t>
+            </w:r>
+            <w:r>
+              <w:br/>
+            </w:r>
+            <w:r>
+              <w:rPr>
+                <w:sz w:val="16"/>
+              </w:rPr>
+              <w:t>(0.0%)</w:t>
+            </w:r>
+          </w:p>
+        </w:tc>
+        <w:tc>
+          <w:tcPr>
+            <w:tcW w:type="dxa" w:w="1224"/>
+          </w:tcPr>
+          <w:p>
+            <w:pPr>
+              <w:jc w:val="center"/>
+            </w:pPr>
+            <w:r/>
+            <w:r>
+              <w:rPr>
+                <w:sz w:val="16"/>
+              </w:rPr>
+              <w:t>$625K</w:t>
+            </w:r>
+            <w:r>
+              <w:br/>
+            </w:r>
+            <w:r>
+              <w:rPr>
+                <w:sz w:val="16"/>
+              </w:rPr>
+              <w:t>(0.25%)</w:t>
+            </w:r>
+          </w:p>
+        </w:tc>
+        <w:tc>
+          <w:tcPr>
+            <w:tcW w:type="dxa" w:w="1224"/>
+          </w:tcPr>
+          <w:p>
+            <w:pPr>
+              <w:jc w:val="center"/>
+            </w:pPr>
+            <w:r/>
+            <w:r>
+              <w:rPr>
+                <w:sz w:val="16"/>
+              </w:rPr>
+              <w:t>$1,500K</w:t>
+            </w:r>
+            <w:r>
+              <w:br/>
+            </w:r>
+            <w:r>
+              <w:rPr>
+                <w:sz w:val="16"/>
+              </w:rPr>
+              <w:t>(0.50%)</w:t>
+            </w:r>
+          </w:p>
+        </w:tc>
+        <w:tc>
+          <w:tcPr>
+            <w:tcW w:type="dxa" w:w="1224"/>
+          </w:tcPr>
+          <w:p>
+            <w:pPr>
+              <w:jc w:val="center"/>
+            </w:pPr>
+            <w:r/>
+            <w:r>
+              <w:rPr>
+                <w:sz w:val="16"/>
+              </w:rPr>
+              <w:t>Post-RTO</w:t>
+            </w:r>
+            <w:r>
+              <w:br/>
+            </w:r>
+            <w:r>
+              <w:rPr>
+                <w:sz w:val="16"/>
+              </w:rPr>
+              <w:t>~FY29</w:t>
+            </w:r>
+          </w:p>
+        </w:tc>
+      </w:tr>
+      <w:tr>
+        <w:tc>
+          <w:tcPr>
+            <w:tcW w:type="dxa" w:w="2664"/>
+            <w:shd w:val="clear" w:color="auto" w:fill="D1FAE5"/>
+          </w:tcPr>
+          <w:p>
+            <w:r/>
+            <w:r>
+              <w:rPr>
+                <w:b/>
+                <w:sz w:val="16"/>
+              </w:rPr>
+              <w:t>TOTAL EARN-OUTS (5-yr, ③ minus ②)</w:t>
+            </w:r>
+          </w:p>
+        </w:tc>
+        <w:tc>
+          <w:tcPr>
+            <w:tcW w:type="dxa" w:w="2232"/>
+            <w:shd w:val="clear" w:color="auto" w:fill="D1FAE5"/>
+          </w:tcPr>
+          <w:p>
+            <w:r/>
+            <w:r>
+              <w:rPr>
+                <w:b/>
+                <w:sz w:val="16"/>
+              </w:rPr>
+            </w:r>
+          </w:p>
+        </w:tc>
+        <w:tc>
+          <w:tcPr>
+            <w:tcW w:type="dxa" w:w="1224"/>
+            <w:shd w:val="clear" w:color="auto" w:fill="D1FAE5"/>
+          </w:tcPr>
+          <w:p>
+            <w:pPr>
+              <w:jc w:val="center"/>
+            </w:pPr>
+            <w:r/>
+            <w:r>
+              <w:rPr>
+                <w:b/>
+                <w:sz w:val="16"/>
+              </w:rPr>
+              <w:t>$950K</w:t>
+            </w:r>
+          </w:p>
+        </w:tc>
+        <w:tc>
+          <w:tcPr>
+            <w:tcW w:type="dxa" w:w="1224"/>
+            <w:shd w:val="clear" w:color="auto" w:fill="D1FAE5"/>
+          </w:tcPr>
+          <w:p>
+            <w:pPr>
+              <w:jc w:val="center"/>
+            </w:pPr>
+            <w:r/>
+            <w:r>
+              <w:rPr>
+                <w:b/>
+                <w:sz w:val="16"/>
+              </w:rPr>
+              <w:t>$2,525K</w:t>
+            </w:r>
+          </w:p>
+        </w:tc>
+        <w:tc>
+          <w:tcPr>
+            <w:tcW w:type="dxa" w:w="1224"/>
+            <w:shd w:val="clear" w:color="auto" w:fill="D1FAE5"/>
+          </w:tcPr>
+          <w:p>
+            <w:pPr>
+              <w:jc w:val="center"/>
+            </w:pPr>
+            <w:r/>
+            <w:r>
+              <w:rPr>
+                <w:b/>
+                <w:sz w:val="16"/>
+              </w:rPr>
+              <w:t>$4,100K</w:t>
+            </w:r>
+          </w:p>
+        </w:tc>
+        <w:tc>
+          <w:tcPr>
+            <w:tcW w:type="dxa" w:w="1224"/>
+            <w:shd w:val="clear" w:color="auto" w:fill="D1FAE5"/>
+          </w:tcPr>
+          <w:p>
+            <w:pPr>
+              <w:jc w:val="center"/>
+            </w:pPr>
+            <w:r/>
+            <w:r>
+              <w:rPr>
+                <w:b/>
+                <w:sz w:val="16"/>
+              </w:rPr>
+            </w:r>
+          </w:p>
+        </w:tc>
+      </w:tr>
+    </w:tbl>
+    <w:p>
+      <w:pPr>
+        <w:spacing w:after="40" w:before="0"/>
       </w:pPr>
     </w:p>
     <w:p>
@@ -1969,7 +3186,7 @@
           <w:color w:val="606060"/>
           <w:sz w:val="17"/>
         </w:rPr>
-        <w:t>Why this structure: SSLC holders receive real Exos equity at close ($1.0M EAI units, ~0.59% of $169.7M 409A, issued as part of Exos's Rule 504 offering) — not only contingent upside. It aligns them with Exos immediately. The earn-out stock stays 0.0–0.5%, so total equity is ~0.59–1.09%.</w:t>
+        <w:t>Earn-out totals verified: Low $750K+$200K+$0=$950K ✓  Base $1,250K+$650K+$625K=$2,525K ✓  High $1,500K+$1,100K+$1,500K=$4,100K ✓  (each = ③ minus ② = ③ minus $5,360K)</w:t>
       </w:r>
     </w:p>
     <w:p>
@@ -1983,7 +3200,7 @@
           <w:color w:val="606060"/>
           <w:sz w:val="17"/>
         </w:rPr>
-        <w:t>Chart: SSLC_OptionB_Total_Compensation_5yr_2026-10-07.png  ·  Full model: EXOS_SSLC_OptionB_Acquisition_Model_2026-10-07.xlsx → 'Total Compensation' sheet  ·  IM program continuity: Exos-SSLC continues the Intuitive Machines contract with no delivery interruption.</w:t>
+        <w:t>EAI units: $1.0M fixed (~0.59% FD) issued as part of Rule 504 offering at close; part of RTO public float; freely tradeable at listing (no lockup). Earn-out stock (0.0–0.5% additional) at RTO listing. Full model: EXOS_SSLC_OptionB_Acquisition_Model_2026-10-07.xlsx → 'EAI Lockup &amp; Liquidity' and 'Total Compensation' sheets.</w:t>
       </w:r>
     </w:p>
     <w:p>
@@ -2282,281 +3499,7 @@
           <w:color w:val="606060"/>
           <w:sz w:val="17"/>
         </w:rPr>
-        <w:t>504 cap: $1.0M counts toward the Rule 504 $10M rolling 12-month cap; confirm remaining capacity. Rule 504 is U.S.-only; EAI units in the Japan round are Reg S — the two must remain distinct. See model → 'EAI Lockup &amp; Liquidity' sheet for full detail.</w:t>
-      </w:r>
-    </w:p>
-    <w:p>
-      <w:pPr>
-        <w:keepNext/>
-        <w:spacing w:after="60" w:before="60"/>
-      </w:pPr>
-      <w:r>
-        <w:rPr>
-          <w:b/>
-          <w:i w:val="0"/>
-          <w:color w:val="1F3A68"/>
-          <w:sz w:val="24"/>
-        </w:rPr>
-        <w:t>4.  EAI Unit Lockup &amp; Liquidity</w:t>
-      </w:r>
-    </w:p>
-    <w:p>
-      <w:pPr>
-        <w:spacing w:after="40" w:before="0"/>
-        <w:ind w:left="288"/>
-      </w:pPr>
-      <w:r>
-        <w:t xml:space="preserve">•  </w:t>
-      </w:r>
-      <w:r>
-        <w:rPr>
-          <w:b/>
-        </w:rPr>
-        <w:t xml:space="preserve">Part of the public float at going public.  </w:t>
-      </w:r>
-      <w:r>
-        <w:t>The $1.0M EAI units are structured to provide part of the float for the Exos RTO and become freely tradeable at going public (the RTO listing). No principals' lockup applies: locked-up shares would not count as public float. Requires the RTO resale registration to include the units.</w:t>
-      </w:r>
-    </w:p>
-    <w:p>
-      <w:pPr>
-        <w:spacing w:after="40" w:before="0"/>
-        <w:ind w:left="288"/>
-      </w:pPr>
-      <w:r>
-        <w:t xml:space="preserve">•  </w:t>
-      </w:r>
-      <w:r>
-        <w:rPr>
-          <w:b/>
-        </w:rPr>
-        <w:t xml:space="preserve">Restricted at issuance — Rule 504 Reg D.  </w:t>
-      </w:r>
-      <w:r>
-        <w:t>Units carry a restrictive legend at issuance and are not freely tradeable prior to the RTO listing. Rule 504 ref: https://www.sec.gov/resources-small-businesses/exempt-offerings/exemption-limited-offerings-not-exceeding-10-million-rule-504-regulation-d</w:t>
-      </w:r>
-    </w:p>
-    <w:tbl>
-      <w:tblPr>
-        <w:tblW w:type="auto" w:w="0"/>
-        <w:jc w:val="center"/>
-        <w:tblLayout w:type="fixed"/>
-        <w:tblLook w:firstColumn="1" w:firstRow="1" w:lastColumn="0" w:lastRow="0" w:noHBand="0" w:noVBand="1" w:val="04A0"/>
-      </w:tblPr>
-      <w:tblGrid>
-        <w:gridCol w:w="3744"/>
-        <w:gridCol w:w="5616"/>
-      </w:tblGrid>
-      <w:tr>
-        <w:tc>
-          <w:tcPr>
-            <w:tcW w:type="dxa" w:w="3744"/>
-            <w:shd w:val="clear" w:color="auto" w:fill="375623"/>
-          </w:tcPr>
-          <w:p>
-            <w:r/>
-            <w:r>
-              <w:rPr>
-                <w:b/>
-                <w:color w:val="FFFFFF"/>
-                <w:sz w:val="18"/>
-              </w:rPr>
-              <w:t>Milestone</w:t>
-            </w:r>
-          </w:p>
-        </w:tc>
-        <w:tc>
-          <w:tcPr>
-            <w:tcW w:type="dxa" w:w="5616"/>
-            <w:shd w:val="clear" w:color="auto" w:fill="375623"/>
-          </w:tcPr>
-          <w:p>
-            <w:r/>
-            <w:r>
-              <w:rPr>
-                <w:b/>
-                <w:color w:val="FFFFFF"/>
-                <w:sz w:val="18"/>
-              </w:rPr>
-              <w:t>Target / Status</w:t>
-            </w:r>
-          </w:p>
-        </w:tc>
-      </w:tr>
-      <w:tr>
-        <w:tc>
-          <w:tcPr>
-            <w:tcW w:type="dxa" w:w="3744"/>
-          </w:tcPr>
-          <w:p>
-            <w:r/>
-            <w:r>
-              <w:rPr>
-                <w:b/>
-                <w:sz w:val="18"/>
-              </w:rPr>
-              <w:t>Board acceptance</w:t>
-            </w:r>
-          </w:p>
-        </w:tc>
-        <w:tc>
-          <w:tcPr>
-            <w:tcW w:type="dxa" w:w="5616"/>
-          </w:tcPr>
-          <w:p>
-            <w:r/>
-            <w:r>
-              <w:rPr>
-                <w:sz w:val="18"/>
-              </w:rPr>
-              <w:t>D+0 — units committed; not yet issued</w:t>
-            </w:r>
-          </w:p>
-        </w:tc>
-      </w:tr>
-      <w:tr>
-        <w:tc>
-          <w:tcPr>
-            <w:tcW w:type="dxa" w:w="3744"/>
-          </w:tcPr>
-          <w:p>
-            <w:r/>
-            <w:r>
-              <w:rPr>
-                <w:b/>
-                <w:sz w:val="18"/>
-              </w:rPr>
-              <w:t>Financing close — units issued</w:t>
-            </w:r>
-          </w:p>
-        </w:tc>
-        <w:tc>
-          <w:tcPr>
-            <w:tcW w:type="dxa" w:w="5616"/>
-          </w:tcPr>
-          <w:p>
-            <w:r/>
-            <w:r>
-              <w:rPr>
-                <w:sz w:val="18"/>
-              </w:rPr>
-              <w:t>Targeted Q1 FY27; units issued as restricted/legended securities</w:t>
-            </w:r>
-          </w:p>
-        </w:tc>
-      </w:tr>
-      <w:tr>
-        <w:tc>
-          <w:tcPr>
-            <w:tcW w:type="dxa" w:w="3744"/>
-          </w:tcPr>
-          <w:p>
-            <w:r/>
-            <w:r>
-              <w:rPr>
-                <w:b/>
-                <w:sz w:val="18"/>
-              </w:rPr>
-              <w:t>Targeted RTO close</w:t>
-            </w:r>
-          </w:p>
-        </w:tc>
-        <w:tc>
-          <w:tcPr>
-            <w:tcW w:type="dxa" w:w="5616"/>
-          </w:tcPr>
-          <w:p>
-            <w:r/>
-            <w:r>
-              <w:rPr>
-                <w:sz w:val="18"/>
-              </w:rPr>
-              <w:t>~6 months post-financing (targeted, not assured)</w:t>
-            </w:r>
-          </w:p>
-        </w:tc>
-      </w:tr>
-      <w:tr>
-        <w:tc>
-          <w:tcPr>
-            <w:tcW w:type="dxa" w:w="3744"/>
-          </w:tcPr>
-          <w:p>
-            <w:r/>
-            <w:r>
-              <w:rPr>
-                <w:b/>
-                <w:sz w:val="18"/>
-              </w:rPr>
-              <w:t>Units tradeable at going public</w:t>
-            </w:r>
-          </w:p>
-        </w:tc>
-        <w:tc>
-          <w:tcPr>
-            <w:tcW w:type="dxa" w:w="5616"/>
-          </w:tcPr>
-          <w:p>
-            <w:r/>
-            <w:r>
-              <w:rPr>
-                <w:sz w:val="18"/>
-              </w:rPr>
-              <w:t>At RTO listing: part of the public float, freely tradeable (no lockup); covered by RTO resale registration</w:t>
-            </w:r>
-          </w:p>
-        </w:tc>
-      </w:tr>
-      <w:tr>
-        <w:tc>
-          <w:tcPr>
-            <w:tcW w:type="dxa" w:w="3744"/>
-          </w:tcPr>
-          <w:p>
-            <w:r/>
-            <w:r>
-              <w:rPr>
-                <w:b/>
-                <w:sz w:val="18"/>
-              </w:rPr>
-              <w:t>ALL DATES</w:t>
-            </w:r>
-          </w:p>
-        </w:tc>
-        <w:tc>
-          <w:tcPr>
-            <w:tcW w:type="dxa" w:w="5616"/>
-          </w:tcPr>
-          <w:p>
-            <w:r/>
-            <w:r>
-              <w:rPr>
-                <w:sz w:val="18"/>
-              </w:rPr>
-              <w:t>Targeted, not assured. RTO may not close.</w:t>
-            </w:r>
-          </w:p>
-        </w:tc>
-      </w:tr>
-    </w:tbl>
-    <w:p>
-      <w:pPr>
-        <w:spacing w:after="60" w:before="0"/>
-      </w:pPr>
-    </w:p>
-    <w:p>
-      <w:pPr>
-        <w:keepNext/>
-        <w:spacing w:after="60" w:before="60"/>
-      </w:pPr>
-      <w:r>
-        <w:rPr>
-          <w:b/>
-          <w:i w:val="0"/>
-          <w:color w:val="1F3A68"/>
-          <w:sz w:val="24"/>
-        </w:rPr>
-        <w:t>5.  Projected Post-RTO Value  (Projection — Not a Promise)</w:t>
+        <w:t>Rule 504: $1.0M toward $10M rolling 12-month cap; U.S.-only (Japan round is Reg S — keep distinct). EAI timeline: committed at board acceptance → issued at financing close (Q1 FY27 targeted) → freely tradeable at RTO listing (targeted ~6 mo post-close; not assured). Full detail: model → 'EAI Lockup &amp; Liquidity' sheet.</w:t>
       </w:r>
     </w:p>
     <w:p>
@@ -2570,349 +3513,7 @@
           <w:color w:val="606060"/>
           <w:sz w:val="17"/>
         </w:rPr>
-        <w:t>Forward-looking projection — management assumptions (RTO completion, listing valuation, ~30% dilution). Not a guarantee; actual results may differ. RTO may not close. SEC Rule 10b-5, 17 CFR 240.10b-5 (https://www.ecfr.gov/current/title-17/chapter-II/part-240/section-240.10b-5) antifraud rules apply. 409A issuance value: $1.0M fixed (~0.59%). Up-front EAI only; earn-out column is additional, at listing, pre-dilution.</w:t>
-      </w:r>
-    </w:p>
-    <w:tbl>
-      <w:tblPr>
-        <w:tblW w:type="auto" w:w="0"/>
-        <w:jc w:val="center"/>
-        <w:tblLayout w:type="fixed"/>
-        <w:tblLook w:firstColumn="1" w:firstRow="1" w:lastColumn="0" w:lastRow="0" w:noHBand="0" w:noVBand="1" w:val="04A0"/>
-      </w:tblPr>
-      <w:tblGrid>
-        <w:gridCol w:w="1224"/>
-        <w:gridCol w:w="1224"/>
-        <w:gridCol w:w="1584"/>
-        <w:gridCol w:w="1872"/>
-        <w:gridCol w:w="2015"/>
-      </w:tblGrid>
-      <w:tr>
-        <w:tc>
-          <w:tcPr>
-            <w:tcW w:type="dxa" w:w="1224"/>
-            <w:shd w:val="clear" w:color="auto" w:fill="1F3A68"/>
-          </w:tcPr>
-          <w:p>
-            <w:r/>
-            <w:r>
-              <w:rPr>
-                <w:b/>
-                <w:color w:val="FFFFFF"/>
-                <w:sz w:val="18"/>
-              </w:rPr>
-              <w:t>Scenario</w:t>
-            </w:r>
-          </w:p>
-        </w:tc>
-        <w:tc>
-          <w:tcPr>
-            <w:tcW w:type="dxa" w:w="1224"/>
-            <w:shd w:val="clear" w:color="auto" w:fill="1F3A68"/>
-          </w:tcPr>
-          <w:p>
-            <w:r/>
-            <w:r>
-              <w:rPr>
-                <w:b/>
-                <w:color w:val="FFFFFF"/>
-                <w:sz w:val="18"/>
-              </w:rPr>
-              <w:t>RTO MEV</w:t>
-            </w:r>
-          </w:p>
-        </w:tc>
-        <w:tc>
-          <w:tcPr>
-            <w:tcW w:type="dxa" w:w="1584"/>
-            <w:shd w:val="clear" w:color="auto" w:fill="1F3A68"/>
-          </w:tcPr>
-          <w:p>
-            <w:r/>
-            <w:r>
-              <w:rPr>
-                <w:b/>
-                <w:color w:val="FFFFFF"/>
-                <w:sz w:val="18"/>
-              </w:rPr>
-              <w:t>~0.59% pre-dil</w:t>
-            </w:r>
-          </w:p>
-        </w:tc>
-        <w:tc>
-          <w:tcPr>
-            <w:tcW w:type="dxa" w:w="1872"/>
-            <w:shd w:val="clear" w:color="auto" w:fill="1F3A68"/>
-          </w:tcPr>
-          <w:p>
-            <w:r/>
-            <w:r>
-              <w:rPr>
-                <w:b/>
-                <w:color w:val="FFFFFF"/>
-                <w:sz w:val="18"/>
-              </w:rPr>
-              <w:t>~0.59% post-dil</w:t>
-              <w:br/>
-              <w:t>(~30% dil)</w:t>
-            </w:r>
-          </w:p>
-        </w:tc>
-        <w:tc>
-          <w:tcPr>
-            <w:tcW w:type="dxa" w:w="2016"/>
-            <w:shd w:val="clear" w:color="auto" w:fill="1F3A68"/>
-          </w:tcPr>
-          <w:p>
-            <w:r/>
-            <w:r>
-              <w:rPr>
-                <w:b/>
-                <w:color w:val="FFFFFF"/>
-                <w:sz w:val="18"/>
-              </w:rPr>
-              <w:t>+ earn-out at listing</w:t>
-            </w:r>
-          </w:p>
-        </w:tc>
-      </w:tr>
-      <w:tr>
-        <w:tc>
-          <w:tcPr>
-            <w:tcW w:type="dxa" w:w="1224"/>
-          </w:tcPr>
-          <w:p>
-            <w:r/>
-            <w:r>
-              <w:rPr>
-                <w:b/>
-                <w:sz w:val="18"/>
-              </w:rPr>
-              <w:t>Low</w:t>
-            </w:r>
-          </w:p>
-        </w:tc>
-        <w:tc>
-          <w:tcPr>
-            <w:tcW w:type="dxa" w:w="1224"/>
-          </w:tcPr>
-          <w:p>
-            <w:r/>
-            <w:r>
-              <w:rPr>
-                <w:sz w:val="18"/>
-              </w:rPr>
-              <w:t>$200M</w:t>
-            </w:r>
-          </w:p>
-        </w:tc>
-        <w:tc>
-          <w:tcPr>
-            <w:tcW w:type="dxa" w:w="1584"/>
-          </w:tcPr>
-          <w:p>
-            <w:r/>
-            <w:r>
-              <w:rPr>
-                <w:sz w:val="18"/>
-              </w:rPr>
-              <w:t>$1.18M</w:t>
-            </w:r>
-          </w:p>
-        </w:tc>
-        <w:tc>
-          <w:tcPr>
-            <w:tcW w:type="dxa" w:w="1872"/>
-          </w:tcPr>
-          <w:p>
-            <w:r/>
-            <w:r>
-              <w:rPr>
-                <w:sz w:val="18"/>
-              </w:rPr>
-              <w:t>$0.83M</w:t>
-            </w:r>
-          </w:p>
-        </w:tc>
-        <w:tc>
-          <w:tcPr>
-            <w:tcW w:type="dxa" w:w="2016"/>
-          </w:tcPr>
-          <w:p>
-            <w:r/>
-            <w:r>
-              <w:rPr>
-                <w:sz w:val="18"/>
-              </w:rPr>
-              <w:t>$0 (0.0%)</w:t>
-            </w:r>
-          </w:p>
-        </w:tc>
-      </w:tr>
-      <w:tr>
-        <w:tc>
-          <w:tcPr>
-            <w:tcW w:type="dxa" w:w="1224"/>
-          </w:tcPr>
-          <w:p>
-            <w:r/>
-            <w:r>
-              <w:rPr>
-                <w:b/>
-                <w:sz w:val="18"/>
-              </w:rPr>
-              <w:t>Base</w:t>
-            </w:r>
-          </w:p>
-        </w:tc>
-        <w:tc>
-          <w:tcPr>
-            <w:tcW w:type="dxa" w:w="1224"/>
-          </w:tcPr>
-          <w:p>
-            <w:r/>
-            <w:r>
-              <w:rPr>
-                <w:sz w:val="18"/>
-              </w:rPr>
-              <w:t>$250M</w:t>
-            </w:r>
-          </w:p>
-        </w:tc>
-        <w:tc>
-          <w:tcPr>
-            <w:tcW w:type="dxa" w:w="1584"/>
-          </w:tcPr>
-          <w:p>
-            <w:r/>
-            <w:r>
-              <w:rPr>
-                <w:sz w:val="18"/>
-              </w:rPr>
-              <w:t>$1.47M</w:t>
-            </w:r>
-          </w:p>
-        </w:tc>
-        <w:tc>
-          <w:tcPr>
-            <w:tcW w:type="dxa" w:w="1872"/>
-          </w:tcPr>
-          <w:p>
-            <w:r/>
-            <w:r>
-              <w:rPr>
-                <w:sz w:val="18"/>
-              </w:rPr>
-              <w:t>$1.03M</w:t>
-            </w:r>
-          </w:p>
-        </w:tc>
-        <w:tc>
-          <w:tcPr>
-            <w:tcW w:type="dxa" w:w="2016"/>
-          </w:tcPr>
-          <w:p>
-            <w:r/>
-            <w:r>
-              <w:rPr>
-                <w:sz w:val="18"/>
-              </w:rPr>
-              <w:t>+$625K (0.25% @ $250M)</w:t>
-            </w:r>
-          </w:p>
-        </w:tc>
-      </w:tr>
-      <w:tr>
-        <w:tc>
-          <w:tcPr>
-            <w:tcW w:type="dxa" w:w="1224"/>
-          </w:tcPr>
-          <w:p>
-            <w:r/>
-            <w:r>
-              <w:rPr>
-                <w:b/>
-                <w:sz w:val="18"/>
-              </w:rPr>
-              <w:t>High</w:t>
-            </w:r>
-          </w:p>
-        </w:tc>
-        <w:tc>
-          <w:tcPr>
-            <w:tcW w:type="dxa" w:w="1224"/>
-          </w:tcPr>
-          <w:p>
-            <w:r/>
-            <w:r>
-              <w:rPr>
-                <w:sz w:val="18"/>
-              </w:rPr>
-              <w:t>$300M</w:t>
-            </w:r>
-          </w:p>
-        </w:tc>
-        <w:tc>
-          <w:tcPr>
-            <w:tcW w:type="dxa" w:w="1584"/>
-          </w:tcPr>
-          <w:p>
-            <w:r/>
-            <w:r>
-              <w:rPr>
-                <w:sz w:val="18"/>
-              </w:rPr>
-              <w:t>$1.77M</w:t>
-            </w:r>
-          </w:p>
-        </w:tc>
-        <w:tc>
-          <w:tcPr>
-            <w:tcW w:type="dxa" w:w="1872"/>
-          </w:tcPr>
-          <w:p>
-            <w:r/>
-            <w:r>
-              <w:rPr>
-                <w:sz w:val="18"/>
-              </w:rPr>
-              <w:t>$1.24M</w:t>
-            </w:r>
-          </w:p>
-        </w:tc>
-        <w:tc>
-          <w:tcPr>
-            <w:tcW w:type="dxa" w:w="2016"/>
-          </w:tcPr>
-          <w:p>
-            <w:r/>
-            <w:r>
-              <w:rPr>
-                <w:sz w:val="18"/>
-              </w:rPr>
-              <w:t>+$1,500K (0.50% @ $300M)</w:t>
-            </w:r>
-          </w:p>
-        </w:tc>
-      </w:tr>
-    </w:tbl>
-    <w:p>
-      <w:pPr>
-        <w:spacing w:after="60" w:before="0"/>
-      </w:pPr>
-    </w:p>
-    <w:p>
-      <w:pPr>
-        <w:spacing w:after="40" w:before="0"/>
-      </w:pPr>
-      <w:r>
-        <w:rPr>
-          <w:b w:val="0"/>
-          <w:i/>
-          <w:color w:val="606060"/>
-          <w:sz w:val="17"/>
-        </w:rPr>
-        <w:t>Detail in model: drafts/EXOS_SSLC_OptionB_Acquisition_Model_2026-10-07.xlsx  ·  With-vs-Without comparison: sheet 'With vs Without Exos Capital'  ·  Exclusivity rescue options: SSLC_Exclusivity_Rescue_Options_and_Draft_Message_2026-10-07_DRAFT_v2.docx</w:t>
+        <w:t>Full model: EXOS_SSLC_OptionB_Acquisition_Model_2026-10-07.xlsx  ·  With-vs-Without: sheet 'With vs Without Exos Capital'  ·  RTO stock projection (mgmt assumption, not a guarantee): see model 'Total Compensation' / 'Returns and Dilution'  ·  Exclusivity rescue options: SSLC_Exclusivity_Rescue_Options_and_Draft_Message_2026-10-07_DRAFT_v2.docx</w:t>
       </w:r>
     </w:p>
     <w:p>

</xml_diff>

<commit_message>
SSLC r2: remove SSLC debts at face ($500K) from all outputs
Per John 10/10: SSLC debts NOT assumed by Exos at close.

Changes:
- Assumptions!B14 = 0 (was $500K)
- ① $4.36M → $3.86M | ② $5.36M → $4.86M
- ③ LOW/BASE/HIGH: $6.31M/$7.885M/$9.46M → $5.81M/$7.385M/$8.96M
- ④ hold to 2031: $12.0M/$15.8M/$19.4M → $11.5M/$15.3M/$18.9M
- Earn-out totals unchanged ($950K/$2,525K/$4,100K = ③ - ②)

Artifacts updated: xlsx model, r2 pptx deck, offer summary docx,
briefing email docx. Scripts updated in parallel (do NOT re-run model script).
</commit_message>
<xml_diff>
--- a/drafts/Exos_SSLC_OptionB_Offer_Summary_2026-10-07.docx
+++ b/drafts/Exos_SSLC_OptionB_Offer_Summary_2026-10-07.docx
@@ -455,7 +455,7 @@
               <w:rPr>
                 <w:sz w:val="16"/>
               </w:rPr>
-              <w:t>SSLC debts paid at face</w:t>
+              <w:t>Working-capital bridge</w:t>
             </w:r>
           </w:p>
         </w:tc>
@@ -520,7 +520,7 @@
               <w:rPr>
                 <w:sz w:val="16"/>
               </w:rPr>
-              <w:t>Close; ~$500K TBV in QB</w:t>
+              <w:t>Close</w:t>
             </w:r>
           </w:p>
         </w:tc>
@@ -529,20 +529,23 @@
         <w:tc>
           <w:tcPr>
             <w:tcW w:type="dxa" w:w="3240"/>
-          </w:tcPr>
-          <w:p>
-            <w:r/>
-            <w:r>
-              <w:rPr>
-                <w:sz w:val="16"/>
-              </w:rPr>
-              <w:t>Working-capital bridge</w:t>
+            <w:shd w:val="clear" w:color="auto" w:fill="F3F4F6"/>
+          </w:tcPr>
+          <w:p>
+            <w:r/>
+            <w:r>
+              <w:rPr>
+                <w:b/>
+                <w:sz w:val="16"/>
+              </w:rPr>
+              <w:t>① Cash at close — target by Feb 15th</w:t>
             </w:r>
           </w:p>
         </w:tc>
         <w:tc>
           <w:tcPr>
             <w:tcW w:type="dxa" w:w="1152"/>
+            <w:shd w:val="clear" w:color="auto" w:fill="F3F4F6"/>
           </w:tcPr>
           <w:p>
             <w:pPr>
@@ -551,15 +554,17 @@
             <w:r/>
             <w:r>
               <w:rPr>
-                <w:sz w:val="16"/>
-              </w:rPr>
-              <w:t>$500K</w:t>
+                <w:b/>
+                <w:sz w:val="16"/>
+              </w:rPr>
+              <w:t>$3,860K</w:t>
             </w:r>
           </w:p>
         </w:tc>
         <w:tc>
           <w:tcPr>
             <w:tcW w:type="dxa" w:w="1152"/>
+            <w:shd w:val="clear" w:color="auto" w:fill="F3F4F6"/>
           </w:tcPr>
           <w:p>
             <w:pPr>
@@ -568,15 +573,17 @@
             <w:r/>
             <w:r>
               <w:rPr>
-                <w:sz w:val="16"/>
-              </w:rPr>
-              <w:t>$500K</w:t>
+                <w:b/>
+                <w:sz w:val="16"/>
+              </w:rPr>
+              <w:t>$3,860K</w:t>
             </w:r>
           </w:p>
         </w:tc>
         <w:tc>
           <w:tcPr>
             <w:tcW w:type="dxa" w:w="1152"/>
+            <w:shd w:val="clear" w:color="auto" w:fill="F3F4F6"/>
           </w:tcPr>
           <w:p>
             <w:pPr>
@@ -585,23 +592,26 @@
             <w:r/>
             <w:r>
               <w:rPr>
-                <w:sz w:val="16"/>
-              </w:rPr>
-              <w:t>$500K</w:t>
+                <w:b/>
+                <w:sz w:val="16"/>
+              </w:rPr>
+              <w:t>$3,860K</w:t>
             </w:r>
           </w:p>
         </w:tc>
         <w:tc>
           <w:tcPr>
             <w:tcW w:type="dxa" w:w="2664"/>
-          </w:tcPr>
-          <w:p>
-            <w:r/>
-            <w:r>
-              <w:rPr>
-                <w:sz w:val="16"/>
-              </w:rPr>
-              <w:t>Close</w:t>
+            <w:shd w:val="clear" w:color="auto" w:fill="F3F4F6"/>
+          </w:tcPr>
+          <w:p>
+            <w:r/>
+            <w:r>
+              <w:rPr>
+                <w:b/>
+                <w:sz w:val="16"/>
+              </w:rPr>
+              <w:t>Cash + costs + stake credit + WC bridge</w:t>
             </w:r>
           </w:p>
         </w:tc>
@@ -610,6 +620,123 @@
         <w:tc>
           <w:tcPr>
             <w:tcW w:type="dxa" w:w="3240"/>
+          </w:tcPr>
+          <w:p>
+            <w:r/>
+            <w:r>
+              <w:rPr>
+                <w:sz w:val="16"/>
+              </w:rPr>
+              <w:t>+ Exos equity — $1.0M fixed EAI units</w:t>
+            </w:r>
+            <w:r>
+              <w:br/>
+            </w:r>
+            <w:r>
+              <w:rPr>
+                <w:sz w:val="16"/>
+              </w:rPr>
+              <w:t>(Rule 504, ~0.59% at 409A ~$170M)</w:t>
+            </w:r>
+          </w:p>
+        </w:tc>
+        <w:tc>
+          <w:tcPr>
+            <w:tcW w:type="dxa" w:w="1152"/>
+          </w:tcPr>
+          <w:p>
+            <w:pPr>
+              <w:jc w:val="right"/>
+            </w:pPr>
+            <w:r/>
+            <w:r>
+              <w:rPr>
+                <w:sz w:val="16"/>
+              </w:rPr>
+              <w:t>$1,000K</w:t>
+            </w:r>
+          </w:p>
+        </w:tc>
+        <w:tc>
+          <w:tcPr>
+            <w:tcW w:type="dxa" w:w="1152"/>
+          </w:tcPr>
+          <w:p>
+            <w:pPr>
+              <w:jc w:val="right"/>
+            </w:pPr>
+            <w:r/>
+            <w:r>
+              <w:rPr>
+                <w:sz w:val="16"/>
+              </w:rPr>
+              <w:t>$1,000K</w:t>
+            </w:r>
+          </w:p>
+        </w:tc>
+        <w:tc>
+          <w:tcPr>
+            <w:tcW w:type="dxa" w:w="1152"/>
+          </w:tcPr>
+          <w:p>
+            <w:pPr>
+              <w:jc w:val="right"/>
+            </w:pPr>
+            <w:r/>
+            <w:r>
+              <w:rPr>
+                <w:sz w:val="16"/>
+              </w:rPr>
+              <w:t>$1,000K</w:t>
+            </w:r>
+          </w:p>
+        </w:tc>
+        <w:tc>
+          <w:tcPr>
+            <w:tcW w:type="dxa" w:w="2664"/>
+          </w:tcPr>
+          <w:p>
+            <w:r/>
+            <w:r>
+              <w:rPr>
+                <w:sz w:val="16"/>
+              </w:rPr>
+              <w:t>EAI units issued as part of Exos's</w:t>
+            </w:r>
+            <w:r>
+              <w:br/>
+            </w:r>
+            <w:r>
+              <w:rPr>
+                <w:sz w:val="16"/>
+              </w:rPr>
+              <w:t>Rule 504 offering, at the 409A value;</w:t>
+            </w:r>
+            <w:r>
+              <w:br/>
+            </w:r>
+            <w:r>
+              <w:rPr>
+                <w:sz w:val="16"/>
+              </w:rPr>
+              <w:t>$1.0M counts toward Rule 504 $10M cap;</w:t>
+            </w:r>
+            <w:r>
+              <w:br/>
+            </w:r>
+            <w:r>
+              <w:rPr>
+                <w:sz w:val="16"/>
+              </w:rPr>
+              <w:t>issued at financing close</w:t>
+            </w:r>
+          </w:p>
+        </w:tc>
+      </w:tr>
+      <w:tr>
+        <w:tc>
+          <w:tcPr>
+            <w:tcW w:type="dxa" w:w="3240"/>
             <w:shd w:val="clear" w:color="auto" w:fill="F3F4F6"/>
           </w:tcPr>
           <w:p>
@@ -619,7 +746,7 @@
                 <w:b/>
                 <w:sz w:val="16"/>
               </w:rPr>
-              <w:t>① Cash &amp; debt relief at close — target by Feb 15th</w:t>
+              <w:t>② Total at financing close (SSLC asset acquisition)</w:t>
             </w:r>
           </w:p>
         </w:tc>
@@ -638,7 +765,7 @@
                 <w:b/>
                 <w:sz w:val="16"/>
               </w:rPr>
-              <w:t>$4,360K</w:t>
+              <w:t>$4,860K</w:t>
             </w:r>
           </w:p>
         </w:tc>
@@ -657,7 +784,7 @@
                 <w:b/>
                 <w:sz w:val="16"/>
               </w:rPr>
-              <w:t>$4,360K</w:t>
+              <w:t>$4,860K</w:t>
             </w:r>
           </w:p>
         </w:tc>
@@ -676,7 +803,7 @@
                 <w:b/>
                 <w:sz w:val="16"/>
               </w:rPr>
-              <w:t>$4,360K</w:t>
+              <w:t>$4,860K</w:t>
             </w:r>
           </w:p>
         </w:tc>
@@ -692,7 +819,7 @@
                 <w:b/>
                 <w:sz w:val="16"/>
               </w:rPr>
-              <w:t>Cash + costs + stake credit + debts + WC bridge</w:t>
+              <w:t>Target: Feb 15th</w:t>
             </w:r>
           </w:p>
         </w:tc>
@@ -708,7 +835,7 @@
               <w:rPr>
                 <w:sz w:val="16"/>
               </w:rPr>
-              <w:t>+ Exos equity — $1.0M fixed EAI units</w:t>
+              <w:t>Tank earn-out: 5% of SSLC's IM tank</w:t>
             </w:r>
             <w:r>
               <w:br/>
@@ -717,7 +844,7 @@
               <w:rPr>
                 <w:sz w:val="16"/>
               </w:rPr>
-              <w:t>(Rule 504, ~0.59% at 409A ~$170M)</w:t>
+              <w:t>revenue/yr, cap $300K/yr, FY27–FY31</w:t>
             </w:r>
           </w:p>
         </w:tc>
@@ -734,7 +861,7 @@
               <w:rPr>
                 <w:sz w:val="16"/>
               </w:rPr>
-              <w:t>$1,000K</w:t>
+              <w:t>$750K</w:t>
             </w:r>
           </w:p>
         </w:tc>
@@ -751,7 +878,7 @@
               <w:rPr>
                 <w:sz w:val="16"/>
               </w:rPr>
-              <w:t>$1,000K</w:t>
+              <w:t>$1,250K</w:t>
             </w:r>
           </w:p>
         </w:tc>
@@ -768,7 +895,7 @@
               <w:rPr>
                 <w:sz w:val="16"/>
               </w:rPr>
-              <w:t>$1,000K</w:t>
+              <w:t>$1,500K</w:t>
             </w:r>
           </w:p>
         </w:tc>
@@ -782,7 +909,7 @@
               <w:rPr>
                 <w:sz w:val="16"/>
               </w:rPr>
-              <w:t>EAI units issued as part of Exos's</w:t>
+              <w:t>Single 5% rate; scenario = revenue</w:t>
             </w:r>
             <w:r>
               <w:br/>
@@ -791,7 +918,7 @@
               <w:rPr>
                 <w:sz w:val="16"/>
               </w:rPr>
-              <w:t>Rule 504 offering, at the 409A value;</w:t>
+              <w:t>SSLC achieves: Low $3M/yr → $150K/yr;</w:t>
             </w:r>
             <w:r>
               <w:br/>
@@ -800,7 +927,7 @@
               <w:rPr>
                 <w:sz w:val="16"/>
               </w:rPr>
-              <w:t>$1.0M counts toward Rule 504 $10M cap;</w:t>
+              <w:t>Base $5M/yr → $250K/yr;</w:t>
             </w:r>
             <w:r>
               <w:br/>
@@ -809,7 +936,7 @@
               <w:rPr>
                 <w:sz w:val="16"/>
               </w:rPr>
-              <w:t>issued at financing close</w:t>
+              <w:t>High $6M+/yr → $300K/yr (cap)</w:t>
             </w:r>
           </w:p>
         </w:tc>
@@ -818,23 +945,31 @@
         <w:tc>
           <w:tcPr>
             <w:tcW w:type="dxa" w:w="3240"/>
-            <w:shd w:val="clear" w:color="auto" w:fill="F3F4F6"/>
-          </w:tcPr>
-          <w:p>
-            <w:r/>
-            <w:r>
-              <w:rPr>
-                <w:b/>
-                <w:sz w:val="16"/>
-              </w:rPr>
-              <w:t>② Total at financing close (SSLC asset acquisition)</w:t>
+            <w:shd w:val="clear" w:color="auto" w:fill="EFF6FF"/>
+          </w:tcPr>
+          <w:p>
+            <w:r/>
+            <w:r>
+              <w:rPr>
+                <w:sz w:val="16"/>
+              </w:rPr>
+              <w:t>Milestone M1: SSLC FY2026-27 rev</w:t>
+            </w:r>
+            <w:r>
+              <w:br/>
+            </w:r>
+            <w:r>
+              <w:rPr>
+                <w:sz w:val="16"/>
+              </w:rPr>
+              <w:t>≥$5.1M</w:t>
             </w:r>
           </w:p>
         </w:tc>
         <w:tc>
           <w:tcPr>
             <w:tcW w:type="dxa" w:w="1152"/>
-            <w:shd w:val="clear" w:color="auto" w:fill="F3F4F6"/>
+            <w:shd w:val="clear" w:color="auto" w:fill="EFF6FF"/>
           </w:tcPr>
           <w:p>
             <w:pPr>
@@ -843,17 +978,16 @@
             <w:r/>
             <w:r>
               <w:rPr>
-                <w:b/>
-                <w:sz w:val="16"/>
-              </w:rPr>
-              <w:t>$5,360K</w:t>
+                <w:sz w:val="16"/>
+              </w:rPr>
+              <w:t>$200K</w:t>
             </w:r>
           </w:p>
         </w:tc>
         <w:tc>
           <w:tcPr>
             <w:tcW w:type="dxa" w:w="1152"/>
-            <w:shd w:val="clear" w:color="auto" w:fill="F3F4F6"/>
+            <w:shd w:val="clear" w:color="auto" w:fill="EFF6FF"/>
           </w:tcPr>
           <w:p>
             <w:pPr>
@@ -862,17 +996,16 @@
             <w:r/>
             <w:r>
               <w:rPr>
-                <w:b/>
-                <w:sz w:val="16"/>
-              </w:rPr>
-              <w:t>$5,360K</w:t>
+                <w:sz w:val="16"/>
+              </w:rPr>
+              <w:t>$200K</w:t>
             </w:r>
           </w:p>
         </w:tc>
         <w:tc>
           <w:tcPr>
             <w:tcW w:type="dxa" w:w="1152"/>
-            <w:shd w:val="clear" w:color="auto" w:fill="F3F4F6"/>
+            <w:shd w:val="clear" w:color="auto" w:fill="EFF6FF"/>
           </w:tcPr>
           <w:p>
             <w:pPr>
@@ -881,26 +1014,33 @@
             <w:r/>
             <w:r>
               <w:rPr>
-                <w:b/>
-                <w:sz w:val="16"/>
-              </w:rPr>
-              <w:t>$5,360K</w:t>
+                <w:sz w:val="16"/>
+              </w:rPr>
+              <w:t>$200K</w:t>
             </w:r>
           </w:p>
         </w:tc>
         <w:tc>
           <w:tcPr>
             <w:tcW w:type="dxa" w:w="2664"/>
-            <w:shd w:val="clear" w:color="auto" w:fill="F3F4F6"/>
-          </w:tcPr>
-          <w:p>
-            <w:r/>
-            <w:r>
-              <w:rPr>
-                <w:b/>
-                <w:sz w:val="16"/>
-              </w:rPr>
-              <w:t>Target: Feb 15th</w:t>
+            <w:shd w:val="clear" w:color="auto" w:fill="EFF6FF"/>
+          </w:tcPr>
+          <w:p>
+            <w:r/>
+            <w:r>
+              <w:rPr>
+                <w:sz w:val="16"/>
+              </w:rPr>
+              <w:t>Pays FY28 Q1 if verified</w:t>
+            </w:r>
+            <w:r>
+              <w:br/>
+            </w:r>
+            <w:r>
+              <w:rPr>
+                <w:sz w:val="16"/>
+              </w:rPr>
+              <w:t>(all scenarios: mgmt base case)</w:t>
             </w:r>
           </w:p>
         </w:tc>
@@ -909,14 +1049,15 @@
         <w:tc>
           <w:tcPr>
             <w:tcW w:type="dxa" w:w="3240"/>
-          </w:tcPr>
-          <w:p>
-            <w:r/>
-            <w:r>
-              <w:rPr>
-                <w:sz w:val="16"/>
-              </w:rPr>
-              <w:t>Tank earn-out: 5% of SSLC's IM tank</w:t>
+            <w:shd w:val="clear" w:color="auto" w:fill="EFF6FF"/>
+          </w:tcPr>
+          <w:p>
+            <w:r/>
+            <w:r>
+              <w:rPr>
+                <w:sz w:val="16"/>
+              </w:rPr>
+              <w:t>Milestone M2: Nebula OTV flight tank set</w:t>
             </w:r>
             <w:r>
               <w:br/>
@@ -925,13 +1066,14 @@
               <w:rPr>
                 <w:sz w:val="16"/>
               </w:rPr>
-              <w:t>revenue/yr, cap $300K/yr, FY27–FY31</w:t>
+              <w:t>delivered &amp; accepted by Intuitive Machines</w:t>
             </w:r>
           </w:p>
         </w:tc>
         <w:tc>
           <w:tcPr>
             <w:tcW w:type="dxa" w:w="1152"/>
+            <w:shd w:val="clear" w:color="auto" w:fill="EFF6FF"/>
           </w:tcPr>
           <w:p>
             <w:pPr>
@@ -942,13 +1084,14 @@
               <w:rPr>
                 <w:sz w:val="16"/>
               </w:rPr>
-              <w:t>$750K</w:t>
+              <w:t>—</w:t>
             </w:r>
           </w:p>
         </w:tc>
         <w:tc>
           <w:tcPr>
             <w:tcW w:type="dxa" w:w="1152"/>
+            <w:shd w:val="clear" w:color="auto" w:fill="EFF6FF"/>
           </w:tcPr>
           <w:p>
             <w:pPr>
@@ -959,13 +1102,14 @@
               <w:rPr>
                 <w:sz w:val="16"/>
               </w:rPr>
-              <w:t>$1,250K</w:t>
+              <w:t>$200K</w:t>
             </w:r>
           </w:p>
         </w:tc>
         <w:tc>
           <w:tcPr>
             <w:tcW w:type="dxa" w:w="1152"/>
+            <w:shd w:val="clear" w:color="auto" w:fill="EFF6FF"/>
           </w:tcPr>
           <w:p>
             <w:pPr>
@@ -976,21 +1120,22 @@
               <w:rPr>
                 <w:sz w:val="16"/>
               </w:rPr>
-              <w:t>$1,500K</w:t>
+              <w:t>$200K</w:t>
             </w:r>
           </w:p>
         </w:tc>
         <w:tc>
           <w:tcPr>
             <w:tcW w:type="dxa" w:w="2664"/>
-          </w:tcPr>
-          <w:p>
-            <w:r/>
-            <w:r>
-              <w:rPr>
-                <w:sz w:val="16"/>
-              </w:rPr>
-              <w:t>Single 5% rate; scenario = revenue</w:t>
+            <w:shd w:val="clear" w:color="auto" w:fill="EFF6FF"/>
+          </w:tcPr>
+          <w:p>
+            <w:r/>
+            <w:r>
+              <w:rPr>
+                <w:sz w:val="16"/>
+              </w:rPr>
+              <w:t>Pays at customer acceptance</w:t>
             </w:r>
             <w:r>
               <w:br/>
@@ -999,25 +1144,7 @@
               <w:rPr>
                 <w:sz w:val="16"/>
               </w:rPr>
-              <w:t>SSLC achieves: Low $3M/yr → $150K/yr;</w:t>
-            </w:r>
-            <w:r>
-              <w:br/>
-            </w:r>
-            <w:r>
-              <w:rPr>
-                <w:sz w:val="16"/>
-              </w:rPr>
-              <w:t>Base $5M/yr → $250K/yr;</w:t>
-            </w:r>
-            <w:r>
-              <w:br/>
-            </w:r>
-            <w:r>
-              <w:rPr>
-                <w:sz w:val="16"/>
-              </w:rPr>
-              <w:t>High $6M+/yr → $300K/yr (cap)</w:t>
+              <w:t>(any year FY27–FY30)</w:t>
             </w:r>
           </w:p>
         </w:tc>
@@ -1034,16 +1161,7 @@
               <w:rPr>
                 <w:sz w:val="16"/>
               </w:rPr>
-              <w:t>Milestone M1: SSLC FY2026-27 rev</w:t>
-            </w:r>
-            <w:r>
-              <w:br/>
-            </w:r>
-            <w:r>
-              <w:rPr>
-                <w:sz w:val="16"/>
-              </w:rPr>
-              <w:t>≥$5.1M</w:t>
+              <w:t>Milestone M3: SSLC annual rev ≥$10M</w:t>
             </w:r>
           </w:p>
         </w:tc>
@@ -1061,7 +1179,7 @@
               <w:rPr>
                 <w:sz w:val="16"/>
               </w:rPr>
-              <w:t>$200K</w:t>
+              <w:t>—</w:t>
             </w:r>
           </w:p>
         </w:tc>
@@ -1079,7 +1197,7 @@
               <w:rPr>
                 <w:sz w:val="16"/>
               </w:rPr>
-              <w:t>$200K</w:t>
+              <w:t>$250K</w:t>
             </w:r>
           </w:p>
         </w:tc>
@@ -1097,7 +1215,7 @@
               <w:rPr>
                 <w:sz w:val="16"/>
               </w:rPr>
-              <w:t>$200K</w:t>
+              <w:t>$250K</w:t>
             </w:r>
           </w:p>
         </w:tc>
@@ -1112,7 +1230,7 @@
               <w:rPr>
                 <w:sz w:val="16"/>
               </w:rPr>
-              <w:t>Pays FY28 Q1 if verified</w:t>
+              <w:t>Pays first year threshold hit</w:t>
             </w:r>
             <w:r>
               <w:br/>
@@ -1121,7 +1239,7 @@
               <w:rPr>
                 <w:sz w:val="16"/>
               </w:rPr>
-              <w:t>(all scenarios: mgmt base case)</w:t>
+              <w:t>(est. FY29 at base/high)</w:t>
             </w:r>
           </w:p>
         </w:tc>
@@ -1138,16 +1256,7 @@
               <w:rPr>
                 <w:sz w:val="16"/>
               </w:rPr>
-              <w:t>Milestone M2: Nebula OTV flight tank set</w:t>
-            </w:r>
-            <w:r>
-              <w:br/>
-            </w:r>
-            <w:r>
-              <w:rPr>
-                <w:sz w:val="16"/>
-              </w:rPr>
-              <w:t>delivered &amp; accepted by Intuitive Machines</w:t>
+              <w:t>Milestone M4: SSLC annual rev ≥$20M</w:t>
             </w:r>
           </w:p>
         </w:tc>
@@ -1183,7 +1292,7 @@
               <w:rPr>
                 <w:sz w:val="16"/>
               </w:rPr>
-              <w:t>$200K</w:t>
+              <w:t>—</w:t>
             </w:r>
           </w:p>
         </w:tc>
@@ -1201,7 +1310,7 @@
               <w:rPr>
                 <w:sz w:val="16"/>
               </w:rPr>
-              <w:t>$200K</w:t>
+              <w:t>$250K</w:t>
             </w:r>
           </w:p>
         </w:tc>
@@ -1216,7 +1325,7 @@
               <w:rPr>
                 <w:sz w:val="16"/>
               </w:rPr>
-              <w:t>Pays at customer acceptance</w:t>
+              <w:t>Pays first year threshold hit</w:t>
             </w:r>
             <w:r>
               <w:br/>
@@ -1225,7 +1334,7 @@
               <w:rPr>
                 <w:sz w:val="16"/>
               </w:rPr>
-              <w:t>(any year FY27–FY30)</w:t>
+              <w:t>(est. FY31 at high)</w:t>
             </w:r>
           </w:p>
         </w:tc>
@@ -1242,7 +1351,16 @@
               <w:rPr>
                 <w:sz w:val="16"/>
               </w:rPr>
-              <w:t>Milestone M3: SSLC annual rev ≥$10M</w:t>
+              <w:t>Milestone M5: 50% reduction in tank build</w:t>
+            </w:r>
+            <w:r>
+              <w:br/>
+            </w:r>
+            <w:r>
+              <w:rPr>
+                <w:sz w:val="16"/>
+              </w:rPr>
+              <w:t>cost (dome &amp; build-process automation proven)</w:t>
             </w:r>
           </w:p>
         </w:tc>
@@ -1278,7 +1396,7 @@
               <w:rPr>
                 <w:sz w:val="16"/>
               </w:rPr>
-              <w:t>$250K</w:t>
+              <w:t>—</w:t>
             </w:r>
           </w:p>
         </w:tc>
@@ -1296,7 +1414,7 @@
               <w:rPr>
                 <w:sz w:val="16"/>
               </w:rPr>
-              <w:t>$250K</w:t>
+              <w:t>$200K</w:t>
             </w:r>
           </w:p>
         </w:tc>
@@ -1311,7 +1429,7 @@
               <w:rPr>
                 <w:sz w:val="16"/>
               </w:rPr>
-              <w:t>Pays first year threshold hit</w:t>
+              <w:t>Pays when 50% cost reduction proven</w:t>
             </w:r>
             <w:r>
               <w:br/>
@@ -1320,7 +1438,7 @@
               <w:rPr>
                 <w:sz w:val="16"/>
               </w:rPr>
-              <w:t>(est. FY29 at base/high)</w:t>
+              <w:t>(est. FY27–FY28)</w:t>
             </w:r>
           </w:p>
         </w:tc>
@@ -1329,22 +1447,29 @@
         <w:tc>
           <w:tcPr>
             <w:tcW w:type="dxa" w:w="3240"/>
-            <w:shd w:val="clear" w:color="auto" w:fill="EFF6FF"/>
-          </w:tcPr>
-          <w:p>
-            <w:r/>
-            <w:r>
-              <w:rPr>
-                <w:sz w:val="16"/>
-              </w:rPr>
-              <w:t>Milestone M4: SSLC annual rev ≥$20M</w:t>
+          </w:tcPr>
+          <w:p>
+            <w:r/>
+            <w:r>
+              <w:rPr>
+                <w:sz w:val="16"/>
+              </w:rPr>
+              <w:t>Exos stock earn-out at listing</w:t>
+            </w:r>
+            <w:r>
+              <w:br/>
+            </w:r>
+            <w:r>
+              <w:rPr>
+                <w:sz w:val="16"/>
+              </w:rPr>
+              <w:t>(on top of ~0.59% EAI up-front)</w:t>
             </w:r>
           </w:p>
         </w:tc>
         <w:tc>
           <w:tcPr>
             <w:tcW w:type="dxa" w:w="1152"/>
-            <w:shd w:val="clear" w:color="auto" w:fill="EFF6FF"/>
           </w:tcPr>
           <w:p>
             <w:pPr>
@@ -1355,14 +1480,13 @@
               <w:rPr>
                 <w:sz w:val="16"/>
               </w:rPr>
-              <w:t>—</w:t>
+              <w:t>$0</w:t>
             </w:r>
           </w:p>
         </w:tc>
         <w:tc>
           <w:tcPr>
             <w:tcW w:type="dxa" w:w="1152"/>
-            <w:shd w:val="clear" w:color="auto" w:fill="EFF6FF"/>
           </w:tcPr>
           <w:p>
             <w:pPr>
@@ -1373,14 +1497,13 @@
               <w:rPr>
                 <w:sz w:val="16"/>
               </w:rPr>
-              <w:t>—</w:t>
+              <w:t>$625K</w:t>
             </w:r>
           </w:p>
         </w:tc>
         <w:tc>
           <w:tcPr>
             <w:tcW w:type="dxa" w:w="1152"/>
-            <w:shd w:val="clear" w:color="auto" w:fill="EFF6FF"/>
           </w:tcPr>
           <w:p>
             <w:pPr>
@@ -1391,22 +1514,21 @@
               <w:rPr>
                 <w:sz w:val="16"/>
               </w:rPr>
-              <w:t>$250K</w:t>
+              <w:t>$1,500K</w:t>
             </w:r>
           </w:p>
         </w:tc>
         <w:tc>
           <w:tcPr>
             <w:tcW w:type="dxa" w:w="2664"/>
-            <w:shd w:val="clear" w:color="auto" w:fill="EFF6FF"/>
-          </w:tcPr>
-          <w:p>
-            <w:r/>
-            <w:r>
-              <w:rPr>
-                <w:sz w:val="16"/>
-              </w:rPr>
-              <w:t>Pays first year threshold hit</w:t>
+          </w:tcPr>
+          <w:p>
+            <w:r/>
+            <w:r>
+              <w:rPr>
+                <w:sz w:val="16"/>
+              </w:rPr>
+              <w:t>Post-RTO ~FY29; earn-out 0.0%/0.25%/0.5% FD; lockup same as Exos principals.</w:t>
             </w:r>
             <w:r>
               <w:br/>
@@ -1415,7 +1537,7 @@
               <w:rPr>
                 <w:sz w:val="16"/>
               </w:rPr>
-              <w:t>(est. FY31 at high)</w:t>
+              <w:t>At 409A: $0/$424K/$848K. Total Exos equity: ~0.59%/~0.84%/~1.09%.</w:t>
             </w:r>
           </w:p>
         </w:tc>
@@ -1424,31 +1546,33 @@
         <w:tc>
           <w:tcPr>
             <w:tcW w:type="dxa" w:w="3240"/>
-            <w:shd w:val="clear" w:color="auto" w:fill="EFF6FF"/>
-          </w:tcPr>
-          <w:p>
-            <w:r/>
-            <w:r>
-              <w:rPr>
-                <w:sz w:val="16"/>
-              </w:rPr>
-              <w:t>Milestone M5: 50% reduction in tank build</w:t>
+            <w:shd w:val="clear" w:color="auto" w:fill="D1FAE5"/>
+          </w:tcPr>
+          <w:p>
+            <w:r/>
+            <w:r>
+              <w:rPr>
+                <w:b/>
+                <w:sz w:val="16"/>
+              </w:rPr>
+              <w:t>③ TOTAL OFFER VALUE, 5-yr</w:t>
             </w:r>
             <w:r>
               <w:br/>
             </w:r>
             <w:r>
               <w:rPr>
-                <w:sz w:val="16"/>
-              </w:rPr>
-              <w:t>cost (dome &amp; build-process automation proven)</w:t>
+                <w:b/>
+                <w:sz w:val="16"/>
+              </w:rPr>
+              <w:t>(② + earn-outs; earn-out stock at listing)</w:t>
             </w:r>
           </w:p>
         </w:tc>
         <w:tc>
           <w:tcPr>
             <w:tcW w:type="dxa" w:w="1152"/>
-            <w:shd w:val="clear" w:color="auto" w:fill="EFF6FF"/>
+            <w:shd w:val="clear" w:color="auto" w:fill="D1FAE5"/>
           </w:tcPr>
           <w:p>
             <w:pPr>
@@ -1457,16 +1581,17 @@
             <w:r/>
             <w:r>
               <w:rPr>
-                <w:sz w:val="16"/>
-              </w:rPr>
-              <w:t>—</w:t>
+                <w:b/>
+                <w:sz w:val="16"/>
+              </w:rPr>
+              <w:t>$5,810K</w:t>
             </w:r>
           </w:p>
         </w:tc>
         <w:tc>
           <w:tcPr>
             <w:tcW w:type="dxa" w:w="1152"/>
-            <w:shd w:val="clear" w:color="auto" w:fill="EFF6FF"/>
+            <w:shd w:val="clear" w:color="auto" w:fill="D1FAE5"/>
           </w:tcPr>
           <w:p>
             <w:pPr>
@@ -1475,16 +1600,17 @@
             <w:r/>
             <w:r>
               <w:rPr>
-                <w:sz w:val="16"/>
-              </w:rPr>
-              <w:t>—</w:t>
+                <w:b/>
+                <w:sz w:val="16"/>
+              </w:rPr>
+              <w:t>$7,385K</w:t>
             </w:r>
           </w:p>
         </w:tc>
         <w:tc>
           <w:tcPr>
             <w:tcW w:type="dxa" w:w="1152"/>
-            <w:shd w:val="clear" w:color="auto" w:fill="EFF6FF"/>
+            <w:shd w:val="clear" w:color="auto" w:fill="D1FAE5"/>
           </w:tcPr>
           <w:p>
             <w:pPr>
@@ -1493,33 +1619,26 @@
             <w:r/>
             <w:r>
               <w:rPr>
-                <w:sz w:val="16"/>
-              </w:rPr>
-              <w:t>$200K</w:t>
+                <w:b/>
+                <w:sz w:val="16"/>
+              </w:rPr>
+              <w:t>$8,960K</w:t>
             </w:r>
           </w:p>
         </w:tc>
         <w:tc>
           <w:tcPr>
             <w:tcW w:type="dxa" w:w="2664"/>
-            <w:shd w:val="clear" w:color="auto" w:fill="EFF6FF"/>
-          </w:tcPr>
-          <w:p>
-            <w:r/>
-            <w:r>
-              <w:rPr>
-                <w:sz w:val="16"/>
-              </w:rPr>
-              <w:t>Pays when 50% cost reduction proven</w:t>
-            </w:r>
-            <w:r>
-              <w:br/>
-            </w:r>
-            <w:r>
-              <w:rPr>
-                <w:sz w:val="16"/>
-              </w:rPr>
-              <w:t>(est. FY27–FY28)</w:t>
+            <w:shd w:val="clear" w:color="auto" w:fill="D1FAE5"/>
+          </w:tcPr>
+          <w:p>
+            <w:r/>
+            <w:r>
+              <w:rPr>
+                <w:b/>
+                <w:sz w:val="16"/>
+              </w:rPr>
+              <w:t>FY27–FY31. HIGH &lt; $10M target — not rebalanced.</w:t>
             </w:r>
           </w:p>
         </w:tc>
@@ -1528,29 +1647,35 @@
         <w:tc>
           <w:tcPr>
             <w:tcW w:type="dxa" w:w="3240"/>
-          </w:tcPr>
-          <w:p>
-            <w:r/>
-            <w:r>
-              <w:rPr>
-                <w:sz w:val="16"/>
-              </w:rPr>
-              <w:t>Exos stock earn-out at listing</w:t>
+            <w:shd w:val="clear" w:color="auto" w:fill="FBD2BC"/>
+          </w:tcPr>
+          <w:p>
+            <w:r/>
+            <w:r>
+              <w:rPr>
+                <w:b/>
+                <w:color w:val="1F3A68"/>
+                <w:sz w:val="16"/>
+              </w:rPr>
+              <w:t>IF HELD: all Exos stock projected</w:t>
             </w:r>
             <w:r>
               <w:br/>
             </w:r>
             <w:r>
               <w:rPr>
-                <w:sz w:val="16"/>
-              </w:rPr>
-              <w:t>(on top of ~0.59% EAI up-front)</w:t>
+                <w:b/>
+                <w:color w:val="1F3A68"/>
+                <w:sz w:val="16"/>
+              </w:rPr>
+              <w:t>in FY2031 (replaces listing earn-out)</w:t>
             </w:r>
           </w:p>
         </w:tc>
         <w:tc>
           <w:tcPr>
             <w:tcW w:type="dxa" w:w="1152"/>
+            <w:shd w:val="clear" w:color="auto" w:fill="FBD2BC"/>
           </w:tcPr>
           <w:p>
             <w:pPr>
@@ -1559,15 +1684,18 @@
             <w:r/>
             <w:r>
               <w:rPr>
-                <w:sz w:val="16"/>
-              </w:rPr>
-              <w:t>$0</w:t>
+                <w:b/>
+                <w:color w:val="1F3A68"/>
+                <w:sz w:val="16"/>
+              </w:rPr>
+              <w:t>$6.7M</w:t>
             </w:r>
           </w:p>
         </w:tc>
         <w:tc>
           <w:tcPr>
             <w:tcW w:type="dxa" w:w="1152"/>
+            <w:shd w:val="clear" w:color="auto" w:fill="FBD2BC"/>
           </w:tcPr>
           <w:p>
             <w:pPr>
@@ -1576,15 +1704,18 @@
             <w:r/>
             <w:r>
               <w:rPr>
-                <w:sz w:val="16"/>
-              </w:rPr>
-              <w:t>$625K</w:t>
+                <w:b/>
+                <w:color w:val="1F3A68"/>
+                <w:sz w:val="16"/>
+              </w:rPr>
+              <w:t>$9.6M</w:t>
             </w:r>
           </w:p>
         </w:tc>
         <w:tc>
           <w:tcPr>
             <w:tcW w:type="dxa" w:w="1152"/>
+            <w:shd w:val="clear" w:color="auto" w:fill="FBD2BC"/>
           </w:tcPr>
           <w:p>
             <w:pPr>
@@ -1593,32 +1724,50 @@
             <w:r/>
             <w:r>
               <w:rPr>
-                <w:sz w:val="16"/>
-              </w:rPr>
-              <w:t>$1,500K</w:t>
+                <w:b/>
+                <w:color w:val="1F3A68"/>
+                <w:sz w:val="16"/>
+              </w:rPr>
+              <w:t>$12.4M</w:t>
             </w:r>
           </w:p>
         </w:tc>
         <w:tc>
           <w:tcPr>
             <w:tcW w:type="dxa" w:w="2664"/>
-          </w:tcPr>
-          <w:p>
-            <w:r/>
-            <w:r>
-              <w:rPr>
-                <w:sz w:val="16"/>
-              </w:rPr>
-              <w:t>Post-RTO ~FY29; earn-out 0.0%/0.25%/0.5% FD; lockup same as Exos principals.</w:t>
+            <w:shd w:val="clear" w:color="auto" w:fill="FBD2BC"/>
+          </w:tcPr>
+          <w:p>
+            <w:r/>
+            <w:r>
+              <w:rPr>
+                <w:b/>
+                <w:color w:val="1F3A68"/>
+                <w:sz w:val="16"/>
+              </w:rPr>
+              <w:t>Total stake ~0.59/0.84/1.09% → ~0.41/0.59/0.76% after</w:t>
             </w:r>
             <w:r>
               <w:br/>
             </w:r>
             <w:r>
               <w:rPr>
-                <w:sz w:val="16"/>
-              </w:rPr>
-              <w:t>At 409A: $0/$424K/$848K. Total Exos equity: ~0.59%/~0.84%/~1.09%.</w:t>
+                <w:b/>
+                <w:color w:val="1F3A68"/>
+                <w:sz w:val="16"/>
+              </w:rPr>
+              <w:t>~30% dilution × ~$1.63B FY31 EV (16× v12 EBITDA).</w:t>
+            </w:r>
+            <w:r>
+              <w:br/>
+            </w:r>
+            <w:r>
+              <w:rPr>
+                <w:b/>
+                <w:color w:val="1F3A68"/>
+                <w:sz w:val="16"/>
+              </w:rPr>
+              <w:t>Projection only; on SSLC-actuals case ~$0.7–1.3M.</w:t>
             </w:r>
           </w:p>
         </w:tc>
@@ -1627,236 +1776,6 @@
         <w:tc>
           <w:tcPr>
             <w:tcW w:type="dxa" w:w="3240"/>
-            <w:shd w:val="clear" w:color="auto" w:fill="D1FAE5"/>
-          </w:tcPr>
-          <w:p>
-            <w:r/>
-            <w:r>
-              <w:rPr>
-                <w:b/>
-                <w:sz w:val="16"/>
-              </w:rPr>
-              <w:t>③ TOTAL OFFER VALUE, 5-yr</w:t>
-            </w:r>
-            <w:r>
-              <w:br/>
-            </w:r>
-            <w:r>
-              <w:rPr>
-                <w:b/>
-                <w:sz w:val="16"/>
-              </w:rPr>
-              <w:t>(② + earn-outs; earn-out stock at listing)</w:t>
-            </w:r>
-          </w:p>
-        </w:tc>
-        <w:tc>
-          <w:tcPr>
-            <w:tcW w:type="dxa" w:w="1152"/>
-            <w:shd w:val="clear" w:color="auto" w:fill="D1FAE5"/>
-          </w:tcPr>
-          <w:p>
-            <w:pPr>
-              <w:jc w:val="right"/>
-            </w:pPr>
-            <w:r/>
-            <w:r>
-              <w:rPr>
-                <w:b/>
-                <w:sz w:val="16"/>
-              </w:rPr>
-              <w:t>$6,310K</w:t>
-            </w:r>
-          </w:p>
-        </w:tc>
-        <w:tc>
-          <w:tcPr>
-            <w:tcW w:type="dxa" w:w="1152"/>
-            <w:shd w:val="clear" w:color="auto" w:fill="D1FAE5"/>
-          </w:tcPr>
-          <w:p>
-            <w:pPr>
-              <w:jc w:val="right"/>
-            </w:pPr>
-            <w:r/>
-            <w:r>
-              <w:rPr>
-                <w:b/>
-                <w:sz w:val="16"/>
-              </w:rPr>
-              <w:t>$7,885K</w:t>
-            </w:r>
-          </w:p>
-        </w:tc>
-        <w:tc>
-          <w:tcPr>
-            <w:tcW w:type="dxa" w:w="1152"/>
-            <w:shd w:val="clear" w:color="auto" w:fill="D1FAE5"/>
-          </w:tcPr>
-          <w:p>
-            <w:pPr>
-              <w:jc w:val="right"/>
-            </w:pPr>
-            <w:r/>
-            <w:r>
-              <w:rPr>
-                <w:b/>
-                <w:sz w:val="16"/>
-              </w:rPr>
-              <w:t>$9,460K</w:t>
-            </w:r>
-          </w:p>
-        </w:tc>
-        <w:tc>
-          <w:tcPr>
-            <w:tcW w:type="dxa" w:w="2664"/>
-            <w:shd w:val="clear" w:color="auto" w:fill="D1FAE5"/>
-          </w:tcPr>
-          <w:p>
-            <w:r/>
-            <w:r>
-              <w:rPr>
-                <w:b/>
-                <w:sz w:val="16"/>
-              </w:rPr>
-              <w:t>FY27–FY31. HIGH &lt; $10M target — not rebalanced.</w:t>
-            </w:r>
-          </w:p>
-        </w:tc>
-      </w:tr>
-      <w:tr>
-        <w:tc>
-          <w:tcPr>
-            <w:tcW w:type="dxa" w:w="3240"/>
-            <w:shd w:val="clear" w:color="auto" w:fill="FBD2BC"/>
-          </w:tcPr>
-          <w:p>
-            <w:r/>
-            <w:r>
-              <w:rPr>
-                <w:b/>
-                <w:color w:val="1F3A68"/>
-                <w:sz w:val="16"/>
-              </w:rPr>
-              <w:t>IF HELD: all Exos stock projected</w:t>
-            </w:r>
-            <w:r>
-              <w:br/>
-            </w:r>
-            <w:r>
-              <w:rPr>
-                <w:b/>
-                <w:color w:val="1F3A68"/>
-                <w:sz w:val="16"/>
-              </w:rPr>
-              <w:t>in FY2031 (replaces listing earn-out)</w:t>
-            </w:r>
-          </w:p>
-        </w:tc>
-        <w:tc>
-          <w:tcPr>
-            <w:tcW w:type="dxa" w:w="1152"/>
-            <w:shd w:val="clear" w:color="auto" w:fill="FBD2BC"/>
-          </w:tcPr>
-          <w:p>
-            <w:pPr>
-              <w:jc w:val="right"/>
-            </w:pPr>
-            <w:r/>
-            <w:r>
-              <w:rPr>
-                <w:b/>
-                <w:color w:val="1F3A68"/>
-                <w:sz w:val="16"/>
-              </w:rPr>
-              <w:t>$6.7M</w:t>
-            </w:r>
-          </w:p>
-        </w:tc>
-        <w:tc>
-          <w:tcPr>
-            <w:tcW w:type="dxa" w:w="1152"/>
-            <w:shd w:val="clear" w:color="auto" w:fill="FBD2BC"/>
-          </w:tcPr>
-          <w:p>
-            <w:pPr>
-              <w:jc w:val="right"/>
-            </w:pPr>
-            <w:r/>
-            <w:r>
-              <w:rPr>
-                <w:b/>
-                <w:color w:val="1F3A68"/>
-                <w:sz w:val="16"/>
-              </w:rPr>
-              <w:t>$9.6M</w:t>
-            </w:r>
-          </w:p>
-        </w:tc>
-        <w:tc>
-          <w:tcPr>
-            <w:tcW w:type="dxa" w:w="1152"/>
-            <w:shd w:val="clear" w:color="auto" w:fill="FBD2BC"/>
-          </w:tcPr>
-          <w:p>
-            <w:pPr>
-              <w:jc w:val="right"/>
-            </w:pPr>
-            <w:r/>
-            <w:r>
-              <w:rPr>
-                <w:b/>
-                <w:color w:val="1F3A68"/>
-                <w:sz w:val="16"/>
-              </w:rPr>
-              <w:t>$12.4M</w:t>
-            </w:r>
-          </w:p>
-        </w:tc>
-        <w:tc>
-          <w:tcPr>
-            <w:tcW w:type="dxa" w:w="2664"/>
-            <w:shd w:val="clear" w:color="auto" w:fill="FBD2BC"/>
-          </w:tcPr>
-          <w:p>
-            <w:r/>
-            <w:r>
-              <w:rPr>
-                <w:b/>
-                <w:color w:val="1F3A68"/>
-                <w:sz w:val="16"/>
-              </w:rPr>
-              <w:t>Total stake ~0.59/0.84/1.09% → ~0.41/0.59/0.76% after</w:t>
-            </w:r>
-            <w:r>
-              <w:br/>
-            </w:r>
-            <w:r>
-              <w:rPr>
-                <w:b/>
-                <w:color w:val="1F3A68"/>
-                <w:sz w:val="16"/>
-              </w:rPr>
-              <w:t>~30% dilution × ~$1.63B FY31 EV (16× v12 EBITDA).</w:t>
-            </w:r>
-            <w:r>
-              <w:br/>
-            </w:r>
-            <w:r>
-              <w:rPr>
-                <w:b/>
-                <w:color w:val="1F3A68"/>
-                <w:sz w:val="16"/>
-              </w:rPr>
-              <w:t>Projection only; on SSLC-actuals case ~$0.7–1.3M.</w:t>
-            </w:r>
-          </w:p>
-        </w:tc>
-      </w:tr>
-      <w:tr>
-        <w:tc>
-          <w:tcPr>
-            <w:tcW w:type="dxa" w:w="3240"/>
             <w:shd w:val="clear" w:color="auto" w:fill="F26A21"/>
           </w:tcPr>
           <w:p>
@@ -1898,7 +1817,7 @@
                 <w:color w:val="FFFFFF"/>
                 <w:sz w:val="16"/>
               </w:rPr>
-              <w:t>$12.0M</w:t>
+              <w:t>$11.5M</w:t>
             </w:r>
           </w:p>
         </w:tc>
@@ -1918,7 +1837,7 @@
                 <w:color w:val="FFFFFF"/>
                 <w:sz w:val="16"/>
               </w:rPr>
-              <w:t>$15.8M</w:t>
+              <w:t>$15.3M</w:t>
             </w:r>
           </w:p>
         </w:tc>
@@ -1938,7 +1857,7 @@
                 <w:color w:val="FFFFFF"/>
                 <w:sz w:val="16"/>
               </w:rPr>
-              <w:t>$19.4M</w:t>
+              <w:t>$18.9M</w:t>
             </w:r>
           </w:p>
         </w:tc>
@@ -3205,7 +3124,7 @@
           <w:color w:val="606060"/>
           <w:sz w:val="17"/>
         </w:rPr>
-        <w:t>Earn-out totals verified: Low $750K+$200K+$0=$950K ✓  Base $1,250K+$650K+$625K=$2,525K ✓  High $1,500K+$1,100K+$1,500K=$4,100K ✓  (each = ③ minus ② = ③ minus $5,360K)</w:t>
+        <w:t>Earn-out totals verified: Low $750K+$200K+$0=$950K ✓  Base $1,250K+$650K+$625K=$2,525K ✓  High $1,500K+$1,100K+$1,500K=$4,100K ✓  (each = ③ minus ② = ③ minus $4,860K)</w:t>
       </w:r>
     </w:p>
     <w:p>
@@ -3420,7 +3339,7 @@
                 <w:b/>
                 <w:sz w:val="18"/>
               </w:rPr>
-              <w:t>SSLC debts assumed</w:t>
+              <w:t>SSLC debts</w:t>
             </w:r>
           </w:p>
         </w:tc>
@@ -3434,7 +3353,7 @@
               <w:rPr>
                 <w:sz w:val="18"/>
               </w:rPr>
-              <w:t>Paid at face at close (est. ~$500K; verify QuickBooks)</w:t>
+              <w:t>Not assumed by Exos; SSLC's own responsibility. Removed from offer 10/10.</w:t>
             </w:r>
           </w:p>
         </w:tc>

</xml_diff>